<commit_message>
255: Fix description field as well as better output for the pdf generation.
</commit_message>
<xml_diff>
--- a/epictrack-api/src/api/reports/report_templates/anticipated_schedule.docx
+++ b/epictrack-api/src/api/reports/report_templates/anticipated_schedule.docx
@@ -4064,7 +4064,6 @@
           <w:p>
             <w:pPr>
               <w:rPr>
-                <w:rFonts w:asciiTheme="minorHAnsi" w:hAnsiTheme="minorHAnsi" w:cstheme="minorHAnsi"/>
                 <w:sz w:val="20"/>
                 <w:szCs w:val="20"/>
               </w:rPr>
@@ -4115,6 +4114,223 @@
                 <w:szCs w:val="20"/>
               </w:rPr>
               <w:t>_info:showEnd</w:t>
+            </w:r>
+            <w:proofErr w:type="spellEnd"/>
+            <w:r>
+              <w:rPr>
+                <w:sz w:val="20"/>
+                <w:szCs w:val="20"/>
+              </w:rPr>
+              <w:t>}</w:t>
+            </w:r>
+          </w:p>
+          <w:p>
+            <w:pPr>
+              <w:rPr>
+                <w:rFonts w:asciiTheme="minorHAnsi" w:hAnsiTheme="minorHAnsi" w:cstheme="minorHAnsi"/>
+                <w:b/>
+                <w:bCs/>
+                <w:sz w:val="20"/>
+                <w:szCs w:val="20"/>
+              </w:rPr>
+            </w:pPr>
+            <w:r>
+              <w:rPr>
+                <w:sz w:val="20"/>
+                <w:szCs w:val="20"/>
+              </w:rPr>
+              <w:t>{$</w:t>
+            </w:r>
+            <w:proofErr w:type="spellStart"/>
+            <w:r>
+              <w:rPr>
+                <w:sz w:val="20"/>
+                <w:szCs w:val="20"/>
+              </w:rPr>
+              <w:t>item_val</w:t>
+            </w:r>
+            <w:proofErr w:type="spellEnd"/>
+            <w:r>
+              <w:rPr>
+                <w:sz w:val="20"/>
+                <w:szCs w:val="20"/>
+              </w:rPr>
+              <w:t>[i</w:t>
+            </w:r>
+            <w:proofErr w:type="gramStart"/>
+            <w:r>
+              <w:rPr>
+                <w:sz w:val="20"/>
+                <w:szCs w:val="20"/>
+              </w:rPr>
+              <w:t>].</w:t>
+            </w:r>
+            <w:proofErr w:type="spellStart"/>
+            <w:r>
+              <w:rPr>
+                <w:sz w:val="20"/>
+                <w:szCs w:val="20"/>
+              </w:rPr>
+              <w:t>notes</w:t>
+            </w:r>
+            <w:proofErr w:type="gramEnd"/>
+            <w:r>
+              <w:rPr>
+                <w:sz w:val="20"/>
+                <w:szCs w:val="20"/>
+              </w:rPr>
+              <w:t>:ifNEM</w:t>
+            </w:r>
+            <w:proofErr w:type="spellEnd"/>
+            <w:r>
+              <w:rPr>
+                <w:sz w:val="20"/>
+                <w:szCs w:val="20"/>
+              </w:rPr>
+              <w:t>():</w:t>
+            </w:r>
+            <w:proofErr w:type="spellStart"/>
+            <w:r>
+              <w:rPr>
+                <w:sz w:val="20"/>
+                <w:szCs w:val="20"/>
+              </w:rPr>
+              <w:t>showBegin</w:t>
+            </w:r>
+            <w:proofErr w:type="spellEnd"/>
+            <w:r>
+              <w:rPr>
+                <w:sz w:val="20"/>
+                <w:szCs w:val="20"/>
+              </w:rPr>
+              <w:t>}</w:t>
+            </w:r>
+          </w:p>
+          <w:p>
+            <w:pPr>
+              <w:rPr>
+                <w:rFonts w:asciiTheme="minorHAnsi" w:hAnsiTheme="minorHAnsi" w:cstheme="minorHAnsi"/>
+                <w:sz w:val="20"/>
+                <w:szCs w:val="20"/>
+              </w:rPr>
+            </w:pPr>
+            <w:r>
+              <w:rPr>
+                <w:rFonts w:asciiTheme="minorHAnsi" w:hAnsiTheme="minorHAnsi" w:cstheme="minorHAnsi"/>
+                <w:b/>
+                <w:sz w:val="20"/>
+                <w:szCs w:val="20"/>
+              </w:rPr>
+              <w:t xml:space="preserve">Notes: </w:t>
+            </w:r>
+            <w:r>
+              <w:rPr>
+                <w:sz w:val="20"/>
+                <w:szCs w:val="20"/>
+              </w:rPr>
+              <w:t>{$</w:t>
+            </w:r>
+            <w:proofErr w:type="spellStart"/>
+            <w:r>
+              <w:rPr>
+                <w:sz w:val="20"/>
+                <w:szCs w:val="20"/>
+              </w:rPr>
+              <w:t>item_val</w:t>
+            </w:r>
+            <w:proofErr w:type="spellEnd"/>
+            <w:r>
+              <w:rPr>
+                <w:sz w:val="20"/>
+                <w:szCs w:val="20"/>
+              </w:rPr>
+              <w:t>[i</w:t>
+            </w:r>
+            <w:proofErr w:type="gramStart"/>
+            <w:r>
+              <w:rPr>
+                <w:sz w:val="20"/>
+                <w:szCs w:val="20"/>
+              </w:rPr>
+              <w:t>].</w:t>
+            </w:r>
+            <w:r>
+              <w:rPr>
+                <w:sz w:val="20"/>
+                <w:szCs w:val="20"/>
+              </w:rPr>
+              <w:t>notes</w:t>
+            </w:r>
+            <w:proofErr w:type="gramEnd"/>
+            <w:r>
+              <w:rPr>
+                <w:sz w:val="20"/>
+                <w:szCs w:val="20"/>
+              </w:rPr>
+              <w:t xml:space="preserve"> </w:t>
+            </w:r>
+            <w:r>
+              <w:rPr>
+                <w:sz w:val="20"/>
+                <w:szCs w:val="20"/>
+              </w:rPr>
+              <w:t>}</w:t>
+            </w:r>
+          </w:p>
+          <w:p>
+            <w:pPr>
+              <w:rPr>
+                <w:rFonts w:asciiTheme="minorHAnsi" w:hAnsiTheme="minorHAnsi" w:cstheme="minorHAnsi"/>
+                <w:sz w:val="20"/>
+                <w:szCs w:val="20"/>
+              </w:rPr>
+            </w:pPr>
+            <w:r>
+              <w:rPr>
+                <w:sz w:val="20"/>
+                <w:szCs w:val="20"/>
+              </w:rPr>
+              <w:t>{$</w:t>
+            </w:r>
+            <w:proofErr w:type="spellStart"/>
+            <w:r>
+              <w:rPr>
+                <w:sz w:val="20"/>
+                <w:szCs w:val="20"/>
+              </w:rPr>
+              <w:t>item_val</w:t>
+            </w:r>
+            <w:proofErr w:type="spellEnd"/>
+            <w:r>
+              <w:rPr>
+                <w:sz w:val="20"/>
+                <w:szCs w:val="20"/>
+              </w:rPr>
+              <w:t>[i</w:t>
+            </w:r>
+            <w:proofErr w:type="gramStart"/>
+            <w:r>
+              <w:rPr>
+                <w:sz w:val="20"/>
+                <w:szCs w:val="20"/>
+              </w:rPr>
+              <w:t>].</w:t>
+            </w:r>
+            <w:proofErr w:type="spellStart"/>
+            <w:r>
+              <w:rPr>
+                <w:sz w:val="20"/>
+                <w:szCs w:val="20"/>
+              </w:rPr>
+              <w:t>notes</w:t>
+            </w:r>
+            <w:proofErr w:type="gramEnd"/>
+            <w:r>
+              <w:rPr>
+                <w:sz w:val="20"/>
+                <w:szCs w:val="20"/>
+              </w:rPr>
+              <w:t>:showEnd</w:t>
             </w:r>
             <w:proofErr w:type="spellEnd"/>
             <w:r>
@@ -7474,7 +7690,6 @@
           <w:p>
             <w:pPr>
               <w:rPr>
-                <w:rFonts w:asciiTheme="minorHAnsi" w:hAnsiTheme="minorHAnsi" w:cstheme="minorHAnsi"/>
                 <w:sz w:val="20"/>
                 <w:szCs w:val="20"/>
               </w:rPr>
@@ -7534,6 +7749,246 @@
               </w:rPr>
               <w:t>}</w:t>
             </w:r>
+          </w:p>
+          <w:p>
+            <w:pPr>
+              <w:rPr>
+                <w:rFonts w:asciiTheme="minorHAnsi" w:hAnsiTheme="minorHAnsi" w:cstheme="minorHAnsi"/>
+                <w:b/>
+                <w:bCs/>
+                <w:sz w:val="20"/>
+                <w:szCs w:val="20"/>
+              </w:rPr>
+            </w:pPr>
+            <w:r>
+              <w:rPr>
+                <w:sz w:val="20"/>
+                <w:szCs w:val="20"/>
+              </w:rPr>
+              <w:t>{$</w:t>
+            </w:r>
+            <w:proofErr w:type="spellStart"/>
+            <w:r>
+              <w:rPr>
+                <w:sz w:val="20"/>
+                <w:szCs w:val="20"/>
+              </w:rPr>
+              <w:t>item_val</w:t>
+            </w:r>
+            <w:proofErr w:type="spellEnd"/>
+            <w:r>
+              <w:rPr>
+                <w:sz w:val="20"/>
+                <w:szCs w:val="20"/>
+              </w:rPr>
+              <w:t>[i</w:t>
+            </w:r>
+            <w:r>
+              <w:rPr>
+                <w:sz w:val="20"/>
+                <w:szCs w:val="20"/>
+              </w:rPr>
+              <w:t>+1</w:t>
+            </w:r>
+            <w:proofErr w:type="gramStart"/>
+            <w:r>
+              <w:rPr>
+                <w:sz w:val="20"/>
+                <w:szCs w:val="20"/>
+              </w:rPr>
+              <w:t>].</w:t>
+            </w:r>
+            <w:proofErr w:type="spellStart"/>
+            <w:r>
+              <w:rPr>
+                <w:sz w:val="20"/>
+                <w:szCs w:val="20"/>
+              </w:rPr>
+              <w:t>notes</w:t>
+            </w:r>
+            <w:proofErr w:type="gramEnd"/>
+            <w:r>
+              <w:rPr>
+                <w:sz w:val="20"/>
+                <w:szCs w:val="20"/>
+              </w:rPr>
+              <w:t>:ifNEM</w:t>
+            </w:r>
+            <w:proofErr w:type="spellEnd"/>
+            <w:r>
+              <w:rPr>
+                <w:sz w:val="20"/>
+                <w:szCs w:val="20"/>
+              </w:rPr>
+              <w:t>():</w:t>
+            </w:r>
+            <w:proofErr w:type="spellStart"/>
+            <w:r>
+              <w:rPr>
+                <w:sz w:val="20"/>
+                <w:szCs w:val="20"/>
+              </w:rPr>
+              <w:t>showBegin</w:t>
+            </w:r>
+            <w:proofErr w:type="spellEnd"/>
+            <w:r>
+              <w:rPr>
+                <w:sz w:val="20"/>
+                <w:szCs w:val="20"/>
+              </w:rPr>
+              <w:t>}</w:t>
+            </w:r>
+          </w:p>
+          <w:p>
+            <w:pPr>
+              <w:rPr>
+                <w:rFonts w:asciiTheme="minorHAnsi" w:hAnsiTheme="minorHAnsi" w:cstheme="minorHAnsi"/>
+                <w:sz w:val="20"/>
+                <w:szCs w:val="20"/>
+              </w:rPr>
+            </w:pPr>
+            <w:r>
+              <w:rPr>
+                <w:rFonts w:asciiTheme="minorHAnsi" w:hAnsiTheme="minorHAnsi" w:cstheme="minorHAnsi"/>
+                <w:b/>
+                <w:sz w:val="20"/>
+                <w:szCs w:val="20"/>
+              </w:rPr>
+              <w:t xml:space="preserve">Notes: </w:t>
+            </w:r>
+            <w:r>
+              <w:rPr>
+                <w:sz w:val="20"/>
+                <w:szCs w:val="20"/>
+              </w:rPr>
+              <w:t>{$</w:t>
+            </w:r>
+            <w:proofErr w:type="spellStart"/>
+            <w:r>
+              <w:rPr>
+                <w:sz w:val="20"/>
+                <w:szCs w:val="20"/>
+              </w:rPr>
+              <w:t>item_val</w:t>
+            </w:r>
+            <w:proofErr w:type="spellEnd"/>
+            <w:r>
+              <w:rPr>
+                <w:sz w:val="20"/>
+                <w:szCs w:val="20"/>
+              </w:rPr>
+              <w:t>[i</w:t>
+            </w:r>
+            <w:r>
+              <w:rPr>
+                <w:sz w:val="20"/>
+                <w:szCs w:val="20"/>
+              </w:rPr>
+              <w:t>+1</w:t>
+            </w:r>
+            <w:proofErr w:type="gramStart"/>
+            <w:r>
+              <w:rPr>
+                <w:sz w:val="20"/>
+                <w:szCs w:val="20"/>
+              </w:rPr>
+              <w:t>].</w:t>
+            </w:r>
+            <w:r>
+              <w:rPr>
+                <w:sz w:val="20"/>
+                <w:szCs w:val="20"/>
+              </w:rPr>
+              <w:t>notes</w:t>
+            </w:r>
+            <w:proofErr w:type="gramEnd"/>
+            <w:r>
+              <w:rPr>
+                <w:sz w:val="20"/>
+                <w:szCs w:val="20"/>
+              </w:rPr>
+              <w:t>}</w:t>
+            </w:r>
+          </w:p>
+          <w:p>
+            <w:pPr>
+              <w:rPr>
+                <w:rFonts w:asciiTheme="minorHAnsi" w:hAnsiTheme="minorHAnsi" w:cstheme="minorHAnsi"/>
+                <w:sz w:val="20"/>
+                <w:szCs w:val="20"/>
+              </w:rPr>
+            </w:pPr>
+            <w:r>
+              <w:rPr>
+                <w:sz w:val="20"/>
+                <w:szCs w:val="20"/>
+              </w:rPr>
+              <w:t>{$</w:t>
+            </w:r>
+            <w:proofErr w:type="spellStart"/>
+            <w:r>
+              <w:rPr>
+                <w:sz w:val="20"/>
+                <w:szCs w:val="20"/>
+              </w:rPr>
+              <w:t>item_val</w:t>
+            </w:r>
+            <w:proofErr w:type="spellEnd"/>
+            <w:r>
+              <w:rPr>
+                <w:sz w:val="20"/>
+                <w:szCs w:val="20"/>
+              </w:rPr>
+              <w:t>[i</w:t>
+            </w:r>
+            <w:r>
+              <w:rPr>
+                <w:sz w:val="20"/>
+                <w:szCs w:val="20"/>
+              </w:rPr>
+              <w:t>+1</w:t>
+            </w:r>
+            <w:proofErr w:type="gramStart"/>
+            <w:r>
+              <w:rPr>
+                <w:sz w:val="20"/>
+                <w:szCs w:val="20"/>
+              </w:rPr>
+              <w:t>].</w:t>
+            </w:r>
+            <w:proofErr w:type="spellStart"/>
+            <w:r>
+              <w:rPr>
+                <w:sz w:val="20"/>
+                <w:szCs w:val="20"/>
+              </w:rPr>
+              <w:t>notes</w:t>
+            </w:r>
+            <w:proofErr w:type="gramEnd"/>
+            <w:r>
+              <w:rPr>
+                <w:sz w:val="20"/>
+                <w:szCs w:val="20"/>
+              </w:rPr>
+              <w:t>:showEnd</w:t>
+            </w:r>
+            <w:proofErr w:type="spellEnd"/>
+            <w:r>
+              <w:rPr>
+                <w:sz w:val="20"/>
+                <w:szCs w:val="20"/>
+              </w:rPr>
+              <w:t>}</w:t>
+            </w:r>
+          </w:p>
+          <w:p>
+            <w:pPr>
+              <w:rPr>
+                <w:rFonts w:asciiTheme="minorHAnsi" w:hAnsiTheme="minorHAnsi" w:cstheme="minorHAnsi"/>
+                <w:sz w:val="20"/>
+                <w:szCs w:val="20"/>
+              </w:rPr>
+            </w:pPr>
           </w:p>
         </w:tc>
       </w:tr>

</xml_diff>

<commit_message>
Add milestone and correct duration to report.
</commit_message>
<xml_diff>
--- a/epictrack-api/src/api/reports/report_templates/anticipated_schedule.docx
+++ b/epictrack-api/src/api/reports/report_templates/anticipated_schedule.docx
@@ -3624,119 +3624,6 @@
                 <w:lang w:val="en"/>
               </w:rPr>
             </w:pPr>
-            <w:r>
-              <w:rPr>
-                <w:rFonts w:asciiTheme="minorHAnsi" w:hAnsiTheme="minorHAnsi" w:cstheme="minorHAnsi"/>
-                <w:bCs/>
-                <w:sz w:val="18"/>
-                <w:szCs w:val="18"/>
-                <w:lang w:val="en"/>
-              </w:rPr>
-              <w:t>{$</w:t>
-            </w:r>
-            <w:proofErr w:type="spellStart"/>
-            <w:r>
-              <w:rPr>
-                <w:rFonts w:asciiTheme="minorHAnsi" w:hAnsiTheme="minorHAnsi" w:cstheme="minorHAnsi"/>
-                <w:bCs/>
-                <w:sz w:val="18"/>
-                <w:szCs w:val="18"/>
-                <w:lang w:val="en"/>
-              </w:rPr>
-              <w:t>item_val</w:t>
-            </w:r>
-            <w:proofErr w:type="spellEnd"/>
-            <w:r>
-              <w:rPr>
-                <w:rFonts w:asciiTheme="minorHAnsi" w:hAnsiTheme="minorHAnsi" w:cstheme="minorHAnsi"/>
-                <w:bCs/>
-                <w:sz w:val="18"/>
-                <w:szCs w:val="18"/>
-                <w:lang w:val="en"/>
-              </w:rPr>
-              <w:t>[</w:t>
-            </w:r>
-            <w:proofErr w:type="spellStart"/>
-            <w:r>
-              <w:rPr>
-                <w:rFonts w:asciiTheme="minorHAnsi" w:hAnsiTheme="minorHAnsi" w:cstheme="minorHAnsi"/>
-                <w:bCs/>
-                <w:sz w:val="18"/>
-                <w:szCs w:val="18"/>
-                <w:lang w:val="en"/>
-              </w:rPr>
-              <w:t>i</w:t>
-            </w:r>
-            <w:proofErr w:type="spellEnd"/>
-            <w:proofErr w:type="gramStart"/>
-            <w:r>
-              <w:rPr>
-                <w:rFonts w:asciiTheme="minorHAnsi" w:hAnsiTheme="minorHAnsi" w:cstheme="minorHAnsi"/>
-                <w:bCs/>
-                <w:sz w:val="18"/>
-                <w:szCs w:val="18"/>
-                <w:lang w:val="en"/>
-              </w:rPr>
-              <w:t>]</w:t>
-            </w:r>
-            <w:r>
-              <w:t xml:space="preserve"> .</w:t>
-            </w:r>
-            <w:proofErr w:type="spellStart"/>
-            <w:r>
-              <w:rPr>
-                <w:rFonts w:asciiTheme="minorHAnsi" w:hAnsiTheme="minorHAnsi" w:cstheme="minorHAnsi"/>
-                <w:bCs/>
-                <w:sz w:val="18"/>
-                <w:szCs w:val="18"/>
-                <w:lang w:val="en"/>
-              </w:rPr>
-              <w:t>next</w:t>
-            </w:r>
-            <w:proofErr w:type="gramEnd"/>
-            <w:r>
-              <w:rPr>
-                <w:rFonts w:asciiTheme="minorHAnsi" w:hAnsiTheme="minorHAnsi" w:cstheme="minorHAnsi"/>
-                <w:bCs/>
-                <w:sz w:val="18"/>
-                <w:szCs w:val="18"/>
-                <w:lang w:val="en"/>
-              </w:rPr>
-              <w:t>_pecp_title:ifNEM</w:t>
-            </w:r>
-            <w:proofErr w:type="spellEnd"/>
-            <w:r>
-              <w:rPr>
-                <w:rFonts w:asciiTheme="minorHAnsi" w:hAnsiTheme="minorHAnsi" w:cstheme="minorHAnsi"/>
-                <w:bCs/>
-                <w:sz w:val="18"/>
-                <w:szCs w:val="18"/>
-                <w:lang w:val="en"/>
-              </w:rPr>
-              <w:t>():</w:t>
-            </w:r>
-            <w:proofErr w:type="spellStart"/>
-            <w:r>
-              <w:rPr>
-                <w:rFonts w:asciiTheme="minorHAnsi" w:hAnsiTheme="minorHAnsi" w:cstheme="minorHAnsi"/>
-                <w:bCs/>
-                <w:sz w:val="18"/>
-                <w:szCs w:val="18"/>
-                <w:lang w:val="en"/>
-              </w:rPr>
-              <w:t>showBegin</w:t>
-            </w:r>
-            <w:proofErr w:type="spellEnd"/>
-            <w:r>
-              <w:rPr>
-                <w:rFonts w:asciiTheme="minorHAnsi" w:hAnsiTheme="minorHAnsi" w:cstheme="minorHAnsi"/>
-                <w:bCs/>
-                <w:sz w:val="18"/>
-                <w:szCs w:val="18"/>
-                <w:lang w:val="en"/>
-              </w:rPr>
-              <w:t>}</w:t>
-            </w:r>
           </w:p>
           <w:p>
             <w:pPr>
@@ -3744,8 +3631,8 @@
               <w:rPr>
                 <w:rFonts w:asciiTheme="minorHAnsi" w:hAnsiTheme="minorHAnsi" w:cstheme="minorHAnsi"/>
                 <w:bCs/>
-                <w:sz w:val="18"/>
-                <w:szCs w:val="18"/>
+                <w:sz w:val="20"/>
+                <w:szCs w:val="20"/>
               </w:rPr>
             </w:pPr>
             <w:r>
@@ -3816,6 +3703,407 @@
                 <w:sz w:val="20"/>
                 <w:szCs w:val="20"/>
               </w:rPr>
+              <w:t>_pe</w:t>
+            </w:r>
+            <w:r>
+              <w:rPr>
+                <w:rFonts w:asciiTheme="minorHAnsi" w:hAnsiTheme="minorHAnsi" w:cstheme="minorHAnsi"/>
+                <w:bCs/>
+                <w:sz w:val="20"/>
+                <w:szCs w:val="20"/>
+              </w:rPr>
+              <w:t>cp_date</w:t>
+            </w:r>
+            <w:r>
+              <w:rPr>
+                <w:rFonts w:asciiTheme="minorHAnsi" w:hAnsiTheme="minorHAnsi" w:cstheme="minorHAnsi"/>
+                <w:bCs/>
+                <w:sz w:val="20"/>
+                <w:szCs w:val="20"/>
+              </w:rPr>
+              <w:t>:showBegin</w:t>
+            </w:r>
+            <w:proofErr w:type="spellEnd"/>
+            <w:r>
+              <w:rPr>
+                <w:rFonts w:asciiTheme="minorHAnsi" w:hAnsiTheme="minorHAnsi" w:cstheme="minorHAnsi"/>
+                <w:bCs/>
+                <w:sz w:val="20"/>
+                <w:szCs w:val="20"/>
+              </w:rPr>
+              <w:t>}</w:t>
+            </w:r>
+          </w:p>
+          <w:p>
+            <w:pPr>
+              <w:spacing w:line="201" w:lineRule="atLeast"/>
+              <w:rPr>
+                <w:rFonts w:asciiTheme="minorHAnsi" w:hAnsiTheme="minorHAnsi" w:cstheme="minorHAnsi"/>
+                <w:bCs/>
+                <w:sz w:val="20"/>
+                <w:szCs w:val="20"/>
+              </w:rPr>
+            </w:pPr>
+            <w:r>
+              <w:rPr>
+                <w:rFonts w:asciiTheme="minorHAnsi" w:hAnsiTheme="minorHAnsi" w:cstheme="minorHAnsi"/>
+                <w:b/>
+                <w:sz w:val="20"/>
+                <w:szCs w:val="20"/>
+              </w:rPr>
+              <w:t>Upcoming Comment Period:</w:t>
+            </w:r>
+            <w:r>
+              <w:rPr>
+                <w:rFonts w:asciiTheme="minorHAnsi" w:hAnsiTheme="minorHAnsi" w:cstheme="minorHAnsi"/>
+                <w:bCs/>
+                <w:sz w:val="18"/>
+                <w:szCs w:val="18"/>
+              </w:rPr>
+              <w:t xml:space="preserve"> </w:t>
+            </w:r>
+            <w:r>
+              <w:rPr>
+                <w:rFonts w:asciiTheme="minorHAnsi" w:hAnsiTheme="minorHAnsi" w:cstheme="minorHAnsi"/>
+                <w:bCs/>
+                <w:sz w:val="20"/>
+                <w:szCs w:val="20"/>
+              </w:rPr>
+              <w:t>{$</w:t>
+            </w:r>
+            <w:proofErr w:type="spellStart"/>
+            <w:r>
+              <w:rPr>
+                <w:rFonts w:asciiTheme="minorHAnsi" w:hAnsiTheme="minorHAnsi" w:cstheme="minorHAnsi"/>
+                <w:bCs/>
+                <w:sz w:val="20"/>
+                <w:szCs w:val="20"/>
+              </w:rPr>
+              <w:t>item_val</w:t>
+            </w:r>
+            <w:proofErr w:type="spellEnd"/>
+            <w:r>
+              <w:rPr>
+                <w:rFonts w:asciiTheme="minorHAnsi" w:hAnsiTheme="minorHAnsi" w:cstheme="minorHAnsi"/>
+                <w:bCs/>
+                <w:sz w:val="20"/>
+                <w:szCs w:val="20"/>
+              </w:rPr>
+              <w:t>[</w:t>
+            </w:r>
+            <w:proofErr w:type="spellStart"/>
+            <w:r>
+              <w:rPr>
+                <w:rFonts w:asciiTheme="minorHAnsi" w:hAnsiTheme="minorHAnsi" w:cstheme="minorHAnsi"/>
+                <w:bCs/>
+                <w:sz w:val="20"/>
+                <w:szCs w:val="20"/>
+              </w:rPr>
+              <w:t>i</w:t>
+            </w:r>
+            <w:proofErr w:type="spellEnd"/>
+            <w:proofErr w:type="gramStart"/>
+            <w:r>
+              <w:rPr>
+                <w:rFonts w:asciiTheme="minorHAnsi" w:hAnsiTheme="minorHAnsi" w:cstheme="minorHAnsi"/>
+                <w:bCs/>
+                <w:sz w:val="20"/>
+                <w:szCs w:val="20"/>
+              </w:rPr>
+              <w:t>].</w:t>
+            </w:r>
+            <w:proofErr w:type="spellStart"/>
+            <w:r>
+              <w:rPr>
+                <w:rFonts w:asciiTheme="minorHAnsi" w:hAnsiTheme="minorHAnsi" w:cstheme="minorHAnsi"/>
+                <w:bCs/>
+                <w:sz w:val="20"/>
+                <w:szCs w:val="20"/>
+              </w:rPr>
+              <w:t>phase</w:t>
+            </w:r>
+            <w:proofErr w:type="gramEnd"/>
+            <w:r>
+              <w:rPr>
+                <w:rFonts w:asciiTheme="minorHAnsi" w:hAnsiTheme="minorHAnsi" w:cstheme="minorHAnsi"/>
+                <w:bCs/>
+                <w:sz w:val="20"/>
+                <w:szCs w:val="20"/>
+              </w:rPr>
+              <w:t>_name</w:t>
+            </w:r>
+            <w:proofErr w:type="spellEnd"/>
+            <w:r>
+              <w:rPr>
+                <w:rFonts w:asciiTheme="minorHAnsi" w:hAnsiTheme="minorHAnsi" w:cstheme="minorHAnsi"/>
+                <w:bCs/>
+                <w:sz w:val="20"/>
+                <w:szCs w:val="20"/>
+              </w:rPr>
+              <w:t>}</w:t>
+            </w:r>
+            <w:r>
+              <w:rPr>
+                <w:rFonts w:asciiTheme="minorHAnsi" w:hAnsiTheme="minorHAnsi" w:cstheme="minorHAnsi"/>
+                <w:bCs/>
+                <w:sz w:val="20"/>
+                <w:szCs w:val="20"/>
+              </w:rPr>
+              <w:t xml:space="preserve"> - </w:t>
+            </w:r>
+            <w:r>
+              <w:rPr>
+                <w:rFonts w:asciiTheme="minorHAnsi" w:hAnsiTheme="minorHAnsi" w:cstheme="minorHAnsi"/>
+                <w:bCs/>
+                <w:sz w:val="20"/>
+                <w:szCs w:val="20"/>
+              </w:rPr>
+              <w:t>{$</w:t>
+            </w:r>
+            <w:proofErr w:type="spellStart"/>
+            <w:r>
+              <w:rPr>
+                <w:rFonts w:asciiTheme="minorHAnsi" w:hAnsiTheme="minorHAnsi" w:cstheme="minorHAnsi"/>
+                <w:bCs/>
+                <w:sz w:val="20"/>
+                <w:szCs w:val="20"/>
+              </w:rPr>
+              <w:t>item_val</w:t>
+            </w:r>
+            <w:proofErr w:type="spellEnd"/>
+            <w:r>
+              <w:rPr>
+                <w:rFonts w:asciiTheme="minorHAnsi" w:hAnsiTheme="minorHAnsi" w:cstheme="minorHAnsi"/>
+                <w:bCs/>
+                <w:sz w:val="20"/>
+                <w:szCs w:val="20"/>
+              </w:rPr>
+              <w:t>[</w:t>
+            </w:r>
+            <w:proofErr w:type="spellStart"/>
+            <w:r>
+              <w:rPr>
+                <w:rFonts w:asciiTheme="minorHAnsi" w:hAnsiTheme="minorHAnsi" w:cstheme="minorHAnsi"/>
+                <w:bCs/>
+                <w:sz w:val="20"/>
+                <w:szCs w:val="20"/>
+              </w:rPr>
+              <w:t>i</w:t>
+            </w:r>
+            <w:proofErr w:type="spellEnd"/>
+            <w:r>
+              <w:rPr>
+                <w:rFonts w:asciiTheme="minorHAnsi" w:hAnsiTheme="minorHAnsi" w:cstheme="minorHAnsi"/>
+                <w:bCs/>
+                <w:sz w:val="20"/>
+                <w:szCs w:val="20"/>
+              </w:rPr>
+              <w:t>].</w:t>
+            </w:r>
+            <w:proofErr w:type="spellStart"/>
+            <w:r>
+              <w:rPr>
+                <w:rFonts w:asciiTheme="minorHAnsi" w:hAnsiTheme="minorHAnsi" w:cstheme="minorHAnsi"/>
+                <w:bCs/>
+                <w:sz w:val="20"/>
+                <w:szCs w:val="20"/>
+              </w:rPr>
+              <w:t>next_pecp_date:formatD</w:t>
+            </w:r>
+            <w:proofErr w:type="spellEnd"/>
+            <w:r>
+              <w:rPr>
+                <w:rFonts w:asciiTheme="minorHAnsi" w:hAnsiTheme="minorHAnsi" w:cstheme="minorHAnsi"/>
+                <w:bCs/>
+                <w:sz w:val="20"/>
+                <w:szCs w:val="20"/>
+              </w:rPr>
+              <w:t>('LL')}</w:t>
+            </w:r>
+            <w:r>
+              <w:rPr>
+                <w:rFonts w:asciiTheme="minorHAnsi" w:hAnsiTheme="minorHAnsi" w:cstheme="minorHAnsi"/>
+                <w:bCs/>
+                <w:sz w:val="20"/>
+                <w:szCs w:val="20"/>
+              </w:rPr>
+              <w:t xml:space="preserve"> </w:t>
+            </w:r>
+            <w:r>
+              <w:rPr>
+                <w:rFonts w:asciiTheme="minorHAnsi" w:hAnsiTheme="minorHAnsi" w:cstheme="minorHAnsi"/>
+                <w:bCs/>
+                <w:sz w:val="20"/>
+                <w:szCs w:val="20"/>
+              </w:rPr>
+              <w:t>(</w:t>
+            </w:r>
+            <w:r>
+              <w:rPr>
+                <w:rFonts w:asciiTheme="minorHAnsi" w:hAnsiTheme="minorHAnsi" w:cstheme="minorHAnsi"/>
+                <w:bCs/>
+                <w:sz w:val="20"/>
+                <w:szCs w:val="20"/>
+              </w:rPr>
+              <w:t>{$</w:t>
+            </w:r>
+            <w:proofErr w:type="spellStart"/>
+            <w:r>
+              <w:rPr>
+                <w:rFonts w:asciiTheme="minorHAnsi" w:hAnsiTheme="minorHAnsi" w:cstheme="minorHAnsi"/>
+                <w:bCs/>
+                <w:sz w:val="20"/>
+                <w:szCs w:val="20"/>
+              </w:rPr>
+              <w:t>item_val</w:t>
+            </w:r>
+            <w:proofErr w:type="spellEnd"/>
+            <w:r>
+              <w:rPr>
+                <w:rFonts w:asciiTheme="minorHAnsi" w:hAnsiTheme="minorHAnsi" w:cstheme="minorHAnsi"/>
+                <w:bCs/>
+                <w:sz w:val="20"/>
+                <w:szCs w:val="20"/>
+              </w:rPr>
+              <w:t>[</w:t>
+            </w:r>
+            <w:proofErr w:type="spellStart"/>
+            <w:r>
+              <w:rPr>
+                <w:rFonts w:asciiTheme="minorHAnsi" w:hAnsiTheme="minorHAnsi" w:cstheme="minorHAnsi"/>
+                <w:bCs/>
+                <w:sz w:val="20"/>
+                <w:szCs w:val="20"/>
+              </w:rPr>
+              <w:t>i</w:t>
+            </w:r>
+            <w:proofErr w:type="spellEnd"/>
+            <w:r>
+              <w:rPr>
+                <w:rFonts w:asciiTheme="minorHAnsi" w:hAnsiTheme="minorHAnsi" w:cstheme="minorHAnsi"/>
+                <w:bCs/>
+                <w:sz w:val="20"/>
+                <w:szCs w:val="20"/>
+              </w:rPr>
+              <w:t>].</w:t>
+            </w:r>
+            <w:proofErr w:type="spellStart"/>
+            <w:r>
+              <w:rPr>
+                <w:rFonts w:asciiTheme="minorHAnsi" w:hAnsiTheme="minorHAnsi" w:cstheme="minorHAnsi"/>
+                <w:bCs/>
+                <w:sz w:val="20"/>
+                <w:szCs w:val="20"/>
+              </w:rPr>
+              <w:t>next_pecp</w:t>
+            </w:r>
+            <w:r>
+              <w:rPr>
+                <w:rFonts w:asciiTheme="minorHAnsi" w:hAnsiTheme="minorHAnsi" w:cstheme="minorHAnsi"/>
+                <w:bCs/>
+                <w:sz w:val="20"/>
+                <w:szCs w:val="20"/>
+              </w:rPr>
+              <w:t>_number_of_days</w:t>
+            </w:r>
+            <w:proofErr w:type="spellEnd"/>
+            <w:r>
+              <w:rPr>
+                <w:rFonts w:asciiTheme="minorHAnsi" w:hAnsiTheme="minorHAnsi" w:cstheme="minorHAnsi"/>
+                <w:bCs/>
+                <w:sz w:val="20"/>
+                <w:szCs w:val="20"/>
+              </w:rPr>
+              <w:t xml:space="preserve">} </w:t>
+            </w:r>
+            <w:r>
+              <w:rPr>
+                <w:rFonts w:asciiTheme="minorHAnsi" w:hAnsiTheme="minorHAnsi" w:cstheme="minorHAnsi"/>
+                <w:bCs/>
+                <w:sz w:val="20"/>
+                <w:szCs w:val="20"/>
+              </w:rPr>
+              <w:t xml:space="preserve"> days)</w:t>
+            </w:r>
+          </w:p>
+          <w:p>
+            <w:pPr>
+              <w:spacing w:line="201" w:lineRule="atLeast"/>
+              <w:rPr>
+                <w:rFonts w:asciiTheme="minorHAnsi" w:hAnsiTheme="minorHAnsi" w:cstheme="minorHAnsi"/>
+                <w:bCs/>
+                <w:sz w:val="20"/>
+                <w:szCs w:val="20"/>
+              </w:rPr>
+            </w:pPr>
+            <w:r>
+              <w:rPr>
+                <w:rFonts w:asciiTheme="minorHAnsi" w:hAnsiTheme="minorHAnsi" w:cstheme="minorHAnsi"/>
+                <w:bCs/>
+                <w:sz w:val="20"/>
+                <w:szCs w:val="20"/>
+              </w:rPr>
+              <w:t>{$</w:t>
+            </w:r>
+            <w:proofErr w:type="spellStart"/>
+            <w:r>
+              <w:rPr>
+                <w:rFonts w:asciiTheme="minorHAnsi" w:hAnsiTheme="minorHAnsi" w:cstheme="minorHAnsi"/>
+                <w:bCs/>
+                <w:sz w:val="20"/>
+                <w:szCs w:val="20"/>
+              </w:rPr>
+              <w:t>item_val</w:t>
+            </w:r>
+            <w:proofErr w:type="spellEnd"/>
+            <w:r>
+              <w:rPr>
+                <w:rFonts w:asciiTheme="minorHAnsi" w:hAnsiTheme="minorHAnsi" w:cstheme="minorHAnsi"/>
+                <w:bCs/>
+                <w:sz w:val="20"/>
+                <w:szCs w:val="20"/>
+              </w:rPr>
+              <w:t>[</w:t>
+            </w:r>
+            <w:proofErr w:type="spellStart"/>
+            <w:r>
+              <w:rPr>
+                <w:rFonts w:asciiTheme="minorHAnsi" w:hAnsiTheme="minorHAnsi" w:cstheme="minorHAnsi"/>
+                <w:bCs/>
+                <w:sz w:val="20"/>
+                <w:szCs w:val="20"/>
+              </w:rPr>
+              <w:t>i</w:t>
+            </w:r>
+            <w:proofErr w:type="spellEnd"/>
+            <w:proofErr w:type="gramStart"/>
+            <w:r>
+              <w:rPr>
+                <w:rFonts w:asciiTheme="minorHAnsi" w:hAnsiTheme="minorHAnsi" w:cstheme="minorHAnsi"/>
+                <w:bCs/>
+                <w:sz w:val="20"/>
+                <w:szCs w:val="20"/>
+              </w:rPr>
+              <w:t>].</w:t>
+            </w:r>
+            <w:proofErr w:type="spellStart"/>
+            <w:r>
+              <w:rPr>
+                <w:rFonts w:asciiTheme="minorHAnsi" w:hAnsiTheme="minorHAnsi" w:cstheme="minorHAnsi"/>
+                <w:bCs/>
+                <w:sz w:val="20"/>
+                <w:szCs w:val="20"/>
+              </w:rPr>
+              <w:t>next</w:t>
+            </w:r>
+            <w:proofErr w:type="gramEnd"/>
+            <w:r>
+              <w:rPr>
+                <w:rFonts w:asciiTheme="minorHAnsi" w:hAnsiTheme="minorHAnsi" w:cstheme="minorHAnsi"/>
+                <w:bCs/>
+                <w:sz w:val="20"/>
+                <w:szCs w:val="20"/>
+              </w:rPr>
               <w:t>_pecp_</w:t>
             </w:r>
             <w:r>
@@ -3827,12 +4115,456 @@
               </w:rPr>
               <w:t>date</w:t>
             </w:r>
-            <w:proofErr w:type="spellEnd"/>
-            <w:r>
-              <w:rPr>
-                <w:rFonts w:asciiTheme="minorHAnsi" w:hAnsiTheme="minorHAnsi" w:cstheme="minorHAnsi"/>
-                <w:sz w:val="20"/>
-                <w:szCs w:val="20"/>
+            <w:r>
+              <w:rPr>
+                <w:rFonts w:asciiTheme="minorHAnsi" w:hAnsiTheme="minorHAnsi" w:cstheme="minorHAnsi"/>
+                <w:bCs/>
+                <w:sz w:val="20"/>
+                <w:szCs w:val="20"/>
+              </w:rPr>
+              <w:t>:showEnd</w:t>
+            </w:r>
+            <w:proofErr w:type="spellEnd"/>
+            <w:r>
+              <w:rPr>
+                <w:rFonts w:asciiTheme="minorHAnsi" w:hAnsiTheme="minorHAnsi" w:cstheme="minorHAnsi"/>
+                <w:bCs/>
+                <w:sz w:val="20"/>
+                <w:szCs w:val="20"/>
+              </w:rPr>
+              <w:t>}</w:t>
+            </w:r>
+          </w:p>
+          <w:p>
+            <w:pPr>
+              <w:spacing w:line="201" w:lineRule="atLeast"/>
+              <w:rPr>
+                <w:rFonts w:asciiTheme="minorHAnsi" w:hAnsiTheme="minorHAnsi" w:cstheme="minorHAnsi"/>
+                <w:bCs/>
+                <w:sz w:val="20"/>
+                <w:szCs w:val="20"/>
+              </w:rPr>
+            </w:pPr>
+          </w:p>
+          <w:p>
+            <w:pPr>
+              <w:spacing w:line="201" w:lineRule="atLeast"/>
+              <w:rPr>
+                <w:rFonts w:asciiTheme="minorHAnsi" w:hAnsiTheme="minorHAnsi" w:cstheme="minorHAnsi"/>
+                <w:bCs/>
+                <w:sz w:val="18"/>
+                <w:szCs w:val="18"/>
+                <w:lang w:val="en"/>
+              </w:rPr>
+            </w:pPr>
+            <w:r>
+              <w:rPr>
+                <w:rFonts w:asciiTheme="minorHAnsi" w:hAnsiTheme="minorHAnsi" w:cstheme="minorHAnsi"/>
+                <w:bCs/>
+                <w:sz w:val="18"/>
+                <w:szCs w:val="18"/>
+                <w:lang w:val="en"/>
+              </w:rPr>
+              <w:t>{$</w:t>
+            </w:r>
+            <w:proofErr w:type="spellStart"/>
+            <w:r>
+              <w:rPr>
+                <w:rFonts w:asciiTheme="minorHAnsi" w:hAnsiTheme="minorHAnsi" w:cstheme="minorHAnsi"/>
+                <w:bCs/>
+                <w:sz w:val="18"/>
+                <w:szCs w:val="18"/>
+                <w:lang w:val="en"/>
+              </w:rPr>
+              <w:t>item_val</w:t>
+            </w:r>
+            <w:proofErr w:type="spellEnd"/>
+            <w:r>
+              <w:rPr>
+                <w:rFonts w:asciiTheme="minorHAnsi" w:hAnsiTheme="minorHAnsi" w:cstheme="minorHAnsi"/>
+                <w:bCs/>
+                <w:sz w:val="18"/>
+                <w:szCs w:val="18"/>
+                <w:lang w:val="en"/>
+              </w:rPr>
+              <w:t>[</w:t>
+            </w:r>
+            <w:proofErr w:type="spellStart"/>
+            <w:r>
+              <w:rPr>
+                <w:rFonts w:asciiTheme="minorHAnsi" w:hAnsiTheme="minorHAnsi" w:cstheme="minorHAnsi"/>
+                <w:bCs/>
+                <w:sz w:val="18"/>
+                <w:szCs w:val="18"/>
+                <w:lang w:val="en"/>
+              </w:rPr>
+              <w:t>i</w:t>
+            </w:r>
+            <w:proofErr w:type="spellEnd"/>
+            <w:proofErr w:type="gramStart"/>
+            <w:r>
+              <w:rPr>
+                <w:rFonts w:asciiTheme="minorHAnsi" w:hAnsiTheme="minorHAnsi" w:cstheme="minorHAnsi"/>
+                <w:bCs/>
+                <w:sz w:val="18"/>
+                <w:szCs w:val="18"/>
+                <w:lang w:val="en"/>
+              </w:rPr>
+              <w:t>]</w:t>
+            </w:r>
+            <w:r>
+              <w:t xml:space="preserve"> .</w:t>
+            </w:r>
+            <w:proofErr w:type="spellStart"/>
+            <w:r>
+              <w:rPr>
+                <w:rFonts w:asciiTheme="minorHAnsi" w:hAnsiTheme="minorHAnsi" w:cstheme="minorHAnsi"/>
+                <w:bCs/>
+                <w:sz w:val="18"/>
+                <w:szCs w:val="18"/>
+                <w:lang w:val="en"/>
+              </w:rPr>
+              <w:t>next</w:t>
+            </w:r>
+            <w:proofErr w:type="gramEnd"/>
+            <w:r>
+              <w:rPr>
+                <w:rFonts w:asciiTheme="minorHAnsi" w:hAnsiTheme="minorHAnsi" w:cstheme="minorHAnsi"/>
+                <w:bCs/>
+                <w:sz w:val="18"/>
+                <w:szCs w:val="18"/>
+                <w:lang w:val="en"/>
+              </w:rPr>
+              <w:t>_pecp_title:ifNEM</w:t>
+            </w:r>
+            <w:proofErr w:type="spellEnd"/>
+            <w:r>
+              <w:rPr>
+                <w:rFonts w:asciiTheme="minorHAnsi" w:hAnsiTheme="minorHAnsi" w:cstheme="minorHAnsi"/>
+                <w:bCs/>
+                <w:sz w:val="18"/>
+                <w:szCs w:val="18"/>
+                <w:lang w:val="en"/>
+              </w:rPr>
+              <w:t>():</w:t>
+            </w:r>
+            <w:proofErr w:type="spellStart"/>
+            <w:r>
+              <w:rPr>
+                <w:rFonts w:asciiTheme="minorHAnsi" w:hAnsiTheme="minorHAnsi" w:cstheme="minorHAnsi"/>
+                <w:bCs/>
+                <w:sz w:val="18"/>
+                <w:szCs w:val="18"/>
+                <w:lang w:val="en"/>
+              </w:rPr>
+              <w:t>showBegin</w:t>
+            </w:r>
+            <w:proofErr w:type="spellEnd"/>
+            <w:r>
+              <w:rPr>
+                <w:rFonts w:asciiTheme="minorHAnsi" w:hAnsiTheme="minorHAnsi" w:cstheme="minorHAnsi"/>
+                <w:bCs/>
+                <w:sz w:val="18"/>
+                <w:szCs w:val="18"/>
+                <w:lang w:val="en"/>
+              </w:rPr>
+              <w:t>}</w:t>
+            </w:r>
+          </w:p>
+          <w:p>
+            <w:pPr>
+              <w:spacing w:line="201" w:lineRule="atLeast"/>
+              <w:rPr>
+                <w:rFonts w:asciiTheme="minorHAnsi" w:hAnsiTheme="minorHAnsi" w:cstheme="minorHAnsi"/>
+                <w:sz w:val="20"/>
+                <w:szCs w:val="20"/>
+              </w:rPr>
+            </w:pPr>
+            <w:r>
+              <w:rPr>
+                <w:rFonts w:asciiTheme="minorHAnsi" w:hAnsiTheme="minorHAnsi" w:cstheme="minorHAnsi"/>
+                <w:b/>
+                <w:sz w:val="20"/>
+                <w:szCs w:val="20"/>
+              </w:rPr>
+              <w:t>Next Milestone:</w:t>
+            </w:r>
+            <w:r>
+              <w:rPr>
+                <w:rFonts w:asciiTheme="minorHAnsi" w:hAnsiTheme="minorHAnsi" w:cstheme="minorHAnsi"/>
+                <w:b/>
+                <w:sz w:val="20"/>
+                <w:szCs w:val="20"/>
+              </w:rPr>
+              <w:t xml:space="preserve"> </w:t>
+            </w:r>
+            <w:r>
+              <w:rPr>
+                <w:rFonts w:asciiTheme="minorHAnsi" w:hAnsiTheme="minorHAnsi" w:cstheme="minorHAnsi"/>
+                <w:sz w:val="20"/>
+                <w:szCs w:val="20"/>
+              </w:rPr>
+              <w:t>{$</w:t>
+            </w:r>
+            <w:proofErr w:type="spellStart"/>
+            <w:r>
+              <w:rPr>
+                <w:rFonts w:asciiTheme="minorHAnsi" w:hAnsiTheme="minorHAnsi" w:cstheme="minorHAnsi"/>
+                <w:sz w:val="20"/>
+                <w:szCs w:val="20"/>
+              </w:rPr>
+              <w:t>item_val</w:t>
+            </w:r>
+            <w:proofErr w:type="spellEnd"/>
+            <w:r>
+              <w:rPr>
+                <w:rFonts w:asciiTheme="minorHAnsi" w:hAnsiTheme="minorHAnsi" w:cstheme="minorHAnsi"/>
+                <w:sz w:val="20"/>
+                <w:szCs w:val="20"/>
+              </w:rPr>
+              <w:t>[</w:t>
+            </w:r>
+            <w:proofErr w:type="spellStart"/>
+            <w:r>
+              <w:rPr>
+                <w:rFonts w:asciiTheme="minorHAnsi" w:hAnsiTheme="minorHAnsi" w:cstheme="minorHAnsi"/>
+                <w:sz w:val="20"/>
+                <w:szCs w:val="20"/>
+              </w:rPr>
+              <w:t>i</w:t>
+            </w:r>
+            <w:proofErr w:type="spellEnd"/>
+            <w:proofErr w:type="gramStart"/>
+            <w:r>
+              <w:rPr>
+                <w:rFonts w:asciiTheme="minorHAnsi" w:hAnsiTheme="minorHAnsi" w:cstheme="minorHAnsi"/>
+                <w:sz w:val="20"/>
+                <w:szCs w:val="20"/>
+              </w:rPr>
+              <w:t>].</w:t>
+            </w:r>
+            <w:proofErr w:type="spellStart"/>
+            <w:r>
+              <w:rPr>
+                <w:rFonts w:asciiTheme="minorHAnsi" w:hAnsiTheme="minorHAnsi" w:cstheme="minorHAnsi"/>
+                <w:sz w:val="20"/>
+                <w:szCs w:val="20"/>
+              </w:rPr>
+              <w:t>next</w:t>
+            </w:r>
+            <w:proofErr w:type="gramEnd"/>
+            <w:r>
+              <w:rPr>
+                <w:rFonts w:asciiTheme="minorHAnsi" w:hAnsiTheme="minorHAnsi" w:cstheme="minorHAnsi"/>
+                <w:sz w:val="20"/>
+                <w:szCs w:val="20"/>
+              </w:rPr>
+              <w:t>_pecp_title</w:t>
+            </w:r>
+            <w:proofErr w:type="spellEnd"/>
+            <w:r>
+              <w:rPr>
+                <w:rFonts w:asciiTheme="minorHAnsi" w:hAnsiTheme="minorHAnsi" w:cstheme="minorHAnsi"/>
+                <w:sz w:val="20"/>
+                <w:szCs w:val="20"/>
+              </w:rPr>
+              <w:t>}</w:t>
+            </w:r>
+          </w:p>
+          <w:p>
+            <w:pPr>
+              <w:spacing w:line="201" w:lineRule="atLeast"/>
+              <w:rPr>
+                <w:rFonts w:asciiTheme="minorHAnsi" w:hAnsiTheme="minorHAnsi" w:cstheme="minorHAnsi"/>
+                <w:sz w:val="18"/>
+                <w:szCs w:val="18"/>
+                <w:lang w:val="en"/>
+              </w:rPr>
+            </w:pPr>
+            <w:r>
+              <w:rPr>
+                <w:rFonts w:asciiTheme="minorHAnsi" w:hAnsiTheme="minorHAnsi" w:cstheme="minorHAnsi"/>
+                <w:sz w:val="18"/>
+                <w:szCs w:val="18"/>
+                <w:lang w:val="en"/>
+              </w:rPr>
+              <w:t>{$</w:t>
+            </w:r>
+            <w:proofErr w:type="spellStart"/>
+            <w:r>
+              <w:rPr>
+                <w:rFonts w:asciiTheme="minorHAnsi" w:hAnsiTheme="minorHAnsi" w:cstheme="minorHAnsi"/>
+                <w:sz w:val="18"/>
+                <w:szCs w:val="18"/>
+                <w:lang w:val="en"/>
+              </w:rPr>
+              <w:t>item_val</w:t>
+            </w:r>
+            <w:proofErr w:type="spellEnd"/>
+            <w:r>
+              <w:rPr>
+                <w:rFonts w:asciiTheme="minorHAnsi" w:hAnsiTheme="minorHAnsi" w:cstheme="minorHAnsi"/>
+                <w:sz w:val="18"/>
+                <w:szCs w:val="18"/>
+                <w:lang w:val="en"/>
+              </w:rPr>
+              <w:t>[</w:t>
+            </w:r>
+            <w:proofErr w:type="spellStart"/>
+            <w:r>
+              <w:rPr>
+                <w:rFonts w:asciiTheme="minorHAnsi" w:hAnsiTheme="minorHAnsi" w:cstheme="minorHAnsi"/>
+                <w:sz w:val="18"/>
+                <w:szCs w:val="18"/>
+                <w:lang w:val="en"/>
+              </w:rPr>
+              <w:t>i</w:t>
+            </w:r>
+            <w:proofErr w:type="spellEnd"/>
+            <w:proofErr w:type="gramStart"/>
+            <w:r>
+              <w:rPr>
+                <w:rFonts w:asciiTheme="minorHAnsi" w:hAnsiTheme="minorHAnsi" w:cstheme="minorHAnsi"/>
+                <w:sz w:val="18"/>
+                <w:szCs w:val="18"/>
+                <w:lang w:val="en"/>
+              </w:rPr>
+              <w:t>].</w:t>
+            </w:r>
+            <w:proofErr w:type="spellStart"/>
+            <w:r>
+              <w:rPr>
+                <w:rFonts w:asciiTheme="minorHAnsi" w:hAnsiTheme="minorHAnsi" w:cstheme="minorHAnsi"/>
+                <w:sz w:val="18"/>
+                <w:szCs w:val="18"/>
+                <w:lang w:val="en"/>
+              </w:rPr>
+              <w:t>next</w:t>
+            </w:r>
+            <w:proofErr w:type="gramEnd"/>
+            <w:r>
+              <w:rPr>
+                <w:rFonts w:asciiTheme="minorHAnsi" w:hAnsiTheme="minorHAnsi" w:cstheme="minorHAnsi"/>
+                <w:sz w:val="18"/>
+                <w:szCs w:val="18"/>
+                <w:lang w:val="en"/>
+              </w:rPr>
+              <w:t>_pecp_title:showEnd</w:t>
+            </w:r>
+            <w:proofErr w:type="spellEnd"/>
+            <w:r>
+              <w:rPr>
+                <w:rFonts w:asciiTheme="minorHAnsi" w:hAnsiTheme="minorHAnsi" w:cstheme="minorHAnsi"/>
+                <w:sz w:val="18"/>
+                <w:szCs w:val="18"/>
+                <w:lang w:val="en"/>
+              </w:rPr>
+              <w:t>}</w:t>
+            </w:r>
+          </w:p>
+          <w:p>
+            <w:pPr>
+              <w:spacing w:line="201" w:lineRule="atLeast"/>
+              <w:rPr>
+                <w:rFonts w:asciiTheme="minorHAnsi" w:hAnsiTheme="minorHAnsi" w:cstheme="minorHAnsi"/>
+                <w:bCs/>
+                <w:sz w:val="18"/>
+                <w:szCs w:val="18"/>
+                <w:lang w:val="en"/>
+              </w:rPr>
+            </w:pPr>
+            <w:r>
+              <w:rPr>
+                <w:rFonts w:asciiTheme="minorHAnsi" w:hAnsiTheme="minorHAnsi" w:cstheme="minorHAnsi"/>
+                <w:bCs/>
+                <w:sz w:val="18"/>
+                <w:szCs w:val="18"/>
+                <w:lang w:val="en"/>
+              </w:rPr>
+              <w:t>{$</w:t>
+            </w:r>
+            <w:proofErr w:type="spellStart"/>
+            <w:r>
+              <w:rPr>
+                <w:rFonts w:asciiTheme="minorHAnsi" w:hAnsiTheme="minorHAnsi" w:cstheme="minorHAnsi"/>
+                <w:bCs/>
+                <w:sz w:val="18"/>
+                <w:szCs w:val="18"/>
+                <w:lang w:val="en"/>
+              </w:rPr>
+              <w:t>item_val</w:t>
+            </w:r>
+            <w:proofErr w:type="spellEnd"/>
+            <w:r>
+              <w:rPr>
+                <w:rFonts w:asciiTheme="minorHAnsi" w:hAnsiTheme="minorHAnsi" w:cstheme="minorHAnsi"/>
+                <w:bCs/>
+                <w:sz w:val="18"/>
+                <w:szCs w:val="18"/>
+                <w:lang w:val="en"/>
+              </w:rPr>
+              <w:t>[</w:t>
+            </w:r>
+            <w:proofErr w:type="spellStart"/>
+            <w:r>
+              <w:rPr>
+                <w:rFonts w:asciiTheme="minorHAnsi" w:hAnsiTheme="minorHAnsi" w:cstheme="minorHAnsi"/>
+                <w:bCs/>
+                <w:sz w:val="18"/>
+                <w:szCs w:val="18"/>
+                <w:lang w:val="en"/>
+              </w:rPr>
+              <w:t>i</w:t>
+            </w:r>
+            <w:proofErr w:type="spellEnd"/>
+            <w:proofErr w:type="gramStart"/>
+            <w:r>
+              <w:rPr>
+                <w:rFonts w:asciiTheme="minorHAnsi" w:hAnsiTheme="minorHAnsi" w:cstheme="minorHAnsi"/>
+                <w:bCs/>
+                <w:sz w:val="18"/>
+                <w:szCs w:val="18"/>
+                <w:lang w:val="en"/>
+              </w:rPr>
+              <w:t>]</w:t>
+            </w:r>
+            <w:r>
+              <w:t xml:space="preserve"> .</w:t>
+            </w:r>
+            <w:proofErr w:type="gramEnd"/>
+            <w:r>
+              <w:rPr>
+                <w:rFonts w:asciiTheme="minorHAnsi" w:hAnsiTheme="minorHAnsi" w:cstheme="minorHAnsi"/>
+                <w:sz w:val="20"/>
+                <w:szCs w:val="20"/>
+              </w:rPr>
+              <w:t xml:space="preserve"> </w:t>
+            </w:r>
+            <w:proofErr w:type="spellStart"/>
+            <w:r>
+              <w:rPr>
+                <w:rFonts w:asciiTheme="minorHAnsi" w:hAnsiTheme="minorHAnsi" w:cstheme="minorHAnsi"/>
+                <w:sz w:val="20"/>
+                <w:szCs w:val="20"/>
+              </w:rPr>
+              <w:t>next_pecp_short_</w:t>
+            </w:r>
+            <w:proofErr w:type="gramStart"/>
+            <w:r>
+              <w:rPr>
+                <w:rFonts w:asciiTheme="minorHAnsi" w:hAnsiTheme="minorHAnsi" w:cstheme="minorHAnsi"/>
+                <w:sz w:val="20"/>
+                <w:szCs w:val="20"/>
+              </w:rPr>
+              <w:t>description</w:t>
+            </w:r>
+            <w:proofErr w:type="spellEnd"/>
+            <w:r>
+              <w:rPr>
+                <w:rFonts w:asciiTheme="minorHAnsi" w:hAnsiTheme="minorHAnsi" w:cstheme="minorHAnsi"/>
+                <w:bCs/>
+                <w:sz w:val="18"/>
+                <w:szCs w:val="18"/>
                 <w:lang w:val="en"/>
               </w:rPr>
               <w:t>:</w:t>
@@ -3841,38 +4573,33 @@
             <w:r>
               <w:rPr>
                 <w:rFonts w:asciiTheme="minorHAnsi" w:hAnsiTheme="minorHAnsi" w:cstheme="minorHAnsi"/>
-                <w:sz w:val="20"/>
-                <w:szCs w:val="20"/>
+                <w:bCs/>
+                <w:sz w:val="18"/>
+                <w:szCs w:val="18"/>
                 <w:lang w:val="en"/>
               </w:rPr>
               <w:t>ifNEM</w:t>
             </w:r>
             <w:proofErr w:type="spellEnd"/>
-            <w:r>
-              <w:rPr>
-                <w:rFonts w:asciiTheme="minorHAnsi" w:hAnsiTheme="minorHAnsi" w:cstheme="minorHAnsi"/>
-                <w:sz w:val="20"/>
-                <w:szCs w:val="20"/>
-                <w:lang w:val="en"/>
-              </w:rPr>
-              <w:t>()</w:t>
-            </w:r>
-            <w:r>
-              <w:rPr>
-                <w:rFonts w:asciiTheme="minorHAnsi" w:hAnsiTheme="minorHAnsi" w:cstheme="minorHAnsi"/>
-                <w:bCs/>
-                <w:sz w:val="20"/>
-                <w:szCs w:val="20"/>
-              </w:rPr>
-              <w:t>:</w:t>
-            </w:r>
-            <w:proofErr w:type="spellStart"/>
-            <w:r>
-              <w:rPr>
-                <w:rFonts w:asciiTheme="minorHAnsi" w:hAnsiTheme="minorHAnsi" w:cstheme="minorHAnsi"/>
-                <w:bCs/>
-                <w:sz w:val="20"/>
-                <w:szCs w:val="20"/>
+            <w:proofErr w:type="gramEnd"/>
+            <w:r>
+              <w:rPr>
+                <w:rFonts w:asciiTheme="minorHAnsi" w:hAnsiTheme="minorHAnsi" w:cstheme="minorHAnsi"/>
+                <w:bCs/>
+                <w:sz w:val="18"/>
+                <w:szCs w:val="18"/>
+                <w:lang w:val="en"/>
+              </w:rPr>
+              <w:t>():</w:t>
+            </w:r>
+            <w:proofErr w:type="spellStart"/>
+            <w:r>
+              <w:rPr>
+                <w:rFonts w:asciiTheme="minorHAnsi" w:hAnsiTheme="minorHAnsi" w:cstheme="minorHAnsi"/>
+                <w:bCs/>
+                <w:sz w:val="18"/>
+                <w:szCs w:val="18"/>
+                <w:lang w:val="en"/>
               </w:rPr>
               <w:t>showBegin</w:t>
             </w:r>
@@ -3881,347 +4608,9 @@
               <w:rPr>
                 <w:rFonts w:asciiTheme="minorHAnsi" w:hAnsiTheme="minorHAnsi" w:cstheme="minorHAnsi"/>
                 <w:bCs/>
-                <w:sz w:val="20"/>
-                <w:szCs w:val="20"/>
-              </w:rPr>
-              <w:t>}</w:t>
-            </w:r>
-            <w:r>
-              <w:rPr>
-                <w:rFonts w:asciiTheme="minorHAnsi" w:hAnsiTheme="minorHAnsi" w:cstheme="minorHAnsi"/>
-                <w:b/>
-                <w:sz w:val="20"/>
-                <w:szCs w:val="20"/>
-              </w:rPr>
-              <w:t>Upcoming Comment Period:</w:t>
-            </w:r>
-            <w:r>
-              <w:rPr>
-                <w:rFonts w:asciiTheme="minorHAnsi" w:hAnsiTheme="minorHAnsi" w:cstheme="minorHAnsi"/>
-                <w:bCs/>
-                <w:sz w:val="18"/>
-                <w:szCs w:val="18"/>
-              </w:rPr>
-              <w:t xml:space="preserve"> </w:t>
-            </w:r>
-            <w:r>
-              <w:rPr>
-                <w:rFonts w:asciiTheme="minorHAnsi" w:hAnsiTheme="minorHAnsi" w:cstheme="minorHAnsi"/>
-                <w:bCs/>
-                <w:sz w:val="20"/>
-                <w:szCs w:val="20"/>
-              </w:rPr>
-              <w:t>{$</w:t>
-            </w:r>
-            <w:proofErr w:type="spellStart"/>
-            <w:r>
-              <w:rPr>
-                <w:rFonts w:asciiTheme="minorHAnsi" w:hAnsiTheme="minorHAnsi" w:cstheme="minorHAnsi"/>
-                <w:bCs/>
-                <w:sz w:val="20"/>
-                <w:szCs w:val="20"/>
-              </w:rPr>
-              <w:t>item_val</w:t>
-            </w:r>
-            <w:proofErr w:type="spellEnd"/>
-            <w:r>
-              <w:rPr>
-                <w:rFonts w:asciiTheme="minorHAnsi" w:hAnsiTheme="minorHAnsi" w:cstheme="minorHAnsi"/>
-                <w:bCs/>
-                <w:sz w:val="20"/>
-                <w:szCs w:val="20"/>
-              </w:rPr>
-              <w:t>[</w:t>
-            </w:r>
-            <w:proofErr w:type="spellStart"/>
-            <w:r>
-              <w:rPr>
-                <w:rFonts w:asciiTheme="minorHAnsi" w:hAnsiTheme="minorHAnsi" w:cstheme="minorHAnsi"/>
-                <w:bCs/>
-                <w:sz w:val="20"/>
-                <w:szCs w:val="20"/>
-              </w:rPr>
-              <w:t>i</w:t>
-            </w:r>
-            <w:proofErr w:type="spellEnd"/>
-            <w:r>
-              <w:rPr>
-                <w:rFonts w:asciiTheme="minorHAnsi" w:hAnsiTheme="minorHAnsi" w:cstheme="minorHAnsi"/>
-                <w:bCs/>
-                <w:sz w:val="20"/>
-                <w:szCs w:val="20"/>
-              </w:rPr>
-              <w:t>].</w:t>
-            </w:r>
-            <w:proofErr w:type="spellStart"/>
-            <w:r>
-              <w:rPr>
-                <w:rFonts w:asciiTheme="minorHAnsi" w:hAnsiTheme="minorHAnsi" w:cstheme="minorHAnsi"/>
-                <w:bCs/>
-                <w:sz w:val="20"/>
-                <w:szCs w:val="20"/>
-              </w:rPr>
-              <w:t>phase_name</w:t>
-            </w:r>
-            <w:proofErr w:type="spellEnd"/>
-            <w:r>
-              <w:rPr>
-                <w:rFonts w:asciiTheme="minorHAnsi" w:hAnsiTheme="minorHAnsi" w:cstheme="minorHAnsi"/>
-                <w:bCs/>
-                <w:sz w:val="20"/>
-                <w:szCs w:val="20"/>
-              </w:rPr>
-              <w:t>}</w:t>
-            </w:r>
-            <w:r>
-              <w:rPr>
-                <w:rFonts w:asciiTheme="minorHAnsi" w:hAnsiTheme="minorHAnsi" w:cstheme="minorHAnsi"/>
-                <w:bCs/>
-                <w:sz w:val="20"/>
-                <w:szCs w:val="20"/>
-              </w:rPr>
-              <w:t xml:space="preserve"> - </w:t>
-            </w:r>
-            <w:r>
-              <w:rPr>
-                <w:rFonts w:asciiTheme="minorHAnsi" w:hAnsiTheme="minorHAnsi" w:cstheme="minorHAnsi"/>
-                <w:bCs/>
-                <w:sz w:val="20"/>
-                <w:szCs w:val="20"/>
-              </w:rPr>
-              <w:t>{$</w:t>
-            </w:r>
-            <w:proofErr w:type="spellStart"/>
-            <w:r>
-              <w:rPr>
-                <w:rFonts w:asciiTheme="minorHAnsi" w:hAnsiTheme="minorHAnsi" w:cstheme="minorHAnsi"/>
-                <w:bCs/>
-                <w:sz w:val="20"/>
-                <w:szCs w:val="20"/>
-              </w:rPr>
-              <w:t>item_val</w:t>
-            </w:r>
-            <w:proofErr w:type="spellEnd"/>
-            <w:r>
-              <w:rPr>
-                <w:rFonts w:asciiTheme="minorHAnsi" w:hAnsiTheme="minorHAnsi" w:cstheme="minorHAnsi"/>
-                <w:bCs/>
-                <w:sz w:val="20"/>
-                <w:szCs w:val="20"/>
-              </w:rPr>
-              <w:t>[</w:t>
-            </w:r>
-            <w:proofErr w:type="spellStart"/>
-            <w:r>
-              <w:rPr>
-                <w:rFonts w:asciiTheme="minorHAnsi" w:hAnsiTheme="minorHAnsi" w:cstheme="minorHAnsi"/>
-                <w:bCs/>
-                <w:sz w:val="20"/>
-                <w:szCs w:val="20"/>
-              </w:rPr>
-              <w:t>i</w:t>
-            </w:r>
-            <w:proofErr w:type="spellEnd"/>
-            <w:r>
-              <w:rPr>
-                <w:rFonts w:asciiTheme="minorHAnsi" w:hAnsiTheme="minorHAnsi" w:cstheme="minorHAnsi"/>
-                <w:bCs/>
-                <w:sz w:val="20"/>
-                <w:szCs w:val="20"/>
-              </w:rPr>
-              <w:t>].</w:t>
-            </w:r>
-            <w:proofErr w:type="spellStart"/>
-            <w:r>
-              <w:rPr>
-                <w:rFonts w:asciiTheme="minorHAnsi" w:hAnsiTheme="minorHAnsi" w:cstheme="minorHAnsi"/>
-                <w:bCs/>
-                <w:sz w:val="20"/>
-                <w:szCs w:val="20"/>
-              </w:rPr>
-              <w:t>next_pecp_date:formatD</w:t>
-            </w:r>
-            <w:proofErr w:type="spellEnd"/>
-            <w:r>
-              <w:rPr>
-                <w:rFonts w:asciiTheme="minorHAnsi" w:hAnsiTheme="minorHAnsi" w:cstheme="minorHAnsi"/>
-                <w:bCs/>
-                <w:sz w:val="20"/>
-                <w:szCs w:val="20"/>
-              </w:rPr>
-              <w:t>('LL')}</w:t>
-            </w:r>
-            <w:r>
-              <w:rPr>
-                <w:rFonts w:asciiTheme="minorHAnsi" w:hAnsiTheme="minorHAnsi" w:cstheme="minorHAnsi"/>
-                <w:bCs/>
-                <w:sz w:val="20"/>
-                <w:szCs w:val="20"/>
-              </w:rPr>
-              <w:t xml:space="preserve"> </w:t>
-            </w:r>
-            <w:r>
-              <w:rPr>
-                <w:rFonts w:asciiTheme="minorHAnsi" w:hAnsiTheme="minorHAnsi" w:cstheme="minorHAnsi"/>
-                <w:bCs/>
-                <w:sz w:val="20"/>
-                <w:szCs w:val="20"/>
-              </w:rPr>
-              <w:t>({$</w:t>
-            </w:r>
-            <w:proofErr w:type="spellStart"/>
-            <w:r>
-              <w:rPr>
-                <w:rFonts w:asciiTheme="minorHAnsi" w:hAnsiTheme="minorHAnsi" w:cstheme="minorHAnsi"/>
-                <w:bCs/>
-                <w:sz w:val="20"/>
-                <w:szCs w:val="20"/>
-              </w:rPr>
-              <w:t>item_val</w:t>
-            </w:r>
-            <w:proofErr w:type="spellEnd"/>
-            <w:r>
-              <w:rPr>
-                <w:rFonts w:asciiTheme="minorHAnsi" w:hAnsiTheme="minorHAnsi" w:cstheme="minorHAnsi"/>
-                <w:bCs/>
-                <w:sz w:val="20"/>
-                <w:szCs w:val="20"/>
-              </w:rPr>
-              <w:t>[</w:t>
-            </w:r>
-            <w:proofErr w:type="spellStart"/>
-            <w:r>
-              <w:rPr>
-                <w:rFonts w:asciiTheme="minorHAnsi" w:hAnsiTheme="minorHAnsi" w:cstheme="minorHAnsi"/>
-                <w:bCs/>
-                <w:sz w:val="20"/>
-                <w:szCs w:val="20"/>
-              </w:rPr>
-              <w:t>i</w:t>
-            </w:r>
-            <w:proofErr w:type="spellEnd"/>
-            <w:r>
-              <w:rPr>
-                <w:rFonts w:asciiTheme="minorHAnsi" w:hAnsiTheme="minorHAnsi" w:cstheme="minorHAnsi"/>
-                <w:bCs/>
-                <w:sz w:val="20"/>
-                <w:szCs w:val="20"/>
-              </w:rPr>
-              <w:t>].</w:t>
-            </w:r>
-            <w:proofErr w:type="spellStart"/>
-            <w:r>
-              <w:rPr>
-                <w:rFonts w:asciiTheme="minorHAnsi" w:hAnsiTheme="minorHAnsi" w:cstheme="minorHAnsi"/>
-                <w:bCs/>
-                <w:sz w:val="20"/>
-                <w:szCs w:val="20"/>
-              </w:rPr>
-              <w:t>event_number_of_days</w:t>
-            </w:r>
-            <w:proofErr w:type="spellEnd"/>
-            <w:r>
-              <w:rPr>
-                <w:rFonts w:asciiTheme="minorHAnsi" w:hAnsiTheme="minorHAnsi" w:cstheme="minorHAnsi"/>
-                <w:bCs/>
-                <w:sz w:val="20"/>
-                <w:szCs w:val="20"/>
-              </w:rPr>
-              <w:t xml:space="preserve">} </w:t>
-            </w:r>
-            <w:r>
-              <w:rPr>
-                <w:rFonts w:asciiTheme="minorHAnsi" w:hAnsiTheme="minorHAnsi" w:cstheme="minorHAnsi"/>
-                <w:bCs/>
-                <w:sz w:val="20"/>
-                <w:szCs w:val="20"/>
-              </w:rPr>
-              <w:t xml:space="preserve"> </w:t>
-            </w:r>
-            <w:r>
-              <w:rPr>
-                <w:rFonts w:asciiTheme="minorHAnsi" w:hAnsiTheme="minorHAnsi" w:cstheme="minorHAnsi"/>
-                <w:bCs/>
-                <w:sz w:val="20"/>
-                <w:szCs w:val="20"/>
-              </w:rPr>
-              <w:t>days) {$</w:t>
-            </w:r>
-            <w:proofErr w:type="spellStart"/>
-            <w:r>
-              <w:rPr>
-                <w:rFonts w:asciiTheme="minorHAnsi" w:hAnsiTheme="minorHAnsi" w:cstheme="minorHAnsi"/>
-                <w:bCs/>
-                <w:sz w:val="20"/>
-                <w:szCs w:val="20"/>
-              </w:rPr>
-              <w:t>item_val</w:t>
-            </w:r>
-            <w:proofErr w:type="spellEnd"/>
-            <w:r>
-              <w:rPr>
-                <w:rFonts w:asciiTheme="minorHAnsi" w:hAnsiTheme="minorHAnsi" w:cstheme="minorHAnsi"/>
-                <w:bCs/>
-                <w:sz w:val="20"/>
-                <w:szCs w:val="20"/>
-              </w:rPr>
-              <w:t>[</w:t>
-            </w:r>
-            <w:proofErr w:type="spellStart"/>
-            <w:r>
-              <w:rPr>
-                <w:rFonts w:asciiTheme="minorHAnsi" w:hAnsiTheme="minorHAnsi" w:cstheme="minorHAnsi"/>
-                <w:bCs/>
-                <w:sz w:val="20"/>
-                <w:szCs w:val="20"/>
-              </w:rPr>
-              <w:t>i</w:t>
-            </w:r>
-            <w:proofErr w:type="spellEnd"/>
-            <w:r>
-              <w:rPr>
-                <w:rFonts w:asciiTheme="minorHAnsi" w:hAnsiTheme="minorHAnsi" w:cstheme="minorHAnsi"/>
-                <w:bCs/>
-                <w:sz w:val="20"/>
-                <w:szCs w:val="20"/>
-              </w:rPr>
-              <w:t>].</w:t>
-            </w:r>
-            <w:proofErr w:type="spellStart"/>
-            <w:r>
-              <w:rPr>
-                <w:rFonts w:asciiTheme="minorHAnsi" w:hAnsiTheme="minorHAnsi" w:cstheme="minorHAnsi"/>
-                <w:bCs/>
-                <w:sz w:val="20"/>
-                <w:szCs w:val="20"/>
-              </w:rPr>
-              <w:t>next_pecp_</w:t>
-            </w:r>
-            <w:r>
-              <w:rPr>
-                <w:rFonts w:asciiTheme="minorHAnsi" w:hAnsiTheme="minorHAnsi" w:cstheme="minorHAnsi"/>
-                <w:bCs/>
-                <w:sz w:val="20"/>
-                <w:szCs w:val="20"/>
-              </w:rPr>
-              <w:t>date</w:t>
-            </w:r>
-            <w:r>
-              <w:rPr>
-                <w:rFonts w:asciiTheme="minorHAnsi" w:hAnsiTheme="minorHAnsi" w:cstheme="minorHAnsi"/>
-                <w:bCs/>
-                <w:sz w:val="20"/>
-                <w:szCs w:val="20"/>
-              </w:rPr>
-              <w:t>:showEnd</w:t>
-            </w:r>
-            <w:proofErr w:type="spellEnd"/>
-            <w:r>
-              <w:rPr>
-                <w:rFonts w:asciiTheme="minorHAnsi" w:hAnsiTheme="minorHAnsi" w:cstheme="minorHAnsi"/>
-                <w:bCs/>
-                <w:sz w:val="20"/>
-                <w:szCs w:val="20"/>
+                <w:sz w:val="18"/>
+                <w:szCs w:val="18"/>
+                <w:lang w:val="en"/>
               </w:rPr>
               <w:t>}</w:t>
             </w:r>

</xml_diff>

<commit_message>
Final update to template
</commit_message>
<xml_diff>
--- a/epictrack-api/src/api/reports/report_templates/anticipated_schedule.docx
+++ b/epictrack-api/src/api/reports/report_templates/anticipated_schedule.docx
@@ -3624,119 +3624,6 @@
                 <w:lang w:val="en"/>
               </w:rPr>
             </w:pPr>
-            <w:r>
-              <w:rPr>
-                <w:rFonts w:asciiTheme="minorHAnsi" w:hAnsiTheme="minorHAnsi" w:cstheme="minorHAnsi"/>
-                <w:bCs/>
-                <w:sz w:val="18"/>
-                <w:szCs w:val="18"/>
-                <w:lang w:val="en"/>
-              </w:rPr>
-              <w:t>{$</w:t>
-            </w:r>
-            <w:proofErr w:type="spellStart"/>
-            <w:r>
-              <w:rPr>
-                <w:rFonts w:asciiTheme="minorHAnsi" w:hAnsiTheme="minorHAnsi" w:cstheme="minorHAnsi"/>
-                <w:bCs/>
-                <w:sz w:val="18"/>
-                <w:szCs w:val="18"/>
-                <w:lang w:val="en"/>
-              </w:rPr>
-              <w:t>item_val</w:t>
-            </w:r>
-            <w:proofErr w:type="spellEnd"/>
-            <w:r>
-              <w:rPr>
-                <w:rFonts w:asciiTheme="minorHAnsi" w:hAnsiTheme="minorHAnsi" w:cstheme="minorHAnsi"/>
-                <w:bCs/>
-                <w:sz w:val="18"/>
-                <w:szCs w:val="18"/>
-                <w:lang w:val="en"/>
-              </w:rPr>
-              <w:t>[</w:t>
-            </w:r>
-            <w:proofErr w:type="spellStart"/>
-            <w:r>
-              <w:rPr>
-                <w:rFonts w:asciiTheme="minorHAnsi" w:hAnsiTheme="minorHAnsi" w:cstheme="minorHAnsi"/>
-                <w:bCs/>
-                <w:sz w:val="18"/>
-                <w:szCs w:val="18"/>
-                <w:lang w:val="en"/>
-              </w:rPr>
-              <w:t>i</w:t>
-            </w:r>
-            <w:proofErr w:type="spellEnd"/>
-            <w:proofErr w:type="gramStart"/>
-            <w:r>
-              <w:rPr>
-                <w:rFonts w:asciiTheme="minorHAnsi" w:hAnsiTheme="minorHAnsi" w:cstheme="minorHAnsi"/>
-                <w:bCs/>
-                <w:sz w:val="18"/>
-                <w:szCs w:val="18"/>
-                <w:lang w:val="en"/>
-              </w:rPr>
-              <w:t>]</w:t>
-            </w:r>
-            <w:r>
-              <w:t xml:space="preserve"> .</w:t>
-            </w:r>
-            <w:proofErr w:type="spellStart"/>
-            <w:r>
-              <w:rPr>
-                <w:rFonts w:asciiTheme="minorHAnsi" w:hAnsiTheme="minorHAnsi" w:cstheme="minorHAnsi"/>
-                <w:bCs/>
-                <w:sz w:val="18"/>
-                <w:szCs w:val="18"/>
-                <w:lang w:val="en"/>
-              </w:rPr>
-              <w:t>next</w:t>
-            </w:r>
-            <w:proofErr w:type="gramEnd"/>
-            <w:r>
-              <w:rPr>
-                <w:rFonts w:asciiTheme="minorHAnsi" w:hAnsiTheme="minorHAnsi" w:cstheme="minorHAnsi"/>
-                <w:bCs/>
-                <w:sz w:val="18"/>
-                <w:szCs w:val="18"/>
-                <w:lang w:val="en"/>
-              </w:rPr>
-              <w:t>_pecp_title:ifNEM</w:t>
-            </w:r>
-            <w:proofErr w:type="spellEnd"/>
-            <w:r>
-              <w:rPr>
-                <w:rFonts w:asciiTheme="minorHAnsi" w:hAnsiTheme="minorHAnsi" w:cstheme="minorHAnsi"/>
-                <w:bCs/>
-                <w:sz w:val="18"/>
-                <w:szCs w:val="18"/>
-                <w:lang w:val="en"/>
-              </w:rPr>
-              <w:t>():</w:t>
-            </w:r>
-            <w:proofErr w:type="spellStart"/>
-            <w:r>
-              <w:rPr>
-                <w:rFonts w:asciiTheme="minorHAnsi" w:hAnsiTheme="minorHAnsi" w:cstheme="minorHAnsi"/>
-                <w:bCs/>
-                <w:sz w:val="18"/>
-                <w:szCs w:val="18"/>
-                <w:lang w:val="en"/>
-              </w:rPr>
-              <w:t>showBegin</w:t>
-            </w:r>
-            <w:proofErr w:type="spellEnd"/>
-            <w:r>
-              <w:rPr>
-                <w:rFonts w:asciiTheme="minorHAnsi" w:hAnsiTheme="minorHAnsi" w:cstheme="minorHAnsi"/>
-                <w:bCs/>
-                <w:sz w:val="18"/>
-                <w:szCs w:val="18"/>
-                <w:lang w:val="en"/>
-              </w:rPr>
-              <w:t>}</w:t>
-            </w:r>
           </w:p>
           <w:p>
             <w:pPr>
@@ -3744,8 +3631,8 @@
               <w:rPr>
                 <w:rFonts w:asciiTheme="minorHAnsi" w:hAnsiTheme="minorHAnsi" w:cstheme="minorHAnsi"/>
                 <w:bCs/>
-                <w:sz w:val="18"/>
-                <w:szCs w:val="18"/>
+                <w:sz w:val="20"/>
+                <w:szCs w:val="20"/>
               </w:rPr>
             </w:pPr>
             <w:r>
@@ -3816,6 +3703,407 @@
                 <w:sz w:val="20"/>
                 <w:szCs w:val="20"/>
               </w:rPr>
+              <w:t>_pe</w:t>
+            </w:r>
+            <w:r>
+              <w:rPr>
+                <w:rFonts w:asciiTheme="minorHAnsi" w:hAnsiTheme="minorHAnsi" w:cstheme="minorHAnsi"/>
+                <w:bCs/>
+                <w:sz w:val="20"/>
+                <w:szCs w:val="20"/>
+              </w:rPr>
+              <w:t>cp_date</w:t>
+            </w:r>
+            <w:r>
+              <w:rPr>
+                <w:rFonts w:asciiTheme="minorHAnsi" w:hAnsiTheme="minorHAnsi" w:cstheme="minorHAnsi"/>
+                <w:bCs/>
+                <w:sz w:val="20"/>
+                <w:szCs w:val="20"/>
+              </w:rPr>
+              <w:t>:showBegin</w:t>
+            </w:r>
+            <w:proofErr w:type="spellEnd"/>
+            <w:r>
+              <w:rPr>
+                <w:rFonts w:asciiTheme="minorHAnsi" w:hAnsiTheme="minorHAnsi" w:cstheme="minorHAnsi"/>
+                <w:bCs/>
+                <w:sz w:val="20"/>
+                <w:szCs w:val="20"/>
+              </w:rPr>
+              <w:t>}</w:t>
+            </w:r>
+          </w:p>
+          <w:p>
+            <w:pPr>
+              <w:spacing w:line="201" w:lineRule="atLeast"/>
+              <w:rPr>
+                <w:rFonts w:asciiTheme="minorHAnsi" w:hAnsiTheme="minorHAnsi" w:cstheme="minorHAnsi"/>
+                <w:bCs/>
+                <w:sz w:val="20"/>
+                <w:szCs w:val="20"/>
+              </w:rPr>
+            </w:pPr>
+            <w:r>
+              <w:rPr>
+                <w:rFonts w:asciiTheme="minorHAnsi" w:hAnsiTheme="minorHAnsi" w:cstheme="minorHAnsi"/>
+                <w:b/>
+                <w:sz w:val="20"/>
+                <w:szCs w:val="20"/>
+              </w:rPr>
+              <w:t>Upcoming Comment Period:</w:t>
+            </w:r>
+            <w:r>
+              <w:rPr>
+                <w:rFonts w:asciiTheme="minorHAnsi" w:hAnsiTheme="minorHAnsi" w:cstheme="minorHAnsi"/>
+                <w:bCs/>
+                <w:sz w:val="18"/>
+                <w:szCs w:val="18"/>
+              </w:rPr>
+              <w:t xml:space="preserve"> </w:t>
+            </w:r>
+            <w:r>
+              <w:rPr>
+                <w:rFonts w:asciiTheme="minorHAnsi" w:hAnsiTheme="minorHAnsi" w:cstheme="minorHAnsi"/>
+                <w:bCs/>
+                <w:sz w:val="20"/>
+                <w:szCs w:val="20"/>
+              </w:rPr>
+              <w:t>{$</w:t>
+            </w:r>
+            <w:proofErr w:type="spellStart"/>
+            <w:r>
+              <w:rPr>
+                <w:rFonts w:asciiTheme="minorHAnsi" w:hAnsiTheme="minorHAnsi" w:cstheme="minorHAnsi"/>
+                <w:bCs/>
+                <w:sz w:val="20"/>
+                <w:szCs w:val="20"/>
+              </w:rPr>
+              <w:t>item_val</w:t>
+            </w:r>
+            <w:proofErr w:type="spellEnd"/>
+            <w:r>
+              <w:rPr>
+                <w:rFonts w:asciiTheme="minorHAnsi" w:hAnsiTheme="minorHAnsi" w:cstheme="minorHAnsi"/>
+                <w:bCs/>
+                <w:sz w:val="20"/>
+                <w:szCs w:val="20"/>
+              </w:rPr>
+              <w:t>[</w:t>
+            </w:r>
+            <w:proofErr w:type="spellStart"/>
+            <w:r>
+              <w:rPr>
+                <w:rFonts w:asciiTheme="minorHAnsi" w:hAnsiTheme="minorHAnsi" w:cstheme="minorHAnsi"/>
+                <w:bCs/>
+                <w:sz w:val="20"/>
+                <w:szCs w:val="20"/>
+              </w:rPr>
+              <w:t>i</w:t>
+            </w:r>
+            <w:proofErr w:type="spellEnd"/>
+            <w:proofErr w:type="gramStart"/>
+            <w:r>
+              <w:rPr>
+                <w:rFonts w:asciiTheme="minorHAnsi" w:hAnsiTheme="minorHAnsi" w:cstheme="minorHAnsi"/>
+                <w:bCs/>
+                <w:sz w:val="20"/>
+                <w:szCs w:val="20"/>
+              </w:rPr>
+              <w:t>].</w:t>
+            </w:r>
+            <w:proofErr w:type="spellStart"/>
+            <w:r>
+              <w:rPr>
+                <w:rFonts w:asciiTheme="minorHAnsi" w:hAnsiTheme="minorHAnsi" w:cstheme="minorHAnsi"/>
+                <w:bCs/>
+                <w:sz w:val="20"/>
+                <w:szCs w:val="20"/>
+              </w:rPr>
+              <w:t>phase</w:t>
+            </w:r>
+            <w:proofErr w:type="gramEnd"/>
+            <w:r>
+              <w:rPr>
+                <w:rFonts w:asciiTheme="minorHAnsi" w:hAnsiTheme="minorHAnsi" w:cstheme="minorHAnsi"/>
+                <w:bCs/>
+                <w:sz w:val="20"/>
+                <w:szCs w:val="20"/>
+              </w:rPr>
+              <w:t>_name</w:t>
+            </w:r>
+            <w:proofErr w:type="spellEnd"/>
+            <w:r>
+              <w:rPr>
+                <w:rFonts w:asciiTheme="minorHAnsi" w:hAnsiTheme="minorHAnsi" w:cstheme="minorHAnsi"/>
+                <w:bCs/>
+                <w:sz w:val="20"/>
+                <w:szCs w:val="20"/>
+              </w:rPr>
+              <w:t>}</w:t>
+            </w:r>
+            <w:r>
+              <w:rPr>
+                <w:rFonts w:asciiTheme="minorHAnsi" w:hAnsiTheme="minorHAnsi" w:cstheme="minorHAnsi"/>
+                <w:bCs/>
+                <w:sz w:val="20"/>
+                <w:szCs w:val="20"/>
+              </w:rPr>
+              <w:t xml:space="preserve"> - </w:t>
+            </w:r>
+            <w:r>
+              <w:rPr>
+                <w:rFonts w:asciiTheme="minorHAnsi" w:hAnsiTheme="minorHAnsi" w:cstheme="minorHAnsi"/>
+                <w:bCs/>
+                <w:sz w:val="20"/>
+                <w:szCs w:val="20"/>
+              </w:rPr>
+              <w:t>{$</w:t>
+            </w:r>
+            <w:proofErr w:type="spellStart"/>
+            <w:r>
+              <w:rPr>
+                <w:rFonts w:asciiTheme="minorHAnsi" w:hAnsiTheme="minorHAnsi" w:cstheme="minorHAnsi"/>
+                <w:bCs/>
+                <w:sz w:val="20"/>
+                <w:szCs w:val="20"/>
+              </w:rPr>
+              <w:t>item_val</w:t>
+            </w:r>
+            <w:proofErr w:type="spellEnd"/>
+            <w:r>
+              <w:rPr>
+                <w:rFonts w:asciiTheme="minorHAnsi" w:hAnsiTheme="minorHAnsi" w:cstheme="minorHAnsi"/>
+                <w:bCs/>
+                <w:sz w:val="20"/>
+                <w:szCs w:val="20"/>
+              </w:rPr>
+              <w:t>[</w:t>
+            </w:r>
+            <w:proofErr w:type="spellStart"/>
+            <w:r>
+              <w:rPr>
+                <w:rFonts w:asciiTheme="minorHAnsi" w:hAnsiTheme="minorHAnsi" w:cstheme="minorHAnsi"/>
+                <w:bCs/>
+                <w:sz w:val="20"/>
+                <w:szCs w:val="20"/>
+              </w:rPr>
+              <w:t>i</w:t>
+            </w:r>
+            <w:proofErr w:type="spellEnd"/>
+            <w:r>
+              <w:rPr>
+                <w:rFonts w:asciiTheme="minorHAnsi" w:hAnsiTheme="minorHAnsi" w:cstheme="minorHAnsi"/>
+                <w:bCs/>
+                <w:sz w:val="20"/>
+                <w:szCs w:val="20"/>
+              </w:rPr>
+              <w:t>].</w:t>
+            </w:r>
+            <w:proofErr w:type="spellStart"/>
+            <w:r>
+              <w:rPr>
+                <w:rFonts w:asciiTheme="minorHAnsi" w:hAnsiTheme="minorHAnsi" w:cstheme="minorHAnsi"/>
+                <w:bCs/>
+                <w:sz w:val="20"/>
+                <w:szCs w:val="20"/>
+              </w:rPr>
+              <w:t>next_pecp_date:formatD</w:t>
+            </w:r>
+            <w:proofErr w:type="spellEnd"/>
+            <w:r>
+              <w:rPr>
+                <w:rFonts w:asciiTheme="minorHAnsi" w:hAnsiTheme="minorHAnsi" w:cstheme="minorHAnsi"/>
+                <w:bCs/>
+                <w:sz w:val="20"/>
+                <w:szCs w:val="20"/>
+              </w:rPr>
+              <w:t>('LL')}</w:t>
+            </w:r>
+            <w:r>
+              <w:rPr>
+                <w:rFonts w:asciiTheme="minorHAnsi" w:hAnsiTheme="minorHAnsi" w:cstheme="minorHAnsi"/>
+                <w:bCs/>
+                <w:sz w:val="20"/>
+                <w:szCs w:val="20"/>
+              </w:rPr>
+              <w:t xml:space="preserve"> </w:t>
+            </w:r>
+            <w:r>
+              <w:rPr>
+                <w:rFonts w:asciiTheme="minorHAnsi" w:hAnsiTheme="minorHAnsi" w:cstheme="minorHAnsi"/>
+                <w:bCs/>
+                <w:sz w:val="20"/>
+                <w:szCs w:val="20"/>
+              </w:rPr>
+              <w:t>(</w:t>
+            </w:r>
+            <w:r>
+              <w:rPr>
+                <w:rFonts w:asciiTheme="minorHAnsi" w:hAnsiTheme="minorHAnsi" w:cstheme="minorHAnsi"/>
+                <w:bCs/>
+                <w:sz w:val="20"/>
+                <w:szCs w:val="20"/>
+              </w:rPr>
+              <w:t>{$</w:t>
+            </w:r>
+            <w:proofErr w:type="spellStart"/>
+            <w:r>
+              <w:rPr>
+                <w:rFonts w:asciiTheme="minorHAnsi" w:hAnsiTheme="minorHAnsi" w:cstheme="minorHAnsi"/>
+                <w:bCs/>
+                <w:sz w:val="20"/>
+                <w:szCs w:val="20"/>
+              </w:rPr>
+              <w:t>item_val</w:t>
+            </w:r>
+            <w:proofErr w:type="spellEnd"/>
+            <w:r>
+              <w:rPr>
+                <w:rFonts w:asciiTheme="minorHAnsi" w:hAnsiTheme="minorHAnsi" w:cstheme="minorHAnsi"/>
+                <w:bCs/>
+                <w:sz w:val="20"/>
+                <w:szCs w:val="20"/>
+              </w:rPr>
+              <w:t>[</w:t>
+            </w:r>
+            <w:proofErr w:type="spellStart"/>
+            <w:r>
+              <w:rPr>
+                <w:rFonts w:asciiTheme="minorHAnsi" w:hAnsiTheme="minorHAnsi" w:cstheme="minorHAnsi"/>
+                <w:bCs/>
+                <w:sz w:val="20"/>
+                <w:szCs w:val="20"/>
+              </w:rPr>
+              <w:t>i</w:t>
+            </w:r>
+            <w:proofErr w:type="spellEnd"/>
+            <w:r>
+              <w:rPr>
+                <w:rFonts w:asciiTheme="minorHAnsi" w:hAnsiTheme="minorHAnsi" w:cstheme="minorHAnsi"/>
+                <w:bCs/>
+                <w:sz w:val="20"/>
+                <w:szCs w:val="20"/>
+              </w:rPr>
+              <w:t>].</w:t>
+            </w:r>
+            <w:proofErr w:type="spellStart"/>
+            <w:r>
+              <w:rPr>
+                <w:rFonts w:asciiTheme="minorHAnsi" w:hAnsiTheme="minorHAnsi" w:cstheme="minorHAnsi"/>
+                <w:bCs/>
+                <w:sz w:val="20"/>
+                <w:szCs w:val="20"/>
+              </w:rPr>
+              <w:t>next_pecp</w:t>
+            </w:r>
+            <w:r>
+              <w:rPr>
+                <w:rFonts w:asciiTheme="minorHAnsi" w:hAnsiTheme="minorHAnsi" w:cstheme="minorHAnsi"/>
+                <w:bCs/>
+                <w:sz w:val="20"/>
+                <w:szCs w:val="20"/>
+              </w:rPr>
+              <w:t>_number_of_days</w:t>
+            </w:r>
+            <w:proofErr w:type="spellEnd"/>
+            <w:r>
+              <w:rPr>
+                <w:rFonts w:asciiTheme="minorHAnsi" w:hAnsiTheme="minorHAnsi" w:cstheme="minorHAnsi"/>
+                <w:bCs/>
+                <w:sz w:val="20"/>
+                <w:szCs w:val="20"/>
+              </w:rPr>
+              <w:t xml:space="preserve">} </w:t>
+            </w:r>
+            <w:r>
+              <w:rPr>
+                <w:rFonts w:asciiTheme="minorHAnsi" w:hAnsiTheme="minorHAnsi" w:cstheme="minorHAnsi"/>
+                <w:bCs/>
+                <w:sz w:val="20"/>
+                <w:szCs w:val="20"/>
+              </w:rPr>
+              <w:t xml:space="preserve"> days)</w:t>
+            </w:r>
+          </w:p>
+          <w:p>
+            <w:pPr>
+              <w:spacing w:line="201" w:lineRule="atLeast"/>
+              <w:rPr>
+                <w:rFonts w:asciiTheme="minorHAnsi" w:hAnsiTheme="minorHAnsi" w:cstheme="minorHAnsi"/>
+                <w:bCs/>
+                <w:sz w:val="20"/>
+                <w:szCs w:val="20"/>
+              </w:rPr>
+            </w:pPr>
+            <w:r>
+              <w:rPr>
+                <w:rFonts w:asciiTheme="minorHAnsi" w:hAnsiTheme="minorHAnsi" w:cstheme="minorHAnsi"/>
+                <w:bCs/>
+                <w:sz w:val="20"/>
+                <w:szCs w:val="20"/>
+              </w:rPr>
+              <w:t>{$</w:t>
+            </w:r>
+            <w:proofErr w:type="spellStart"/>
+            <w:r>
+              <w:rPr>
+                <w:rFonts w:asciiTheme="minorHAnsi" w:hAnsiTheme="minorHAnsi" w:cstheme="minorHAnsi"/>
+                <w:bCs/>
+                <w:sz w:val="20"/>
+                <w:szCs w:val="20"/>
+              </w:rPr>
+              <w:t>item_val</w:t>
+            </w:r>
+            <w:proofErr w:type="spellEnd"/>
+            <w:r>
+              <w:rPr>
+                <w:rFonts w:asciiTheme="minorHAnsi" w:hAnsiTheme="minorHAnsi" w:cstheme="minorHAnsi"/>
+                <w:bCs/>
+                <w:sz w:val="20"/>
+                <w:szCs w:val="20"/>
+              </w:rPr>
+              <w:t>[</w:t>
+            </w:r>
+            <w:proofErr w:type="spellStart"/>
+            <w:r>
+              <w:rPr>
+                <w:rFonts w:asciiTheme="minorHAnsi" w:hAnsiTheme="minorHAnsi" w:cstheme="minorHAnsi"/>
+                <w:bCs/>
+                <w:sz w:val="20"/>
+                <w:szCs w:val="20"/>
+              </w:rPr>
+              <w:t>i</w:t>
+            </w:r>
+            <w:proofErr w:type="spellEnd"/>
+            <w:proofErr w:type="gramStart"/>
+            <w:r>
+              <w:rPr>
+                <w:rFonts w:asciiTheme="minorHAnsi" w:hAnsiTheme="minorHAnsi" w:cstheme="minorHAnsi"/>
+                <w:bCs/>
+                <w:sz w:val="20"/>
+                <w:szCs w:val="20"/>
+              </w:rPr>
+              <w:t>].</w:t>
+            </w:r>
+            <w:proofErr w:type="spellStart"/>
+            <w:r>
+              <w:rPr>
+                <w:rFonts w:asciiTheme="minorHAnsi" w:hAnsiTheme="minorHAnsi" w:cstheme="minorHAnsi"/>
+                <w:bCs/>
+                <w:sz w:val="20"/>
+                <w:szCs w:val="20"/>
+              </w:rPr>
+              <w:t>next</w:t>
+            </w:r>
+            <w:proofErr w:type="gramEnd"/>
+            <w:r>
+              <w:rPr>
+                <w:rFonts w:asciiTheme="minorHAnsi" w:hAnsiTheme="minorHAnsi" w:cstheme="minorHAnsi"/>
+                <w:bCs/>
+                <w:sz w:val="20"/>
+                <w:szCs w:val="20"/>
+              </w:rPr>
               <w:t>_pecp_</w:t>
             </w:r>
             <w:r>
@@ -3827,12 +4115,456 @@
               </w:rPr>
               <w:t>date</w:t>
             </w:r>
-            <w:proofErr w:type="spellEnd"/>
-            <w:r>
-              <w:rPr>
-                <w:rFonts w:asciiTheme="minorHAnsi" w:hAnsiTheme="minorHAnsi" w:cstheme="minorHAnsi"/>
-                <w:sz w:val="20"/>
-                <w:szCs w:val="20"/>
+            <w:r>
+              <w:rPr>
+                <w:rFonts w:asciiTheme="minorHAnsi" w:hAnsiTheme="minorHAnsi" w:cstheme="minorHAnsi"/>
+                <w:bCs/>
+                <w:sz w:val="20"/>
+                <w:szCs w:val="20"/>
+              </w:rPr>
+              <w:t>:showEnd</w:t>
+            </w:r>
+            <w:proofErr w:type="spellEnd"/>
+            <w:r>
+              <w:rPr>
+                <w:rFonts w:asciiTheme="minorHAnsi" w:hAnsiTheme="minorHAnsi" w:cstheme="minorHAnsi"/>
+                <w:bCs/>
+                <w:sz w:val="20"/>
+                <w:szCs w:val="20"/>
+              </w:rPr>
+              <w:t>}</w:t>
+            </w:r>
+          </w:p>
+          <w:p>
+            <w:pPr>
+              <w:spacing w:line="201" w:lineRule="atLeast"/>
+              <w:rPr>
+                <w:rFonts w:asciiTheme="minorHAnsi" w:hAnsiTheme="minorHAnsi" w:cstheme="minorHAnsi"/>
+                <w:bCs/>
+                <w:sz w:val="20"/>
+                <w:szCs w:val="20"/>
+              </w:rPr>
+            </w:pPr>
+          </w:p>
+          <w:p>
+            <w:pPr>
+              <w:spacing w:line="201" w:lineRule="atLeast"/>
+              <w:rPr>
+                <w:rFonts w:asciiTheme="minorHAnsi" w:hAnsiTheme="minorHAnsi" w:cstheme="minorHAnsi"/>
+                <w:bCs/>
+                <w:sz w:val="18"/>
+                <w:szCs w:val="18"/>
+                <w:lang w:val="en"/>
+              </w:rPr>
+            </w:pPr>
+            <w:r>
+              <w:rPr>
+                <w:rFonts w:asciiTheme="minorHAnsi" w:hAnsiTheme="minorHAnsi" w:cstheme="minorHAnsi"/>
+                <w:bCs/>
+                <w:sz w:val="18"/>
+                <w:szCs w:val="18"/>
+                <w:lang w:val="en"/>
+              </w:rPr>
+              <w:t>{$</w:t>
+            </w:r>
+            <w:proofErr w:type="spellStart"/>
+            <w:r>
+              <w:rPr>
+                <w:rFonts w:asciiTheme="minorHAnsi" w:hAnsiTheme="minorHAnsi" w:cstheme="minorHAnsi"/>
+                <w:bCs/>
+                <w:sz w:val="18"/>
+                <w:szCs w:val="18"/>
+                <w:lang w:val="en"/>
+              </w:rPr>
+              <w:t>item_val</w:t>
+            </w:r>
+            <w:proofErr w:type="spellEnd"/>
+            <w:r>
+              <w:rPr>
+                <w:rFonts w:asciiTheme="minorHAnsi" w:hAnsiTheme="minorHAnsi" w:cstheme="minorHAnsi"/>
+                <w:bCs/>
+                <w:sz w:val="18"/>
+                <w:szCs w:val="18"/>
+                <w:lang w:val="en"/>
+              </w:rPr>
+              <w:t>[</w:t>
+            </w:r>
+            <w:proofErr w:type="spellStart"/>
+            <w:r>
+              <w:rPr>
+                <w:rFonts w:asciiTheme="minorHAnsi" w:hAnsiTheme="minorHAnsi" w:cstheme="minorHAnsi"/>
+                <w:bCs/>
+                <w:sz w:val="18"/>
+                <w:szCs w:val="18"/>
+                <w:lang w:val="en"/>
+              </w:rPr>
+              <w:t>i</w:t>
+            </w:r>
+            <w:proofErr w:type="spellEnd"/>
+            <w:proofErr w:type="gramStart"/>
+            <w:r>
+              <w:rPr>
+                <w:rFonts w:asciiTheme="minorHAnsi" w:hAnsiTheme="minorHAnsi" w:cstheme="minorHAnsi"/>
+                <w:bCs/>
+                <w:sz w:val="18"/>
+                <w:szCs w:val="18"/>
+                <w:lang w:val="en"/>
+              </w:rPr>
+              <w:t>]</w:t>
+            </w:r>
+            <w:r>
+              <w:t xml:space="preserve"> .</w:t>
+            </w:r>
+            <w:proofErr w:type="spellStart"/>
+            <w:r>
+              <w:rPr>
+                <w:rFonts w:asciiTheme="minorHAnsi" w:hAnsiTheme="minorHAnsi" w:cstheme="minorHAnsi"/>
+                <w:bCs/>
+                <w:sz w:val="18"/>
+                <w:szCs w:val="18"/>
+                <w:lang w:val="en"/>
+              </w:rPr>
+              <w:t>next</w:t>
+            </w:r>
+            <w:proofErr w:type="gramEnd"/>
+            <w:r>
+              <w:rPr>
+                <w:rFonts w:asciiTheme="minorHAnsi" w:hAnsiTheme="minorHAnsi" w:cstheme="minorHAnsi"/>
+                <w:bCs/>
+                <w:sz w:val="18"/>
+                <w:szCs w:val="18"/>
+                <w:lang w:val="en"/>
+              </w:rPr>
+              <w:t>_pecp_title:ifNEM</w:t>
+            </w:r>
+            <w:proofErr w:type="spellEnd"/>
+            <w:r>
+              <w:rPr>
+                <w:rFonts w:asciiTheme="minorHAnsi" w:hAnsiTheme="minorHAnsi" w:cstheme="minorHAnsi"/>
+                <w:bCs/>
+                <w:sz w:val="18"/>
+                <w:szCs w:val="18"/>
+                <w:lang w:val="en"/>
+              </w:rPr>
+              <w:t>():</w:t>
+            </w:r>
+            <w:proofErr w:type="spellStart"/>
+            <w:r>
+              <w:rPr>
+                <w:rFonts w:asciiTheme="minorHAnsi" w:hAnsiTheme="minorHAnsi" w:cstheme="minorHAnsi"/>
+                <w:bCs/>
+                <w:sz w:val="18"/>
+                <w:szCs w:val="18"/>
+                <w:lang w:val="en"/>
+              </w:rPr>
+              <w:t>showBegin</w:t>
+            </w:r>
+            <w:proofErr w:type="spellEnd"/>
+            <w:r>
+              <w:rPr>
+                <w:rFonts w:asciiTheme="minorHAnsi" w:hAnsiTheme="minorHAnsi" w:cstheme="minorHAnsi"/>
+                <w:bCs/>
+                <w:sz w:val="18"/>
+                <w:szCs w:val="18"/>
+                <w:lang w:val="en"/>
+              </w:rPr>
+              <w:t>}</w:t>
+            </w:r>
+          </w:p>
+          <w:p>
+            <w:pPr>
+              <w:spacing w:line="201" w:lineRule="atLeast"/>
+              <w:rPr>
+                <w:rFonts w:asciiTheme="minorHAnsi" w:hAnsiTheme="minorHAnsi" w:cstheme="minorHAnsi"/>
+                <w:sz w:val="20"/>
+                <w:szCs w:val="20"/>
+              </w:rPr>
+            </w:pPr>
+            <w:r>
+              <w:rPr>
+                <w:rFonts w:asciiTheme="minorHAnsi" w:hAnsiTheme="minorHAnsi" w:cstheme="minorHAnsi"/>
+                <w:b/>
+                <w:sz w:val="20"/>
+                <w:szCs w:val="20"/>
+              </w:rPr>
+              <w:t>Next Milestone:</w:t>
+            </w:r>
+            <w:r>
+              <w:rPr>
+                <w:rFonts w:asciiTheme="minorHAnsi" w:hAnsiTheme="minorHAnsi" w:cstheme="minorHAnsi"/>
+                <w:b/>
+                <w:sz w:val="20"/>
+                <w:szCs w:val="20"/>
+              </w:rPr>
+              <w:t xml:space="preserve"> </w:t>
+            </w:r>
+            <w:r>
+              <w:rPr>
+                <w:rFonts w:asciiTheme="minorHAnsi" w:hAnsiTheme="minorHAnsi" w:cstheme="minorHAnsi"/>
+                <w:sz w:val="20"/>
+                <w:szCs w:val="20"/>
+              </w:rPr>
+              <w:t>{$</w:t>
+            </w:r>
+            <w:proofErr w:type="spellStart"/>
+            <w:r>
+              <w:rPr>
+                <w:rFonts w:asciiTheme="minorHAnsi" w:hAnsiTheme="minorHAnsi" w:cstheme="minorHAnsi"/>
+                <w:sz w:val="20"/>
+                <w:szCs w:val="20"/>
+              </w:rPr>
+              <w:t>item_val</w:t>
+            </w:r>
+            <w:proofErr w:type="spellEnd"/>
+            <w:r>
+              <w:rPr>
+                <w:rFonts w:asciiTheme="minorHAnsi" w:hAnsiTheme="minorHAnsi" w:cstheme="minorHAnsi"/>
+                <w:sz w:val="20"/>
+                <w:szCs w:val="20"/>
+              </w:rPr>
+              <w:t>[</w:t>
+            </w:r>
+            <w:proofErr w:type="spellStart"/>
+            <w:r>
+              <w:rPr>
+                <w:rFonts w:asciiTheme="minorHAnsi" w:hAnsiTheme="minorHAnsi" w:cstheme="minorHAnsi"/>
+                <w:sz w:val="20"/>
+                <w:szCs w:val="20"/>
+              </w:rPr>
+              <w:t>i</w:t>
+            </w:r>
+            <w:proofErr w:type="spellEnd"/>
+            <w:proofErr w:type="gramStart"/>
+            <w:r>
+              <w:rPr>
+                <w:rFonts w:asciiTheme="minorHAnsi" w:hAnsiTheme="minorHAnsi" w:cstheme="minorHAnsi"/>
+                <w:sz w:val="20"/>
+                <w:szCs w:val="20"/>
+              </w:rPr>
+              <w:t>].</w:t>
+            </w:r>
+            <w:proofErr w:type="spellStart"/>
+            <w:r>
+              <w:rPr>
+                <w:rFonts w:asciiTheme="minorHAnsi" w:hAnsiTheme="minorHAnsi" w:cstheme="minorHAnsi"/>
+                <w:sz w:val="20"/>
+                <w:szCs w:val="20"/>
+              </w:rPr>
+              <w:t>next</w:t>
+            </w:r>
+            <w:proofErr w:type="gramEnd"/>
+            <w:r>
+              <w:rPr>
+                <w:rFonts w:asciiTheme="minorHAnsi" w:hAnsiTheme="minorHAnsi" w:cstheme="minorHAnsi"/>
+                <w:sz w:val="20"/>
+                <w:szCs w:val="20"/>
+              </w:rPr>
+              <w:t>_pecp_title</w:t>
+            </w:r>
+            <w:proofErr w:type="spellEnd"/>
+            <w:r>
+              <w:rPr>
+                <w:rFonts w:asciiTheme="minorHAnsi" w:hAnsiTheme="minorHAnsi" w:cstheme="minorHAnsi"/>
+                <w:sz w:val="20"/>
+                <w:szCs w:val="20"/>
+              </w:rPr>
+              <w:t>}</w:t>
+            </w:r>
+          </w:p>
+          <w:p>
+            <w:pPr>
+              <w:spacing w:line="201" w:lineRule="atLeast"/>
+              <w:rPr>
+                <w:rFonts w:asciiTheme="minorHAnsi" w:hAnsiTheme="minorHAnsi" w:cstheme="minorHAnsi"/>
+                <w:sz w:val="18"/>
+                <w:szCs w:val="18"/>
+                <w:lang w:val="en"/>
+              </w:rPr>
+            </w:pPr>
+            <w:r>
+              <w:rPr>
+                <w:rFonts w:asciiTheme="minorHAnsi" w:hAnsiTheme="minorHAnsi" w:cstheme="minorHAnsi"/>
+                <w:sz w:val="18"/>
+                <w:szCs w:val="18"/>
+                <w:lang w:val="en"/>
+              </w:rPr>
+              <w:t>{$</w:t>
+            </w:r>
+            <w:proofErr w:type="spellStart"/>
+            <w:r>
+              <w:rPr>
+                <w:rFonts w:asciiTheme="minorHAnsi" w:hAnsiTheme="minorHAnsi" w:cstheme="minorHAnsi"/>
+                <w:sz w:val="18"/>
+                <w:szCs w:val="18"/>
+                <w:lang w:val="en"/>
+              </w:rPr>
+              <w:t>item_val</w:t>
+            </w:r>
+            <w:proofErr w:type="spellEnd"/>
+            <w:r>
+              <w:rPr>
+                <w:rFonts w:asciiTheme="minorHAnsi" w:hAnsiTheme="minorHAnsi" w:cstheme="minorHAnsi"/>
+                <w:sz w:val="18"/>
+                <w:szCs w:val="18"/>
+                <w:lang w:val="en"/>
+              </w:rPr>
+              <w:t>[</w:t>
+            </w:r>
+            <w:proofErr w:type="spellStart"/>
+            <w:r>
+              <w:rPr>
+                <w:rFonts w:asciiTheme="minorHAnsi" w:hAnsiTheme="minorHAnsi" w:cstheme="minorHAnsi"/>
+                <w:sz w:val="18"/>
+                <w:szCs w:val="18"/>
+                <w:lang w:val="en"/>
+              </w:rPr>
+              <w:t>i</w:t>
+            </w:r>
+            <w:proofErr w:type="spellEnd"/>
+            <w:proofErr w:type="gramStart"/>
+            <w:r>
+              <w:rPr>
+                <w:rFonts w:asciiTheme="minorHAnsi" w:hAnsiTheme="minorHAnsi" w:cstheme="minorHAnsi"/>
+                <w:sz w:val="18"/>
+                <w:szCs w:val="18"/>
+                <w:lang w:val="en"/>
+              </w:rPr>
+              <w:t>].</w:t>
+            </w:r>
+            <w:proofErr w:type="spellStart"/>
+            <w:r>
+              <w:rPr>
+                <w:rFonts w:asciiTheme="minorHAnsi" w:hAnsiTheme="minorHAnsi" w:cstheme="minorHAnsi"/>
+                <w:sz w:val="18"/>
+                <w:szCs w:val="18"/>
+                <w:lang w:val="en"/>
+              </w:rPr>
+              <w:t>next</w:t>
+            </w:r>
+            <w:proofErr w:type="gramEnd"/>
+            <w:r>
+              <w:rPr>
+                <w:rFonts w:asciiTheme="minorHAnsi" w:hAnsiTheme="minorHAnsi" w:cstheme="minorHAnsi"/>
+                <w:sz w:val="18"/>
+                <w:szCs w:val="18"/>
+                <w:lang w:val="en"/>
+              </w:rPr>
+              <w:t>_pecp_title:showEnd</w:t>
+            </w:r>
+            <w:proofErr w:type="spellEnd"/>
+            <w:r>
+              <w:rPr>
+                <w:rFonts w:asciiTheme="minorHAnsi" w:hAnsiTheme="minorHAnsi" w:cstheme="minorHAnsi"/>
+                <w:sz w:val="18"/>
+                <w:szCs w:val="18"/>
+                <w:lang w:val="en"/>
+              </w:rPr>
+              <w:t>}</w:t>
+            </w:r>
+          </w:p>
+          <w:p>
+            <w:pPr>
+              <w:spacing w:line="201" w:lineRule="atLeast"/>
+              <w:rPr>
+                <w:rFonts w:asciiTheme="minorHAnsi" w:hAnsiTheme="minorHAnsi" w:cstheme="minorHAnsi"/>
+                <w:bCs/>
+                <w:sz w:val="18"/>
+                <w:szCs w:val="18"/>
+                <w:lang w:val="en"/>
+              </w:rPr>
+            </w:pPr>
+            <w:r>
+              <w:rPr>
+                <w:rFonts w:asciiTheme="minorHAnsi" w:hAnsiTheme="minorHAnsi" w:cstheme="minorHAnsi"/>
+                <w:bCs/>
+                <w:sz w:val="18"/>
+                <w:szCs w:val="18"/>
+                <w:lang w:val="en"/>
+              </w:rPr>
+              <w:t>{$</w:t>
+            </w:r>
+            <w:proofErr w:type="spellStart"/>
+            <w:r>
+              <w:rPr>
+                <w:rFonts w:asciiTheme="minorHAnsi" w:hAnsiTheme="minorHAnsi" w:cstheme="minorHAnsi"/>
+                <w:bCs/>
+                <w:sz w:val="18"/>
+                <w:szCs w:val="18"/>
+                <w:lang w:val="en"/>
+              </w:rPr>
+              <w:t>item_val</w:t>
+            </w:r>
+            <w:proofErr w:type="spellEnd"/>
+            <w:r>
+              <w:rPr>
+                <w:rFonts w:asciiTheme="minorHAnsi" w:hAnsiTheme="minorHAnsi" w:cstheme="minorHAnsi"/>
+                <w:bCs/>
+                <w:sz w:val="18"/>
+                <w:szCs w:val="18"/>
+                <w:lang w:val="en"/>
+              </w:rPr>
+              <w:t>[</w:t>
+            </w:r>
+            <w:proofErr w:type="spellStart"/>
+            <w:r>
+              <w:rPr>
+                <w:rFonts w:asciiTheme="minorHAnsi" w:hAnsiTheme="minorHAnsi" w:cstheme="minorHAnsi"/>
+                <w:bCs/>
+                <w:sz w:val="18"/>
+                <w:szCs w:val="18"/>
+                <w:lang w:val="en"/>
+              </w:rPr>
+              <w:t>i</w:t>
+            </w:r>
+            <w:proofErr w:type="spellEnd"/>
+            <w:proofErr w:type="gramStart"/>
+            <w:r>
+              <w:rPr>
+                <w:rFonts w:asciiTheme="minorHAnsi" w:hAnsiTheme="minorHAnsi" w:cstheme="minorHAnsi"/>
+                <w:bCs/>
+                <w:sz w:val="18"/>
+                <w:szCs w:val="18"/>
+                <w:lang w:val="en"/>
+              </w:rPr>
+              <w:t>]</w:t>
+            </w:r>
+            <w:r>
+              <w:t xml:space="preserve"> .</w:t>
+            </w:r>
+            <w:proofErr w:type="gramEnd"/>
+            <w:r>
+              <w:rPr>
+                <w:rFonts w:asciiTheme="minorHAnsi" w:hAnsiTheme="minorHAnsi" w:cstheme="minorHAnsi"/>
+                <w:sz w:val="20"/>
+                <w:szCs w:val="20"/>
+              </w:rPr>
+              <w:t xml:space="preserve"> </w:t>
+            </w:r>
+            <w:proofErr w:type="spellStart"/>
+            <w:r>
+              <w:rPr>
+                <w:rFonts w:asciiTheme="minorHAnsi" w:hAnsiTheme="minorHAnsi" w:cstheme="minorHAnsi"/>
+                <w:sz w:val="20"/>
+                <w:szCs w:val="20"/>
+              </w:rPr>
+              <w:t>next_pecp_short_</w:t>
+            </w:r>
+            <w:proofErr w:type="gramStart"/>
+            <w:r>
+              <w:rPr>
+                <w:rFonts w:asciiTheme="minorHAnsi" w:hAnsiTheme="minorHAnsi" w:cstheme="minorHAnsi"/>
+                <w:sz w:val="20"/>
+                <w:szCs w:val="20"/>
+              </w:rPr>
+              <w:t>description</w:t>
+            </w:r>
+            <w:proofErr w:type="spellEnd"/>
+            <w:r>
+              <w:rPr>
+                <w:rFonts w:asciiTheme="minorHAnsi" w:hAnsiTheme="minorHAnsi" w:cstheme="minorHAnsi"/>
+                <w:bCs/>
+                <w:sz w:val="18"/>
+                <w:szCs w:val="18"/>
                 <w:lang w:val="en"/>
               </w:rPr>
               <w:t>:</w:t>
@@ -3841,38 +4573,33 @@
             <w:r>
               <w:rPr>
                 <w:rFonts w:asciiTheme="minorHAnsi" w:hAnsiTheme="minorHAnsi" w:cstheme="minorHAnsi"/>
-                <w:sz w:val="20"/>
-                <w:szCs w:val="20"/>
+                <w:bCs/>
+                <w:sz w:val="18"/>
+                <w:szCs w:val="18"/>
                 <w:lang w:val="en"/>
               </w:rPr>
               <w:t>ifNEM</w:t>
             </w:r>
             <w:proofErr w:type="spellEnd"/>
-            <w:r>
-              <w:rPr>
-                <w:rFonts w:asciiTheme="minorHAnsi" w:hAnsiTheme="minorHAnsi" w:cstheme="minorHAnsi"/>
-                <w:sz w:val="20"/>
-                <w:szCs w:val="20"/>
-                <w:lang w:val="en"/>
-              </w:rPr>
-              <w:t>()</w:t>
-            </w:r>
-            <w:r>
-              <w:rPr>
-                <w:rFonts w:asciiTheme="minorHAnsi" w:hAnsiTheme="minorHAnsi" w:cstheme="minorHAnsi"/>
-                <w:bCs/>
-                <w:sz w:val="20"/>
-                <w:szCs w:val="20"/>
-              </w:rPr>
-              <w:t>:</w:t>
-            </w:r>
-            <w:proofErr w:type="spellStart"/>
-            <w:r>
-              <w:rPr>
-                <w:rFonts w:asciiTheme="minorHAnsi" w:hAnsiTheme="minorHAnsi" w:cstheme="minorHAnsi"/>
-                <w:bCs/>
-                <w:sz w:val="20"/>
-                <w:szCs w:val="20"/>
+            <w:proofErr w:type="gramEnd"/>
+            <w:r>
+              <w:rPr>
+                <w:rFonts w:asciiTheme="minorHAnsi" w:hAnsiTheme="minorHAnsi" w:cstheme="minorHAnsi"/>
+                <w:bCs/>
+                <w:sz w:val="18"/>
+                <w:szCs w:val="18"/>
+                <w:lang w:val="en"/>
+              </w:rPr>
+              <w:t>():</w:t>
+            </w:r>
+            <w:proofErr w:type="spellStart"/>
+            <w:r>
+              <w:rPr>
+                <w:rFonts w:asciiTheme="minorHAnsi" w:hAnsiTheme="minorHAnsi" w:cstheme="minorHAnsi"/>
+                <w:bCs/>
+                <w:sz w:val="18"/>
+                <w:szCs w:val="18"/>
+                <w:lang w:val="en"/>
               </w:rPr>
               <w:t>showBegin</w:t>
             </w:r>
@@ -3881,347 +4608,9 @@
               <w:rPr>
                 <w:rFonts w:asciiTheme="minorHAnsi" w:hAnsiTheme="minorHAnsi" w:cstheme="minorHAnsi"/>
                 <w:bCs/>
-                <w:sz w:val="20"/>
-                <w:szCs w:val="20"/>
-              </w:rPr>
-              <w:t>}</w:t>
-            </w:r>
-            <w:r>
-              <w:rPr>
-                <w:rFonts w:asciiTheme="minorHAnsi" w:hAnsiTheme="minorHAnsi" w:cstheme="minorHAnsi"/>
-                <w:b/>
-                <w:sz w:val="20"/>
-                <w:szCs w:val="20"/>
-              </w:rPr>
-              <w:t>Upcoming Comment Period:</w:t>
-            </w:r>
-            <w:r>
-              <w:rPr>
-                <w:rFonts w:asciiTheme="minorHAnsi" w:hAnsiTheme="minorHAnsi" w:cstheme="minorHAnsi"/>
-                <w:bCs/>
-                <w:sz w:val="18"/>
-                <w:szCs w:val="18"/>
-              </w:rPr>
-              <w:t xml:space="preserve"> </w:t>
-            </w:r>
-            <w:r>
-              <w:rPr>
-                <w:rFonts w:asciiTheme="minorHAnsi" w:hAnsiTheme="minorHAnsi" w:cstheme="minorHAnsi"/>
-                <w:bCs/>
-                <w:sz w:val="20"/>
-                <w:szCs w:val="20"/>
-              </w:rPr>
-              <w:t>{$</w:t>
-            </w:r>
-            <w:proofErr w:type="spellStart"/>
-            <w:r>
-              <w:rPr>
-                <w:rFonts w:asciiTheme="minorHAnsi" w:hAnsiTheme="minorHAnsi" w:cstheme="minorHAnsi"/>
-                <w:bCs/>
-                <w:sz w:val="20"/>
-                <w:szCs w:val="20"/>
-              </w:rPr>
-              <w:t>item_val</w:t>
-            </w:r>
-            <w:proofErr w:type="spellEnd"/>
-            <w:r>
-              <w:rPr>
-                <w:rFonts w:asciiTheme="minorHAnsi" w:hAnsiTheme="minorHAnsi" w:cstheme="minorHAnsi"/>
-                <w:bCs/>
-                <w:sz w:val="20"/>
-                <w:szCs w:val="20"/>
-              </w:rPr>
-              <w:t>[</w:t>
-            </w:r>
-            <w:proofErr w:type="spellStart"/>
-            <w:r>
-              <w:rPr>
-                <w:rFonts w:asciiTheme="minorHAnsi" w:hAnsiTheme="minorHAnsi" w:cstheme="minorHAnsi"/>
-                <w:bCs/>
-                <w:sz w:val="20"/>
-                <w:szCs w:val="20"/>
-              </w:rPr>
-              <w:t>i</w:t>
-            </w:r>
-            <w:proofErr w:type="spellEnd"/>
-            <w:r>
-              <w:rPr>
-                <w:rFonts w:asciiTheme="minorHAnsi" w:hAnsiTheme="minorHAnsi" w:cstheme="minorHAnsi"/>
-                <w:bCs/>
-                <w:sz w:val="20"/>
-                <w:szCs w:val="20"/>
-              </w:rPr>
-              <w:t>].</w:t>
-            </w:r>
-            <w:proofErr w:type="spellStart"/>
-            <w:r>
-              <w:rPr>
-                <w:rFonts w:asciiTheme="minorHAnsi" w:hAnsiTheme="minorHAnsi" w:cstheme="minorHAnsi"/>
-                <w:bCs/>
-                <w:sz w:val="20"/>
-                <w:szCs w:val="20"/>
-              </w:rPr>
-              <w:t>phase_name</w:t>
-            </w:r>
-            <w:proofErr w:type="spellEnd"/>
-            <w:r>
-              <w:rPr>
-                <w:rFonts w:asciiTheme="minorHAnsi" w:hAnsiTheme="minorHAnsi" w:cstheme="minorHAnsi"/>
-                <w:bCs/>
-                <w:sz w:val="20"/>
-                <w:szCs w:val="20"/>
-              </w:rPr>
-              <w:t>}</w:t>
-            </w:r>
-            <w:r>
-              <w:rPr>
-                <w:rFonts w:asciiTheme="minorHAnsi" w:hAnsiTheme="minorHAnsi" w:cstheme="minorHAnsi"/>
-                <w:bCs/>
-                <w:sz w:val="20"/>
-                <w:szCs w:val="20"/>
-              </w:rPr>
-              <w:t xml:space="preserve"> - </w:t>
-            </w:r>
-            <w:r>
-              <w:rPr>
-                <w:rFonts w:asciiTheme="minorHAnsi" w:hAnsiTheme="minorHAnsi" w:cstheme="minorHAnsi"/>
-                <w:bCs/>
-                <w:sz w:val="20"/>
-                <w:szCs w:val="20"/>
-              </w:rPr>
-              <w:t>{$</w:t>
-            </w:r>
-            <w:proofErr w:type="spellStart"/>
-            <w:r>
-              <w:rPr>
-                <w:rFonts w:asciiTheme="minorHAnsi" w:hAnsiTheme="minorHAnsi" w:cstheme="minorHAnsi"/>
-                <w:bCs/>
-                <w:sz w:val="20"/>
-                <w:szCs w:val="20"/>
-              </w:rPr>
-              <w:t>item_val</w:t>
-            </w:r>
-            <w:proofErr w:type="spellEnd"/>
-            <w:r>
-              <w:rPr>
-                <w:rFonts w:asciiTheme="minorHAnsi" w:hAnsiTheme="minorHAnsi" w:cstheme="minorHAnsi"/>
-                <w:bCs/>
-                <w:sz w:val="20"/>
-                <w:szCs w:val="20"/>
-              </w:rPr>
-              <w:t>[</w:t>
-            </w:r>
-            <w:proofErr w:type="spellStart"/>
-            <w:r>
-              <w:rPr>
-                <w:rFonts w:asciiTheme="minorHAnsi" w:hAnsiTheme="minorHAnsi" w:cstheme="minorHAnsi"/>
-                <w:bCs/>
-                <w:sz w:val="20"/>
-                <w:szCs w:val="20"/>
-              </w:rPr>
-              <w:t>i</w:t>
-            </w:r>
-            <w:proofErr w:type="spellEnd"/>
-            <w:r>
-              <w:rPr>
-                <w:rFonts w:asciiTheme="minorHAnsi" w:hAnsiTheme="minorHAnsi" w:cstheme="minorHAnsi"/>
-                <w:bCs/>
-                <w:sz w:val="20"/>
-                <w:szCs w:val="20"/>
-              </w:rPr>
-              <w:t>].</w:t>
-            </w:r>
-            <w:proofErr w:type="spellStart"/>
-            <w:r>
-              <w:rPr>
-                <w:rFonts w:asciiTheme="minorHAnsi" w:hAnsiTheme="minorHAnsi" w:cstheme="minorHAnsi"/>
-                <w:bCs/>
-                <w:sz w:val="20"/>
-                <w:szCs w:val="20"/>
-              </w:rPr>
-              <w:t>next_pecp_date:formatD</w:t>
-            </w:r>
-            <w:proofErr w:type="spellEnd"/>
-            <w:r>
-              <w:rPr>
-                <w:rFonts w:asciiTheme="minorHAnsi" w:hAnsiTheme="minorHAnsi" w:cstheme="minorHAnsi"/>
-                <w:bCs/>
-                <w:sz w:val="20"/>
-                <w:szCs w:val="20"/>
-              </w:rPr>
-              <w:t>('LL')}</w:t>
-            </w:r>
-            <w:r>
-              <w:rPr>
-                <w:rFonts w:asciiTheme="minorHAnsi" w:hAnsiTheme="minorHAnsi" w:cstheme="minorHAnsi"/>
-                <w:bCs/>
-                <w:sz w:val="20"/>
-                <w:szCs w:val="20"/>
-              </w:rPr>
-              <w:t xml:space="preserve"> </w:t>
-            </w:r>
-            <w:r>
-              <w:rPr>
-                <w:rFonts w:asciiTheme="minorHAnsi" w:hAnsiTheme="minorHAnsi" w:cstheme="minorHAnsi"/>
-                <w:bCs/>
-                <w:sz w:val="20"/>
-                <w:szCs w:val="20"/>
-              </w:rPr>
-              <w:t>({$</w:t>
-            </w:r>
-            <w:proofErr w:type="spellStart"/>
-            <w:r>
-              <w:rPr>
-                <w:rFonts w:asciiTheme="minorHAnsi" w:hAnsiTheme="minorHAnsi" w:cstheme="minorHAnsi"/>
-                <w:bCs/>
-                <w:sz w:val="20"/>
-                <w:szCs w:val="20"/>
-              </w:rPr>
-              <w:t>item_val</w:t>
-            </w:r>
-            <w:proofErr w:type="spellEnd"/>
-            <w:r>
-              <w:rPr>
-                <w:rFonts w:asciiTheme="minorHAnsi" w:hAnsiTheme="minorHAnsi" w:cstheme="minorHAnsi"/>
-                <w:bCs/>
-                <w:sz w:val="20"/>
-                <w:szCs w:val="20"/>
-              </w:rPr>
-              <w:t>[</w:t>
-            </w:r>
-            <w:proofErr w:type="spellStart"/>
-            <w:r>
-              <w:rPr>
-                <w:rFonts w:asciiTheme="minorHAnsi" w:hAnsiTheme="minorHAnsi" w:cstheme="minorHAnsi"/>
-                <w:bCs/>
-                <w:sz w:val="20"/>
-                <w:szCs w:val="20"/>
-              </w:rPr>
-              <w:t>i</w:t>
-            </w:r>
-            <w:proofErr w:type="spellEnd"/>
-            <w:r>
-              <w:rPr>
-                <w:rFonts w:asciiTheme="minorHAnsi" w:hAnsiTheme="minorHAnsi" w:cstheme="minorHAnsi"/>
-                <w:bCs/>
-                <w:sz w:val="20"/>
-                <w:szCs w:val="20"/>
-              </w:rPr>
-              <w:t>].</w:t>
-            </w:r>
-            <w:proofErr w:type="spellStart"/>
-            <w:r>
-              <w:rPr>
-                <w:rFonts w:asciiTheme="minorHAnsi" w:hAnsiTheme="minorHAnsi" w:cstheme="minorHAnsi"/>
-                <w:bCs/>
-                <w:sz w:val="20"/>
-                <w:szCs w:val="20"/>
-              </w:rPr>
-              <w:t>event_number_of_days</w:t>
-            </w:r>
-            <w:proofErr w:type="spellEnd"/>
-            <w:r>
-              <w:rPr>
-                <w:rFonts w:asciiTheme="minorHAnsi" w:hAnsiTheme="minorHAnsi" w:cstheme="minorHAnsi"/>
-                <w:bCs/>
-                <w:sz w:val="20"/>
-                <w:szCs w:val="20"/>
-              </w:rPr>
-              <w:t xml:space="preserve">} </w:t>
-            </w:r>
-            <w:r>
-              <w:rPr>
-                <w:rFonts w:asciiTheme="minorHAnsi" w:hAnsiTheme="minorHAnsi" w:cstheme="minorHAnsi"/>
-                <w:bCs/>
-                <w:sz w:val="20"/>
-                <w:szCs w:val="20"/>
-              </w:rPr>
-              <w:t xml:space="preserve"> </w:t>
-            </w:r>
-            <w:r>
-              <w:rPr>
-                <w:rFonts w:asciiTheme="minorHAnsi" w:hAnsiTheme="minorHAnsi" w:cstheme="minorHAnsi"/>
-                <w:bCs/>
-                <w:sz w:val="20"/>
-                <w:szCs w:val="20"/>
-              </w:rPr>
-              <w:t>days) {$</w:t>
-            </w:r>
-            <w:proofErr w:type="spellStart"/>
-            <w:r>
-              <w:rPr>
-                <w:rFonts w:asciiTheme="minorHAnsi" w:hAnsiTheme="minorHAnsi" w:cstheme="minorHAnsi"/>
-                <w:bCs/>
-                <w:sz w:val="20"/>
-                <w:szCs w:val="20"/>
-              </w:rPr>
-              <w:t>item_val</w:t>
-            </w:r>
-            <w:proofErr w:type="spellEnd"/>
-            <w:r>
-              <w:rPr>
-                <w:rFonts w:asciiTheme="minorHAnsi" w:hAnsiTheme="minorHAnsi" w:cstheme="minorHAnsi"/>
-                <w:bCs/>
-                <w:sz w:val="20"/>
-                <w:szCs w:val="20"/>
-              </w:rPr>
-              <w:t>[</w:t>
-            </w:r>
-            <w:proofErr w:type="spellStart"/>
-            <w:r>
-              <w:rPr>
-                <w:rFonts w:asciiTheme="minorHAnsi" w:hAnsiTheme="minorHAnsi" w:cstheme="minorHAnsi"/>
-                <w:bCs/>
-                <w:sz w:val="20"/>
-                <w:szCs w:val="20"/>
-              </w:rPr>
-              <w:t>i</w:t>
-            </w:r>
-            <w:proofErr w:type="spellEnd"/>
-            <w:r>
-              <w:rPr>
-                <w:rFonts w:asciiTheme="minorHAnsi" w:hAnsiTheme="minorHAnsi" w:cstheme="minorHAnsi"/>
-                <w:bCs/>
-                <w:sz w:val="20"/>
-                <w:szCs w:val="20"/>
-              </w:rPr>
-              <w:t>].</w:t>
-            </w:r>
-            <w:proofErr w:type="spellStart"/>
-            <w:r>
-              <w:rPr>
-                <w:rFonts w:asciiTheme="minorHAnsi" w:hAnsiTheme="minorHAnsi" w:cstheme="minorHAnsi"/>
-                <w:bCs/>
-                <w:sz w:val="20"/>
-                <w:szCs w:val="20"/>
-              </w:rPr>
-              <w:t>next_pecp_</w:t>
-            </w:r>
-            <w:r>
-              <w:rPr>
-                <w:rFonts w:asciiTheme="minorHAnsi" w:hAnsiTheme="minorHAnsi" w:cstheme="minorHAnsi"/>
-                <w:bCs/>
-                <w:sz w:val="20"/>
-                <w:szCs w:val="20"/>
-              </w:rPr>
-              <w:t>date</w:t>
-            </w:r>
-            <w:r>
-              <w:rPr>
-                <w:rFonts w:asciiTheme="minorHAnsi" w:hAnsiTheme="minorHAnsi" w:cstheme="minorHAnsi"/>
-                <w:bCs/>
-                <w:sz w:val="20"/>
-                <w:szCs w:val="20"/>
-              </w:rPr>
-              <w:t>:showEnd</w:t>
-            </w:r>
-            <w:proofErr w:type="spellEnd"/>
-            <w:r>
-              <w:rPr>
-                <w:rFonts w:asciiTheme="minorHAnsi" w:hAnsiTheme="minorHAnsi" w:cstheme="minorHAnsi"/>
-                <w:bCs/>
-                <w:sz w:val="20"/>
-                <w:szCs w:val="20"/>
+                <w:sz w:val="18"/>
+                <w:szCs w:val="18"/>
+                <w:lang w:val="en"/>
               </w:rPr>
               <w:t>}</w:t>
             </w:r>

</xml_diff>

<commit_message>
Update AS to not use work_title
</commit_message>
<xml_diff>
--- a/epictrack-api/src/api/reports/report_templates/anticipated_schedule.docx
+++ b/epictrack-api/src/api/reports/report_templates/anticipated_schedule.docx
@@ -120,8 +120,8 @@
         <w:tblLook w:val="04a0" w:noHBand="0" w:noVBand="1" w:firstColumn="1" w:lastRow="0" w:lastColumn="0" w:firstRow="1"/>
       </w:tblPr>
       <w:tblGrid>
-        <w:gridCol w:w="283"/>
-        <w:gridCol w:w="3686"/>
+        <w:gridCol w:w="282"/>
+        <w:gridCol w:w="3687"/>
         <w:gridCol w:w="3754"/>
         <w:gridCol w:w="5983"/>
       </w:tblGrid>
@@ -131,7 +131,7 @@
         </w:trPr>
         <w:tc>
           <w:tcPr>
-            <w:tcW w:w="283" w:type="dxa"/>
+            <w:tcW w:w="282" w:type="dxa"/>
             <w:tcBorders/>
             <w:shd w:color="auto" w:fill="auto" w:val="clear"/>
             <w:vAlign w:val="center"/>
@@ -160,7 +160,7 @@
         </w:tc>
         <w:tc>
           <w:tcPr>
-            <w:tcW w:w="3686" w:type="dxa"/>
+            <w:tcW w:w="3687" w:type="dxa"/>
             <w:tcBorders/>
             <w:shd w:color="auto" w:fill="auto" w:val="clear"/>
             <w:vAlign w:val="center"/>
@@ -255,7 +255,7 @@
         </w:trPr>
         <w:tc>
           <w:tcPr>
-            <w:tcW w:w="283" w:type="dxa"/>
+            <w:tcW w:w="282" w:type="dxa"/>
             <w:tcBorders/>
             <w:shd w:color="auto" w:fill="auto" w:val="clear"/>
           </w:tcPr>
@@ -283,7 +283,7 @@
         </w:tc>
         <w:tc>
           <w:tcPr>
-            <w:tcW w:w="3686" w:type="dxa"/>
+            <w:tcW w:w="3687" w:type="dxa"/>
             <w:tcBorders/>
             <w:shd w:color="auto" w:fill="auto" w:val="clear"/>
           </w:tcPr>
@@ -300,27 +300,7 @@
                 <w:sz w:val="18"/>
                 <w:szCs w:val="18"/>
               </w:rPr>
-              <w:t>{$item_val[i].work_type_id:ifEQ(</w:t>
-            </w:r>
-            <w:r>
-              <w:rPr>
-                <w:rFonts w:cs="Calibri" w:cstheme="minorHAnsi"/>
-                <w:b w:val="false"/>
-                <w:bCs w:val="false"/>
-                <w:sz w:val="18"/>
-                <w:szCs w:val="18"/>
-              </w:rPr>
-              <w:t>7</w:t>
-            </w:r>
-            <w:r>
-              <w:rPr>
-                <w:rFonts w:cs="Calibri" w:cstheme="minorHAnsi"/>
-                <w:b w:val="false"/>
-                <w:bCs w:val="false"/>
-                <w:sz w:val="18"/>
-                <w:szCs w:val="18"/>
-              </w:rPr>
-              <w:t>):showBegin}</w:t>
+              <w:t>{$item_val[i].work_type_id:ifEQ(7):showBegin}</w:t>
             </w:r>
             <w:r>
               <w:rPr>
@@ -331,6 +311,19 @@
                 <w:szCs w:val="24"/>
               </w:rPr>
               <w:t>{$item_val[i].</w:t>
+            </w:r>
+            <w:r>
+              <w:rPr>
+                <w:rFonts w:eastAsia="Calibri" w:cs="Calibri" w:cstheme="minorHAnsi"/>
+                <w:b/>
+                <w:bCs/>
+                <w:color w:val="auto"/>
+                <w:kern w:val="0"/>
+                <w:sz w:val="24"/>
+                <w:szCs w:val="24"/>
+                <w:lang w:val="en-CA" w:eastAsia="en-US" w:bidi="ar-SA"/>
+              </w:rPr>
+              <w:t>amendment</w:t>
             </w:r>
             <w:r>
               <w:rPr>
@@ -341,7 +334,7 @@
                 <w:szCs w:val="24"/>
                 <w:lang w:eastAsia="en-US"/>
               </w:rPr>
-              <w:t>work_title</w:t>
+              <w:t>_title</w:t>
             </w:r>
             <w:r>
               <w:rPr>
@@ -351,17 +344,7 @@
                 <w:sz w:val="24"/>
                 <w:szCs w:val="24"/>
               </w:rPr>
-              <w:t xml:space="preserve">} - </w:t>
-            </w:r>
-            <w:r>
-              <w:rPr>
-                <w:rFonts w:cs="Calibri" w:cstheme="minorHAnsi"/>
-                <w:b/>
-                <w:bCs/>
-                <w:sz w:val="24"/>
-                <w:szCs w:val="24"/>
-              </w:rPr>
-              <w:t>Amendment</w:t>
+              <w:t xml:space="preserve">} </w:t>
             </w:r>
             <w:r>
               <w:rPr>
@@ -371,27 +354,7 @@
                 <w:sz w:val="18"/>
                 <w:szCs w:val="18"/>
               </w:rPr>
-              <w:t>{$item_val[i].work_type_id:showEnd}{$item_val[i].work_type_id:ifNE(</w:t>
-            </w:r>
-            <w:r>
-              <w:rPr>
-                <w:rFonts w:cs="Calibri" w:cstheme="minorHAnsi"/>
-                <w:b w:val="false"/>
-                <w:bCs w:val="false"/>
-                <w:sz w:val="18"/>
-                <w:szCs w:val="18"/>
-              </w:rPr>
-              <w:t>7</w:t>
-            </w:r>
-            <w:r>
-              <w:rPr>
-                <w:rFonts w:cs="Calibri" w:cstheme="minorHAnsi"/>
-                <w:b w:val="false"/>
-                <w:bCs w:val="false"/>
-                <w:sz w:val="18"/>
-                <w:szCs w:val="18"/>
-              </w:rPr>
-              <w:t>):showBegin}</w:t>
+              <w:t>{$item_val[i].work_type_id:showEnd}{$item_val[i].work_type_id:ifNE(7):showBegin}</w:t>
             </w:r>
             <w:r>
               <w:rPr>
@@ -1365,7 +1328,7 @@
         </w:trPr>
         <w:tc>
           <w:tcPr>
-            <w:tcW w:w="283" w:type="dxa"/>
+            <w:tcW w:w="282" w:type="dxa"/>
             <w:tcBorders/>
             <w:shd w:color="auto" w:fill="auto" w:val="clear"/>
           </w:tcPr>
@@ -1393,7 +1356,7 @@
         </w:tc>
         <w:tc>
           <w:tcPr>
-            <w:tcW w:w="3686" w:type="dxa"/>
+            <w:tcW w:w="3687" w:type="dxa"/>
             <w:tcBorders/>
             <w:shd w:color="auto" w:fill="auto" w:val="clear"/>
           </w:tcPr>
@@ -3241,17 +3204,18 @@
     <w:qFormat/>
     <w:pPr>
       <w:widowControl/>
+      <w:suppressAutoHyphens w:val="true"/>
       <w:bidi w:val="0"/>
       <w:spacing w:before="0" w:after="0"/>
       <w:jc w:val="left"/>
     </w:pPr>
     <w:rPr>
-      <w:rFonts w:ascii="Calibri" w:hAnsi="Calibri" w:cs="Calibri" w:eastAsia="Calibri" w:asciiTheme="minorHAnsi" w:eastAsiaTheme="minorHAnsi" w:hAnsiTheme="minorHAnsi"/>
+      <w:rFonts w:ascii="Calibri" w:hAnsi="Calibri" w:eastAsia="Calibri" w:cs="Calibri" w:asciiTheme="minorHAnsi" w:eastAsiaTheme="minorHAnsi" w:hAnsiTheme="minorHAnsi"/>
       <w:color w:val="auto"/>
       <w:kern w:val="0"/>
       <w:sz w:val="22"/>
       <w:szCs w:val="22"/>
-      <w:lang w:eastAsia="en-US" w:val="en-CA" w:bidi="ar-SA"/>
+      <w:lang w:val="en-CA" w:eastAsia="en-US" w:bidi="ar-SA"/>
     </w:rPr>
   </w:style>
   <w:style w:type="character" w:styleId="DefaultParagraphFont" w:default="1">
@@ -3602,17 +3566,18 @@
     <w:qFormat/>
     <w:pPr>
       <w:widowControl/>
+      <w:suppressAutoHyphens w:val="true"/>
       <w:bidi w:val="0"/>
       <w:spacing w:before="0" w:after="0"/>
       <w:jc w:val="left"/>
     </w:pPr>
     <w:rPr>
-      <w:rFonts w:ascii="Calibri" w:hAnsi="Calibri" w:cs="Calibri" w:eastAsia="Calibri" w:asciiTheme="minorHAnsi" w:eastAsiaTheme="minorHAnsi" w:hAnsiTheme="minorHAnsi"/>
+      <w:rFonts w:ascii="Calibri" w:hAnsi="Calibri" w:eastAsia="Calibri" w:cs="Calibri" w:asciiTheme="minorHAnsi" w:eastAsiaTheme="minorHAnsi" w:hAnsiTheme="minorHAnsi"/>
       <w:color w:val="auto"/>
       <w:kern w:val="0"/>
       <w:sz w:val="22"/>
       <w:szCs w:val="22"/>
-      <w:lang w:eastAsia="en-US" w:val="en-CA" w:bidi="ar-SA"/>
+      <w:lang w:val="en-CA" w:eastAsia="en-US" w:bidi="ar-SA"/>
     </w:rPr>
   </w:style>
   <w:style w:type="paragraph" w:styleId="TableBody" w:customStyle="1">

</xml_diff>

<commit_message>
[Track-275] AS update ea type
</commit_message>
<xml_diff>
--- a/epictrack-api/src/api/reports/report_templates/anticipated_schedule.docx
+++ b/epictrack-api/src/api/reports/report_templates/anticipated_schedule.docx
@@ -422,14 +422,7 @@
           <w:p>
             <w:pPr>
               <w:pStyle w:val="Normal"/>
-              <w:rPr>
-                <w:rFonts w:ascii="Calibri" w:hAnsi="Calibri" w:cs="Calibri" w:asciiTheme="minorHAnsi" w:cstheme="minorHAnsi" w:hAnsiTheme="minorHAnsi"/>
-                <w:b/>
-                <w:b/>
-                <w:bCs/>
-                <w:sz w:val="18"/>
-                <w:szCs w:val="18"/>
-              </w:rPr>
+              <w:rPr/>
             </w:pPr>
             <w:r>
               <w:rPr>
@@ -491,37 +484,17 @@
                 <w:szCs w:val="18"/>
                 <w:lang w:val="en"/>
               </w:rPr>
-              <w:t xml:space="preserve">{$item_val[i].proponent:showEnd} </w:t>
-            </w:r>
-          </w:p>
-          <w:p>
-            <w:pPr>
-              <w:pStyle w:val="Normal"/>
-              <w:rPr>
-                <w:rFonts w:ascii="Calibri" w:hAnsi="Calibri" w:cs="Calibri" w:asciiTheme="minorHAnsi" w:cstheme="minorHAnsi" w:hAnsiTheme="minorHAnsi"/>
-                <w:b/>
-                <w:b/>
-                <w:bCs/>
-                <w:sz w:val="18"/>
-                <w:szCs w:val="18"/>
-                <w:lang w:val="en"/>
-              </w:rPr>
-            </w:pPr>
-            <w:r>
-              <w:rPr>
-                <w:rFonts w:cs="Calibri" w:cstheme="minorHAnsi"/>
-                <w:sz w:val="18"/>
-                <w:szCs w:val="18"/>
-                <w:lang w:val="en"/>
-              </w:rPr>
-              <w:t>{$item_val[i].region:ifNEM():showBegin}</w:t>
-            </w:r>
-          </w:p>
-          <w:p>
-            <w:pPr>
-              <w:pStyle w:val="Normal"/>
-              <w:rPr>
-                <w:rFonts w:ascii="Calibri" w:hAnsi="Calibri" w:cs="Calibri" w:asciiTheme="minorHAnsi" w:cstheme="minorHAnsi" w:hAnsiTheme="minorHAnsi"/>
+              <w:t>{$item_val[i].proponent:showEnd}{$item_val[i].region:ifNEM():showBegin}</w:t>
+            </w:r>
+          </w:p>
+          <w:p>
+            <w:pPr>
+              <w:pStyle w:val="Normal"/>
+              <w:rPr>
+                <w:rFonts w:ascii="Calibri" w:hAnsi="Calibri" w:cs="Calibri" w:asciiTheme="minorHAnsi" w:cstheme="minorHAnsi" w:hAnsiTheme="minorHAnsi"/>
+                <w:b/>
+                <w:b/>
+                <w:bCs/>
                 <w:sz w:val="18"/>
                 <w:szCs w:val="18"/>
                 <w:lang w:val="en"/>
@@ -565,27 +538,7 @@
                 <w:szCs w:val="18"/>
                 <w:lang w:val="en"/>
               </w:rPr>
-              <w:t>{$item_val[i].region:showEnd}</w:t>
-            </w:r>
-          </w:p>
-          <w:p>
-            <w:pPr>
-              <w:pStyle w:val="Normal"/>
-              <w:rPr>
-                <w:rFonts w:ascii="Calibri" w:hAnsi="Calibri" w:cs="Calibri" w:asciiTheme="minorHAnsi" w:cstheme="minorHAnsi" w:hAnsiTheme="minorHAnsi"/>
-                <w:sz w:val="18"/>
-                <w:szCs w:val="18"/>
-                <w:lang w:val="en"/>
-              </w:rPr>
-            </w:pPr>
-            <w:r>
-              <w:rPr>
-                <w:rFonts w:cs="Calibri" w:cstheme="minorHAnsi"/>
-                <w:sz w:val="18"/>
-                <w:szCs w:val="18"/>
-                <w:lang w:val="en"/>
-              </w:rPr>
-              <w:t>{$item_val[i].location:ifNEM():showBegin}</w:t>
+              <w:t>{$item_val[i].region:showEnd}{$item_val[i].location:ifNEM():showBegin}</w:t>
             </w:r>
           </w:p>
           <w:p>
@@ -642,27 +595,6 @@
           <w:p>
             <w:pPr>
               <w:pStyle w:val="Normal"/>
-              <w:rPr>
-                <w:rFonts w:ascii="Calibri" w:hAnsi="Calibri" w:cs="Calibri" w:asciiTheme="minorHAnsi" w:cstheme="minorHAnsi" w:hAnsiTheme="minorHAnsi"/>
-                <w:sz w:val="18"/>
-                <w:szCs w:val="18"/>
-                <w:lang w:val="en"/>
-              </w:rPr>
-            </w:pPr>
-            <w:r>
-              <w:rPr>
-                <w:rFonts w:cs="Calibri" w:cstheme="minorHAnsi"/>
-                <w:bCs/>
-                <w:sz w:val="18"/>
-                <w:szCs w:val="18"/>
-                <w:lang w:val="en"/>
-              </w:rPr>
-              <w:t>{$item_val[i].ea_act:ifNEM():showBegin}</w:t>
-            </w:r>
-          </w:p>
-          <w:p>
-            <w:pPr>
-              <w:pStyle w:val="Normal"/>
               <w:spacing w:lineRule="atLeast" w:line="201"/>
               <w:rPr>
                 <w:rFonts w:ascii="Calibri" w:hAnsi="Calibri" w:cs="Calibri" w:asciiTheme="minorHAnsi" w:cstheme="minorHAnsi" w:hAnsiTheme="minorHAnsi"/>
@@ -690,73 +622,7 @@
                 <w:szCs w:val="18"/>
                 <w:lang w:val="en"/>
               </w:rPr>
-              <w:t>{$item_val[i].ea_act}{$item_val[i]</w:t>
-            </w:r>
-            <w:r>
-              <w:rPr/>
-              <w:t xml:space="preserve"> .</w:t>
-            </w:r>
-            <w:r>
-              <w:rPr>
-                <w:rFonts w:cs="Calibri" w:cstheme="minorHAnsi"/>
-                <w:bCs/>
-                <w:sz w:val="18"/>
-                <w:szCs w:val="18"/>
-                <w:lang w:val="en"/>
-              </w:rPr>
-              <w:t>substitution_act:ifNEM():showBegin};</w:t>
-            </w:r>
-            <w:r>
-              <w:rPr>
-                <w:rFonts w:cs="Calibri" w:cstheme="minorHAnsi"/>
-                <w:b/>
-                <w:bCs/>
-                <w:sz w:val="18"/>
-                <w:szCs w:val="18"/>
-                <w:lang w:val="en"/>
-              </w:rPr>
-              <w:t xml:space="preserve"> </w:t>
-            </w:r>
-            <w:r>
-              <w:rPr>
-                <w:rFonts w:cs="Calibri" w:cstheme="minorHAnsi"/>
-                <w:bCs/>
-                <w:sz w:val="18"/>
-                <w:szCs w:val="18"/>
-                <w:lang w:val="en"/>
-              </w:rPr>
-              <w:t>S</w:t>
-            </w:r>
-            <w:r>
-              <w:rPr>
-                <w:rFonts w:cs="Calibri" w:cstheme="minorHAnsi"/>
-                <w:sz w:val="18"/>
-                <w:szCs w:val="18"/>
-                <w:lang w:val="en"/>
-              </w:rPr>
-              <w:t>ubstituted ({$item_val[i].substitution_act}){$item_val[i].substitution_act:showEnd}</w:t>
-            </w:r>
-          </w:p>
-          <w:p>
-            <w:pPr>
-              <w:pStyle w:val="Normal"/>
-              <w:spacing w:lineRule="atLeast" w:line="201"/>
-              <w:rPr>
-                <w:rFonts w:ascii="Calibri" w:hAnsi="Calibri" w:cs="Calibri" w:asciiTheme="minorHAnsi" w:cstheme="minorHAnsi" w:hAnsiTheme="minorHAnsi"/>
-                <w:sz w:val="18"/>
-                <w:szCs w:val="18"/>
-                <w:lang w:val="en"/>
-              </w:rPr>
-            </w:pPr>
-            <w:r>
-              <w:rPr>
-                <w:rFonts w:cs="Calibri" w:cstheme="minorHAnsi"/>
-                <w:bCs/>
-                <w:sz w:val="18"/>
-                <w:szCs w:val="18"/>
-                <w:lang w:val="en"/>
-              </w:rPr>
-              <w:t>{$item_val[i].ea_act:showEnd}</w:t>
+              <w:t>{$item_val[i].ea_type}</w:t>
             </w:r>
           </w:p>
           <w:p>
@@ -1041,7 +907,7 @@
                 <w:sz w:val="20"/>
                 <w:szCs w:val="20"/>
               </w:rPr>
-              <w:t>):show(Referral):elseShow(Decision)} Date:</w:t>
+              <w:t>):show(Referral ):elseShow(Decision )} Date:</w:t>
             </w:r>
             <w:r>
               <w:rPr>
@@ -1070,19 +936,6 @@
               </w:rPr>
               <w:t>{$item_val[i].referral_date:showEnd}</w:t>
             </w:r>
-          </w:p>
-          <w:p>
-            <w:pPr>
-              <w:pStyle w:val="Normal"/>
-              <w:spacing w:lineRule="atLeast" w:line="201"/>
-              <w:rPr>
-                <w:rFonts w:ascii="Calibri" w:hAnsi="Calibri" w:cs="Calibri" w:asciiTheme="minorHAnsi" w:cstheme="minorHAnsi" w:hAnsiTheme="minorHAnsi"/>
-                <w:bCs/>
-                <w:sz w:val="18"/>
-                <w:szCs w:val="18"/>
-                <w:lang w:val="en"/>
-              </w:rPr>
-            </w:pPr>
             <w:r>
               <w:rPr>
                 <w:rFonts w:cs="Calibri" w:cstheme="minorHAnsi"/>
@@ -1235,27 +1088,7 @@
                 <w:sz w:val="20"/>
                 <w:szCs w:val="20"/>
               </w:rPr>
-              <w:t>{$item_val[i].additional_info:showEnd}</w:t>
-            </w:r>
-          </w:p>
-          <w:p>
-            <w:pPr>
-              <w:pStyle w:val="Normal"/>
-              <w:rPr>
-                <w:rFonts w:ascii="Calibri" w:hAnsi="Calibri" w:cs="Calibri" w:asciiTheme="minorHAnsi" w:cstheme="minorHAnsi" w:hAnsiTheme="minorHAnsi"/>
-                <w:b/>
-                <w:b/>
-                <w:bCs/>
-                <w:sz w:val="20"/>
-                <w:szCs w:val="20"/>
-              </w:rPr>
-            </w:pPr>
-            <w:r>
-              <w:rPr>
-                <w:sz w:val="20"/>
-                <w:szCs w:val="20"/>
-              </w:rPr>
-              <w:t>{$item_val[i].notes:ifNEM():showBegin}</w:t>
+              <w:t>{$item_val[i].additional_info:showEnd}{$item_val[i].notes:ifNEM():showBegin}</w:t>
             </w:r>
           </w:p>
           <w:p>
@@ -1962,7 +1795,7 @@
                 <w:sz w:val="20"/>
                 <w:szCs w:val="20"/>
               </w:rPr>
-              <w:t>):show(Referral):elseShow(Decision)}  Date:</w:t>
+              <w:t>):show(Referral ):elseShow(Decision )}  Date:</w:t>
             </w:r>
             <w:r>
               <w:rPr>

</xml_diff>

<commit_message>
[Track-276] AS add responsible minister or responsible ministry
</commit_message>
<xml_diff>
--- a/epictrack-api/src/api/reports/report_templates/anticipated_schedule.docx
+++ b/epictrack-api/src/api/reports/report_templates/anticipated_schedule.docx
@@ -640,10 +640,12 @@
             <w:r>
               <w:rPr>
                 <w:rFonts w:cs="Calibri" w:cstheme="minorHAnsi"/>
-                <w:sz w:val="18"/>
-                <w:szCs w:val="18"/>
-              </w:rPr>
-              <w:t>{$item_val[i].ministry_name:ifNEM():showBegin}</w:t>
+                <w:bCs/>
+                <w:sz w:val="18"/>
+                <w:szCs w:val="18"/>
+                <w:lang w:val="en"/>
+              </w:rPr>
+              <w:t>{$item_val[i].ministry:ifNEM():showBegin}{$item_val[i].responsible_minister:ifNEM():showBegin}</w:t>
             </w:r>
           </w:p>
           <w:p>
@@ -662,18 +664,22 @@
               <w:rPr>
                 <w:rFonts w:cs="Calibri" w:cstheme="minorHAnsi"/>
                 <w:b/>
-                <w:sz w:val="18"/>
-                <w:szCs w:val="18"/>
-              </w:rPr>
-              <w:t xml:space="preserve">Responsible Minister: </w:t>
-            </w:r>
-            <w:r>
-              <w:rPr>
-                <w:rFonts w:cs="Calibri" w:cstheme="minorHAnsi"/>
-                <w:sz w:val="18"/>
-                <w:szCs w:val="18"/>
-              </w:rPr>
-              <w:t>{$item_val[i].ministry_name}</w:t>
+                <w:bCs/>
+                <w:sz w:val="18"/>
+                <w:szCs w:val="18"/>
+                <w:lang w:val="en"/>
+              </w:rPr>
+              <w:t>Responsible Minister:</w:t>
+            </w:r>
+            <w:r>
+              <w:rPr>
+                <w:rFonts w:cs="Calibri" w:cstheme="minorHAnsi"/>
+                <w:bCs/>
+                <w:sz w:val="18"/>
+                <w:szCs w:val="18"/>
+                <w:lang w:val="en"/>
+              </w:rPr>
+              <w:t xml:space="preserve"> {$item_val[i].responsible_minister} {$item_val[i].responsible_minister:ifNEM():showEnd}{$item_val[i].responsible_minister:ifEmpty():showBegin}</w:t>
             </w:r>
           </w:p>
           <w:p>
@@ -682,17 +688,66 @@
               <w:spacing w:lineRule="atLeast" w:line="201"/>
               <w:rPr>
                 <w:rFonts w:ascii="Calibri" w:hAnsi="Calibri" w:cs="Calibri" w:asciiTheme="minorHAnsi" w:cstheme="minorHAnsi" w:hAnsiTheme="minorHAnsi"/>
-                <w:sz w:val="18"/>
-                <w:szCs w:val="18"/>
-              </w:rPr>
-            </w:pPr>
-            <w:r>
-              <w:rPr>
-                <w:rFonts w:cs="Calibri" w:cstheme="minorHAnsi"/>
-                <w:sz w:val="18"/>
-                <w:szCs w:val="18"/>
-              </w:rPr>
-              <w:t>{$item_val[i].ministry_name:showEnd}</w:t>
+                <w:bCs/>
+                <w:sz w:val="18"/>
+                <w:szCs w:val="18"/>
+                <w:lang w:val="en"/>
+              </w:rPr>
+            </w:pPr>
+            <w:r>
+              <w:rPr>
+                <w:rFonts w:cs="Calibri" w:cstheme="minorHAnsi"/>
+                <w:b/>
+                <w:bCs/>
+                <w:sz w:val="18"/>
+                <w:szCs w:val="18"/>
+                <w:lang w:val="en"/>
+              </w:rPr>
+              <w:t>R</w:t>
+            </w:r>
+            <w:r>
+              <w:rPr>
+                <w:rFonts w:cs="Calibri" w:cstheme="minorHAnsi"/>
+                <w:b/>
+                <w:bCs/>
+                <w:sz w:val="18"/>
+                <w:szCs w:val="18"/>
+                <w:lang w:val="en"/>
+              </w:rPr>
+              <w:t>esponsible Ministry:</w:t>
+            </w:r>
+            <w:r>
+              <w:rPr>
+                <w:rFonts w:cs="Calibri" w:cstheme="minorHAnsi"/>
+                <w:bCs/>
+                <w:sz w:val="18"/>
+                <w:szCs w:val="18"/>
+                <w:lang w:val="en"/>
+              </w:rPr>
+              <w:t xml:space="preserve"> {$item_val[i].ministry}</w:t>
+            </w:r>
+          </w:p>
+          <w:p>
+            <w:pPr>
+              <w:pStyle w:val="Normal"/>
+              <w:spacing w:lineRule="atLeast" w:line="201"/>
+              <w:rPr>
+                <w:rFonts w:ascii="Calibri" w:hAnsi="Calibri" w:cs="Calibri" w:asciiTheme="minorHAnsi" w:cstheme="minorHAnsi" w:hAnsiTheme="minorHAnsi"/>
+                <w:bCs/>
+                <w:sz w:val="18"/>
+                <w:szCs w:val="18"/>
+                <w:lang w:val="en"/>
+              </w:rPr>
+            </w:pPr>
+            <w:r>
+              <w:rPr>
+                <w:rFonts w:cs="Calibri" w:cstheme="minorHAnsi"/>
+                <w:bCs/>
+                <w:sz w:val="18"/>
+                <w:szCs w:val="18"/>
+                <w:lang w:val="en"/>
+              </w:rPr>
+              <w:t>{$item_val[i].responsible_minister:ifEmpty():showEnd}{$item_val[i].ministry:ifNEM():showEnd}</w:t>
             </w:r>
           </w:p>
           <w:p>
@@ -907,7 +962,7 @@
                 <w:sz w:val="20"/>
                 <w:szCs w:val="20"/>
               </w:rPr>
-              <w:t>):show(Referral ):elseShow(Decision )} Date:</w:t>
+              <w:t>):show(Referral Date):elseShow(Decision Date)}:</w:t>
             </w:r>
             <w:r>
               <w:rPr>

</xml_diff>

<commit_message>
Add width to number column in AS report
</commit_message>
<xml_diff>
--- a/epictrack-api/src/api/reports/report_templates/anticipated_schedule.docx
+++ b/epictrack-api/src/api/reports/report_templates/anticipated_schedule.docx
@@ -120,10 +120,10 @@
         <w:tblLook w:val="04a0" w:noHBand="0" w:noVBand="1" w:firstColumn="1" w:lastRow="0" w:lastColumn="0" w:firstRow="1"/>
       </w:tblPr>
       <w:tblGrid>
-        <w:gridCol w:w="282"/>
-        <w:gridCol w:w="3687"/>
-        <w:gridCol w:w="3754"/>
-        <w:gridCol w:w="5983"/>
+        <w:gridCol w:w="452"/>
+        <w:gridCol w:w="3517"/>
+        <w:gridCol w:w="3950"/>
+        <w:gridCol w:w="5787"/>
       </w:tblGrid>
       <w:tr>
         <w:trPr>
@@ -131,7 +131,7 @@
         </w:trPr>
         <w:tc>
           <w:tcPr>
-            <w:tcW w:w="282" w:type="dxa"/>
+            <w:tcW w:w="452" w:type="dxa"/>
             <w:tcBorders/>
             <w:shd w:color="auto" w:fill="auto" w:val="clear"/>
             <w:vAlign w:val="center"/>
@@ -139,6 +139,11 @@
           <w:p>
             <w:pPr>
               <w:pStyle w:val="Normal"/>
+              <w:widowControl/>
+              <w:suppressAutoHyphens w:val="true"/>
+              <w:bidi w:val="0"/>
+              <w:spacing w:before="0" w:after="0"/>
+              <w:ind w:left="0" w:right="360" w:hanging="0"/>
               <w:jc w:val="center"/>
               <w:rPr>
                 <w:rFonts w:ascii="Calibri" w:hAnsi="Calibri" w:cs="Calibri" w:asciiTheme="minorHAnsi" w:cstheme="minorHAnsi" w:hAnsiTheme="minorHAnsi"/>
@@ -160,7 +165,7 @@
         </w:tc>
         <w:tc>
           <w:tcPr>
-            <w:tcW w:w="3687" w:type="dxa"/>
+            <w:tcW w:w="3517" w:type="dxa"/>
             <w:tcBorders/>
             <w:shd w:color="auto" w:fill="auto" w:val="clear"/>
             <w:vAlign w:val="center"/>
@@ -190,7 +195,7 @@
         </w:tc>
         <w:tc>
           <w:tcPr>
-            <w:tcW w:w="3754" w:type="dxa"/>
+            <w:tcW w:w="3950" w:type="dxa"/>
             <w:tcBorders/>
             <w:shd w:color="auto" w:fill="auto" w:val="clear"/>
             <w:vAlign w:val="center"/>
@@ -220,7 +225,7 @@
         </w:tc>
         <w:tc>
           <w:tcPr>
-            <w:tcW w:w="5983" w:type="dxa"/>
+            <w:tcW w:w="5787" w:type="dxa"/>
             <w:tcBorders/>
             <w:shd w:color="auto" w:fill="auto" w:val="clear"/>
             <w:vAlign w:val="center"/>
@@ -255,20 +260,24 @@
         </w:trPr>
         <w:tc>
           <w:tcPr>
-            <w:tcW w:w="282" w:type="dxa"/>
+            <w:tcW w:w="452" w:type="dxa"/>
             <w:tcBorders/>
             <w:shd w:color="auto" w:fill="auto" w:val="clear"/>
           </w:tcPr>
           <w:p>
             <w:pPr>
               <w:pStyle w:val="Normal"/>
-              <w:rPr>
-                <w:rFonts w:ascii="Calibri" w:hAnsi="Calibri" w:cs="Calibri" w:asciiTheme="minorHAnsi" w:cstheme="minorHAnsi" w:hAnsiTheme="minorHAnsi"/>
-                <w:b/>
-                <w:b/>
-                <w:sz w:val="20"/>
-                <w:szCs w:val="20"/>
-              </w:rPr>
+              <w:widowControl/>
+              <w:tabs>
+                <w:tab w:val="clear" w:pos="720"/>
+                <w:tab w:val="left" w:pos="453" w:leader="none"/>
+              </w:tabs>
+              <w:suppressAutoHyphens w:val="true"/>
+              <w:bidi w:val="0"/>
+              <w:spacing w:before="0" w:after="0"/>
+              <w:ind w:left="0" w:right="-89" w:hanging="0"/>
+              <w:jc w:val="left"/>
+              <w:rPr/>
             </w:pPr>
             <w:r>
               <w:rPr>
@@ -283,7 +292,7 @@
         </w:tc>
         <w:tc>
           <w:tcPr>
-            <w:tcW w:w="3687" w:type="dxa"/>
+            <w:tcW w:w="3517" w:type="dxa"/>
             <w:tcBorders/>
             <w:shd w:color="auto" w:fill="auto" w:val="clear"/>
           </w:tcPr>
@@ -703,18 +712,7 @@
                 <w:szCs w:val="18"/>
                 <w:lang w:val="en"/>
               </w:rPr>
-              <w:t>R</w:t>
-            </w:r>
-            <w:r>
-              <w:rPr>
-                <w:rFonts w:cs="Calibri" w:cstheme="minorHAnsi"/>
-                <w:b/>
-                <w:bCs/>
-                <w:sz w:val="18"/>
-                <w:szCs w:val="18"/>
-                <w:lang w:val="en"/>
-              </w:rPr>
-              <w:t>esponsible Ministry:</w:t>
+              <w:t>Responsible Ministry:</w:t>
             </w:r>
             <w:r>
               <w:rPr>
@@ -787,7 +785,7 @@
         </w:tc>
         <w:tc>
           <w:tcPr>
-            <w:tcW w:w="3754" w:type="dxa"/>
+            <w:tcW w:w="3950" w:type="dxa"/>
             <w:tcBorders/>
             <w:shd w:color="auto" w:fill="auto" w:val="clear"/>
           </w:tcPr>
@@ -911,7 +909,7 @@
         </w:tc>
         <w:tc>
           <w:tcPr>
-            <w:tcW w:w="5983" w:type="dxa"/>
+            <w:tcW w:w="5787" w:type="dxa"/>
             <w:tcBorders/>
             <w:shd w:color="auto" w:fill="auto" w:val="clear"/>
           </w:tcPr>
@@ -1187,25 +1185,6 @@
                 <w:szCs w:val="20"/>
               </w:rPr>
               <w:t>{$item_val[i].notes:showEnd}</w:t>
-            </w:r>
-          </w:p>
-          <w:p>
-            <w:pPr>
-              <w:pStyle w:val="Normal"/>
-              <w:rPr>
-                <w:rFonts w:ascii="Calibri" w:hAnsi="Calibri" w:cs="Calibri" w:asciiTheme="minorHAnsi" w:cstheme="minorHAnsi" w:hAnsiTheme="minorHAnsi"/>
-                <w:bCs/>
-                <w:sz w:val="20"/>
-                <w:szCs w:val="20"/>
-              </w:rPr>
-            </w:pPr>
-            <w:r>
-              <w:rPr>
-                <w:rFonts w:cs="Calibri" w:cstheme="minorHAnsi"/>
-                <w:bCs/>
-                <w:sz w:val="20"/>
-                <w:szCs w:val="20"/>
-              </w:rPr>
             </w:r>
           </w:p>
         </w:tc>
@@ -1216,7 +1195,7 @@
         </w:trPr>
         <w:tc>
           <w:tcPr>
-            <w:tcW w:w="282" w:type="dxa"/>
+            <w:tcW w:w="452" w:type="dxa"/>
             <w:tcBorders/>
             <w:shd w:color="auto" w:fill="auto" w:val="clear"/>
           </w:tcPr>
@@ -1244,7 +1223,7 @@
         </w:tc>
         <w:tc>
           <w:tcPr>
-            <w:tcW w:w="3687" w:type="dxa"/>
+            <w:tcW w:w="3517" w:type="dxa"/>
             <w:tcBorders/>
             <w:shd w:color="auto" w:fill="auto" w:val="clear"/>
           </w:tcPr>
@@ -1734,7 +1713,7 @@
         </w:tc>
         <w:tc>
           <w:tcPr>
-            <w:tcW w:w="3754" w:type="dxa"/>
+            <w:tcW w:w="3950" w:type="dxa"/>
             <w:tcBorders/>
             <w:shd w:color="auto" w:fill="auto" w:val="clear"/>
           </w:tcPr>
@@ -1799,7 +1778,7 @@
         </w:tc>
         <w:tc>
           <w:tcPr>
-            <w:tcW w:w="5983" w:type="dxa"/>
+            <w:tcW w:w="5787" w:type="dxa"/>
             <w:tcBorders/>
             <w:shd w:color="auto" w:fill="auto" w:val="clear"/>
           </w:tcPr>

</xml_diff>

<commit_message>
[Track-277] AS Sort groups in report
</commit_message>
<xml_diff>
--- a/epictrack-api/src/api/reports/report_templates/anticipated_schedule.docx
+++ b/epictrack-api/src/api/reports/report_templates/anticipated_schedule.docx
@@ -65,7 +65,28 @@
           <w:sz w:val="28"/>
           <w:szCs w:val="28"/>
         </w:rPr>
-        <w:t>{d.report_data[i].att}</w:t>
+        <w:t>{d.report_data[i].</w:t>
+      </w:r>
+      <w:r>
+        <w:rPr>
+          <w:rFonts w:eastAsia="Calibri" w:cs="Calibri" w:cstheme="minorHAnsi"/>
+          <w:b/>
+          <w:color w:val="auto"/>
+          <w:kern w:val="0"/>
+          <w:sz w:val="28"/>
+          <w:szCs w:val="28"/>
+          <w:lang w:val="en-CA" w:eastAsia="en-US" w:bidi="ar-SA"/>
+        </w:rPr>
+        <w:t>group</w:t>
+      </w:r>
+      <w:r>
+        <w:rPr>
+          <w:rFonts w:cs="Calibri" w:cstheme="minorHAnsi"/>
+          <w:b/>
+          <w:sz w:val="28"/>
+          <w:szCs w:val="28"/>
+        </w:rPr>
+        <w:t>}</w:t>
       </w:r>
     </w:p>
     <w:p>
@@ -102,7 +123,28 @@
           <w:sz w:val="28"/>
           <w:szCs w:val="28"/>
         </w:rPr>
-        <w:t>d.report_data[i].val}</w:t>
+        <w:t>d.report_data[i].</w:t>
+      </w:r>
+      <w:r>
+        <w:rPr>
+          <w:rFonts w:eastAsia="Calibri" w:cs="Calibri" w:cstheme="minorHAnsi"/>
+          <w:b/>
+          <w:color w:val="auto"/>
+          <w:kern w:val="0"/>
+          <w:sz w:val="28"/>
+          <w:szCs w:val="28"/>
+          <w:lang w:val="en-CA" w:eastAsia="en-US" w:bidi="ar-SA"/>
+        </w:rPr>
+        <w:t>items</w:t>
+      </w:r>
+      <w:r>
+        <w:rPr>
+          <w:rFonts w:cs="Calibri" w:cstheme="minorHAnsi"/>
+          <w:b/>
+          <w:sz w:val="28"/>
+          <w:szCs w:val="28"/>
+        </w:rPr>
+        <w:t>}</w:t>
       </w:r>
     </w:p>
     <w:tbl>

</xml_diff>

<commit_message>
[Track-220] Update Anticipated Date label
</commit_message>
<xml_diff>
--- a/epictrack-api/src/api/reports/report_templates/anticipated_schedule.docx
+++ b/epictrack-api/src/api/reports/report_templates/anticipated_schedule.docx
@@ -1,6 +1,6 @@
 
 <file path=word/document.xml><?xml version="1.0" encoding="utf-8"?>
-<w:document xmlns:o="urn:schemas-microsoft-com:office:office" xmlns:r="http://schemas.openxmlformats.org/officeDocument/2006/relationships" xmlns:v="urn:schemas-microsoft-com:vml" xmlns:w="http://schemas.openxmlformats.org/wordprocessingml/2006/main" xmlns:w10="urn:schemas-microsoft-com:office:word" xmlns:wp="http://schemas.openxmlformats.org/drawingml/2006/wordprocessingDrawing" xmlns:wps="http://schemas.microsoft.com/office/word/2010/wordprocessingShape" xmlns:wpg="http://schemas.microsoft.com/office/word/2010/wordprocessingGroup" xmlns:mc="http://schemas.openxmlformats.org/markup-compatibility/2006" xmlns:wp14="http://schemas.microsoft.com/office/word/2010/wordprocessingDrawing" xmlns:w14="http://schemas.microsoft.com/office/word/2010/wordml" xmlns:w15="http://schemas.microsoft.com/office/word/2012/wordml" mc:Ignorable="w14 wp14 w15">
+<w:document xmlns:o="urn:schemas-microsoft-com:office:office" xmlns:r="http://schemas.openxmlformats.org/officeDocument/2006/relationships" xmlns:v="urn:schemas-microsoft-com:vml" xmlns:w="http://schemas.openxmlformats.org/wordprocessingml/2006/main" xmlns:w10="urn:schemas-microsoft-com:office:word" xmlns:wp="http://schemas.openxmlformats.org/drawingml/2006/wordprocessingDrawing" xmlns:wps="http://schemas.microsoft.com/office/word/2010/wordprocessingShape" xmlns:wpg="http://schemas.microsoft.com/office/word/2010/wordprocessingGroup" xmlns:mc="http://schemas.openxmlformats.org/markup-compatibility/2006" xmlns:wp14="http://schemas.microsoft.com/office/word/2010/wordprocessingDrawing" xmlns:w14="http://schemas.microsoft.com/office/word/2010/wordml" mc:Ignorable="w14 wp14">
   <w:body>
     <w:p>
       <w:pPr>
@@ -147,7 +147,6 @@
         <w:tblW w:w="14271" w:type="dxa"/>
         <w:jc w:val="left"/>
         <w:tblInd w:w="-289" w:type="dxa"/>
-        <w:tblLayout w:type="fixed"/>
         <w:tblCellMar>
           <w:top w:w="0" w:type="dxa"/>
           <w:left w:w="108" w:type="dxa"/>
@@ -158,8 +157,8 @@
       </w:tblPr>
       <w:tblGrid>
         <w:gridCol w:w="589"/>
-        <w:gridCol w:w="3543"/>
-        <w:gridCol w:w="4233"/>
+        <w:gridCol w:w="3542"/>
+        <w:gridCol w:w="4234"/>
         <w:gridCol w:w="5905"/>
       </w:tblGrid>
       <w:tr>
@@ -191,19 +190,17 @@
             </w:pPr>
             <w:r>
               <w:rPr>
-                <w:rFonts w:eastAsia="Calibri" w:cs="Calibri" w:cstheme="minorHAnsi"/>
-                <w:b/>
-                <w:kern w:val="0"/>
+                <w:rFonts w:cs="Calibri" w:cstheme="minorHAnsi"/>
+                <w:b/>
                 <w:sz w:val="20"/>
                 <w:szCs w:val="20"/>
-                <w:lang w:val="en-CA" w:bidi="ar-SA"/>
               </w:rPr>
             </w:r>
           </w:p>
         </w:tc>
         <w:tc>
           <w:tcPr>
-            <w:tcW w:w="3543" w:type="dxa"/>
+            <w:tcW w:w="3542" w:type="dxa"/>
             <w:tcBorders/>
             <w:shd w:color="auto" w:fill="auto" w:val="clear"/>
             <w:vAlign w:val="center"/>
@@ -238,7 +235,7 @@
         </w:tc>
         <w:tc>
           <w:tcPr>
-            <w:tcW w:w="4233" w:type="dxa"/>
+            <w:tcW w:w="4234" w:type="dxa"/>
             <w:tcBorders/>
             <w:shd w:color="auto" w:fill="auto" w:val="clear"/>
             <w:vAlign w:val="center"/>
@@ -302,18 +299,7 @@
                 <w:szCs w:val="20"/>
                 <w:lang w:val="en-CA" w:bidi="ar-SA"/>
               </w:rPr>
-              <w:t>Anticipated Referral Date/Next PCP/</w:t>
-            </w:r>
-            <w:r>
-              <w:rPr>
-                <w:rFonts w:eastAsia="Calibri" w:cs="Calibri" w:cstheme="minorHAnsi"/>
-                <w:b/>
-                <w:kern w:val="0"/>
-                <w:sz w:val="20"/>
-                <w:szCs w:val="20"/>
-                <w:lang w:val="en-CA" w:bidi="ar-SA"/>
-              </w:rPr>
-              <w:t>Status</w:t>
+              <w:t>Anticipated Referral Date/Next PCP/Status</w:t>
             </w:r>
           </w:p>
         </w:tc>
@@ -361,7 +347,7 @@
         </w:tc>
         <w:tc>
           <w:tcPr>
-            <w:tcW w:w="3543" w:type="dxa"/>
+            <w:tcW w:w="3542" w:type="dxa"/>
             <w:tcBorders/>
             <w:shd w:color="auto" w:fill="auto" w:val="clear"/>
           </w:tcPr>
@@ -909,19 +895,18 @@
             </w:pPr>
             <w:r>
               <w:rPr>
-                <w:rFonts w:eastAsia="Calibri" w:cs="Calibri" w:cstheme="minorHAnsi"/>
-                <w:b/>
-                <w:kern w:val="0"/>
-                <w:sz w:val="18"/>
-                <w:szCs w:val="18"/>
-                <w:lang w:val="en-CA" w:bidi="ar-SA"/>
+                <w:rFonts w:cs="Calibri" w:cstheme="minorHAnsi"/>
+                <w:b/>
+                <w:sz w:val="18"/>
+                <w:szCs w:val="18"/>
+                <w:lang w:val="en-US"/>
               </w:rPr>
             </w:r>
           </w:p>
         </w:tc>
         <w:tc>
           <w:tcPr>
-            <w:tcW w:w="4233" w:type="dxa"/>
+            <w:tcW w:w="4234" w:type="dxa"/>
             <w:tcBorders/>
             <w:shd w:color="auto" w:fill="auto" w:val="clear"/>
           </w:tcPr>
@@ -988,11 +973,10 @@
             </w:pPr>
             <w:r>
               <w:rPr>
-                <w:rFonts w:eastAsia="Calibri" w:cs="Calibri" w:cstheme="minorHAnsi"/>
-                <w:kern w:val="0"/>
-                <w:sz w:val="18"/>
-                <w:szCs w:val="18"/>
-                <w:lang w:val="en-CA" w:bidi="ar-SA"/>
+                <w:rFonts w:cs="Calibri" w:cstheme="minorHAnsi"/>
+                <w:sz w:val="18"/>
+                <w:szCs w:val="18"/>
+                <w:lang w:val="en-US"/>
               </w:rPr>
             </w:r>
           </w:p>
@@ -1082,11 +1066,9 @@
             </w:pPr>
             <w:r>
               <w:rPr>
-                <w:rFonts w:eastAsia="Calibri" w:cs="Calibri" w:cstheme="minorHAnsi"/>
-                <w:kern w:val="0"/>
+                <w:rFonts w:cs="Calibri" w:cstheme="minorHAnsi"/>
                 <w:sz w:val="20"/>
                 <w:szCs w:val="20"/>
-                <w:lang w:val="en-CA" w:bidi="ar-SA"/>
               </w:rPr>
             </w:r>
           </w:p>
@@ -1130,63 +1112,82 @@
                 <w:szCs w:val="18"/>
                 <w:lang w:val="en-CA" w:bidi="ar-SA"/>
               </w:rPr>
-              <w:t>{$item_val[i].milestone_type:ifEQ(</w:t>
-            </w:r>
-            <w:r>
-              <w:rPr>
-                <w:rFonts w:eastAsia="Calibri" w:cs="Calibri" w:cstheme="minorHAnsi"/>
-                <w:b/>
-                <w:bCs/>
-                <w:kern w:val="0"/>
-                <w:sz w:val="18"/>
-                <w:szCs w:val="18"/>
-                <w:lang w:val="en-IN" w:bidi="ar-SA"/>
-              </w:rPr>
-              <w:t>5</w:t>
-            </w:r>
-            <w:r>
-              <w:rPr>
-                <w:rFonts w:eastAsia="Calibri" w:cs="Calibri" w:cstheme="minorHAnsi"/>
-                <w:b/>
-                <w:bCs/>
-                <w:kern w:val="0"/>
-                <w:sz w:val="18"/>
-                <w:szCs w:val="18"/>
-                <w:lang w:val="en-CA" w:bidi="ar-SA"/>
-              </w:rPr>
-              <w:t xml:space="preserve">):show(Referral Date):elseShow(Decision Date)}: </w:t>
-            </w:r>
-            <w:r>
-              <w:rPr>
-                <w:rFonts w:eastAsia="Calibri" w:cs="Calibri" w:cstheme="minorHAnsi"/>
-                <w:kern w:val="0"/>
-                <w:sz w:val="18"/>
-                <w:szCs w:val="18"/>
-                <w:lang w:val="en-CA" w:bidi="ar-SA"/>
-              </w:rPr>
-              <w:t>{$item_val[i].referral_date:formatD('LL')}{$item_val[i].referral_date:showEnd}</w:t>
-            </w:r>
-          </w:p>
-          <w:p>
-            <w:pPr>
-              <w:pStyle w:val="Normal"/>
-              <w:widowControl/>
-              <w:suppressAutoHyphens w:val="true"/>
-              <w:spacing w:before="0" w:after="0"/>
-              <w:jc w:val="left"/>
-              <w:rPr>
-                <w:rFonts w:cs="Calibri" w:cstheme="minorHAnsi"/>
-                <w:sz w:val="18"/>
-                <w:szCs w:val="18"/>
-              </w:rPr>
-            </w:pPr>
-            <w:r>
-              <w:rPr>
-                <w:rFonts w:eastAsia="Calibri" w:cs="Calibri" w:cstheme="minorHAnsi"/>
-                <w:kern w:val="0"/>
-                <w:sz w:val="18"/>
-                <w:szCs w:val="18"/>
-                <w:lang w:val="en-CA" w:bidi="ar-SA"/>
+              <w:t>{$item_val[i].</w:t>
+            </w:r>
+            <w:r>
+              <w:rPr>
+                <w:rFonts w:eastAsia="Calibri" w:cs="Calibri" w:cstheme="minorHAnsi"/>
+                <w:b/>
+                <w:bCs/>
+                <w:color w:val="auto"/>
+                <w:kern w:val="0"/>
+                <w:sz w:val="18"/>
+                <w:szCs w:val="18"/>
+                <w:lang w:val="en-CA" w:eastAsia="en-US" w:bidi="ar-SA"/>
+              </w:rPr>
+              <w:t>anticipated_date_label</w:t>
+            </w:r>
+            <w:r>
+              <w:rPr>
+                <w:rFonts w:eastAsia="Calibri" w:cs="Calibri" w:cstheme="minorHAnsi"/>
+                <w:b/>
+                <w:bCs/>
+                <w:kern w:val="0"/>
+                <w:sz w:val="18"/>
+                <w:szCs w:val="18"/>
+                <w:lang w:val="en-CA" w:bidi="ar-SA"/>
+              </w:rPr>
+              <w:t xml:space="preserve">}: </w:t>
+            </w:r>
+            <w:r>
+              <w:rPr>
+                <w:rFonts w:eastAsia="Calibri" w:cs="Calibri" w:cstheme="minorHAnsi"/>
+                <w:kern w:val="0"/>
+                <w:sz w:val="18"/>
+                <w:szCs w:val="18"/>
+                <w:lang w:val="en-CA" w:bidi="ar-SA"/>
+              </w:rPr>
+              <w:t>{$item_val[i].referral_date:formatD('</w:t>
+            </w:r>
+            <w:r>
+              <w:rPr>
+                <w:rFonts w:eastAsia="Calibri" w:cs="Calibri" w:cstheme="minorHAnsi"/>
+                <w:kern w:val="0"/>
+                <w:sz w:val="18"/>
+                <w:szCs w:val="18"/>
+                <w:lang w:val="en-CA" w:bidi="ar-SA"/>
+              </w:rPr>
+              <w:t>MMM DD, YYYY</w:t>
+            </w:r>
+            <w:r>
+              <w:rPr>
+                <w:rFonts w:eastAsia="Calibri" w:cs="Calibri" w:cstheme="minorHAnsi"/>
+                <w:kern w:val="0"/>
+                <w:sz w:val="18"/>
+                <w:szCs w:val="18"/>
+                <w:lang w:val="en-CA" w:bidi="ar-SA"/>
+              </w:rPr>
+              <w:t>')}{$item_val[i].referral_date:showEnd}</w:t>
+            </w:r>
+          </w:p>
+          <w:p>
+            <w:pPr>
+              <w:pStyle w:val="Normal"/>
+              <w:widowControl/>
+              <w:suppressAutoHyphens w:val="true"/>
+              <w:spacing w:before="0" w:after="0"/>
+              <w:jc w:val="left"/>
+              <w:rPr>
+                <w:rFonts w:cs="Calibri" w:cstheme="minorHAnsi"/>
+                <w:sz w:val="18"/>
+                <w:szCs w:val="18"/>
+              </w:rPr>
+            </w:pPr>
+            <w:r>
+              <w:rPr>
+                <w:rFonts w:cs="Calibri" w:cstheme="minorHAnsi"/>
+                <w:sz w:val="18"/>
+                <w:szCs w:val="18"/>
               </w:rPr>
             </w:r>
           </w:p>
@@ -1275,12 +1276,10 @@
             </w:pPr>
             <w:r>
               <w:rPr>
-                <w:rFonts w:eastAsia="Calibri" w:cs="Calibri" w:cstheme="minorHAnsi"/>
-                <w:bCs/>
-                <w:kern w:val="0"/>
-                <w:sz w:val="18"/>
-                <w:szCs w:val="18"/>
-                <w:lang w:val="en-CA" w:bidi="ar-SA"/>
+                <w:rFonts w:cs="Calibri" w:cstheme="minorHAnsi"/>
+                <w:bCs/>
+                <w:sz w:val="18"/>
+                <w:szCs w:val="18"/>
               </w:rPr>
             </w:r>
           </w:p>
@@ -1379,12 +1378,11 @@
             </w:pPr>
             <w:r>
               <w:rPr>
-                <w:rFonts w:eastAsia="Calibri" w:cs="Calibri" w:cstheme="minorHAnsi"/>
-                <w:bCs/>
-                <w:kern w:val="0"/>
-                <w:sz w:val="18"/>
-                <w:szCs w:val="18"/>
-                <w:lang w:val="en-CA" w:bidi="ar-SA"/>
+                <w:rFonts w:cs="Calibri" w:cstheme="minorHAnsi"/>
+                <w:bCs/>
+                <w:sz w:val="18"/>
+                <w:szCs w:val="18"/>
+                <w:lang w:val="en-US"/>
               </w:rPr>
             </w:r>
           </w:p>
@@ -1461,13 +1459,11 @@
             </w:pPr>
             <w:r>
               <w:rPr>
-                <w:rFonts w:eastAsia="Calibri" w:cs="Calibri" w:cstheme="minorHAnsi"/>
-                <w:b/>
-                <w:bCs/>
-                <w:kern w:val="0"/>
-                <w:sz w:val="18"/>
-                <w:szCs w:val="18"/>
-                <w:lang w:val="en-CA" w:bidi="ar-SA"/>
+                <w:rFonts w:cs="Calibri" w:cstheme="minorHAnsi"/>
+                <w:b/>
+                <w:bCs/>
+                <w:sz w:val="18"/>
+                <w:szCs w:val="18"/>
               </w:rPr>
             </w:r>
           </w:p>
@@ -1529,11 +1525,8 @@
             </w:pPr>
             <w:r>
               <w:rPr>
-                <w:rFonts w:eastAsia="Calibri"/>
-                <w:kern w:val="0"/>
-                <w:sz w:val="18"/>
-                <w:szCs w:val="18"/>
-                <w:lang w:val="en-CA" w:bidi="ar-SA"/>
+                <w:sz w:val="18"/>
+                <w:szCs w:val="18"/>
               </w:rPr>
             </w:r>
           </w:p>
@@ -1579,7 +1572,7 @@
         </w:tc>
         <w:tc>
           <w:tcPr>
-            <w:tcW w:w="3543" w:type="dxa"/>
+            <w:tcW w:w="3542" w:type="dxa"/>
             <w:tcBorders/>
             <w:shd w:color="auto" w:fill="auto" w:val="clear"/>
           </w:tcPr>
@@ -2159,7 +2152,7 @@
         </w:tc>
         <w:tc>
           <w:tcPr>
-            <w:tcW w:w="4233" w:type="dxa"/>
+            <w:tcW w:w="4234" w:type="dxa"/>
             <w:tcBorders/>
             <w:shd w:color="auto" w:fill="auto" w:val="clear"/>
           </w:tcPr>
@@ -2944,7 +2937,7 @@
       <w:footerReference w:type="first" r:id="rId5"/>
       <w:type w:val="nextPage"/>
       <w:pgSz w:orient="landscape" w:w="15840" w:h="12240"/>
-      <w:pgMar w:left="851" w:right="851" w:gutter="0" w:header="624" w:top="681" w:footer="709" w:bottom="766"/>
+      <w:pgMar w:left="851" w:right="851" w:header="624" w:top="681" w:footer="709" w:bottom="766" w:gutter="0"/>
       <w:pgNumType w:fmt="decimal"/>
       <w:formProt w:val="false"/>
       <w:titlePg/>
@@ -2956,7 +2949,7 @@
 </file>
 
 <file path=word/footer1.xml><?xml version="1.0" encoding="utf-8"?>
-<w:ftr xmlns:o="urn:schemas-microsoft-com:office:office" xmlns:r="http://schemas.openxmlformats.org/officeDocument/2006/relationships" xmlns:v="urn:schemas-microsoft-com:vml" xmlns:w="http://schemas.openxmlformats.org/wordprocessingml/2006/main" xmlns:w10="urn:schemas-microsoft-com:office:word" xmlns:wp="http://schemas.openxmlformats.org/drawingml/2006/wordprocessingDrawing" xmlns:wps="http://schemas.microsoft.com/office/word/2010/wordprocessingShape" xmlns:wpg="http://schemas.microsoft.com/office/word/2010/wordprocessingGroup" xmlns:mc="http://schemas.openxmlformats.org/markup-compatibility/2006" xmlns:wp14="http://schemas.microsoft.com/office/word/2010/wordprocessingDrawing" xmlns:w14="http://schemas.microsoft.com/office/word/2010/wordml" xmlns:w15="http://schemas.microsoft.com/office/word/2012/wordml" mc:Ignorable="w14 wp14 w15">
+<w:ftr xmlns:o="urn:schemas-microsoft-com:office:office" xmlns:r="http://schemas.openxmlformats.org/officeDocument/2006/relationships" xmlns:v="urn:schemas-microsoft-com:vml" xmlns:w="http://schemas.openxmlformats.org/wordprocessingml/2006/main" xmlns:w10="urn:schemas-microsoft-com:office:word" xmlns:wp="http://schemas.openxmlformats.org/drawingml/2006/wordprocessingDrawing" xmlns:wps="http://schemas.microsoft.com/office/word/2010/wordprocessingShape" xmlns:wpg="http://schemas.microsoft.com/office/word/2010/wordprocessingGroup" xmlns:mc="http://schemas.openxmlformats.org/markup-compatibility/2006" xmlns:wp14="http://schemas.microsoft.com/office/word/2010/wordprocessingDrawing" xmlns:w14="http://schemas.microsoft.com/office/word/2010/wordml" mc:Ignorable="w14 wp14">
   <w:p>
     <w:pPr>
       <w:pStyle w:val="Footer"/>
@@ -2989,7 +2982,7 @@
         <w:szCs w:val="16"/>
         <w:bCs/>
       </w:rPr>
-      <w:instrText xml:space="preserve"> PAGE </w:instrText>
+      <w:instrText> PAGE </w:instrText>
     </w:r>
     <w:r>
       <w:rPr>
@@ -3041,7 +3034,7 @@
         <w:szCs w:val="16"/>
         <w:bCs/>
       </w:rPr>
-      <w:instrText xml:space="preserve"> NUMPAGES </w:instrText>
+      <w:instrText> NUMPAGES </w:instrText>
     </w:r>
     <w:r>
       <w:rPr>
@@ -3075,7 +3068,7 @@
 </file>
 
 <file path=word/footer2.xml><?xml version="1.0" encoding="utf-8"?>
-<w:ftr xmlns:o="urn:schemas-microsoft-com:office:office" xmlns:r="http://schemas.openxmlformats.org/officeDocument/2006/relationships" xmlns:v="urn:schemas-microsoft-com:vml" xmlns:w="http://schemas.openxmlformats.org/wordprocessingml/2006/main" xmlns:w10="urn:schemas-microsoft-com:office:word" xmlns:wp="http://schemas.openxmlformats.org/drawingml/2006/wordprocessingDrawing" xmlns:wps="http://schemas.microsoft.com/office/word/2010/wordprocessingShape" xmlns:wpg="http://schemas.microsoft.com/office/word/2010/wordprocessingGroup" xmlns:mc="http://schemas.openxmlformats.org/markup-compatibility/2006" xmlns:wp14="http://schemas.microsoft.com/office/word/2010/wordprocessingDrawing" xmlns:w14="http://schemas.microsoft.com/office/word/2010/wordml" xmlns:w15="http://schemas.microsoft.com/office/word/2012/wordml" mc:Ignorable="w14 wp14 w15">
+<w:ftr xmlns:o="urn:schemas-microsoft-com:office:office" xmlns:r="http://schemas.openxmlformats.org/officeDocument/2006/relationships" xmlns:v="urn:schemas-microsoft-com:vml" xmlns:w="http://schemas.openxmlformats.org/wordprocessingml/2006/main" xmlns:w10="urn:schemas-microsoft-com:office:word" xmlns:wp="http://schemas.openxmlformats.org/drawingml/2006/wordprocessingDrawing" xmlns:wps="http://schemas.microsoft.com/office/word/2010/wordprocessingShape" xmlns:wpg="http://schemas.microsoft.com/office/word/2010/wordprocessingGroup" xmlns:mc="http://schemas.openxmlformats.org/markup-compatibility/2006" xmlns:wp14="http://schemas.microsoft.com/office/word/2010/wordprocessingDrawing" xmlns:w14="http://schemas.microsoft.com/office/word/2010/wordml" mc:Ignorable="w14 wp14">
   <w:p>
     <w:pPr>
       <w:pStyle w:val="Footer"/>
@@ -3108,7 +3101,7 @@
         <w:szCs w:val="16"/>
         <w:bCs/>
       </w:rPr>
-      <w:instrText xml:space="preserve"> PAGE </w:instrText>
+      <w:instrText> PAGE </w:instrText>
     </w:r>
     <w:r>
       <w:rPr>
@@ -3160,7 +3153,7 @@
         <w:szCs w:val="16"/>
         <w:bCs/>
       </w:rPr>
-      <w:instrText xml:space="preserve"> NUMPAGES </w:instrText>
+      <w:instrText> NUMPAGES </w:instrText>
     </w:r>
     <w:r>
       <w:rPr>
@@ -3194,7 +3187,7 @@
 </file>
 
 <file path=word/header1.xml><?xml version="1.0" encoding="utf-8"?>
-<w:hdr xmlns:o="urn:schemas-microsoft-com:office:office" xmlns:r="http://schemas.openxmlformats.org/officeDocument/2006/relationships" xmlns:v="urn:schemas-microsoft-com:vml" xmlns:w="http://schemas.openxmlformats.org/wordprocessingml/2006/main" xmlns:w10="urn:schemas-microsoft-com:office:word" xmlns:wp="http://schemas.openxmlformats.org/drawingml/2006/wordprocessingDrawing" xmlns:wps="http://schemas.microsoft.com/office/word/2010/wordprocessingShape" xmlns:wpg="http://schemas.microsoft.com/office/word/2010/wordprocessingGroup" xmlns:mc="http://schemas.openxmlformats.org/markup-compatibility/2006" xmlns:wp14="http://schemas.microsoft.com/office/word/2010/wordprocessingDrawing" xmlns:w14="http://schemas.microsoft.com/office/word/2010/wordml" xmlns:w15="http://schemas.microsoft.com/office/word/2012/wordml" mc:Ignorable="w14 wp14 w15">
+<w:hdr xmlns:o="urn:schemas-microsoft-com:office:office" xmlns:r="http://schemas.openxmlformats.org/officeDocument/2006/relationships" xmlns:v="urn:schemas-microsoft-com:vml" xmlns:w="http://schemas.openxmlformats.org/wordprocessingml/2006/main" xmlns:w10="urn:schemas-microsoft-com:office:word" xmlns:wp="http://schemas.openxmlformats.org/drawingml/2006/wordprocessingDrawing" xmlns:wps="http://schemas.microsoft.com/office/word/2010/wordprocessingShape" xmlns:wpg="http://schemas.microsoft.com/office/word/2010/wordprocessingGroup" xmlns:mc="http://schemas.openxmlformats.org/markup-compatibility/2006" xmlns:wp14="http://schemas.microsoft.com/office/word/2010/wordprocessingDrawing" xmlns:w14="http://schemas.microsoft.com/office/word/2010/wordml" mc:Ignorable="w14 wp14">
   <w:p>
     <w:pPr>
       <w:pStyle w:val="Header"/>
@@ -3209,7 +3202,7 @@
 </file>
 
 <file path=word/header2.xml><?xml version="1.0" encoding="utf-8"?>
-<w:hdr xmlns:o="urn:schemas-microsoft-com:office:office" xmlns:r="http://schemas.openxmlformats.org/officeDocument/2006/relationships" xmlns:v="urn:schemas-microsoft-com:vml" xmlns:w="http://schemas.openxmlformats.org/wordprocessingml/2006/main" xmlns:w10="urn:schemas-microsoft-com:office:word" xmlns:wp="http://schemas.openxmlformats.org/drawingml/2006/wordprocessingDrawing" xmlns:wps="http://schemas.microsoft.com/office/word/2010/wordprocessingShape" xmlns:wpg="http://schemas.microsoft.com/office/word/2010/wordprocessingGroup" xmlns:mc="http://schemas.openxmlformats.org/markup-compatibility/2006" xmlns:wp14="http://schemas.microsoft.com/office/word/2010/wordprocessingDrawing" xmlns:w14="http://schemas.microsoft.com/office/word/2010/wordml" xmlns:w15="http://schemas.microsoft.com/office/word/2012/wordml" mc:Ignorable="w14 wp14 w15">
+<w:hdr xmlns:o="urn:schemas-microsoft-com:office:office" xmlns:r="http://schemas.openxmlformats.org/officeDocument/2006/relationships" xmlns:v="urn:schemas-microsoft-com:vml" xmlns:w="http://schemas.openxmlformats.org/wordprocessingml/2006/main" xmlns:w10="urn:schemas-microsoft-com:office:word" xmlns:wp="http://schemas.openxmlformats.org/drawingml/2006/wordprocessingDrawing" xmlns:wps="http://schemas.microsoft.com/office/word/2010/wordprocessingShape" xmlns:wpg="http://schemas.microsoft.com/office/word/2010/wordprocessingGroup" xmlns:mc="http://schemas.openxmlformats.org/markup-compatibility/2006" xmlns:wp14="http://schemas.microsoft.com/office/word/2010/wordprocessingDrawing" xmlns:w14="http://schemas.microsoft.com/office/word/2010/wordml" mc:Ignorable="w14 wp14">
   <w:p>
     <w:pPr>
       <w:pStyle w:val="Header"/>
@@ -3667,12 +3660,12 @@
       <w:jc w:val="left"/>
     </w:pPr>
     <w:rPr>
-      <w:rFonts w:cs="Calibri" w:ascii="Calibri" w:hAnsi="Calibri" w:eastAsia="Calibri" w:asciiTheme="minorHAnsi" w:eastAsiaTheme="minorHAnsi" w:hAnsiTheme="minorHAnsi"/>
+      <w:rFonts w:ascii="Calibri" w:hAnsi="Calibri" w:eastAsia="Calibri" w:cs="Calibri" w:asciiTheme="minorHAnsi" w:eastAsiaTheme="minorHAnsi" w:hAnsiTheme="minorHAnsi"/>
       <w:color w:val="auto"/>
       <w:kern w:val="0"/>
       <w:sz w:val="22"/>
       <w:szCs w:val="22"/>
-      <w:lang w:eastAsia="en-US" w:val="en-CA" w:bidi="ar-SA"/>
+      <w:lang w:val="en-CA" w:eastAsia="en-US" w:bidi="ar-SA"/>
     </w:rPr>
   </w:style>
   <w:style w:type="character" w:styleId="DefaultParagraphFont" w:default="1">
@@ -4045,12 +4038,12 @@
       <w:jc w:val="left"/>
     </w:pPr>
     <w:rPr>
-      <w:rFonts w:cs="Calibri" w:ascii="Calibri" w:hAnsi="Calibri" w:eastAsia="Calibri" w:asciiTheme="minorHAnsi" w:eastAsiaTheme="minorHAnsi" w:hAnsiTheme="minorHAnsi"/>
+      <w:rFonts w:ascii="Calibri" w:hAnsi="Calibri" w:eastAsia="Calibri" w:cs="Calibri" w:asciiTheme="minorHAnsi" w:eastAsiaTheme="minorHAnsi" w:hAnsiTheme="minorHAnsi"/>
       <w:color w:val="auto"/>
       <w:kern w:val="0"/>
       <w:sz w:val="22"/>
       <w:szCs w:val="22"/>
-      <w:lang w:eastAsia="en-US" w:val="en-CA" w:bidi="ar-SA"/>
+      <w:lang w:val="en-CA" w:eastAsia="en-US" w:bidi="ar-SA"/>
     </w:rPr>
   </w:style>
   <w:style w:type="paragraph" w:styleId="TableBody" w:customStyle="1">

</xml_diff>

<commit_message>
[Track-343] AS report remove extra field and formatting
</commit_message>
<xml_diff>
--- a/epictrack-api/src/api/reports/report_templates/anticipated_schedule.docx
+++ b/epictrack-api/src/api/reports/report_templates/anticipated_schedule.docx
@@ -20,7 +20,7 @@
           <w:sz w:val="20"/>
           <w:szCs w:val="20"/>
         </w:rPr>
-        <w:t>*Anticipated decision dates subject to change next_pecp_phase_name</w:t>
+        <w:t>*Anticipated decision dates subject to change</w:t>
       </w:r>
     </w:p>
     <w:p>
@@ -409,7 +409,11 @@
               </w:rPr>
             </w:pPr>
             <w:r>
-              <w:rPr/>
+              <w:rPr>
+                <w:rFonts w:cs="Calibri" w:cstheme="minorHAnsi"/>
+                <w:sz w:val="18"/>
+                <w:szCs w:val="18"/>
+              </w:rPr>
             </w:r>
           </w:p>
           <w:p>
@@ -774,17 +778,16 @@
               <w:spacing w:lineRule="atLeast" w:line="201"/>
               <w:rPr>
                 <w:rFonts w:cs="Calibri" w:cstheme="minorHAnsi"/>
-                <w:b/>
-                <w:b/>
-                <w:sz w:val="18"/>
-                <w:szCs w:val="18"/>
-                <w:lang w:val="en-US"/>
-              </w:rPr>
-            </w:pPr>
-            <w:r>
-              <w:rPr>
-                <w:rFonts w:cs="Calibri" w:cstheme="minorHAnsi"/>
-                <w:b/>
+                <w:bCs/>
+                <w:sz w:val="18"/>
+                <w:szCs w:val="18"/>
+                <w:lang w:val="en-US"/>
+              </w:rPr>
+            </w:pPr>
+            <w:r>
+              <w:rPr>
+                <w:rFonts w:cs="Calibri" w:cstheme="minorHAnsi"/>
+                <w:bCs/>
                 <w:sz w:val="18"/>
                 <w:szCs w:val="18"/>
                 <w:lang w:val="en-US"/>
@@ -916,23 +919,6 @@
               <w:t>{$item_val[i].project_description:showEnd}</w:t>
             </w:r>
           </w:p>
-          <w:p>
-            <w:pPr>
-              <w:pStyle w:val="Normal"/>
-              <w:rPr>
-                <w:rFonts w:cs="Calibri" w:cstheme="minorHAnsi"/>
-                <w:sz w:val="20"/>
-                <w:szCs w:val="20"/>
-              </w:rPr>
-            </w:pPr>
-            <w:r>
-              <w:rPr>
-                <w:rFonts w:cs="Calibri" w:cstheme="minorHAnsi"/>
-                <w:sz w:val="20"/>
-                <w:szCs w:val="20"/>
-              </w:rPr>
-            </w:r>
-          </w:p>
         </w:tc>
         <w:tc>
           <w:tcPr>
@@ -1325,21 +1311,6 @@
                 <w:szCs w:val="18"/>
               </w:rPr>
               <w:t>{$item_val[i].notes }{$item_val[i].notes:showEnd}</w:t>
-            </w:r>
-          </w:p>
-          <w:p>
-            <w:pPr>
-              <w:pStyle w:val="Normal"/>
-              <w:rPr>
-                <w:sz w:val="18"/>
-                <w:szCs w:val="18"/>
-              </w:rPr>
-            </w:pPr>
-            <w:r>
-              <w:rPr>
-                <w:sz w:val="18"/>
-                <w:szCs w:val="18"/>
-              </w:rPr>
             </w:r>
           </w:p>
         </w:tc>
@@ -2394,129 +2365,36 @@
     <w:p>
       <w:pPr>
         <w:pStyle w:val="Normal"/>
-        <w:spacing w:lineRule="auto" w:line="276"/>
+        <w:jc w:val="center"/>
         <w:rPr>
-          <w:rFonts w:cs="Calibri" w:cstheme="minorHAnsi"/>
           <w:b/>
           <w:b/>
+          <w:bCs/>
           <w:sz w:val="28"/>
           <w:szCs w:val="28"/>
         </w:rPr>
       </w:pPr>
       <w:r>
-        <w:rPr>
-          <w:rFonts w:cs="Calibri" w:cstheme="minorHAnsi"/>
-          <w:b/>
-          <w:sz w:val="28"/>
-          <w:szCs w:val="28"/>
-        </w:rPr>
+        <w:br w:type="page"/>
+      </w:r>
+      <w:r>
+        <w:rPr/>
       </w:r>
     </w:p>
     <w:p>
       <w:pPr>
         <w:pStyle w:val="Normal"/>
-        <w:rPr>
-          <w:rFonts w:cs="Calibri" w:cstheme="minorHAnsi"/>
-          <w:b/>
-          <w:b/>
-          <w:sz w:val="28"/>
-          <w:szCs w:val="28"/>
-        </w:rPr>
+        <w:jc w:val="center"/>
+        <w:rPr/>
       </w:pPr>
       <w:r>
         <w:rPr>
-          <w:rFonts w:cs="Calibri" w:cstheme="minorHAnsi"/>
           <w:b/>
-          <w:sz w:val="28"/>
-          <w:szCs w:val="28"/>
-        </w:rPr>
-      </w:r>
-      <w:r>
-        <w:br w:type="page"/>
-      </w:r>
-    </w:p>
-    <w:p>
-      <w:pPr>
-        <w:pStyle w:val="Normal"/>
-        <w:spacing w:lineRule="auto" w:line="276"/>
-        <w:rPr>
-          <w:rFonts w:cs="Calibri" w:cstheme="minorHAnsi"/>
-          <w:b/>
-          <w:b/>
-          <w:sz w:val="28"/>
-          <w:szCs w:val="28"/>
-        </w:rPr>
-      </w:pPr>
-      <w:r>
-        <w:rPr>
-          <w:rFonts w:cs="Calibri" w:cstheme="minorHAnsi"/>
-          <w:b/>
-          <w:sz w:val="28"/>
-          <w:szCs w:val="28"/>
-        </w:rPr>
-      </w:r>
-    </w:p>
-    <w:p>
-      <w:pPr>
-        <w:pStyle w:val="Normal"/>
-        <w:shd w:val="clear" w:color="auto" w:fill="FFFFFF" w:themeFill="background1"/>
-        <w:spacing w:lineRule="auto" w:line="276"/>
-        <w:jc w:val="center"/>
-        <w:rPr>
-          <w:rFonts w:cs="Calibri" w:cstheme="minorHAnsi"/>
-          <w:b/>
-          <w:b/>
-          <w:sz w:val="28"/>
-          <w:szCs w:val="28"/>
-        </w:rPr>
-      </w:pPr>
-      <w:r>
-        <w:rPr>
-          <w:rFonts w:cs="Calibri" w:cstheme="minorHAnsi"/>
-          <w:b/>
+          <w:bCs/>
           <w:sz w:val="28"/>
           <w:szCs w:val="28"/>
         </w:rPr>
         <w:t>{d.report_data[i+1].att}</w:t>
-      </w:r>
-    </w:p>
-    <w:p>
-      <w:pPr>
-        <w:pStyle w:val="Normal"/>
-        <w:spacing w:lineRule="auto" w:line="276"/>
-        <w:jc w:val="center"/>
-        <w:rPr>
-          <w:rFonts w:cs="Calibri" w:cstheme="minorHAnsi"/>
-          <w:b/>
-          <w:b/>
-          <w:sz w:val="28"/>
-          <w:szCs w:val="28"/>
-        </w:rPr>
-      </w:pPr>
-      <w:r>
-        <w:rPr>
-          <w:rFonts w:cs="Calibri" w:cstheme="minorHAnsi"/>
-          <w:b/>
-          <w:sz w:val="28"/>
-          <w:szCs w:val="28"/>
-        </w:rPr>
-      </w:r>
-    </w:p>
-    <w:p>
-      <w:pPr>
-        <w:pStyle w:val="Normal"/>
-        <w:tabs>
-          <w:tab w:val="clear" w:pos="720"/>
-          <w:tab w:val="left" w:pos="4635" w:leader="none"/>
-        </w:tabs>
-        <w:rPr>
-          <w:rFonts w:cs="Calibri" w:cstheme="minorHAnsi"/>
-          <w:sz w:val="4"/>
-          <w:szCs w:val="4"/>
-        </w:rPr>
-      </w:pPr>
-      <w:r>
-        <w:rPr/>
       </w:r>
     </w:p>
     <w:sectPr>
@@ -3249,12 +3127,12 @@
       <w:jc w:val="left"/>
     </w:pPr>
     <w:rPr>
-      <w:rFonts w:cs="Calibri" w:ascii="Calibri" w:hAnsi="Calibri" w:eastAsia="Calibri" w:asciiTheme="minorHAnsi" w:eastAsiaTheme="minorHAnsi" w:hAnsiTheme="minorHAnsi"/>
+      <w:rFonts w:ascii="Calibri" w:hAnsi="Calibri" w:eastAsia="Calibri" w:cs="Calibri" w:asciiTheme="minorHAnsi" w:eastAsiaTheme="minorHAnsi" w:hAnsiTheme="minorHAnsi"/>
       <w:color w:val="auto"/>
       <w:kern w:val="0"/>
       <w:sz w:val="22"/>
       <w:szCs w:val="22"/>
-      <w:lang w:eastAsia="en-US" w:val="en-CA" w:bidi="ar-SA"/>
+      <w:lang w:val="en-CA" w:eastAsia="en-US" w:bidi="ar-SA"/>
     </w:rPr>
   </w:style>
   <w:style w:type="character" w:styleId="DefaultParagraphFont" w:default="1">
@@ -3626,12 +3504,12 @@
       <w:jc w:val="left"/>
     </w:pPr>
     <w:rPr>
-      <w:rFonts w:cs="Calibri" w:ascii="Calibri" w:hAnsi="Calibri" w:eastAsia="Calibri" w:asciiTheme="minorHAnsi" w:eastAsiaTheme="minorHAnsi" w:hAnsiTheme="minorHAnsi"/>
+      <w:rFonts w:ascii="Calibri" w:hAnsi="Calibri" w:eastAsia="Calibri" w:cs="Calibri" w:asciiTheme="minorHAnsi" w:eastAsiaTheme="minorHAnsi" w:hAnsiTheme="minorHAnsi"/>
       <w:color w:val="auto"/>
       <w:kern w:val="0"/>
       <w:sz w:val="22"/>
       <w:szCs w:val="22"/>
-      <w:lang w:eastAsia="en-US" w:val="en-CA" w:bidi="ar-SA"/>
+      <w:lang w:val="en-CA" w:eastAsia="en-US" w:bidi="ar-SA"/>
     </w:rPr>
   </w:style>
   <w:style w:type="paragraph" w:styleId="TableBody" w:customStyle="1">

</xml_diff>

<commit_message>
[Track-252] AS update next milestone logic
</commit_message>
<xml_diff>
--- a/epictrack-api/src/api/reports/report_templates/anticipated_schedule.docx
+++ b/epictrack-api/src/api/reports/report_templates/anticipated_schedule.docx
@@ -1064,192 +1064,84 @@
                 <w:bCs/>
                 <w:sz w:val="18"/>
                 <w:szCs w:val="18"/>
-                <w:lang w:val="en-US"/>
-              </w:rPr>
-              <w:t>{$item_val[i]</w:t>
-            </w:r>
-            <w:r>
+              </w:rPr>
+              <w:t>{$item_val[i].next_pecp_date:showEnd}</w:t>
+            </w:r>
+          </w:p>
+          <w:p>
+            <w:pPr>
+              <w:pStyle w:val="Normal"/>
+              <w:rPr>
+                <w:rFonts w:eastAsia="Calibri" w:cs="Calibri" w:cstheme="minorHAnsi"/>
+                <w:sz w:val="18"/>
+                <w:szCs w:val="18"/>
+                <w:lang w:val="en-US"/>
+              </w:rPr>
+            </w:pPr>
+            <w:r>
+              <w:rPr>
+                <w:rFonts w:eastAsia="Calibri" w:cs="Calibri" w:cstheme="minorHAnsi"/>
+                <w:b/>
+                <w:sz w:val="18"/>
+                <w:szCs w:val="18"/>
+              </w:rPr>
+              <w:t xml:space="preserve">Next Milestone: </w:t>
+            </w:r>
+            <w:r>
+              <w:rPr>
+                <w:rFonts w:eastAsia="Calibri" w:cs="Calibri" w:cstheme="minorHAnsi"/>
+                <w:sz w:val="18"/>
+                <w:szCs w:val="18"/>
+              </w:rPr>
+              <w:t>{$item_val[i].next_</w:t>
+            </w:r>
+            <w:r>
+              <w:rPr>
+                <w:rFonts w:eastAsia="Calibri" w:cs="Calibri" w:cstheme="minorHAnsi"/>
+                <w:color w:val="auto"/>
+                <w:kern w:val="0"/>
+                <w:sz w:val="18"/>
+                <w:szCs w:val="18"/>
+                <w:lang w:val="en-CA" w:eastAsia="en-US" w:bidi="ar-SA"/>
+              </w:rPr>
+              <w:t>event_name</w:t>
+            </w:r>
+            <w:r>
+              <w:rPr>
+                <w:rFonts w:eastAsia="Calibri" w:cs="Calibri" w:cstheme="minorHAnsi"/>
+                <w:sz w:val="18"/>
+                <w:szCs w:val="18"/>
+              </w:rPr>
+              <w:t>}</w:t>
+            </w:r>
+          </w:p>
+          <w:p>
+            <w:pPr>
+              <w:pStyle w:val="Normal"/>
               <w:rPr>
                 <w:rFonts w:eastAsia="Calibri"/>
                 <w:sz w:val="18"/>
                 <w:szCs w:val="18"/>
               </w:rPr>
-              <w:t xml:space="preserve"> .</w:t>
-            </w:r>
-            <w:r>
-              <w:rPr>
-                <w:rFonts w:eastAsia="Calibri" w:cs="Calibri" w:cstheme="minorHAnsi"/>
-                <w:bCs/>
-                <w:sz w:val="18"/>
-                <w:szCs w:val="18"/>
-                <w:lang w:val="en-US"/>
-              </w:rPr>
-              <w:t>next_pecp_title:ifNEM():showBegin}</w:t>
-            </w:r>
-          </w:p>
-          <w:p>
-            <w:pPr>
-              <w:pStyle w:val="Normal"/>
-              <w:rPr>
-                <w:rFonts w:eastAsia="Calibri" w:cs="Calibri" w:cstheme="minorHAnsi"/>
-                <w:sz w:val="18"/>
-                <w:szCs w:val="18"/>
-                <w:lang w:val="en-US"/>
-              </w:rPr>
-            </w:pPr>
-            <w:r>
-              <w:rPr>
-                <w:rFonts w:eastAsia="Calibri" w:cs="Calibri" w:cstheme="minorHAnsi"/>
-                <w:b/>
-                <w:sz w:val="18"/>
-                <w:szCs w:val="18"/>
-              </w:rPr>
-              <w:t xml:space="preserve">Next Milestone: </w:t>
-            </w:r>
-            <w:r>
-              <w:rPr>
-                <w:rFonts w:eastAsia="Calibri" w:cs="Calibri" w:cstheme="minorHAnsi"/>
-                <w:sz w:val="18"/>
-                <w:szCs w:val="18"/>
-              </w:rPr>
-              <w:t>{$item_val[i].next_pecp_title}</w:t>
-            </w:r>
-            <w:r>
-              <w:rPr>
-                <w:rFonts w:eastAsia="Calibri" w:cs="Calibri" w:cstheme="minorHAnsi"/>
-                <w:sz w:val="18"/>
-                <w:szCs w:val="18"/>
-                <w:lang w:val="en-US"/>
-              </w:rPr>
-              <w:t>{$item_val[i].next_pecp_title:showEnd}</w:t>
-            </w:r>
-            <w:r>
-              <w:rPr>
-                <w:rFonts w:eastAsia="Calibri" w:cs="Calibri" w:cstheme="minorHAnsi"/>
-                <w:bCs/>
-                <w:sz w:val="18"/>
-                <w:szCs w:val="18"/>
-              </w:rPr>
-              <w:t>{$item_val[i].next_pecp_date:showEnd}{$item_val[i].next_pecp_date</w:t>
-            </w:r>
-            <w:r>
-              <w:rPr>
-                <w:rFonts w:eastAsia="Calibri" w:cs="Calibri" w:cstheme="minorHAnsi"/>
-                <w:sz w:val="18"/>
-                <w:szCs w:val="18"/>
-                <w:lang w:val="en-US"/>
-              </w:rPr>
-              <w:t>:ifEM():showBegin}</w:t>
-            </w:r>
-            <w:r>
-              <w:rPr>
-                <w:rFonts w:eastAsia="Calibri" w:cs="Calibri" w:cstheme="minorHAnsi"/>
-                <w:bCs/>
-                <w:sz w:val="18"/>
-                <w:szCs w:val="18"/>
-                <w:lang w:val="en-US"/>
-              </w:rPr>
-              <w:t>{$item_val[i]</w:t>
-            </w:r>
-            <w:r>
+            </w:pPr>
+            <w:r>
+              <w:rPr>
+                <w:rFonts w:eastAsia="Calibri" w:cs="Calibri" w:cstheme="minorHAnsi"/>
+                <w:sz w:val="18"/>
+                <w:szCs w:val="18"/>
+              </w:rPr>
+              <w:t>{$item_val[i].additional_info:ifNEM():showBegin}</w:t>
+            </w:r>
+          </w:p>
+          <w:p>
+            <w:pPr>
+              <w:pStyle w:val="Normal"/>
               <w:rPr>
                 <w:rFonts w:eastAsia="Calibri"/>
                 <w:sz w:val="18"/>
                 <w:szCs w:val="18"/>
               </w:rPr>
-              <w:t xml:space="preserve"> .</w:t>
-            </w:r>
-            <w:r>
-              <w:rPr>
-                <w:rFonts w:eastAsia="Calibri" w:cs="Calibri" w:cstheme="minorHAnsi"/>
-                <w:bCs/>
-                <w:sz w:val="18"/>
-                <w:szCs w:val="18"/>
-                <w:lang w:val="en-US"/>
-              </w:rPr>
-              <w:t>next_pecp_title:ifNEM():showBegin}</w:t>
-            </w:r>
-            <w:r>
-              <w:rPr>
-                <w:rFonts w:eastAsia="Calibri" w:cs="Calibri" w:cstheme="minorHAnsi"/>
-                <w:b/>
-                <w:sz w:val="18"/>
-                <w:szCs w:val="18"/>
-              </w:rPr>
-              <w:t xml:space="preserve">Next Milestone: </w:t>
-            </w:r>
-            <w:r>
-              <w:rPr>
-                <w:rFonts w:eastAsia="Calibri" w:cs="Calibri" w:cstheme="minorHAnsi"/>
-                <w:sz w:val="18"/>
-                <w:szCs w:val="18"/>
-              </w:rPr>
-              <w:t>{$item_val[i].next_pecp_title}</w:t>
-            </w:r>
-            <w:r>
-              <w:rPr>
-                <w:rFonts w:eastAsia="Calibri" w:cs="Calibri" w:cstheme="minorHAnsi"/>
-                <w:sz w:val="18"/>
-                <w:szCs w:val="18"/>
-                <w:lang w:val="en-US"/>
-              </w:rPr>
-              <w:t>{$item_val[i].next_pecp_title:showEnd}</w:t>
-            </w:r>
-            <w:r>
-              <w:rPr>
-                <w:rFonts w:eastAsia="Calibri" w:cs="Calibri" w:cstheme="minorHAnsi"/>
-                <w:bCs/>
-                <w:sz w:val="18"/>
-                <w:szCs w:val="18"/>
-              </w:rPr>
-              <w:t>{$item_val[i].next_pecp_date</w:t>
-            </w:r>
-            <w:r>
-              <w:rPr>
-                <w:rFonts w:eastAsia="Calibri" w:cs="Calibri" w:cstheme="minorHAnsi"/>
-                <w:sz w:val="18"/>
-                <w:szCs w:val="18"/>
-                <w:lang w:val="en-US"/>
-              </w:rPr>
-              <w:t>:ifNEM():showEnd}</w:t>
-            </w:r>
-          </w:p>
-          <w:p>
-            <w:pPr>
-              <w:pStyle w:val="Normal"/>
-              <w:rPr>
-                <w:rFonts w:eastAsia="Calibri" w:cs="Calibri" w:cstheme="minorHAnsi"/>
-                <w:sz w:val="18"/>
-                <w:szCs w:val="18"/>
-                <w:lang w:val="en-US"/>
-              </w:rPr>
-            </w:pPr>
-            <w:r>
-              <w:rPr>
-                <w:rFonts w:eastAsia="Calibri" w:cs="Calibri" w:cstheme="minorHAnsi"/>
-                <w:sz w:val="18"/>
-                <w:szCs w:val="18"/>
-                <w:lang w:val="en-US"/>
-              </w:rPr>
-            </w:r>
-          </w:p>
-          <w:p>
-            <w:pPr>
-              <w:pStyle w:val="Normal"/>
-              <w:rPr>
-                <w:rFonts w:eastAsia="Calibri"/>
-                <w:sz w:val="18"/>
-                <w:szCs w:val="18"/>
-              </w:rPr>
-            </w:pPr>
-            <w:r>
-              <w:rPr>
-                <w:rFonts w:eastAsia="Calibri" w:cs="Calibri" w:cstheme="minorHAnsi"/>
-                <w:sz w:val="18"/>
-                <w:szCs w:val="18"/>
-              </w:rPr>
-              <w:t>{$item_val[i].additional_info:ifNEM():showBegin}</w:t>
-            </w:r>
+            </w:pPr>
             <w:r>
               <w:rPr>
                 <w:rFonts w:eastAsia="Calibri" w:cs="Calibri" w:cstheme="minorHAnsi"/>
@@ -2375,10 +2267,15 @@
         </w:rPr>
       </w:pPr>
       <w:r>
-        <w:br w:type="page"/>
+        <w:rPr>
+          <w:b/>
+          <w:bCs/>
+          <w:sz w:val="28"/>
+          <w:szCs w:val="28"/>
+        </w:rPr>
       </w:r>
       <w:r>
-        <w:rPr/>
+        <w:br w:type="page"/>
       </w:r>
     </w:p>
     <w:p>

</xml_diff>

<commit_message>
[Track-344] AS combine amendment sections
</commit_message>
<xml_diff>
--- a/epictrack-api/src/api/reports/report_templates/anticipated_schedule.docx
+++ b/epictrack-api/src/api/reports/report_templates/anticipated_schedule.docx
@@ -896,27 +896,7 @@
                 <w:szCs w:val="18"/>
                 <w:lang w:val="en-US"/>
               </w:rPr>
-              <w:t>: {$item_val[i].project_description}</w:t>
-            </w:r>
-          </w:p>
-          <w:p>
-            <w:pPr>
-              <w:pStyle w:val="Normal"/>
-              <w:rPr>
-                <w:rFonts w:cs="Calibri" w:cstheme="minorHAnsi"/>
-                <w:sz w:val="18"/>
-                <w:szCs w:val="18"/>
-                <w:lang w:val="en-US"/>
-              </w:rPr>
-            </w:pPr>
-            <w:r>
-              <w:rPr>
-                <w:rFonts w:eastAsia="Calibri" w:cs="Calibri" w:cstheme="minorHAnsi"/>
-                <w:sz w:val="18"/>
-                <w:szCs w:val="18"/>
-                <w:lang w:val="en-US"/>
-              </w:rPr>
-              <w:t>{$item_val[i].project_description:showEnd}</w:t>
+              <w:t>: {$item_val[i].project_description}{$item_val[i].project_description:showEnd}</w:t>
             </w:r>
           </w:p>
         </w:tc>

</xml_diff>

<commit_message>
[Track-359] AS Remove responsible ministry
</commit_message>
<xml_diff>
--- a/epictrack-api/src/api/reports/report_templates/anticipated_schedule.docx
+++ b/epictrack-api/src/api/reports/report_templates/anticipated_schedule.docx
@@ -632,109 +632,13 @@
               <w:spacing w:lineRule="atLeast" w:line="201"/>
               <w:rPr>
                 <w:rFonts w:cs="Calibri" w:cstheme="minorHAnsi"/>
-                <w:bCs/>
-                <w:sz w:val="18"/>
-                <w:szCs w:val="18"/>
-                <w:lang w:val="en-US"/>
-              </w:rPr>
-            </w:pPr>
-            <w:r>
-              <w:rPr>
-                <w:rFonts w:eastAsia="Calibri" w:cs="Calibri" w:cstheme="minorHAnsi"/>
-                <w:bCs/>
-                <w:sz w:val="18"/>
-                <w:szCs w:val="18"/>
-                <w:lang w:val="en-US"/>
-              </w:rPr>
-              <w:t>{$item_val[i].ministry:ifNEM():showBegin}{$item_val[i].responsible_minister:ifNEM():showBegin}</w:t>
-            </w:r>
-            <w:r>
-              <w:rPr>
-                <w:rFonts w:eastAsia="Calibri" w:cs="Calibri" w:cstheme="minorHAnsi"/>
-                <w:b/>
-                <w:bCs/>
-                <w:sz w:val="18"/>
-                <w:szCs w:val="18"/>
-                <w:lang w:val="en-US"/>
-              </w:rPr>
-              <w:t>Responsible Minister:</w:t>
-            </w:r>
-            <w:r>
-              <w:rPr>
-                <w:rFonts w:eastAsia="Calibri" w:cs="Calibri" w:cstheme="minorHAnsi"/>
-                <w:bCs/>
-                <w:sz w:val="18"/>
-                <w:szCs w:val="18"/>
-                <w:lang w:val="en-US"/>
-              </w:rPr>
-              <w:t xml:space="preserve"> {$item_val[i].responsible_minister} {$item_val[i].responsible_minister:ifNEM():showEnd}</w:t>
-            </w:r>
-          </w:p>
-          <w:p>
-            <w:pPr>
-              <w:pStyle w:val="Normal"/>
-              <w:spacing w:lineRule="atLeast" w:line="201"/>
-              <w:rPr>
-                <w:rFonts w:cs="Calibri" w:cstheme="minorHAnsi"/>
-                <w:bCs/>
-                <w:sz w:val="18"/>
-                <w:szCs w:val="18"/>
-                <w:lang w:val="en-US"/>
-              </w:rPr>
-            </w:pPr>
-            <w:r>
-              <w:rPr>
-                <w:rFonts w:eastAsia="Calibri" w:cs="Calibri" w:cstheme="minorHAnsi"/>
-                <w:bCs/>
-                <w:sz w:val="18"/>
-                <w:szCs w:val="18"/>
-                <w:lang w:val="en-US"/>
-              </w:rPr>
-              <w:t>{$item_val[i].responsible_minister:ifEmpty():showBegin}</w:t>
-            </w:r>
-            <w:r>
-              <w:rPr>
-                <w:rFonts w:eastAsia="Calibri" w:cs="Calibri" w:cstheme="minorHAnsi"/>
-                <w:b/>
-                <w:bCs/>
-                <w:sz w:val="18"/>
-                <w:szCs w:val="18"/>
-                <w:lang w:val="en-US"/>
-              </w:rPr>
-              <w:t>Responsible Ministry:</w:t>
-            </w:r>
-            <w:r>
-              <w:rPr>
-                <w:rFonts w:eastAsia="Calibri" w:cs="Calibri" w:cstheme="minorHAnsi"/>
-                <w:bCs/>
-                <w:sz w:val="18"/>
-                <w:szCs w:val="18"/>
-                <w:lang w:val="en-US"/>
-              </w:rPr>
-              <w:t xml:space="preserve"> {$item_val[i].ministry}</w:t>
-            </w:r>
-          </w:p>
-          <w:p>
-            <w:pPr>
-              <w:pStyle w:val="Normal"/>
-              <w:spacing w:lineRule="atLeast" w:line="201"/>
-              <w:rPr>
-                <w:rFonts w:cs="Calibri" w:cstheme="minorHAnsi"/>
-                <w:bCs/>
-                <w:sz w:val="18"/>
-                <w:szCs w:val="18"/>
-                <w:lang w:val="en-US"/>
-              </w:rPr>
-            </w:pPr>
-            <w:r>
-              <w:rPr>
-                <w:rFonts w:eastAsia="Calibri" w:cs="Calibri" w:cstheme="minorHAnsi"/>
-                <w:bCs/>
-                <w:sz w:val="18"/>
-                <w:szCs w:val="18"/>
-                <w:lang w:val="en-US"/>
-              </w:rPr>
-              <w:t>{$item_val[i].responsible_minister:ifEmpty():showEnd}{$item_val[i].ministry:ifNEM():showEnd}</w:t>
+                <w:sz w:val="18"/>
+                <w:szCs w:val="18"/>
+                <w:lang w:val="en-US"/>
+              </w:rPr>
+            </w:pPr>
+            <w:r>
+              <w:rPr/>
             </w:r>
           </w:p>
           <w:p>
@@ -1607,62 +1511,6 @@
                 <w:lang w:val="en-US"/>
               </w:rPr>
               <w:t>{$item_val[i+1].ea_act:showEnd}</w:t>
-            </w:r>
-            <w:r>
-              <w:rPr>
-                <w:rFonts w:eastAsia="Calibri" w:cs="Calibri" w:cstheme="minorHAnsi"/>
-                <w:sz w:val="18"/>
-                <w:szCs w:val="18"/>
-              </w:rPr>
-              <w:t>{$item_val[i+1].ministry_name:ifNEM():showBegin}</w:t>
-            </w:r>
-          </w:p>
-          <w:p>
-            <w:pPr>
-              <w:pStyle w:val="Normal"/>
-              <w:spacing w:lineRule="atLeast" w:line="201"/>
-              <w:rPr>
-                <w:rFonts w:cs="Calibri" w:cstheme="minorHAnsi"/>
-                <w:bCs/>
-                <w:sz w:val="18"/>
-                <w:szCs w:val="18"/>
-                <w:lang w:val="en-US"/>
-              </w:rPr>
-            </w:pPr>
-            <w:r>
-              <w:rPr>
-                <w:rFonts w:eastAsia="Calibri" w:cs="Calibri" w:cstheme="minorHAnsi"/>
-                <w:b/>
-                <w:sz w:val="18"/>
-                <w:szCs w:val="18"/>
-              </w:rPr>
-              <w:t xml:space="preserve">Responsible Minister: </w:t>
-            </w:r>
-            <w:r>
-              <w:rPr>
-                <w:rFonts w:eastAsia="Calibri" w:cs="Calibri" w:cstheme="minorHAnsi"/>
-                <w:sz w:val="18"/>
-                <w:szCs w:val="18"/>
-              </w:rPr>
-              <w:t>{$item_val[i+1].ministry_name}</w:t>
-            </w:r>
-          </w:p>
-          <w:p>
-            <w:pPr>
-              <w:pStyle w:val="Normal"/>
-              <w:rPr>
-                <w:rFonts w:cs="Calibri" w:cstheme="minorHAnsi"/>
-                <w:sz w:val="18"/>
-                <w:szCs w:val="18"/>
-              </w:rPr>
-            </w:pPr>
-            <w:r>
-              <w:rPr>
-                <w:rFonts w:eastAsia="Calibri" w:cs="Calibri" w:cstheme="minorHAnsi"/>
-                <w:sz w:val="18"/>
-                <w:szCs w:val="18"/>
-              </w:rPr>
-              <w:t>{$item_val[i+1].ministry_name:showEnd}</w:t>
             </w:r>
           </w:p>
           <w:p>
@@ -2344,7 +2192,7 @@
         <w:szCs w:val="16"/>
         <w:bCs/>
       </w:rPr>
-      <w:t>4</w:t>
+      <w:t>3</w:t>
     </w:r>
     <w:r>
       <w:rPr>
@@ -2396,7 +2244,7 @@
         <w:szCs w:val="16"/>
         <w:bCs/>
       </w:rPr>
-      <w:t>4</w:t>
+      <w:t>3</w:t>
     </w:r>
     <w:r>
       <w:rPr>
@@ -2515,7 +2363,7 @@
         <w:szCs w:val="16"/>
         <w:bCs/>
       </w:rPr>
-      <w:t>4</w:t>
+      <w:t>3</w:t>
     </w:r>
     <w:r>
       <w:rPr>

</xml_diff>

<commit_message>
TRACK-308: Added 2nd minister to AS report
</commit_message>
<xml_diff>
--- a/epictrack-api/src/api/reports/report_templates/anticipated_schedule.docx
+++ b/epictrack-api/src/api/reports/report_templates/anticipated_schedule.docx
@@ -1,6 +1,6 @@
 
 <file path=word/document.xml><?xml version="1.0" encoding="utf-8"?>
-<w:document xmlns:o="urn:schemas-microsoft-com:office:office" xmlns:r="http://schemas.openxmlformats.org/officeDocument/2006/relationships" xmlns:v="urn:schemas-microsoft-com:vml" xmlns:w="http://schemas.openxmlformats.org/wordprocessingml/2006/main" xmlns:w10="urn:schemas-microsoft-com:office:word" xmlns:wp="http://schemas.openxmlformats.org/drawingml/2006/wordprocessingDrawing" xmlns:wps="http://schemas.microsoft.com/office/word/2010/wordprocessingShape" xmlns:wpg="http://schemas.microsoft.com/office/word/2010/wordprocessingGroup" xmlns:mc="http://schemas.openxmlformats.org/markup-compatibility/2006" xmlns:wp14="http://schemas.microsoft.com/office/word/2010/wordprocessingDrawing" xmlns:w14="http://schemas.microsoft.com/office/word/2010/wordml" mc:Ignorable="w14 wp14">
+<w:document xmlns:o="urn:schemas-microsoft-com:office:office" xmlns:r="http://schemas.openxmlformats.org/officeDocument/2006/relationships" xmlns:v="urn:schemas-microsoft-com:vml" xmlns:w="http://schemas.openxmlformats.org/wordprocessingml/2006/main" xmlns:w10="urn:schemas-microsoft-com:office:word" xmlns:wp="http://schemas.openxmlformats.org/drawingml/2006/wordprocessingDrawing" xmlns:wps="http://schemas.microsoft.com/office/word/2010/wordprocessingShape" xmlns:wpg="http://schemas.microsoft.com/office/word/2010/wordprocessingGroup" xmlns:mc="http://schemas.openxmlformats.org/markup-compatibility/2006" xmlns:wp14="http://schemas.microsoft.com/office/word/2010/wordprocessingDrawing" xmlns:w14="http://schemas.microsoft.com/office/word/2010/wordml" xmlns:w15="http://schemas.microsoft.com/office/word/2012/wordml" mc:Ignorable="w14 wp14 w15">
   <w:body>
     <w:p>
       <w:pPr>
@@ -167,6 +167,7 @@
         <w:tblW w:w="14417" w:type="dxa"/>
         <w:jc w:val="left"/>
         <w:tblInd w:w="-289" w:type="dxa"/>
+        <w:tblLayout w:type="fixed"/>
         <w:tblCellMar>
           <w:top w:w="0" w:type="dxa"/>
           <w:left w:w="108" w:type="dxa"/>
@@ -195,6 +196,7 @@
           <w:p>
             <w:pPr>
               <w:pStyle w:val="Normal"/>
+              <w:widowControl w:val="false"/>
               <w:ind w:right="360" w:hanging="0"/>
               <w:jc w:val="center"/>
               <w:rPr>
@@ -225,6 +227,7 @@
           <w:p>
             <w:pPr>
               <w:pStyle w:val="Normal"/>
+              <w:widowControl w:val="false"/>
               <w:jc w:val="center"/>
               <w:rPr>
                 <w:rFonts w:cs="Calibri" w:cstheme="minorHAnsi"/>
@@ -255,6 +258,7 @@
           <w:p>
             <w:pPr>
               <w:pStyle w:val="Normal"/>
+              <w:widowControl w:val="false"/>
               <w:jc w:val="center"/>
               <w:rPr>
                 <w:rFonts w:cs="Calibri" w:cstheme="minorHAnsi"/>
@@ -285,6 +289,7 @@
           <w:p>
             <w:pPr>
               <w:pStyle w:val="Normal"/>
+              <w:widowControl w:val="false"/>
               <w:jc w:val="center"/>
               <w:rPr>
                 <w:rFonts w:cs="Calibri" w:cstheme="minorHAnsi"/>
@@ -319,6 +324,7 @@
           <w:p>
             <w:pPr>
               <w:pStyle w:val="Normal"/>
+              <w:widowControl w:val="false"/>
               <w:tabs>
                 <w:tab w:val="clear" w:pos="720"/>
                 <w:tab w:val="left" w:pos="453" w:leader="none"/>
@@ -348,6 +354,7 @@
           <w:p>
             <w:pPr>
               <w:pStyle w:val="Normal"/>
+              <w:widowControl w:val="false"/>
               <w:rPr>
                 <w:rFonts w:cs="Calibri" w:cstheme="minorHAnsi"/>
                 <w:sz w:val="18"/>
@@ -402,23 +409,25 @@
           <w:p>
             <w:pPr>
               <w:pStyle w:val="Normal"/>
-              <w:rPr>
-                <w:rFonts w:cs="Calibri" w:cstheme="minorHAnsi"/>
-                <w:sz w:val="18"/>
-                <w:szCs w:val="18"/>
-              </w:rPr>
-            </w:pPr>
-            <w:r>
-              <w:rPr>
-                <w:rFonts w:cs="Calibri" w:cstheme="minorHAnsi"/>
-                <w:sz w:val="18"/>
-                <w:szCs w:val="18"/>
-              </w:rPr>
-            </w:r>
-          </w:p>
-          <w:p>
-            <w:pPr>
-              <w:pStyle w:val="Normal"/>
+              <w:widowControl w:val="false"/>
+              <w:rPr>
+                <w:rFonts w:cs="Calibri" w:cstheme="minorHAnsi"/>
+                <w:sz w:val="18"/>
+                <w:szCs w:val="18"/>
+              </w:rPr>
+            </w:pPr>
+            <w:r>
+              <w:rPr>
+                <w:rFonts w:cs="Calibri" w:cstheme="minorHAnsi"/>
+                <w:sz w:val="18"/>
+                <w:szCs w:val="18"/>
+              </w:rPr>
+            </w:r>
+          </w:p>
+          <w:p>
+            <w:pPr>
+              <w:pStyle w:val="Normal"/>
+              <w:widowControl w:val="false"/>
               <w:rPr>
                 <w:rFonts w:ascii="Calibri" w:hAnsi="Calibri" w:eastAsia="Calibri"/>
               </w:rPr>
@@ -456,6 +465,7 @@
           <w:p>
             <w:pPr>
               <w:pStyle w:val="Normal"/>
+              <w:widowControl w:val="false"/>
               <w:rPr>
                 <w:rFonts w:cs="Calibri" w:cstheme="minorHAnsi"/>
                 <w:sz w:val="18"/>
@@ -476,6 +486,7 @@
           <w:p>
             <w:pPr>
               <w:pStyle w:val="Normal"/>
+              <w:widowControl w:val="false"/>
               <w:rPr>
                 <w:rFonts w:cs="Calibri" w:cstheme="minorHAnsi"/>
                 <w:sz w:val="18"/>
@@ -516,6 +527,7 @@
           <w:p>
             <w:pPr>
               <w:pStyle w:val="Normal"/>
+              <w:widowControl w:val="false"/>
               <w:rPr>
                 <w:rFonts w:cs="Calibri" w:cstheme="minorHAnsi"/>
                 <w:sz w:val="18"/>
@@ -536,6 +548,7 @@
           <w:p>
             <w:pPr>
               <w:pStyle w:val="Normal"/>
+              <w:widowControl w:val="false"/>
               <w:rPr>
                 <w:rFonts w:cs="Calibri" w:cstheme="minorHAnsi"/>
                 <w:sz w:val="18"/>
@@ -576,6 +589,7 @@
           <w:p>
             <w:pPr>
               <w:pStyle w:val="Normal"/>
+              <w:widowControl w:val="false"/>
               <w:rPr>
                 <w:rFonts w:cs="Calibri" w:cstheme="minorHAnsi"/>
                 <w:sz w:val="18"/>
@@ -596,6 +610,7 @@
           <w:p>
             <w:pPr>
               <w:pStyle w:val="Normal"/>
+              <w:widowControl w:val="false"/>
               <w:spacing w:lineRule="atLeast" w:line="201"/>
               <w:rPr>
                 <w:rFonts w:cs="Calibri" w:cstheme="minorHAnsi"/>
@@ -629,6 +644,7 @@
           <w:p>
             <w:pPr>
               <w:pStyle w:val="Normal"/>
+              <w:widowControl w:val="false"/>
               <w:spacing w:lineRule="atLeast" w:line="201"/>
               <w:rPr>
                 <w:rFonts w:cs="Calibri" w:cstheme="minorHAnsi"/>
@@ -638,12 +654,18 @@
               </w:rPr>
             </w:pPr>
             <w:r>
-              <w:rPr/>
-            </w:r>
-          </w:p>
-          <w:p>
-            <w:pPr>
-              <w:pStyle w:val="Normal"/>
+              <w:rPr>
+                <w:rFonts w:cs="Calibri" w:cstheme="minorHAnsi"/>
+                <w:sz w:val="18"/>
+                <w:szCs w:val="18"/>
+                <w:lang w:val="en-US"/>
+              </w:rPr>
+            </w:r>
+          </w:p>
+          <w:p>
+            <w:pPr>
+              <w:pStyle w:val="Normal"/>
+              <w:widowControl w:val="false"/>
               <w:spacing w:lineRule="atLeast" w:line="201"/>
               <w:rPr>
                 <w:rFonts w:cs="Calibri" w:cstheme="minorHAnsi"/>
@@ -671,14 +693,37 @@
                 <w:szCs w:val="18"/>
                 <w:lang w:val="en-US"/>
               </w:rPr>
-              <w:t>{$item_val[i].milestone_type:ifEQ(4):showBegin}Minister {$item_val[i].eac_decision_by}{$item_val[i].milestone_type:showEnd}</w:t>
-              <w:br/>
-              <w:t>{$item_val[i].milestone_type:ifNE(4):showBegin}{$item_val[i].decision_by}{$item_val[i].milestone_type:showEnd}</w:t>
-            </w:r>
-          </w:p>
-          <w:p>
-            <w:pPr>
-              <w:pStyle w:val="Normal"/>
+              <w:t>{$item_val[i].decision_by}</w:t>
+            </w:r>
+          </w:p>
+          <w:p>
+            <w:pPr>
+              <w:pStyle w:val="Normal"/>
+              <w:widowControl w:val="false"/>
+              <w:spacing w:lineRule="atLeast" w:line="201"/>
+              <w:rPr>
+                <w:rFonts w:cs="Calibri" w:cstheme="minorHAnsi"/>
+                <w:bCs/>
+                <w:sz w:val="18"/>
+                <w:szCs w:val="18"/>
+                <w:lang w:val="en-US"/>
+              </w:rPr>
+            </w:pPr>
+            <w:r>
+              <w:rPr>
+                <w:rFonts w:eastAsia="Calibri" w:cs="Calibri" w:cstheme="minorHAnsi"/>
+                <w:bCs/>
+                <w:sz w:val="18"/>
+                <w:szCs w:val="18"/>
+                <w:lang w:val="en-US"/>
+              </w:rPr>
+              <w:t>{$item_val[i].minister}</w:t>
+            </w:r>
+          </w:p>
+          <w:p>
+            <w:pPr>
+              <w:pStyle w:val="Normal"/>
+              <w:widowControl w:val="false"/>
               <w:spacing w:lineRule="atLeast" w:line="201"/>
               <w:rPr>
                 <w:rFonts w:cs="Calibri" w:cstheme="minorHAnsi"/>
@@ -708,6 +753,7 @@
           <w:p>
             <w:pPr>
               <w:pStyle w:val="Normal"/>
+              <w:widowControl w:val="false"/>
               <w:rPr>
                 <w:rFonts w:cs="Calibri" w:cstheme="minorHAnsi"/>
                 <w:sz w:val="18"/>
@@ -748,25 +794,27 @@
           <w:p>
             <w:pPr>
               <w:pStyle w:val="Normal"/>
-              <w:rPr>
-                <w:rFonts w:cs="Calibri" w:cstheme="minorHAnsi"/>
-                <w:sz w:val="18"/>
-                <w:szCs w:val="18"/>
-                <w:lang w:val="en-US"/>
-              </w:rPr>
-            </w:pPr>
-            <w:r>
-              <w:rPr>
-                <w:rFonts w:cs="Calibri" w:cstheme="minorHAnsi"/>
-                <w:sz w:val="18"/>
-                <w:szCs w:val="18"/>
-                <w:lang w:val="en-US"/>
-              </w:rPr>
-            </w:r>
-          </w:p>
-          <w:p>
-            <w:pPr>
-              <w:pStyle w:val="Normal"/>
+              <w:widowControl w:val="false"/>
+              <w:rPr>
+                <w:rFonts w:cs="Calibri" w:cstheme="minorHAnsi"/>
+                <w:sz w:val="18"/>
+                <w:szCs w:val="18"/>
+                <w:lang w:val="en-US"/>
+              </w:rPr>
+            </w:pPr>
+            <w:r>
+              <w:rPr>
+                <w:rFonts w:cs="Calibri" w:cstheme="minorHAnsi"/>
+                <w:sz w:val="18"/>
+                <w:szCs w:val="18"/>
+                <w:lang w:val="en-US"/>
+              </w:rPr>
+            </w:r>
+          </w:p>
+          <w:p>
+            <w:pPr>
+              <w:pStyle w:val="Normal"/>
+              <w:widowControl w:val="false"/>
               <w:rPr>
                 <w:rFonts w:cs="Calibri" w:cstheme="minorHAnsi"/>
                 <w:sz w:val="18"/>
@@ -813,6 +861,7 @@
           <w:p>
             <w:pPr>
               <w:pStyle w:val="Normal"/>
+              <w:widowControl w:val="false"/>
               <w:rPr>
                 <w:rFonts w:eastAsia="Calibri" w:cs="Calibri" w:cstheme="minorHAnsi"/>
                 <w:sz w:val="18"/>
@@ -849,6 +898,7 @@
           <w:p>
             <w:pPr>
               <w:pStyle w:val="Normal"/>
+              <w:widowControl w:val="false"/>
               <w:rPr>
                 <w:rFonts w:eastAsia="Calibri" w:cs="Calibri" w:cstheme="minorHAnsi"/>
                 <w:bCs/>
@@ -887,6 +937,7 @@
           <w:p>
             <w:pPr>
               <w:pStyle w:val="Normal"/>
+              <w:widowControl w:val="false"/>
               <w:rPr>
                 <w:rFonts w:eastAsia="Calibri" w:cs="Calibri" w:cstheme="minorHAnsi"/>
                 <w:bCs/>
@@ -935,6 +986,7 @@
           <w:p>
             <w:pPr>
               <w:pStyle w:val="Normal"/>
+              <w:widowControl w:val="false"/>
               <w:rPr>
                 <w:rFonts w:eastAsia="Calibri" w:cs="Calibri" w:cstheme="minorHAnsi"/>
                 <w:sz w:val="18"/>
@@ -955,6 +1007,7 @@
           <w:p>
             <w:pPr>
               <w:pStyle w:val="Normal"/>
+              <w:widowControl w:val="false"/>
               <w:rPr>
                 <w:rFonts w:eastAsia="Calibri" w:cs="Calibri" w:cstheme="minorHAnsi"/>
                 <w:sz w:val="18"/>
@@ -1002,6 +1055,7 @@
           <w:p>
             <w:pPr>
               <w:pStyle w:val="Normal"/>
+              <w:widowControl w:val="false"/>
               <w:rPr>
                 <w:rFonts w:eastAsia="Calibri"/>
                 <w:sz w:val="18"/>
@@ -1020,6 +1074,7 @@
           <w:p>
             <w:pPr>
               <w:pStyle w:val="Normal"/>
+              <w:widowControl w:val="false"/>
               <w:rPr>
                 <w:rFonts w:eastAsia="Calibri"/>
                 <w:sz w:val="18"/>
@@ -1047,6 +1102,7 @@
           <w:p>
             <w:pPr>
               <w:pStyle w:val="Normal"/>
+              <w:widowControl w:val="false"/>
               <w:rPr>
                 <w:rFonts w:eastAsia="Calibri" w:cs="Calibri" w:cstheme="minorHAnsi"/>
                 <w:sz w:val="18"/>
@@ -1065,6 +1121,7 @@
           <w:p>
             <w:pPr>
               <w:pStyle w:val="Normal"/>
+              <w:widowControl w:val="false"/>
               <w:rPr>
                 <w:rFonts w:eastAsia="Calibri" w:cs="Calibri" w:cstheme="minorHAnsi"/>
                 <w:sz w:val="18"/>
@@ -1093,7 +1150,7 @@
       </w:tr>
       <w:tr>
         <w:trPr>
-          <w:trHeight w:val="2707" w:hRule="atLeast"/>
+          <w:trHeight w:val="4320" w:hRule="atLeast"/>
         </w:trPr>
         <w:tc>
           <w:tcPr>
@@ -1104,13 +1161,8 @@
           <w:p>
             <w:pPr>
               <w:pStyle w:val="Normal"/>
-              <w:rPr>
-                <w:rFonts w:cs="Calibri" w:cstheme="minorHAnsi"/>
-                <w:b/>
-                <w:b/>
-                <w:sz w:val="20"/>
-                <w:szCs w:val="20"/>
-              </w:rPr>
+              <w:widowControl w:val="false"/>
+              <w:rPr/>
             </w:pPr>
             <w:r>
               <w:rPr>
@@ -1132,48 +1184,45 @@
           <w:p>
             <w:pPr>
               <w:pStyle w:val="Normal"/>
-              <w:rPr>
-                <w:rFonts w:cs="Calibri" w:cstheme="minorHAnsi"/>
+              <w:widowControl w:val="false"/>
+              <w:rPr/>
+            </w:pPr>
+            <w:r>
+              <w:rPr>
+                <w:rFonts w:eastAsia="Calibri" w:cs="Calibri" w:cstheme="minorHAnsi"/>
+                <w:sz w:val="18"/>
+                <w:szCs w:val="18"/>
+              </w:rPr>
+              <w:t>{$item_val[i+1].project_name:ifNEM():showBegin}</w:t>
+            </w:r>
+            <w:r>
+              <w:rPr>
+                <w:rFonts w:eastAsia="Calibri" w:cs="Calibri" w:cstheme="minorHAnsi"/>
+                <w:b/>
+                <w:bCs/>
                 <w:sz w:val="24"/>
                 <w:szCs w:val="24"/>
               </w:rPr>
-            </w:pPr>
-            <w:r>
-              <w:rPr>
-                <w:rFonts w:eastAsia="Calibri" w:cs="Calibri" w:cstheme="minorHAnsi"/>
-                <w:sz w:val="18"/>
-                <w:szCs w:val="18"/>
-              </w:rPr>
-              <w:t>{$item_val[i+1].project_name:ifNEM():showBegin}</w:t>
-            </w:r>
-            <w:r>
-              <w:rPr>
-                <w:rFonts w:eastAsia="Calibri" w:cs="Calibri" w:cstheme="minorHAnsi"/>
+              <w:t>{$item_val[i+1].</w:t>
+            </w:r>
+            <w:r>
+              <w:rPr>
+                <w:rFonts w:eastAsia="Calibri"/>
                 <w:b/>
                 <w:bCs/>
                 <w:sz w:val="24"/>
                 <w:szCs w:val="24"/>
               </w:rPr>
-              <w:t>{$item_val[i+1].</w:t>
-            </w:r>
-            <w:r>
-              <w:rPr>
-                <w:rFonts w:eastAsia="Calibri"/>
+              <w:t>p</w:t>
+            </w:r>
+            <w:r>
+              <w:rPr>
+                <w:rFonts w:eastAsia="Calibri" w:cs="Calibri" w:cstheme="minorHAnsi"/>
                 <w:b/>
                 <w:bCs/>
                 <w:sz w:val="24"/>
                 <w:szCs w:val="24"/>
               </w:rPr>
-              <w:t>p</w:t>
-            </w:r>
-            <w:r>
-              <w:rPr>
-                <w:rFonts w:eastAsia="Calibri" w:cs="Calibri" w:cstheme="minorHAnsi"/>
-                <w:b/>
-                <w:bCs/>
-                <w:sz w:val="24"/>
-                <w:szCs w:val="24"/>
-              </w:rPr>
               <w:t>roject_name}</w:t>
             </w:r>
             <w:r>
@@ -1188,14 +1237,8 @@
           <w:p>
             <w:pPr>
               <w:pStyle w:val="Normal"/>
-              <w:rPr>
-                <w:rFonts w:cs="Calibri" w:cstheme="minorHAnsi"/>
-                <w:b/>
-                <w:b/>
-                <w:bCs/>
-                <w:sz w:val="18"/>
-                <w:szCs w:val="18"/>
-              </w:rPr>
+              <w:widowControl w:val="false"/>
+              <w:rPr/>
             </w:pPr>
             <w:r>
               <w:rPr>
@@ -1210,12 +1253,8 @@
           <w:p>
             <w:pPr>
               <w:pStyle w:val="Normal"/>
-              <w:rPr>
-                <w:rFonts w:cs="Calibri" w:cstheme="minorHAnsi"/>
-                <w:sz w:val="18"/>
-                <w:szCs w:val="18"/>
-                <w:lang w:val="en-US"/>
-              </w:rPr>
+              <w:widowControl w:val="false"/>
+              <w:rPr/>
             </w:pPr>
             <w:r>
               <w:rPr>
@@ -1241,12 +1280,8 @@
           <w:p>
             <w:pPr>
               <w:pStyle w:val="Normal"/>
-              <w:rPr>
-                <w:rFonts w:cs="Calibri" w:cstheme="minorHAnsi"/>
-                <w:sz w:val="18"/>
-                <w:szCs w:val="18"/>
-                <w:lang w:val="en-US"/>
-              </w:rPr>
+              <w:widowControl w:val="false"/>
+              <w:rPr/>
             </w:pPr>
             <w:r>
               <w:rPr>
@@ -1261,15 +1296,8 @@
           <w:p>
             <w:pPr>
               <w:pStyle w:val="Normal"/>
-              <w:rPr>
-                <w:rFonts w:cs="Calibri" w:cstheme="minorHAnsi"/>
-                <w:b/>
-                <w:b/>
-                <w:bCs/>
-                <w:sz w:val="18"/>
-                <w:szCs w:val="18"/>
-                <w:lang w:val="en-US"/>
-              </w:rPr>
+              <w:widowControl w:val="false"/>
+              <w:rPr/>
             </w:pPr>
             <w:r>
               <w:rPr>
@@ -1284,12 +1312,8 @@
           <w:p>
             <w:pPr>
               <w:pStyle w:val="Normal"/>
-              <w:rPr>
-                <w:rFonts w:cs="Calibri" w:cstheme="minorHAnsi"/>
-                <w:sz w:val="18"/>
-                <w:szCs w:val="18"/>
-                <w:lang w:val="en-US"/>
-              </w:rPr>
+              <w:widowControl w:val="false"/>
+              <w:rPr/>
             </w:pPr>
             <w:r>
               <w:rPr>
@@ -1315,12 +1339,8 @@
           <w:p>
             <w:pPr>
               <w:pStyle w:val="Normal"/>
-              <w:rPr>
-                <w:rFonts w:cs="Calibri" w:cstheme="minorHAnsi"/>
-                <w:sz w:val="18"/>
-                <w:szCs w:val="18"/>
-                <w:lang w:val="en-US"/>
-              </w:rPr>
+              <w:widowControl w:val="false"/>
+              <w:rPr/>
             </w:pPr>
             <w:r>
               <w:rPr>
@@ -1335,12 +1355,8 @@
           <w:p>
             <w:pPr>
               <w:pStyle w:val="Normal"/>
-              <w:rPr>
-                <w:rFonts w:cs="Calibri" w:cstheme="minorHAnsi"/>
-                <w:sz w:val="18"/>
-                <w:szCs w:val="18"/>
-                <w:lang w:val="en-US"/>
-              </w:rPr>
+              <w:widowControl w:val="false"/>
+              <w:rPr/>
             </w:pPr>
             <w:r>
               <w:rPr>
@@ -1355,12 +1371,8 @@
           <w:p>
             <w:pPr>
               <w:pStyle w:val="Normal"/>
-              <w:rPr>
-                <w:rFonts w:cs="Calibri" w:cstheme="minorHAnsi"/>
-                <w:sz w:val="18"/>
-                <w:szCs w:val="18"/>
-                <w:lang w:val="en-US"/>
-              </w:rPr>
+              <w:widowControl w:val="false"/>
+              <w:rPr/>
             </w:pPr>
             <w:r>
               <w:rPr>
@@ -1386,12 +1398,8 @@
           <w:p>
             <w:pPr>
               <w:pStyle w:val="Normal"/>
-              <w:rPr>
-                <w:rFonts w:cs="Calibri" w:cstheme="minorHAnsi"/>
-                <w:sz w:val="18"/>
-                <w:szCs w:val="18"/>
-                <w:lang w:val="en-US"/>
-              </w:rPr>
+              <w:widowControl w:val="false"/>
+              <w:rPr/>
             </w:pPr>
             <w:r>
               <w:rPr>
@@ -1406,12 +1414,8 @@
           <w:p>
             <w:pPr>
               <w:pStyle w:val="Normal"/>
-              <w:rPr>
-                <w:rFonts w:cs="Calibri" w:cstheme="minorHAnsi"/>
-                <w:sz w:val="18"/>
-                <w:szCs w:val="18"/>
-                <w:lang w:val="en-US"/>
-              </w:rPr>
+              <w:widowControl w:val="false"/>
+              <w:rPr/>
             </w:pPr>
             <w:r>
               <w:rPr>
@@ -1427,13 +1431,9 @@
           <w:p>
             <w:pPr>
               <w:pStyle w:val="Normal"/>
+              <w:widowControl w:val="false"/>
               <w:spacing w:lineRule="atLeast" w:line="201"/>
-              <w:rPr>
-                <w:rFonts w:cs="Calibri" w:cstheme="minorHAnsi"/>
-                <w:sz w:val="18"/>
-                <w:szCs w:val="18"/>
-                <w:lang w:val="en-US"/>
-              </w:rPr>
+              <w:rPr/>
             </w:pPr>
             <w:r>
               <w:rPr>
@@ -1516,14 +1516,8 @@
           <w:p>
             <w:pPr>
               <w:pStyle w:val="Normal"/>
-              <w:rPr>
-                <w:rFonts w:cs="Calibri" w:cstheme="minorHAnsi"/>
-                <w:b/>
-                <w:b/>
-                <w:bCs/>
-                <w:sz w:val="24"/>
-                <w:szCs w:val="24"/>
-              </w:rPr>
+              <w:widowControl w:val="false"/>
+              <w:rPr/>
             </w:pPr>
             <w:r>
               <w:rPr>
@@ -1543,7 +1537,24 @@
                 <w:szCs w:val="18"/>
                 <w:lang w:val="en-US"/>
               </w:rPr>
-              <w:t>{$item_val[i+1].milestone_type:ifEQ(4):showBegin}Minister {$item_val[i+1].eac_decision_by}{$item_val[i+1].milestone_type:showEnd}{$item_val[i+1].milestone_type:ifNE(4):showBegin}{$item_val[i+1].decision_by}{$item_val[i+1].milestone_type:showEnd}</w:t>
+              <w:t>{$item_val[i+1].decision_by}</w:t>
+            </w:r>
+          </w:p>
+          <w:p>
+            <w:pPr>
+              <w:pStyle w:val="Normal"/>
+              <w:widowControl w:val="false"/>
+              <w:rPr/>
+            </w:pPr>
+            <w:r>
+              <w:rPr>
+                <w:rFonts w:eastAsia="Calibri" w:cs="Calibri" w:cstheme="minorHAnsi"/>
+                <w:bCs/>
+                <w:sz w:val="18"/>
+                <w:szCs w:val="18"/>
+                <w:lang w:val="en-US"/>
+              </w:rPr>
+              <w:t>{$item_val[i+1].minister}</w:t>
             </w:r>
           </w:p>
         </w:tc>
@@ -1556,6 +1567,7 @@
           <w:p>
             <w:pPr>
               <w:pStyle w:val="Normal"/>
+              <w:widowControl w:val="false"/>
               <w:rPr>
                 <w:rFonts w:cs="Calibri" w:cstheme="minorHAnsi"/>
                 <w:sz w:val="18"/>
@@ -1576,6 +1588,7 @@
           <w:p>
             <w:pPr>
               <w:pStyle w:val="Normal"/>
+              <w:widowControl w:val="false"/>
               <w:rPr>
                 <w:rFonts w:cs="Calibri" w:cstheme="minorHAnsi"/>
                 <w:sz w:val="18"/>
@@ -1595,6 +1608,7 @@
           <w:p>
             <w:pPr>
               <w:pStyle w:val="Normal"/>
+              <w:widowControl w:val="false"/>
               <w:rPr>
                 <w:rFonts w:cs="Calibri" w:cstheme="minorHAnsi"/>
                 <w:sz w:val="20"/>
@@ -1621,6 +1635,7 @@
           <w:p>
             <w:pPr>
               <w:pStyle w:val="Normal"/>
+              <w:widowControl w:val="false"/>
               <w:rPr>
                 <w:rFonts w:cs="Calibri" w:cstheme="minorHAnsi"/>
                 <w:bCs/>
@@ -1688,6 +1703,7 @@
           <w:p>
             <w:pPr>
               <w:pStyle w:val="Normal"/>
+              <w:widowControl w:val="false"/>
               <w:rPr>
                 <w:rFonts w:cs="Calibri" w:cstheme="minorHAnsi"/>
                 <w:bCs/>
@@ -1707,6 +1723,7 @@
           <w:p>
             <w:pPr>
               <w:pStyle w:val="Normal"/>
+              <w:widowControl w:val="false"/>
               <w:spacing w:lineRule="atLeast" w:line="201"/>
               <w:rPr>
                 <w:rFonts w:cs="Calibri" w:cstheme="minorHAnsi"/>
@@ -1748,6 +1765,7 @@
           <w:p>
             <w:pPr>
               <w:pStyle w:val="Normal"/>
+              <w:widowControl w:val="false"/>
               <w:spacing w:lineRule="atLeast" w:line="201"/>
               <w:rPr>
                 <w:rFonts w:cs="Calibri" w:cstheme="minorHAnsi"/>
@@ -1777,6 +1795,7 @@
           <w:p>
             <w:pPr>
               <w:pStyle w:val="Normal"/>
+              <w:widowControl w:val="false"/>
               <w:spacing w:lineRule="atLeast" w:line="201"/>
               <w:rPr>
                 <w:rFonts w:cs="Calibri" w:cstheme="minorHAnsi"/>
@@ -1798,6 +1817,7 @@
           <w:p>
             <w:pPr>
               <w:pStyle w:val="Normal"/>
+              <w:widowControl w:val="false"/>
               <w:spacing w:lineRule="atLeast" w:line="201"/>
               <w:rPr>
                 <w:rFonts w:cs="Calibri" w:cstheme="minorHAnsi"/>
@@ -1847,6 +1867,7 @@
           <w:p>
             <w:pPr>
               <w:pStyle w:val="Normal"/>
+              <w:widowControl w:val="false"/>
               <w:spacing w:lineRule="atLeast" w:line="201"/>
               <w:rPr>
                 <w:rFonts w:cs="Calibri" w:cstheme="minorHAnsi"/>
@@ -1876,6 +1897,7 @@
           <w:p>
             <w:pPr>
               <w:pStyle w:val="Normal"/>
+              <w:widowControl w:val="false"/>
               <w:spacing w:lineRule="atLeast" w:line="201"/>
               <w:rPr>
                 <w:rFonts w:cs="Calibri" w:cstheme="minorHAnsi"/>
@@ -1914,6 +1936,7 @@
           <w:p>
             <w:pPr>
               <w:pStyle w:val="Normal"/>
+              <w:widowControl w:val="false"/>
               <w:spacing w:lineRule="atLeast" w:line="201"/>
               <w:rPr>
                 <w:rFonts w:cs="Calibri" w:cstheme="minorHAnsi"/>
@@ -1955,6 +1978,7 @@
           <w:p>
             <w:pPr>
               <w:pStyle w:val="Normal"/>
+              <w:widowControl w:val="false"/>
               <w:spacing w:lineRule="atLeast" w:line="201"/>
               <w:rPr>
                 <w:rFonts w:cs="Calibri" w:cstheme="minorHAnsi"/>
@@ -1984,6 +2008,7 @@
           <w:p>
             <w:pPr>
               <w:pStyle w:val="Normal"/>
+              <w:widowControl w:val="false"/>
               <w:spacing w:lineRule="atLeast" w:line="201"/>
               <w:rPr>
                 <w:rFonts w:cs="Calibri" w:cstheme="minorHAnsi"/>
@@ -2005,6 +2030,7 @@
           <w:p>
             <w:pPr>
               <w:pStyle w:val="Normal"/>
+              <w:widowControl w:val="false"/>
               <w:rPr>
                 <w:rFonts w:cs="Calibri" w:cstheme="minorHAnsi"/>
                 <w:b/>
@@ -2026,6 +2052,7 @@
           <w:p>
             <w:pPr>
               <w:pStyle w:val="Normal"/>
+              <w:widowControl w:val="false"/>
               <w:rPr>
                 <w:rFonts w:cs="Calibri" w:cstheme="minorHAnsi"/>
                 <w:sz w:val="18"/>
@@ -2062,6 +2089,7 @@
           <w:p>
             <w:pPr>
               <w:pStyle w:val="Normal"/>
+              <w:widowControl w:val="false"/>
               <w:rPr>
                 <w:rFonts w:cs="Calibri" w:cstheme="minorHAnsi"/>
                 <w:sz w:val="20"/>
@@ -2129,7 +2157,7 @@
       <w:footerReference w:type="first" r:id="rId5"/>
       <w:type w:val="nextPage"/>
       <w:pgSz w:orient="landscape" w:w="15840" w:h="12240"/>
-      <w:pgMar w:left="851" w:right="851" w:header="624" w:top="681" w:footer="709" w:bottom="766" w:gutter="0"/>
+      <w:pgMar w:left="851" w:right="851" w:gutter="0" w:header="624" w:top="681" w:footer="709" w:bottom="766"/>
       <w:pgNumType w:fmt="decimal"/>
       <w:formProt w:val="false"/>
       <w:titlePg/>
@@ -2141,7 +2169,7 @@
 </file>
 
 <file path=word/footer1.xml><?xml version="1.0" encoding="utf-8"?>
-<w:ftr xmlns:o="urn:schemas-microsoft-com:office:office" xmlns:r="http://schemas.openxmlformats.org/officeDocument/2006/relationships" xmlns:v="urn:schemas-microsoft-com:vml" xmlns:w="http://schemas.openxmlformats.org/wordprocessingml/2006/main" xmlns:w10="urn:schemas-microsoft-com:office:word" xmlns:wp="http://schemas.openxmlformats.org/drawingml/2006/wordprocessingDrawing" xmlns:wps="http://schemas.microsoft.com/office/word/2010/wordprocessingShape" xmlns:wpg="http://schemas.microsoft.com/office/word/2010/wordprocessingGroup" xmlns:mc="http://schemas.openxmlformats.org/markup-compatibility/2006" xmlns:wp14="http://schemas.microsoft.com/office/word/2010/wordprocessingDrawing" xmlns:w14="http://schemas.microsoft.com/office/word/2010/wordml" mc:Ignorable="w14 wp14">
+<w:ftr xmlns:o="urn:schemas-microsoft-com:office:office" xmlns:r="http://schemas.openxmlformats.org/officeDocument/2006/relationships" xmlns:v="urn:schemas-microsoft-com:vml" xmlns:w="http://schemas.openxmlformats.org/wordprocessingml/2006/main" xmlns:w10="urn:schemas-microsoft-com:office:word" xmlns:wp="http://schemas.openxmlformats.org/drawingml/2006/wordprocessingDrawing" xmlns:wps="http://schemas.microsoft.com/office/word/2010/wordprocessingShape" xmlns:wpg="http://schemas.microsoft.com/office/word/2010/wordprocessingGroup" xmlns:mc="http://schemas.openxmlformats.org/markup-compatibility/2006" xmlns:wp14="http://schemas.microsoft.com/office/word/2010/wordprocessingDrawing" xmlns:w14="http://schemas.microsoft.com/office/word/2010/wordml" xmlns:w15="http://schemas.microsoft.com/office/word/2012/wordml" mc:Ignorable="w14 wp14 w15">
   <w:p>
     <w:pPr>
       <w:pStyle w:val="Footer"/>
@@ -2174,7 +2202,7 @@
         <w:szCs w:val="16"/>
         <w:bCs/>
       </w:rPr>
-      <w:instrText> PAGE </w:instrText>
+      <w:instrText xml:space="preserve"> PAGE </w:instrText>
     </w:r>
     <w:r>
       <w:rPr>
@@ -2226,7 +2254,7 @@
         <w:szCs w:val="16"/>
         <w:bCs/>
       </w:rPr>
-      <w:instrText> NUMPAGES </w:instrText>
+      <w:instrText xml:space="preserve"> NUMPAGES </w:instrText>
     </w:r>
     <w:r>
       <w:rPr>
@@ -2260,7 +2288,7 @@
 </file>
 
 <file path=word/footer2.xml><?xml version="1.0" encoding="utf-8"?>
-<w:ftr xmlns:o="urn:schemas-microsoft-com:office:office" xmlns:r="http://schemas.openxmlformats.org/officeDocument/2006/relationships" xmlns:v="urn:schemas-microsoft-com:vml" xmlns:w="http://schemas.openxmlformats.org/wordprocessingml/2006/main" xmlns:w10="urn:schemas-microsoft-com:office:word" xmlns:wp="http://schemas.openxmlformats.org/drawingml/2006/wordprocessingDrawing" xmlns:wps="http://schemas.microsoft.com/office/word/2010/wordprocessingShape" xmlns:wpg="http://schemas.microsoft.com/office/word/2010/wordprocessingGroup" xmlns:mc="http://schemas.openxmlformats.org/markup-compatibility/2006" xmlns:wp14="http://schemas.microsoft.com/office/word/2010/wordprocessingDrawing" xmlns:w14="http://schemas.microsoft.com/office/word/2010/wordml" mc:Ignorable="w14 wp14">
+<w:ftr xmlns:o="urn:schemas-microsoft-com:office:office" xmlns:r="http://schemas.openxmlformats.org/officeDocument/2006/relationships" xmlns:v="urn:schemas-microsoft-com:vml" xmlns:w="http://schemas.openxmlformats.org/wordprocessingml/2006/main" xmlns:w10="urn:schemas-microsoft-com:office:word" xmlns:wp="http://schemas.openxmlformats.org/drawingml/2006/wordprocessingDrawing" xmlns:wps="http://schemas.microsoft.com/office/word/2010/wordprocessingShape" xmlns:wpg="http://schemas.microsoft.com/office/word/2010/wordprocessingGroup" xmlns:mc="http://schemas.openxmlformats.org/markup-compatibility/2006" xmlns:wp14="http://schemas.microsoft.com/office/word/2010/wordprocessingDrawing" xmlns:w14="http://schemas.microsoft.com/office/word/2010/wordml" xmlns:w15="http://schemas.microsoft.com/office/word/2012/wordml" mc:Ignorable="w14 wp14 w15">
   <w:p>
     <w:pPr>
       <w:pStyle w:val="Footer"/>
@@ -2293,7 +2321,7 @@
         <w:szCs w:val="16"/>
         <w:bCs/>
       </w:rPr>
-      <w:instrText> PAGE </w:instrText>
+      <w:instrText xml:space="preserve"> PAGE </w:instrText>
     </w:r>
     <w:r>
       <w:rPr>
@@ -2345,7 +2373,7 @@
         <w:szCs w:val="16"/>
         <w:bCs/>
       </w:rPr>
-      <w:instrText> NUMPAGES </w:instrText>
+      <w:instrText xml:space="preserve"> NUMPAGES </w:instrText>
     </w:r>
     <w:r>
       <w:rPr>
@@ -2379,7 +2407,7 @@
 </file>
 
 <file path=word/header1.xml><?xml version="1.0" encoding="utf-8"?>
-<w:hdr xmlns:o="urn:schemas-microsoft-com:office:office" xmlns:r="http://schemas.openxmlformats.org/officeDocument/2006/relationships" xmlns:v="urn:schemas-microsoft-com:vml" xmlns:w="http://schemas.openxmlformats.org/wordprocessingml/2006/main" xmlns:w10="urn:schemas-microsoft-com:office:word" xmlns:wp="http://schemas.openxmlformats.org/drawingml/2006/wordprocessingDrawing" xmlns:wps="http://schemas.microsoft.com/office/word/2010/wordprocessingShape" xmlns:wpg="http://schemas.microsoft.com/office/word/2010/wordprocessingGroup" xmlns:mc="http://schemas.openxmlformats.org/markup-compatibility/2006" xmlns:wp14="http://schemas.microsoft.com/office/word/2010/wordprocessingDrawing" xmlns:w14="http://schemas.microsoft.com/office/word/2010/wordml" mc:Ignorable="w14 wp14">
+<w:hdr xmlns:o="urn:schemas-microsoft-com:office:office" xmlns:r="http://schemas.openxmlformats.org/officeDocument/2006/relationships" xmlns:v="urn:schemas-microsoft-com:vml" xmlns:w="http://schemas.openxmlformats.org/wordprocessingml/2006/main" xmlns:w10="urn:schemas-microsoft-com:office:word" xmlns:wp="http://schemas.openxmlformats.org/drawingml/2006/wordprocessingDrawing" xmlns:wps="http://schemas.microsoft.com/office/word/2010/wordprocessingShape" xmlns:wpg="http://schemas.microsoft.com/office/word/2010/wordprocessingGroup" xmlns:mc="http://schemas.openxmlformats.org/markup-compatibility/2006" xmlns:wp14="http://schemas.microsoft.com/office/word/2010/wordprocessingDrawing" xmlns:w14="http://schemas.microsoft.com/office/word/2010/wordml" xmlns:w15="http://schemas.microsoft.com/office/word/2012/wordml" mc:Ignorable="w14 wp14 w15">
   <w:p>
     <w:pPr>
       <w:pStyle w:val="Header"/>
@@ -2394,7 +2422,7 @@
 </file>
 
 <file path=word/header2.xml><?xml version="1.0" encoding="utf-8"?>
-<w:hdr xmlns:o="urn:schemas-microsoft-com:office:office" xmlns:r="http://schemas.openxmlformats.org/officeDocument/2006/relationships" xmlns:v="urn:schemas-microsoft-com:vml" xmlns:w="http://schemas.openxmlformats.org/wordprocessingml/2006/main" xmlns:w10="urn:schemas-microsoft-com:office:word" xmlns:wp="http://schemas.openxmlformats.org/drawingml/2006/wordprocessingDrawing" xmlns:wps="http://schemas.microsoft.com/office/word/2010/wordprocessingShape" xmlns:wpg="http://schemas.microsoft.com/office/word/2010/wordprocessingGroup" xmlns:mc="http://schemas.openxmlformats.org/markup-compatibility/2006" xmlns:wp14="http://schemas.microsoft.com/office/word/2010/wordprocessingDrawing" xmlns:w14="http://schemas.microsoft.com/office/word/2010/wordml" mc:Ignorable="w14 wp14">
+<w:hdr xmlns:o="urn:schemas-microsoft-com:office:office" xmlns:r="http://schemas.openxmlformats.org/officeDocument/2006/relationships" xmlns:v="urn:schemas-microsoft-com:vml" xmlns:w="http://schemas.openxmlformats.org/wordprocessingml/2006/main" xmlns:w10="urn:schemas-microsoft-com:office:word" xmlns:wp="http://schemas.openxmlformats.org/drawingml/2006/wordprocessingDrawing" xmlns:wps="http://schemas.microsoft.com/office/word/2010/wordprocessingShape" xmlns:wpg="http://schemas.microsoft.com/office/word/2010/wordprocessingGroup" xmlns:mc="http://schemas.openxmlformats.org/markup-compatibility/2006" xmlns:wp14="http://schemas.microsoft.com/office/word/2010/wordprocessingDrawing" xmlns:w14="http://schemas.microsoft.com/office/word/2010/wordml" xmlns:w15="http://schemas.microsoft.com/office/word/2012/wordml" mc:Ignorable="w14 wp14 w15">
   <w:p>
     <w:pPr>
       <w:pStyle w:val="Header"/>
@@ -2969,7 +2997,6 @@
   <w:style w:type="character" w:styleId="CommentTextChar" w:customStyle="1">
     <w:name w:val="Comment Text Char"/>
     <w:basedOn w:val="DefaultParagraphFont"/>
-    <w:link w:val="CommentText"/>
     <w:uiPriority w:val="99"/>
     <w:qFormat/>
     <w:rPr>
@@ -2981,7 +3008,6 @@
   <w:style w:type="character" w:styleId="CommentSubjectChar" w:customStyle="1">
     <w:name w:val="Comment Subject Char"/>
     <w:basedOn w:val="CommentTextChar"/>
-    <w:link w:val="CommentSubject"/>
     <w:uiPriority w:val="99"/>
     <w:semiHidden/>
     <w:qFormat/>
@@ -3264,7 +3290,6 @@
     <w:semiHidden/>
     <w:unhideWhenUsed/>
     <w:tblPr>
-      <w:tblInd w:w="0" w:type="dxa"/>
       <w:tblCellMar>
         <w:top w:w="0" w:type="dxa"/>
         <w:left w:w="108" w:type="dxa"/>

</xml_diff>

<commit_message>
TRACK-308: Added 2nd minister to AS report (#2569)
</commit_message>
<xml_diff>
--- a/epictrack-api/src/api/reports/report_templates/anticipated_schedule.docx
+++ b/epictrack-api/src/api/reports/report_templates/anticipated_schedule.docx
@@ -1,6 +1,6 @@
 
 <file path=word/document.xml><?xml version="1.0" encoding="utf-8"?>
-<w:document xmlns:o="urn:schemas-microsoft-com:office:office" xmlns:r="http://schemas.openxmlformats.org/officeDocument/2006/relationships" xmlns:v="urn:schemas-microsoft-com:vml" xmlns:w="http://schemas.openxmlformats.org/wordprocessingml/2006/main" xmlns:w10="urn:schemas-microsoft-com:office:word" xmlns:wp="http://schemas.openxmlformats.org/drawingml/2006/wordprocessingDrawing" xmlns:wps="http://schemas.microsoft.com/office/word/2010/wordprocessingShape" xmlns:wpg="http://schemas.microsoft.com/office/word/2010/wordprocessingGroup" xmlns:mc="http://schemas.openxmlformats.org/markup-compatibility/2006" xmlns:wp14="http://schemas.microsoft.com/office/word/2010/wordprocessingDrawing" xmlns:w14="http://schemas.microsoft.com/office/word/2010/wordml" mc:Ignorable="w14 wp14">
+<w:document xmlns:o="urn:schemas-microsoft-com:office:office" xmlns:r="http://schemas.openxmlformats.org/officeDocument/2006/relationships" xmlns:v="urn:schemas-microsoft-com:vml" xmlns:w="http://schemas.openxmlformats.org/wordprocessingml/2006/main" xmlns:w10="urn:schemas-microsoft-com:office:word" xmlns:wp="http://schemas.openxmlformats.org/drawingml/2006/wordprocessingDrawing" xmlns:wps="http://schemas.microsoft.com/office/word/2010/wordprocessingShape" xmlns:wpg="http://schemas.microsoft.com/office/word/2010/wordprocessingGroup" xmlns:mc="http://schemas.openxmlformats.org/markup-compatibility/2006" xmlns:wp14="http://schemas.microsoft.com/office/word/2010/wordprocessingDrawing" xmlns:w14="http://schemas.microsoft.com/office/word/2010/wordml" xmlns:w15="http://schemas.microsoft.com/office/word/2012/wordml" mc:Ignorable="w14 wp14 w15">
   <w:body>
     <w:p>
       <w:pPr>
@@ -167,6 +167,7 @@
         <w:tblW w:w="14417" w:type="dxa"/>
         <w:jc w:val="left"/>
         <w:tblInd w:w="-289" w:type="dxa"/>
+        <w:tblLayout w:type="fixed"/>
         <w:tblCellMar>
           <w:top w:w="0" w:type="dxa"/>
           <w:left w:w="108" w:type="dxa"/>
@@ -195,6 +196,7 @@
           <w:p>
             <w:pPr>
               <w:pStyle w:val="Normal"/>
+              <w:widowControl w:val="false"/>
               <w:ind w:right="360" w:hanging="0"/>
               <w:jc w:val="center"/>
               <w:rPr>
@@ -225,6 +227,7 @@
           <w:p>
             <w:pPr>
               <w:pStyle w:val="Normal"/>
+              <w:widowControl w:val="false"/>
               <w:jc w:val="center"/>
               <w:rPr>
                 <w:rFonts w:cs="Calibri" w:cstheme="minorHAnsi"/>
@@ -255,6 +258,7 @@
           <w:p>
             <w:pPr>
               <w:pStyle w:val="Normal"/>
+              <w:widowControl w:val="false"/>
               <w:jc w:val="center"/>
               <w:rPr>
                 <w:rFonts w:cs="Calibri" w:cstheme="minorHAnsi"/>
@@ -285,6 +289,7 @@
           <w:p>
             <w:pPr>
               <w:pStyle w:val="Normal"/>
+              <w:widowControl w:val="false"/>
               <w:jc w:val="center"/>
               <w:rPr>
                 <w:rFonts w:cs="Calibri" w:cstheme="minorHAnsi"/>
@@ -319,6 +324,7 @@
           <w:p>
             <w:pPr>
               <w:pStyle w:val="Normal"/>
+              <w:widowControl w:val="false"/>
               <w:tabs>
                 <w:tab w:val="clear" w:pos="720"/>
                 <w:tab w:val="left" w:pos="453" w:leader="none"/>
@@ -348,6 +354,7 @@
           <w:p>
             <w:pPr>
               <w:pStyle w:val="Normal"/>
+              <w:widowControl w:val="false"/>
               <w:rPr>
                 <w:rFonts w:cs="Calibri" w:cstheme="minorHAnsi"/>
                 <w:sz w:val="18"/>
@@ -402,23 +409,25 @@
           <w:p>
             <w:pPr>
               <w:pStyle w:val="Normal"/>
-              <w:rPr>
-                <w:rFonts w:cs="Calibri" w:cstheme="minorHAnsi"/>
-                <w:sz w:val="18"/>
-                <w:szCs w:val="18"/>
-              </w:rPr>
-            </w:pPr>
-            <w:r>
-              <w:rPr>
-                <w:rFonts w:cs="Calibri" w:cstheme="minorHAnsi"/>
-                <w:sz w:val="18"/>
-                <w:szCs w:val="18"/>
-              </w:rPr>
-            </w:r>
-          </w:p>
-          <w:p>
-            <w:pPr>
-              <w:pStyle w:val="Normal"/>
+              <w:widowControl w:val="false"/>
+              <w:rPr>
+                <w:rFonts w:cs="Calibri" w:cstheme="minorHAnsi"/>
+                <w:sz w:val="18"/>
+                <w:szCs w:val="18"/>
+              </w:rPr>
+            </w:pPr>
+            <w:r>
+              <w:rPr>
+                <w:rFonts w:cs="Calibri" w:cstheme="minorHAnsi"/>
+                <w:sz w:val="18"/>
+                <w:szCs w:val="18"/>
+              </w:rPr>
+            </w:r>
+          </w:p>
+          <w:p>
+            <w:pPr>
+              <w:pStyle w:val="Normal"/>
+              <w:widowControl w:val="false"/>
               <w:rPr>
                 <w:rFonts w:ascii="Calibri" w:hAnsi="Calibri" w:eastAsia="Calibri"/>
               </w:rPr>
@@ -456,6 +465,7 @@
           <w:p>
             <w:pPr>
               <w:pStyle w:val="Normal"/>
+              <w:widowControl w:val="false"/>
               <w:rPr>
                 <w:rFonts w:cs="Calibri" w:cstheme="minorHAnsi"/>
                 <w:sz w:val="18"/>
@@ -476,6 +486,7 @@
           <w:p>
             <w:pPr>
               <w:pStyle w:val="Normal"/>
+              <w:widowControl w:val="false"/>
               <w:rPr>
                 <w:rFonts w:cs="Calibri" w:cstheme="minorHAnsi"/>
                 <w:sz w:val="18"/>
@@ -516,6 +527,7 @@
           <w:p>
             <w:pPr>
               <w:pStyle w:val="Normal"/>
+              <w:widowControl w:val="false"/>
               <w:rPr>
                 <w:rFonts w:cs="Calibri" w:cstheme="minorHAnsi"/>
                 <w:sz w:val="18"/>
@@ -536,6 +548,7 @@
           <w:p>
             <w:pPr>
               <w:pStyle w:val="Normal"/>
+              <w:widowControl w:val="false"/>
               <w:rPr>
                 <w:rFonts w:cs="Calibri" w:cstheme="minorHAnsi"/>
                 <w:sz w:val="18"/>
@@ -576,6 +589,7 @@
           <w:p>
             <w:pPr>
               <w:pStyle w:val="Normal"/>
+              <w:widowControl w:val="false"/>
               <w:rPr>
                 <w:rFonts w:cs="Calibri" w:cstheme="minorHAnsi"/>
                 <w:sz w:val="18"/>
@@ -596,6 +610,7 @@
           <w:p>
             <w:pPr>
               <w:pStyle w:val="Normal"/>
+              <w:widowControl w:val="false"/>
               <w:spacing w:lineRule="atLeast" w:line="201"/>
               <w:rPr>
                 <w:rFonts w:cs="Calibri" w:cstheme="minorHAnsi"/>
@@ -629,6 +644,7 @@
           <w:p>
             <w:pPr>
               <w:pStyle w:val="Normal"/>
+              <w:widowControl w:val="false"/>
               <w:spacing w:lineRule="atLeast" w:line="201"/>
               <w:rPr>
                 <w:rFonts w:cs="Calibri" w:cstheme="minorHAnsi"/>
@@ -638,12 +654,18 @@
               </w:rPr>
             </w:pPr>
             <w:r>
-              <w:rPr/>
-            </w:r>
-          </w:p>
-          <w:p>
-            <w:pPr>
-              <w:pStyle w:val="Normal"/>
+              <w:rPr>
+                <w:rFonts w:cs="Calibri" w:cstheme="minorHAnsi"/>
+                <w:sz w:val="18"/>
+                <w:szCs w:val="18"/>
+                <w:lang w:val="en-US"/>
+              </w:rPr>
+            </w:r>
+          </w:p>
+          <w:p>
+            <w:pPr>
+              <w:pStyle w:val="Normal"/>
+              <w:widowControl w:val="false"/>
               <w:spacing w:lineRule="atLeast" w:line="201"/>
               <w:rPr>
                 <w:rFonts w:cs="Calibri" w:cstheme="minorHAnsi"/>
@@ -671,14 +693,37 @@
                 <w:szCs w:val="18"/>
                 <w:lang w:val="en-US"/>
               </w:rPr>
-              <w:t>{$item_val[i].milestone_type:ifEQ(4):showBegin}Minister {$item_val[i].eac_decision_by}{$item_val[i].milestone_type:showEnd}</w:t>
-              <w:br/>
-              <w:t>{$item_val[i].milestone_type:ifNE(4):showBegin}{$item_val[i].decision_by}{$item_val[i].milestone_type:showEnd}</w:t>
-            </w:r>
-          </w:p>
-          <w:p>
-            <w:pPr>
-              <w:pStyle w:val="Normal"/>
+              <w:t>{$item_val[i].decision_by}</w:t>
+            </w:r>
+          </w:p>
+          <w:p>
+            <w:pPr>
+              <w:pStyle w:val="Normal"/>
+              <w:widowControl w:val="false"/>
+              <w:spacing w:lineRule="atLeast" w:line="201"/>
+              <w:rPr>
+                <w:rFonts w:cs="Calibri" w:cstheme="minorHAnsi"/>
+                <w:bCs/>
+                <w:sz w:val="18"/>
+                <w:szCs w:val="18"/>
+                <w:lang w:val="en-US"/>
+              </w:rPr>
+            </w:pPr>
+            <w:r>
+              <w:rPr>
+                <w:rFonts w:eastAsia="Calibri" w:cs="Calibri" w:cstheme="minorHAnsi"/>
+                <w:bCs/>
+                <w:sz w:val="18"/>
+                <w:szCs w:val="18"/>
+                <w:lang w:val="en-US"/>
+              </w:rPr>
+              <w:t>{$item_val[i].minister}</w:t>
+            </w:r>
+          </w:p>
+          <w:p>
+            <w:pPr>
+              <w:pStyle w:val="Normal"/>
+              <w:widowControl w:val="false"/>
               <w:spacing w:lineRule="atLeast" w:line="201"/>
               <w:rPr>
                 <w:rFonts w:cs="Calibri" w:cstheme="minorHAnsi"/>
@@ -708,6 +753,7 @@
           <w:p>
             <w:pPr>
               <w:pStyle w:val="Normal"/>
+              <w:widowControl w:val="false"/>
               <w:rPr>
                 <w:rFonts w:cs="Calibri" w:cstheme="minorHAnsi"/>
                 <w:sz w:val="18"/>
@@ -748,25 +794,27 @@
           <w:p>
             <w:pPr>
               <w:pStyle w:val="Normal"/>
-              <w:rPr>
-                <w:rFonts w:cs="Calibri" w:cstheme="minorHAnsi"/>
-                <w:sz w:val="18"/>
-                <w:szCs w:val="18"/>
-                <w:lang w:val="en-US"/>
-              </w:rPr>
-            </w:pPr>
-            <w:r>
-              <w:rPr>
-                <w:rFonts w:cs="Calibri" w:cstheme="minorHAnsi"/>
-                <w:sz w:val="18"/>
-                <w:szCs w:val="18"/>
-                <w:lang w:val="en-US"/>
-              </w:rPr>
-            </w:r>
-          </w:p>
-          <w:p>
-            <w:pPr>
-              <w:pStyle w:val="Normal"/>
+              <w:widowControl w:val="false"/>
+              <w:rPr>
+                <w:rFonts w:cs="Calibri" w:cstheme="minorHAnsi"/>
+                <w:sz w:val="18"/>
+                <w:szCs w:val="18"/>
+                <w:lang w:val="en-US"/>
+              </w:rPr>
+            </w:pPr>
+            <w:r>
+              <w:rPr>
+                <w:rFonts w:cs="Calibri" w:cstheme="minorHAnsi"/>
+                <w:sz w:val="18"/>
+                <w:szCs w:val="18"/>
+                <w:lang w:val="en-US"/>
+              </w:rPr>
+            </w:r>
+          </w:p>
+          <w:p>
+            <w:pPr>
+              <w:pStyle w:val="Normal"/>
+              <w:widowControl w:val="false"/>
               <w:rPr>
                 <w:rFonts w:cs="Calibri" w:cstheme="minorHAnsi"/>
                 <w:sz w:val="18"/>
@@ -813,6 +861,7 @@
           <w:p>
             <w:pPr>
               <w:pStyle w:val="Normal"/>
+              <w:widowControl w:val="false"/>
               <w:rPr>
                 <w:rFonts w:eastAsia="Calibri" w:cs="Calibri" w:cstheme="minorHAnsi"/>
                 <w:sz w:val="18"/>
@@ -849,6 +898,7 @@
           <w:p>
             <w:pPr>
               <w:pStyle w:val="Normal"/>
+              <w:widowControl w:val="false"/>
               <w:rPr>
                 <w:rFonts w:eastAsia="Calibri" w:cs="Calibri" w:cstheme="minorHAnsi"/>
                 <w:bCs/>
@@ -887,6 +937,7 @@
           <w:p>
             <w:pPr>
               <w:pStyle w:val="Normal"/>
+              <w:widowControl w:val="false"/>
               <w:rPr>
                 <w:rFonts w:eastAsia="Calibri" w:cs="Calibri" w:cstheme="minorHAnsi"/>
                 <w:bCs/>
@@ -935,6 +986,7 @@
           <w:p>
             <w:pPr>
               <w:pStyle w:val="Normal"/>
+              <w:widowControl w:val="false"/>
               <w:rPr>
                 <w:rFonts w:eastAsia="Calibri" w:cs="Calibri" w:cstheme="minorHAnsi"/>
                 <w:sz w:val="18"/>
@@ -955,6 +1007,7 @@
           <w:p>
             <w:pPr>
               <w:pStyle w:val="Normal"/>
+              <w:widowControl w:val="false"/>
               <w:rPr>
                 <w:rFonts w:eastAsia="Calibri" w:cs="Calibri" w:cstheme="minorHAnsi"/>
                 <w:sz w:val="18"/>
@@ -1002,6 +1055,7 @@
           <w:p>
             <w:pPr>
               <w:pStyle w:val="Normal"/>
+              <w:widowControl w:val="false"/>
               <w:rPr>
                 <w:rFonts w:eastAsia="Calibri"/>
                 <w:sz w:val="18"/>
@@ -1020,6 +1074,7 @@
           <w:p>
             <w:pPr>
               <w:pStyle w:val="Normal"/>
+              <w:widowControl w:val="false"/>
               <w:rPr>
                 <w:rFonts w:eastAsia="Calibri"/>
                 <w:sz w:val="18"/>
@@ -1047,6 +1102,7 @@
           <w:p>
             <w:pPr>
               <w:pStyle w:val="Normal"/>
+              <w:widowControl w:val="false"/>
               <w:rPr>
                 <w:rFonts w:eastAsia="Calibri" w:cs="Calibri" w:cstheme="minorHAnsi"/>
                 <w:sz w:val="18"/>
@@ -1065,6 +1121,7 @@
           <w:p>
             <w:pPr>
               <w:pStyle w:val="Normal"/>
+              <w:widowControl w:val="false"/>
               <w:rPr>
                 <w:rFonts w:eastAsia="Calibri" w:cs="Calibri" w:cstheme="minorHAnsi"/>
                 <w:sz w:val="18"/>
@@ -1093,7 +1150,7 @@
       </w:tr>
       <w:tr>
         <w:trPr>
-          <w:trHeight w:val="2707" w:hRule="atLeast"/>
+          <w:trHeight w:val="4320" w:hRule="atLeast"/>
         </w:trPr>
         <w:tc>
           <w:tcPr>
@@ -1104,13 +1161,8 @@
           <w:p>
             <w:pPr>
               <w:pStyle w:val="Normal"/>
-              <w:rPr>
-                <w:rFonts w:cs="Calibri" w:cstheme="minorHAnsi"/>
-                <w:b/>
-                <w:b/>
-                <w:sz w:val="20"/>
-                <w:szCs w:val="20"/>
-              </w:rPr>
+              <w:widowControl w:val="false"/>
+              <w:rPr/>
             </w:pPr>
             <w:r>
               <w:rPr>
@@ -1132,48 +1184,45 @@
           <w:p>
             <w:pPr>
               <w:pStyle w:val="Normal"/>
-              <w:rPr>
-                <w:rFonts w:cs="Calibri" w:cstheme="minorHAnsi"/>
+              <w:widowControl w:val="false"/>
+              <w:rPr/>
+            </w:pPr>
+            <w:r>
+              <w:rPr>
+                <w:rFonts w:eastAsia="Calibri" w:cs="Calibri" w:cstheme="minorHAnsi"/>
+                <w:sz w:val="18"/>
+                <w:szCs w:val="18"/>
+              </w:rPr>
+              <w:t>{$item_val[i+1].project_name:ifNEM():showBegin}</w:t>
+            </w:r>
+            <w:r>
+              <w:rPr>
+                <w:rFonts w:eastAsia="Calibri" w:cs="Calibri" w:cstheme="minorHAnsi"/>
+                <w:b/>
+                <w:bCs/>
                 <w:sz w:val="24"/>
                 <w:szCs w:val="24"/>
               </w:rPr>
-            </w:pPr>
-            <w:r>
-              <w:rPr>
-                <w:rFonts w:eastAsia="Calibri" w:cs="Calibri" w:cstheme="minorHAnsi"/>
-                <w:sz w:val="18"/>
-                <w:szCs w:val="18"/>
-              </w:rPr>
-              <w:t>{$item_val[i+1].project_name:ifNEM():showBegin}</w:t>
-            </w:r>
-            <w:r>
-              <w:rPr>
-                <w:rFonts w:eastAsia="Calibri" w:cs="Calibri" w:cstheme="minorHAnsi"/>
+              <w:t>{$item_val[i+1].</w:t>
+            </w:r>
+            <w:r>
+              <w:rPr>
+                <w:rFonts w:eastAsia="Calibri"/>
                 <w:b/>
                 <w:bCs/>
                 <w:sz w:val="24"/>
                 <w:szCs w:val="24"/>
               </w:rPr>
-              <w:t>{$item_val[i+1].</w:t>
-            </w:r>
-            <w:r>
-              <w:rPr>
-                <w:rFonts w:eastAsia="Calibri"/>
+              <w:t>p</w:t>
+            </w:r>
+            <w:r>
+              <w:rPr>
+                <w:rFonts w:eastAsia="Calibri" w:cs="Calibri" w:cstheme="minorHAnsi"/>
                 <w:b/>
                 <w:bCs/>
                 <w:sz w:val="24"/>
                 <w:szCs w:val="24"/>
               </w:rPr>
-              <w:t>p</w:t>
-            </w:r>
-            <w:r>
-              <w:rPr>
-                <w:rFonts w:eastAsia="Calibri" w:cs="Calibri" w:cstheme="minorHAnsi"/>
-                <w:b/>
-                <w:bCs/>
-                <w:sz w:val="24"/>
-                <w:szCs w:val="24"/>
-              </w:rPr>
               <w:t>roject_name}</w:t>
             </w:r>
             <w:r>
@@ -1188,14 +1237,8 @@
           <w:p>
             <w:pPr>
               <w:pStyle w:val="Normal"/>
-              <w:rPr>
-                <w:rFonts w:cs="Calibri" w:cstheme="minorHAnsi"/>
-                <w:b/>
-                <w:b/>
-                <w:bCs/>
-                <w:sz w:val="18"/>
-                <w:szCs w:val="18"/>
-              </w:rPr>
+              <w:widowControl w:val="false"/>
+              <w:rPr/>
             </w:pPr>
             <w:r>
               <w:rPr>
@@ -1210,12 +1253,8 @@
           <w:p>
             <w:pPr>
               <w:pStyle w:val="Normal"/>
-              <w:rPr>
-                <w:rFonts w:cs="Calibri" w:cstheme="minorHAnsi"/>
-                <w:sz w:val="18"/>
-                <w:szCs w:val="18"/>
-                <w:lang w:val="en-US"/>
-              </w:rPr>
+              <w:widowControl w:val="false"/>
+              <w:rPr/>
             </w:pPr>
             <w:r>
               <w:rPr>
@@ -1241,12 +1280,8 @@
           <w:p>
             <w:pPr>
               <w:pStyle w:val="Normal"/>
-              <w:rPr>
-                <w:rFonts w:cs="Calibri" w:cstheme="minorHAnsi"/>
-                <w:sz w:val="18"/>
-                <w:szCs w:val="18"/>
-                <w:lang w:val="en-US"/>
-              </w:rPr>
+              <w:widowControl w:val="false"/>
+              <w:rPr/>
             </w:pPr>
             <w:r>
               <w:rPr>
@@ -1261,15 +1296,8 @@
           <w:p>
             <w:pPr>
               <w:pStyle w:val="Normal"/>
-              <w:rPr>
-                <w:rFonts w:cs="Calibri" w:cstheme="minorHAnsi"/>
-                <w:b/>
-                <w:b/>
-                <w:bCs/>
-                <w:sz w:val="18"/>
-                <w:szCs w:val="18"/>
-                <w:lang w:val="en-US"/>
-              </w:rPr>
+              <w:widowControl w:val="false"/>
+              <w:rPr/>
             </w:pPr>
             <w:r>
               <w:rPr>
@@ -1284,12 +1312,8 @@
           <w:p>
             <w:pPr>
               <w:pStyle w:val="Normal"/>
-              <w:rPr>
-                <w:rFonts w:cs="Calibri" w:cstheme="minorHAnsi"/>
-                <w:sz w:val="18"/>
-                <w:szCs w:val="18"/>
-                <w:lang w:val="en-US"/>
-              </w:rPr>
+              <w:widowControl w:val="false"/>
+              <w:rPr/>
             </w:pPr>
             <w:r>
               <w:rPr>
@@ -1315,12 +1339,8 @@
           <w:p>
             <w:pPr>
               <w:pStyle w:val="Normal"/>
-              <w:rPr>
-                <w:rFonts w:cs="Calibri" w:cstheme="minorHAnsi"/>
-                <w:sz w:val="18"/>
-                <w:szCs w:val="18"/>
-                <w:lang w:val="en-US"/>
-              </w:rPr>
+              <w:widowControl w:val="false"/>
+              <w:rPr/>
             </w:pPr>
             <w:r>
               <w:rPr>
@@ -1335,12 +1355,8 @@
           <w:p>
             <w:pPr>
               <w:pStyle w:val="Normal"/>
-              <w:rPr>
-                <w:rFonts w:cs="Calibri" w:cstheme="minorHAnsi"/>
-                <w:sz w:val="18"/>
-                <w:szCs w:val="18"/>
-                <w:lang w:val="en-US"/>
-              </w:rPr>
+              <w:widowControl w:val="false"/>
+              <w:rPr/>
             </w:pPr>
             <w:r>
               <w:rPr>
@@ -1355,12 +1371,8 @@
           <w:p>
             <w:pPr>
               <w:pStyle w:val="Normal"/>
-              <w:rPr>
-                <w:rFonts w:cs="Calibri" w:cstheme="minorHAnsi"/>
-                <w:sz w:val="18"/>
-                <w:szCs w:val="18"/>
-                <w:lang w:val="en-US"/>
-              </w:rPr>
+              <w:widowControl w:val="false"/>
+              <w:rPr/>
             </w:pPr>
             <w:r>
               <w:rPr>
@@ -1386,12 +1398,8 @@
           <w:p>
             <w:pPr>
               <w:pStyle w:val="Normal"/>
-              <w:rPr>
-                <w:rFonts w:cs="Calibri" w:cstheme="minorHAnsi"/>
-                <w:sz w:val="18"/>
-                <w:szCs w:val="18"/>
-                <w:lang w:val="en-US"/>
-              </w:rPr>
+              <w:widowControl w:val="false"/>
+              <w:rPr/>
             </w:pPr>
             <w:r>
               <w:rPr>
@@ -1406,12 +1414,8 @@
           <w:p>
             <w:pPr>
               <w:pStyle w:val="Normal"/>
-              <w:rPr>
-                <w:rFonts w:cs="Calibri" w:cstheme="minorHAnsi"/>
-                <w:sz w:val="18"/>
-                <w:szCs w:val="18"/>
-                <w:lang w:val="en-US"/>
-              </w:rPr>
+              <w:widowControl w:val="false"/>
+              <w:rPr/>
             </w:pPr>
             <w:r>
               <w:rPr>
@@ -1427,13 +1431,9 @@
           <w:p>
             <w:pPr>
               <w:pStyle w:val="Normal"/>
+              <w:widowControl w:val="false"/>
               <w:spacing w:lineRule="atLeast" w:line="201"/>
-              <w:rPr>
-                <w:rFonts w:cs="Calibri" w:cstheme="minorHAnsi"/>
-                <w:sz w:val="18"/>
-                <w:szCs w:val="18"/>
-                <w:lang w:val="en-US"/>
-              </w:rPr>
+              <w:rPr/>
             </w:pPr>
             <w:r>
               <w:rPr>
@@ -1516,14 +1516,8 @@
           <w:p>
             <w:pPr>
               <w:pStyle w:val="Normal"/>
-              <w:rPr>
-                <w:rFonts w:cs="Calibri" w:cstheme="minorHAnsi"/>
-                <w:b/>
-                <w:b/>
-                <w:bCs/>
-                <w:sz w:val="24"/>
-                <w:szCs w:val="24"/>
-              </w:rPr>
+              <w:widowControl w:val="false"/>
+              <w:rPr/>
             </w:pPr>
             <w:r>
               <w:rPr>
@@ -1543,7 +1537,24 @@
                 <w:szCs w:val="18"/>
                 <w:lang w:val="en-US"/>
               </w:rPr>
-              <w:t>{$item_val[i+1].milestone_type:ifEQ(4):showBegin}Minister {$item_val[i+1].eac_decision_by}{$item_val[i+1].milestone_type:showEnd}{$item_val[i+1].milestone_type:ifNE(4):showBegin}{$item_val[i+1].decision_by}{$item_val[i+1].milestone_type:showEnd}</w:t>
+              <w:t>{$item_val[i+1].decision_by}</w:t>
+            </w:r>
+          </w:p>
+          <w:p>
+            <w:pPr>
+              <w:pStyle w:val="Normal"/>
+              <w:widowControl w:val="false"/>
+              <w:rPr/>
+            </w:pPr>
+            <w:r>
+              <w:rPr>
+                <w:rFonts w:eastAsia="Calibri" w:cs="Calibri" w:cstheme="minorHAnsi"/>
+                <w:bCs/>
+                <w:sz w:val="18"/>
+                <w:szCs w:val="18"/>
+                <w:lang w:val="en-US"/>
+              </w:rPr>
+              <w:t>{$item_val[i+1].minister}</w:t>
             </w:r>
           </w:p>
         </w:tc>
@@ -1556,6 +1567,7 @@
           <w:p>
             <w:pPr>
               <w:pStyle w:val="Normal"/>
+              <w:widowControl w:val="false"/>
               <w:rPr>
                 <w:rFonts w:cs="Calibri" w:cstheme="minorHAnsi"/>
                 <w:sz w:val="18"/>
@@ -1576,6 +1588,7 @@
           <w:p>
             <w:pPr>
               <w:pStyle w:val="Normal"/>
+              <w:widowControl w:val="false"/>
               <w:rPr>
                 <w:rFonts w:cs="Calibri" w:cstheme="minorHAnsi"/>
                 <w:sz w:val="18"/>
@@ -1595,6 +1608,7 @@
           <w:p>
             <w:pPr>
               <w:pStyle w:val="Normal"/>
+              <w:widowControl w:val="false"/>
               <w:rPr>
                 <w:rFonts w:cs="Calibri" w:cstheme="minorHAnsi"/>
                 <w:sz w:val="20"/>
@@ -1621,6 +1635,7 @@
           <w:p>
             <w:pPr>
               <w:pStyle w:val="Normal"/>
+              <w:widowControl w:val="false"/>
               <w:rPr>
                 <w:rFonts w:cs="Calibri" w:cstheme="minorHAnsi"/>
                 <w:bCs/>
@@ -1688,6 +1703,7 @@
           <w:p>
             <w:pPr>
               <w:pStyle w:val="Normal"/>
+              <w:widowControl w:val="false"/>
               <w:rPr>
                 <w:rFonts w:cs="Calibri" w:cstheme="minorHAnsi"/>
                 <w:bCs/>
@@ -1707,6 +1723,7 @@
           <w:p>
             <w:pPr>
               <w:pStyle w:val="Normal"/>
+              <w:widowControl w:val="false"/>
               <w:spacing w:lineRule="atLeast" w:line="201"/>
               <w:rPr>
                 <w:rFonts w:cs="Calibri" w:cstheme="minorHAnsi"/>
@@ -1748,6 +1765,7 @@
           <w:p>
             <w:pPr>
               <w:pStyle w:val="Normal"/>
+              <w:widowControl w:val="false"/>
               <w:spacing w:lineRule="atLeast" w:line="201"/>
               <w:rPr>
                 <w:rFonts w:cs="Calibri" w:cstheme="minorHAnsi"/>
@@ -1777,6 +1795,7 @@
           <w:p>
             <w:pPr>
               <w:pStyle w:val="Normal"/>
+              <w:widowControl w:val="false"/>
               <w:spacing w:lineRule="atLeast" w:line="201"/>
               <w:rPr>
                 <w:rFonts w:cs="Calibri" w:cstheme="minorHAnsi"/>
@@ -1798,6 +1817,7 @@
           <w:p>
             <w:pPr>
               <w:pStyle w:val="Normal"/>
+              <w:widowControl w:val="false"/>
               <w:spacing w:lineRule="atLeast" w:line="201"/>
               <w:rPr>
                 <w:rFonts w:cs="Calibri" w:cstheme="minorHAnsi"/>
@@ -1847,6 +1867,7 @@
           <w:p>
             <w:pPr>
               <w:pStyle w:val="Normal"/>
+              <w:widowControl w:val="false"/>
               <w:spacing w:lineRule="atLeast" w:line="201"/>
               <w:rPr>
                 <w:rFonts w:cs="Calibri" w:cstheme="minorHAnsi"/>
@@ -1876,6 +1897,7 @@
           <w:p>
             <w:pPr>
               <w:pStyle w:val="Normal"/>
+              <w:widowControl w:val="false"/>
               <w:spacing w:lineRule="atLeast" w:line="201"/>
               <w:rPr>
                 <w:rFonts w:cs="Calibri" w:cstheme="minorHAnsi"/>
@@ -1914,6 +1936,7 @@
           <w:p>
             <w:pPr>
               <w:pStyle w:val="Normal"/>
+              <w:widowControl w:val="false"/>
               <w:spacing w:lineRule="atLeast" w:line="201"/>
               <w:rPr>
                 <w:rFonts w:cs="Calibri" w:cstheme="minorHAnsi"/>
@@ -1955,6 +1978,7 @@
           <w:p>
             <w:pPr>
               <w:pStyle w:val="Normal"/>
+              <w:widowControl w:val="false"/>
               <w:spacing w:lineRule="atLeast" w:line="201"/>
               <w:rPr>
                 <w:rFonts w:cs="Calibri" w:cstheme="minorHAnsi"/>
@@ -1984,6 +2008,7 @@
           <w:p>
             <w:pPr>
               <w:pStyle w:val="Normal"/>
+              <w:widowControl w:val="false"/>
               <w:spacing w:lineRule="atLeast" w:line="201"/>
               <w:rPr>
                 <w:rFonts w:cs="Calibri" w:cstheme="minorHAnsi"/>
@@ -2005,6 +2030,7 @@
           <w:p>
             <w:pPr>
               <w:pStyle w:val="Normal"/>
+              <w:widowControl w:val="false"/>
               <w:rPr>
                 <w:rFonts w:cs="Calibri" w:cstheme="minorHAnsi"/>
                 <w:b/>
@@ -2026,6 +2052,7 @@
           <w:p>
             <w:pPr>
               <w:pStyle w:val="Normal"/>
+              <w:widowControl w:val="false"/>
               <w:rPr>
                 <w:rFonts w:cs="Calibri" w:cstheme="minorHAnsi"/>
                 <w:sz w:val="18"/>
@@ -2062,6 +2089,7 @@
           <w:p>
             <w:pPr>
               <w:pStyle w:val="Normal"/>
+              <w:widowControl w:val="false"/>
               <w:rPr>
                 <w:rFonts w:cs="Calibri" w:cstheme="minorHAnsi"/>
                 <w:sz w:val="20"/>
@@ -2129,7 +2157,7 @@
       <w:footerReference w:type="first" r:id="rId5"/>
       <w:type w:val="nextPage"/>
       <w:pgSz w:orient="landscape" w:w="15840" w:h="12240"/>
-      <w:pgMar w:left="851" w:right="851" w:header="624" w:top="681" w:footer="709" w:bottom="766" w:gutter="0"/>
+      <w:pgMar w:left="851" w:right="851" w:gutter="0" w:header="624" w:top="681" w:footer="709" w:bottom="766"/>
       <w:pgNumType w:fmt="decimal"/>
       <w:formProt w:val="false"/>
       <w:titlePg/>
@@ -2141,7 +2169,7 @@
 </file>
 
 <file path=word/footer1.xml><?xml version="1.0" encoding="utf-8"?>
-<w:ftr xmlns:o="urn:schemas-microsoft-com:office:office" xmlns:r="http://schemas.openxmlformats.org/officeDocument/2006/relationships" xmlns:v="urn:schemas-microsoft-com:vml" xmlns:w="http://schemas.openxmlformats.org/wordprocessingml/2006/main" xmlns:w10="urn:schemas-microsoft-com:office:word" xmlns:wp="http://schemas.openxmlformats.org/drawingml/2006/wordprocessingDrawing" xmlns:wps="http://schemas.microsoft.com/office/word/2010/wordprocessingShape" xmlns:wpg="http://schemas.microsoft.com/office/word/2010/wordprocessingGroup" xmlns:mc="http://schemas.openxmlformats.org/markup-compatibility/2006" xmlns:wp14="http://schemas.microsoft.com/office/word/2010/wordprocessingDrawing" xmlns:w14="http://schemas.microsoft.com/office/word/2010/wordml" mc:Ignorable="w14 wp14">
+<w:ftr xmlns:o="urn:schemas-microsoft-com:office:office" xmlns:r="http://schemas.openxmlformats.org/officeDocument/2006/relationships" xmlns:v="urn:schemas-microsoft-com:vml" xmlns:w="http://schemas.openxmlformats.org/wordprocessingml/2006/main" xmlns:w10="urn:schemas-microsoft-com:office:word" xmlns:wp="http://schemas.openxmlformats.org/drawingml/2006/wordprocessingDrawing" xmlns:wps="http://schemas.microsoft.com/office/word/2010/wordprocessingShape" xmlns:wpg="http://schemas.microsoft.com/office/word/2010/wordprocessingGroup" xmlns:mc="http://schemas.openxmlformats.org/markup-compatibility/2006" xmlns:wp14="http://schemas.microsoft.com/office/word/2010/wordprocessingDrawing" xmlns:w14="http://schemas.microsoft.com/office/word/2010/wordml" xmlns:w15="http://schemas.microsoft.com/office/word/2012/wordml" mc:Ignorable="w14 wp14 w15">
   <w:p>
     <w:pPr>
       <w:pStyle w:val="Footer"/>
@@ -2174,7 +2202,7 @@
         <w:szCs w:val="16"/>
         <w:bCs/>
       </w:rPr>
-      <w:instrText> PAGE </w:instrText>
+      <w:instrText xml:space="preserve"> PAGE </w:instrText>
     </w:r>
     <w:r>
       <w:rPr>
@@ -2226,7 +2254,7 @@
         <w:szCs w:val="16"/>
         <w:bCs/>
       </w:rPr>
-      <w:instrText> NUMPAGES </w:instrText>
+      <w:instrText xml:space="preserve"> NUMPAGES </w:instrText>
     </w:r>
     <w:r>
       <w:rPr>
@@ -2260,7 +2288,7 @@
 </file>
 
 <file path=word/footer2.xml><?xml version="1.0" encoding="utf-8"?>
-<w:ftr xmlns:o="urn:schemas-microsoft-com:office:office" xmlns:r="http://schemas.openxmlformats.org/officeDocument/2006/relationships" xmlns:v="urn:schemas-microsoft-com:vml" xmlns:w="http://schemas.openxmlformats.org/wordprocessingml/2006/main" xmlns:w10="urn:schemas-microsoft-com:office:word" xmlns:wp="http://schemas.openxmlformats.org/drawingml/2006/wordprocessingDrawing" xmlns:wps="http://schemas.microsoft.com/office/word/2010/wordprocessingShape" xmlns:wpg="http://schemas.microsoft.com/office/word/2010/wordprocessingGroup" xmlns:mc="http://schemas.openxmlformats.org/markup-compatibility/2006" xmlns:wp14="http://schemas.microsoft.com/office/word/2010/wordprocessingDrawing" xmlns:w14="http://schemas.microsoft.com/office/word/2010/wordml" mc:Ignorable="w14 wp14">
+<w:ftr xmlns:o="urn:schemas-microsoft-com:office:office" xmlns:r="http://schemas.openxmlformats.org/officeDocument/2006/relationships" xmlns:v="urn:schemas-microsoft-com:vml" xmlns:w="http://schemas.openxmlformats.org/wordprocessingml/2006/main" xmlns:w10="urn:schemas-microsoft-com:office:word" xmlns:wp="http://schemas.openxmlformats.org/drawingml/2006/wordprocessingDrawing" xmlns:wps="http://schemas.microsoft.com/office/word/2010/wordprocessingShape" xmlns:wpg="http://schemas.microsoft.com/office/word/2010/wordprocessingGroup" xmlns:mc="http://schemas.openxmlformats.org/markup-compatibility/2006" xmlns:wp14="http://schemas.microsoft.com/office/word/2010/wordprocessingDrawing" xmlns:w14="http://schemas.microsoft.com/office/word/2010/wordml" xmlns:w15="http://schemas.microsoft.com/office/word/2012/wordml" mc:Ignorable="w14 wp14 w15">
   <w:p>
     <w:pPr>
       <w:pStyle w:val="Footer"/>
@@ -2293,7 +2321,7 @@
         <w:szCs w:val="16"/>
         <w:bCs/>
       </w:rPr>
-      <w:instrText> PAGE </w:instrText>
+      <w:instrText xml:space="preserve"> PAGE </w:instrText>
     </w:r>
     <w:r>
       <w:rPr>
@@ -2345,7 +2373,7 @@
         <w:szCs w:val="16"/>
         <w:bCs/>
       </w:rPr>
-      <w:instrText> NUMPAGES </w:instrText>
+      <w:instrText xml:space="preserve"> NUMPAGES </w:instrText>
     </w:r>
     <w:r>
       <w:rPr>
@@ -2379,7 +2407,7 @@
 </file>
 
 <file path=word/header1.xml><?xml version="1.0" encoding="utf-8"?>
-<w:hdr xmlns:o="urn:schemas-microsoft-com:office:office" xmlns:r="http://schemas.openxmlformats.org/officeDocument/2006/relationships" xmlns:v="urn:schemas-microsoft-com:vml" xmlns:w="http://schemas.openxmlformats.org/wordprocessingml/2006/main" xmlns:w10="urn:schemas-microsoft-com:office:word" xmlns:wp="http://schemas.openxmlformats.org/drawingml/2006/wordprocessingDrawing" xmlns:wps="http://schemas.microsoft.com/office/word/2010/wordprocessingShape" xmlns:wpg="http://schemas.microsoft.com/office/word/2010/wordprocessingGroup" xmlns:mc="http://schemas.openxmlformats.org/markup-compatibility/2006" xmlns:wp14="http://schemas.microsoft.com/office/word/2010/wordprocessingDrawing" xmlns:w14="http://schemas.microsoft.com/office/word/2010/wordml" mc:Ignorable="w14 wp14">
+<w:hdr xmlns:o="urn:schemas-microsoft-com:office:office" xmlns:r="http://schemas.openxmlformats.org/officeDocument/2006/relationships" xmlns:v="urn:schemas-microsoft-com:vml" xmlns:w="http://schemas.openxmlformats.org/wordprocessingml/2006/main" xmlns:w10="urn:schemas-microsoft-com:office:word" xmlns:wp="http://schemas.openxmlformats.org/drawingml/2006/wordprocessingDrawing" xmlns:wps="http://schemas.microsoft.com/office/word/2010/wordprocessingShape" xmlns:wpg="http://schemas.microsoft.com/office/word/2010/wordprocessingGroup" xmlns:mc="http://schemas.openxmlformats.org/markup-compatibility/2006" xmlns:wp14="http://schemas.microsoft.com/office/word/2010/wordprocessingDrawing" xmlns:w14="http://schemas.microsoft.com/office/word/2010/wordml" xmlns:w15="http://schemas.microsoft.com/office/word/2012/wordml" mc:Ignorable="w14 wp14 w15">
   <w:p>
     <w:pPr>
       <w:pStyle w:val="Header"/>
@@ -2394,7 +2422,7 @@
 </file>
 
 <file path=word/header2.xml><?xml version="1.0" encoding="utf-8"?>
-<w:hdr xmlns:o="urn:schemas-microsoft-com:office:office" xmlns:r="http://schemas.openxmlformats.org/officeDocument/2006/relationships" xmlns:v="urn:schemas-microsoft-com:vml" xmlns:w="http://schemas.openxmlformats.org/wordprocessingml/2006/main" xmlns:w10="urn:schemas-microsoft-com:office:word" xmlns:wp="http://schemas.openxmlformats.org/drawingml/2006/wordprocessingDrawing" xmlns:wps="http://schemas.microsoft.com/office/word/2010/wordprocessingShape" xmlns:wpg="http://schemas.microsoft.com/office/word/2010/wordprocessingGroup" xmlns:mc="http://schemas.openxmlformats.org/markup-compatibility/2006" xmlns:wp14="http://schemas.microsoft.com/office/word/2010/wordprocessingDrawing" xmlns:w14="http://schemas.microsoft.com/office/word/2010/wordml" mc:Ignorable="w14 wp14">
+<w:hdr xmlns:o="urn:schemas-microsoft-com:office:office" xmlns:r="http://schemas.openxmlformats.org/officeDocument/2006/relationships" xmlns:v="urn:schemas-microsoft-com:vml" xmlns:w="http://schemas.openxmlformats.org/wordprocessingml/2006/main" xmlns:w10="urn:schemas-microsoft-com:office:word" xmlns:wp="http://schemas.openxmlformats.org/drawingml/2006/wordprocessingDrawing" xmlns:wps="http://schemas.microsoft.com/office/word/2010/wordprocessingShape" xmlns:wpg="http://schemas.microsoft.com/office/word/2010/wordprocessingGroup" xmlns:mc="http://schemas.openxmlformats.org/markup-compatibility/2006" xmlns:wp14="http://schemas.microsoft.com/office/word/2010/wordprocessingDrawing" xmlns:w14="http://schemas.microsoft.com/office/word/2010/wordml" xmlns:w15="http://schemas.microsoft.com/office/word/2012/wordml" mc:Ignorable="w14 wp14 w15">
   <w:p>
     <w:pPr>
       <w:pStyle w:val="Header"/>
@@ -2969,7 +2997,6 @@
   <w:style w:type="character" w:styleId="CommentTextChar" w:customStyle="1">
     <w:name w:val="Comment Text Char"/>
     <w:basedOn w:val="DefaultParagraphFont"/>
-    <w:link w:val="CommentText"/>
     <w:uiPriority w:val="99"/>
     <w:qFormat/>
     <w:rPr>
@@ -2981,7 +3008,6 @@
   <w:style w:type="character" w:styleId="CommentSubjectChar" w:customStyle="1">
     <w:name w:val="Comment Subject Char"/>
     <w:basedOn w:val="CommentTextChar"/>
-    <w:link w:val="CommentSubject"/>
     <w:uiPriority w:val="99"/>
     <w:semiHidden/>
     <w:qFormat/>
@@ -3264,7 +3290,6 @@
     <w:semiHidden/>
     <w:unhideWhenUsed/>
     <w:tblPr>
-      <w:tblInd w:w="0" w:type="dxa"/>
       <w:tblCellMar>
         <w:top w:w="0" w:type="dxa"/>
         <w:left w:w="108" w:type="dxa"/>

</xml_diff>

<commit_message>
[Track-469] AS add newline before ministers
</commit_message>
<xml_diff>
--- a/epictrack-api/src/api/reports/report_templates/anticipated_schedule.docx
+++ b/epictrack-api/src/api/reports/report_templates/anticipated_schedule.docx
@@ -1,6 +1,6 @@
 
 <file path=word/document.xml><?xml version="1.0" encoding="utf-8"?>
-<w:document xmlns:o="urn:schemas-microsoft-com:office:office" xmlns:r="http://schemas.openxmlformats.org/officeDocument/2006/relationships" xmlns:v="urn:schemas-microsoft-com:vml" xmlns:w="http://schemas.openxmlformats.org/wordprocessingml/2006/main" xmlns:w10="urn:schemas-microsoft-com:office:word" xmlns:wp="http://schemas.openxmlformats.org/drawingml/2006/wordprocessingDrawing" xmlns:wps="http://schemas.microsoft.com/office/word/2010/wordprocessingShape" xmlns:wpg="http://schemas.microsoft.com/office/word/2010/wordprocessingGroup" xmlns:mc="http://schemas.openxmlformats.org/markup-compatibility/2006" xmlns:wp14="http://schemas.microsoft.com/office/word/2010/wordprocessingDrawing" xmlns:w14="http://schemas.microsoft.com/office/word/2010/wordml" xmlns:w15="http://schemas.microsoft.com/office/word/2012/wordml" mc:Ignorable="w14 wp14 w15">
+<w:document xmlns:o="urn:schemas-microsoft-com:office:office" xmlns:r="http://schemas.openxmlformats.org/officeDocument/2006/relationships" xmlns:v="urn:schemas-microsoft-com:vml" xmlns:w="http://schemas.openxmlformats.org/wordprocessingml/2006/main" xmlns:w10="urn:schemas-microsoft-com:office:word" xmlns:wp="http://schemas.openxmlformats.org/drawingml/2006/wordprocessingDrawing" xmlns:wps="http://schemas.microsoft.com/office/word/2010/wordprocessingShape" xmlns:wpg="http://schemas.microsoft.com/office/word/2010/wordprocessingGroup" xmlns:mc="http://schemas.openxmlformats.org/markup-compatibility/2006" xmlns:wp14="http://schemas.microsoft.com/office/word/2010/wordprocessingDrawing" xmlns:w14="http://schemas.microsoft.com/office/word/2010/wordml" mc:Ignorable="w14 wp14">
   <w:body>
     <w:p>
       <w:pPr>
@@ -167,7 +167,6 @@
         <w:tblW w:w="14417" w:type="dxa"/>
         <w:jc w:val="left"/>
         <w:tblInd w:w="-289" w:type="dxa"/>
-        <w:tblLayout w:type="fixed"/>
         <w:tblCellMar>
           <w:top w:w="0" w:type="dxa"/>
           <w:left w:w="108" w:type="dxa"/>
@@ -683,8 +682,22 @@
                 <w:szCs w:val="18"/>
                 <w:lang w:val="en-US"/>
               </w:rPr>
-              <w:t xml:space="preserve">Decision to be made by: </w:t>
-            </w:r>
+              <w:t>Decision to be made by:</w:t>
+            </w:r>
+          </w:p>
+          <w:p>
+            <w:pPr>
+              <w:pStyle w:val="Normal"/>
+              <w:widowControl w:val="false"/>
+              <w:spacing w:lineRule="atLeast" w:line="201"/>
+              <w:rPr>
+                <w:rFonts w:cs="Calibri" w:cstheme="minorHAnsi"/>
+                <w:bCs/>
+                <w:sz w:val="18"/>
+                <w:szCs w:val="18"/>
+                <w:lang w:val="en-US"/>
+              </w:rPr>
+            </w:pPr>
             <w:r>
               <w:rPr>
                 <w:rFonts w:eastAsia="Calibri" w:cs="Calibri" w:cstheme="minorHAnsi"/>
@@ -1527,8 +1540,15 @@
                 <w:szCs w:val="18"/>
                 <w:lang w:val="en-US"/>
               </w:rPr>
-              <w:t xml:space="preserve">Decision to be made by: </w:t>
-            </w:r>
+              <w:t>Decision to be made by:</w:t>
+            </w:r>
+          </w:p>
+          <w:p>
+            <w:pPr>
+              <w:pStyle w:val="Normal"/>
+              <w:widowControl w:val="false"/>
+              <w:rPr/>
+            </w:pPr>
             <w:r>
               <w:rPr>
                 <w:rFonts w:eastAsia="Calibri" w:cs="Calibri" w:cstheme="minorHAnsi"/>
@@ -2157,7 +2177,7 @@
       <w:footerReference w:type="first" r:id="rId5"/>
       <w:type w:val="nextPage"/>
       <w:pgSz w:orient="landscape" w:w="15840" w:h="12240"/>
-      <w:pgMar w:left="851" w:right="851" w:gutter="0" w:header="624" w:top="681" w:footer="709" w:bottom="766"/>
+      <w:pgMar w:left="851" w:right="851" w:header="624" w:top="681" w:footer="709" w:bottom="766" w:gutter="0"/>
       <w:pgNumType w:fmt="decimal"/>
       <w:formProt w:val="false"/>
       <w:titlePg/>
@@ -2169,7 +2189,7 @@
 </file>
 
 <file path=word/footer1.xml><?xml version="1.0" encoding="utf-8"?>
-<w:ftr xmlns:o="urn:schemas-microsoft-com:office:office" xmlns:r="http://schemas.openxmlformats.org/officeDocument/2006/relationships" xmlns:v="urn:schemas-microsoft-com:vml" xmlns:w="http://schemas.openxmlformats.org/wordprocessingml/2006/main" xmlns:w10="urn:schemas-microsoft-com:office:word" xmlns:wp="http://schemas.openxmlformats.org/drawingml/2006/wordprocessingDrawing" xmlns:wps="http://schemas.microsoft.com/office/word/2010/wordprocessingShape" xmlns:wpg="http://schemas.microsoft.com/office/word/2010/wordprocessingGroup" xmlns:mc="http://schemas.openxmlformats.org/markup-compatibility/2006" xmlns:wp14="http://schemas.microsoft.com/office/word/2010/wordprocessingDrawing" xmlns:w14="http://schemas.microsoft.com/office/word/2010/wordml" xmlns:w15="http://schemas.microsoft.com/office/word/2012/wordml" mc:Ignorable="w14 wp14 w15">
+<w:ftr xmlns:o="urn:schemas-microsoft-com:office:office" xmlns:r="http://schemas.openxmlformats.org/officeDocument/2006/relationships" xmlns:v="urn:schemas-microsoft-com:vml" xmlns:w="http://schemas.openxmlformats.org/wordprocessingml/2006/main" xmlns:w10="urn:schemas-microsoft-com:office:word" xmlns:wp="http://schemas.openxmlformats.org/drawingml/2006/wordprocessingDrawing" xmlns:wps="http://schemas.microsoft.com/office/word/2010/wordprocessingShape" xmlns:wpg="http://schemas.microsoft.com/office/word/2010/wordprocessingGroup" xmlns:mc="http://schemas.openxmlformats.org/markup-compatibility/2006" xmlns:wp14="http://schemas.microsoft.com/office/word/2010/wordprocessingDrawing" xmlns:w14="http://schemas.microsoft.com/office/word/2010/wordml" mc:Ignorable="w14 wp14">
   <w:p>
     <w:pPr>
       <w:pStyle w:val="Footer"/>
@@ -2202,7 +2222,7 @@
         <w:szCs w:val="16"/>
         <w:bCs/>
       </w:rPr>
-      <w:instrText xml:space="preserve"> PAGE </w:instrText>
+      <w:instrText> PAGE </w:instrText>
     </w:r>
     <w:r>
       <w:rPr>
@@ -2254,7 +2274,7 @@
         <w:szCs w:val="16"/>
         <w:bCs/>
       </w:rPr>
-      <w:instrText xml:space="preserve"> NUMPAGES </w:instrText>
+      <w:instrText> NUMPAGES </w:instrText>
     </w:r>
     <w:r>
       <w:rPr>
@@ -2288,7 +2308,7 @@
 </file>
 
 <file path=word/footer2.xml><?xml version="1.0" encoding="utf-8"?>
-<w:ftr xmlns:o="urn:schemas-microsoft-com:office:office" xmlns:r="http://schemas.openxmlformats.org/officeDocument/2006/relationships" xmlns:v="urn:schemas-microsoft-com:vml" xmlns:w="http://schemas.openxmlformats.org/wordprocessingml/2006/main" xmlns:w10="urn:schemas-microsoft-com:office:word" xmlns:wp="http://schemas.openxmlformats.org/drawingml/2006/wordprocessingDrawing" xmlns:wps="http://schemas.microsoft.com/office/word/2010/wordprocessingShape" xmlns:wpg="http://schemas.microsoft.com/office/word/2010/wordprocessingGroup" xmlns:mc="http://schemas.openxmlformats.org/markup-compatibility/2006" xmlns:wp14="http://schemas.microsoft.com/office/word/2010/wordprocessingDrawing" xmlns:w14="http://schemas.microsoft.com/office/word/2010/wordml" xmlns:w15="http://schemas.microsoft.com/office/word/2012/wordml" mc:Ignorable="w14 wp14 w15">
+<w:ftr xmlns:o="urn:schemas-microsoft-com:office:office" xmlns:r="http://schemas.openxmlformats.org/officeDocument/2006/relationships" xmlns:v="urn:schemas-microsoft-com:vml" xmlns:w="http://schemas.openxmlformats.org/wordprocessingml/2006/main" xmlns:w10="urn:schemas-microsoft-com:office:word" xmlns:wp="http://schemas.openxmlformats.org/drawingml/2006/wordprocessingDrawing" xmlns:wps="http://schemas.microsoft.com/office/word/2010/wordprocessingShape" xmlns:wpg="http://schemas.microsoft.com/office/word/2010/wordprocessingGroup" xmlns:mc="http://schemas.openxmlformats.org/markup-compatibility/2006" xmlns:wp14="http://schemas.microsoft.com/office/word/2010/wordprocessingDrawing" xmlns:w14="http://schemas.microsoft.com/office/word/2010/wordml" mc:Ignorable="w14 wp14">
   <w:p>
     <w:pPr>
       <w:pStyle w:val="Footer"/>
@@ -2321,7 +2341,7 @@
         <w:szCs w:val="16"/>
         <w:bCs/>
       </w:rPr>
-      <w:instrText xml:space="preserve"> PAGE </w:instrText>
+      <w:instrText> PAGE </w:instrText>
     </w:r>
     <w:r>
       <w:rPr>
@@ -2373,7 +2393,7 @@
         <w:szCs w:val="16"/>
         <w:bCs/>
       </w:rPr>
-      <w:instrText xml:space="preserve"> NUMPAGES </w:instrText>
+      <w:instrText> NUMPAGES </w:instrText>
     </w:r>
     <w:r>
       <w:rPr>
@@ -2407,7 +2427,7 @@
 </file>
 
 <file path=word/header1.xml><?xml version="1.0" encoding="utf-8"?>
-<w:hdr xmlns:o="urn:schemas-microsoft-com:office:office" xmlns:r="http://schemas.openxmlformats.org/officeDocument/2006/relationships" xmlns:v="urn:schemas-microsoft-com:vml" xmlns:w="http://schemas.openxmlformats.org/wordprocessingml/2006/main" xmlns:w10="urn:schemas-microsoft-com:office:word" xmlns:wp="http://schemas.openxmlformats.org/drawingml/2006/wordprocessingDrawing" xmlns:wps="http://schemas.microsoft.com/office/word/2010/wordprocessingShape" xmlns:wpg="http://schemas.microsoft.com/office/word/2010/wordprocessingGroup" xmlns:mc="http://schemas.openxmlformats.org/markup-compatibility/2006" xmlns:wp14="http://schemas.microsoft.com/office/word/2010/wordprocessingDrawing" xmlns:w14="http://schemas.microsoft.com/office/word/2010/wordml" xmlns:w15="http://schemas.microsoft.com/office/word/2012/wordml" mc:Ignorable="w14 wp14 w15">
+<w:hdr xmlns:o="urn:schemas-microsoft-com:office:office" xmlns:r="http://schemas.openxmlformats.org/officeDocument/2006/relationships" xmlns:v="urn:schemas-microsoft-com:vml" xmlns:w="http://schemas.openxmlformats.org/wordprocessingml/2006/main" xmlns:w10="urn:schemas-microsoft-com:office:word" xmlns:wp="http://schemas.openxmlformats.org/drawingml/2006/wordprocessingDrawing" xmlns:wps="http://schemas.microsoft.com/office/word/2010/wordprocessingShape" xmlns:wpg="http://schemas.microsoft.com/office/word/2010/wordprocessingGroup" xmlns:mc="http://schemas.openxmlformats.org/markup-compatibility/2006" xmlns:wp14="http://schemas.microsoft.com/office/word/2010/wordprocessingDrawing" xmlns:w14="http://schemas.microsoft.com/office/word/2010/wordml" mc:Ignorable="w14 wp14">
   <w:p>
     <w:pPr>
       <w:pStyle w:val="Header"/>
@@ -2422,7 +2442,7 @@
 </file>
 
 <file path=word/header2.xml><?xml version="1.0" encoding="utf-8"?>
-<w:hdr xmlns:o="urn:schemas-microsoft-com:office:office" xmlns:r="http://schemas.openxmlformats.org/officeDocument/2006/relationships" xmlns:v="urn:schemas-microsoft-com:vml" xmlns:w="http://schemas.openxmlformats.org/wordprocessingml/2006/main" xmlns:w10="urn:schemas-microsoft-com:office:word" xmlns:wp="http://schemas.openxmlformats.org/drawingml/2006/wordprocessingDrawing" xmlns:wps="http://schemas.microsoft.com/office/word/2010/wordprocessingShape" xmlns:wpg="http://schemas.microsoft.com/office/word/2010/wordprocessingGroup" xmlns:mc="http://schemas.openxmlformats.org/markup-compatibility/2006" xmlns:wp14="http://schemas.microsoft.com/office/word/2010/wordprocessingDrawing" xmlns:w14="http://schemas.microsoft.com/office/word/2010/wordml" xmlns:w15="http://schemas.microsoft.com/office/word/2012/wordml" mc:Ignorable="w14 wp14 w15">
+<w:hdr xmlns:o="urn:schemas-microsoft-com:office:office" xmlns:r="http://schemas.openxmlformats.org/officeDocument/2006/relationships" xmlns:v="urn:schemas-microsoft-com:vml" xmlns:w="http://schemas.openxmlformats.org/wordprocessingml/2006/main" xmlns:w10="urn:schemas-microsoft-com:office:word" xmlns:wp="http://schemas.openxmlformats.org/drawingml/2006/wordprocessingDrawing" xmlns:wps="http://schemas.microsoft.com/office/word/2010/wordprocessingShape" xmlns:wpg="http://schemas.microsoft.com/office/word/2010/wordprocessingGroup" xmlns:mc="http://schemas.openxmlformats.org/markup-compatibility/2006" xmlns:wp14="http://schemas.microsoft.com/office/word/2010/wordprocessingDrawing" xmlns:w14="http://schemas.microsoft.com/office/word/2010/wordml" mc:Ignorable="w14 wp14">
   <w:p>
     <w:pPr>
       <w:pStyle w:val="Header"/>

</xml_diff>

<commit_message>
[Track-469] AS add newline before ministers (#2575)
</commit_message>
<xml_diff>
--- a/epictrack-api/src/api/reports/report_templates/anticipated_schedule.docx
+++ b/epictrack-api/src/api/reports/report_templates/anticipated_schedule.docx
@@ -1,6 +1,6 @@
 
 <file path=word/document.xml><?xml version="1.0" encoding="utf-8"?>
-<w:document xmlns:o="urn:schemas-microsoft-com:office:office" xmlns:r="http://schemas.openxmlformats.org/officeDocument/2006/relationships" xmlns:v="urn:schemas-microsoft-com:vml" xmlns:w="http://schemas.openxmlformats.org/wordprocessingml/2006/main" xmlns:w10="urn:schemas-microsoft-com:office:word" xmlns:wp="http://schemas.openxmlformats.org/drawingml/2006/wordprocessingDrawing" xmlns:wps="http://schemas.microsoft.com/office/word/2010/wordprocessingShape" xmlns:wpg="http://schemas.microsoft.com/office/word/2010/wordprocessingGroup" xmlns:mc="http://schemas.openxmlformats.org/markup-compatibility/2006" xmlns:wp14="http://schemas.microsoft.com/office/word/2010/wordprocessingDrawing" xmlns:w14="http://schemas.microsoft.com/office/word/2010/wordml" xmlns:w15="http://schemas.microsoft.com/office/word/2012/wordml" mc:Ignorable="w14 wp14 w15">
+<w:document xmlns:o="urn:schemas-microsoft-com:office:office" xmlns:r="http://schemas.openxmlformats.org/officeDocument/2006/relationships" xmlns:v="urn:schemas-microsoft-com:vml" xmlns:w="http://schemas.openxmlformats.org/wordprocessingml/2006/main" xmlns:w10="urn:schemas-microsoft-com:office:word" xmlns:wp="http://schemas.openxmlformats.org/drawingml/2006/wordprocessingDrawing" xmlns:wps="http://schemas.microsoft.com/office/word/2010/wordprocessingShape" xmlns:wpg="http://schemas.microsoft.com/office/word/2010/wordprocessingGroup" xmlns:mc="http://schemas.openxmlformats.org/markup-compatibility/2006" xmlns:wp14="http://schemas.microsoft.com/office/word/2010/wordprocessingDrawing" xmlns:w14="http://schemas.microsoft.com/office/word/2010/wordml" mc:Ignorable="w14 wp14">
   <w:body>
     <w:p>
       <w:pPr>
@@ -167,7 +167,6 @@
         <w:tblW w:w="14417" w:type="dxa"/>
         <w:jc w:val="left"/>
         <w:tblInd w:w="-289" w:type="dxa"/>
-        <w:tblLayout w:type="fixed"/>
         <w:tblCellMar>
           <w:top w:w="0" w:type="dxa"/>
           <w:left w:w="108" w:type="dxa"/>
@@ -683,8 +682,22 @@
                 <w:szCs w:val="18"/>
                 <w:lang w:val="en-US"/>
               </w:rPr>
-              <w:t xml:space="preserve">Decision to be made by: </w:t>
-            </w:r>
+              <w:t>Decision to be made by:</w:t>
+            </w:r>
+          </w:p>
+          <w:p>
+            <w:pPr>
+              <w:pStyle w:val="Normal"/>
+              <w:widowControl w:val="false"/>
+              <w:spacing w:lineRule="atLeast" w:line="201"/>
+              <w:rPr>
+                <w:rFonts w:cs="Calibri" w:cstheme="minorHAnsi"/>
+                <w:bCs/>
+                <w:sz w:val="18"/>
+                <w:szCs w:val="18"/>
+                <w:lang w:val="en-US"/>
+              </w:rPr>
+            </w:pPr>
             <w:r>
               <w:rPr>
                 <w:rFonts w:eastAsia="Calibri" w:cs="Calibri" w:cstheme="minorHAnsi"/>
@@ -1527,8 +1540,15 @@
                 <w:szCs w:val="18"/>
                 <w:lang w:val="en-US"/>
               </w:rPr>
-              <w:t xml:space="preserve">Decision to be made by: </w:t>
-            </w:r>
+              <w:t>Decision to be made by:</w:t>
+            </w:r>
+          </w:p>
+          <w:p>
+            <w:pPr>
+              <w:pStyle w:val="Normal"/>
+              <w:widowControl w:val="false"/>
+              <w:rPr/>
+            </w:pPr>
             <w:r>
               <w:rPr>
                 <w:rFonts w:eastAsia="Calibri" w:cs="Calibri" w:cstheme="minorHAnsi"/>
@@ -2157,7 +2177,7 @@
       <w:footerReference w:type="first" r:id="rId5"/>
       <w:type w:val="nextPage"/>
       <w:pgSz w:orient="landscape" w:w="15840" w:h="12240"/>
-      <w:pgMar w:left="851" w:right="851" w:gutter="0" w:header="624" w:top="681" w:footer="709" w:bottom="766"/>
+      <w:pgMar w:left="851" w:right="851" w:header="624" w:top="681" w:footer="709" w:bottom="766" w:gutter="0"/>
       <w:pgNumType w:fmt="decimal"/>
       <w:formProt w:val="false"/>
       <w:titlePg/>
@@ -2169,7 +2189,7 @@
 </file>
 
 <file path=word/footer1.xml><?xml version="1.0" encoding="utf-8"?>
-<w:ftr xmlns:o="urn:schemas-microsoft-com:office:office" xmlns:r="http://schemas.openxmlformats.org/officeDocument/2006/relationships" xmlns:v="urn:schemas-microsoft-com:vml" xmlns:w="http://schemas.openxmlformats.org/wordprocessingml/2006/main" xmlns:w10="urn:schemas-microsoft-com:office:word" xmlns:wp="http://schemas.openxmlformats.org/drawingml/2006/wordprocessingDrawing" xmlns:wps="http://schemas.microsoft.com/office/word/2010/wordprocessingShape" xmlns:wpg="http://schemas.microsoft.com/office/word/2010/wordprocessingGroup" xmlns:mc="http://schemas.openxmlformats.org/markup-compatibility/2006" xmlns:wp14="http://schemas.microsoft.com/office/word/2010/wordprocessingDrawing" xmlns:w14="http://schemas.microsoft.com/office/word/2010/wordml" xmlns:w15="http://schemas.microsoft.com/office/word/2012/wordml" mc:Ignorable="w14 wp14 w15">
+<w:ftr xmlns:o="urn:schemas-microsoft-com:office:office" xmlns:r="http://schemas.openxmlformats.org/officeDocument/2006/relationships" xmlns:v="urn:schemas-microsoft-com:vml" xmlns:w="http://schemas.openxmlformats.org/wordprocessingml/2006/main" xmlns:w10="urn:schemas-microsoft-com:office:word" xmlns:wp="http://schemas.openxmlformats.org/drawingml/2006/wordprocessingDrawing" xmlns:wps="http://schemas.microsoft.com/office/word/2010/wordprocessingShape" xmlns:wpg="http://schemas.microsoft.com/office/word/2010/wordprocessingGroup" xmlns:mc="http://schemas.openxmlformats.org/markup-compatibility/2006" xmlns:wp14="http://schemas.microsoft.com/office/word/2010/wordprocessingDrawing" xmlns:w14="http://schemas.microsoft.com/office/word/2010/wordml" mc:Ignorable="w14 wp14">
   <w:p>
     <w:pPr>
       <w:pStyle w:val="Footer"/>
@@ -2202,7 +2222,7 @@
         <w:szCs w:val="16"/>
         <w:bCs/>
       </w:rPr>
-      <w:instrText xml:space="preserve"> PAGE </w:instrText>
+      <w:instrText> PAGE </w:instrText>
     </w:r>
     <w:r>
       <w:rPr>
@@ -2254,7 +2274,7 @@
         <w:szCs w:val="16"/>
         <w:bCs/>
       </w:rPr>
-      <w:instrText xml:space="preserve"> NUMPAGES </w:instrText>
+      <w:instrText> NUMPAGES </w:instrText>
     </w:r>
     <w:r>
       <w:rPr>
@@ -2288,7 +2308,7 @@
 </file>
 
 <file path=word/footer2.xml><?xml version="1.0" encoding="utf-8"?>
-<w:ftr xmlns:o="urn:schemas-microsoft-com:office:office" xmlns:r="http://schemas.openxmlformats.org/officeDocument/2006/relationships" xmlns:v="urn:schemas-microsoft-com:vml" xmlns:w="http://schemas.openxmlformats.org/wordprocessingml/2006/main" xmlns:w10="urn:schemas-microsoft-com:office:word" xmlns:wp="http://schemas.openxmlformats.org/drawingml/2006/wordprocessingDrawing" xmlns:wps="http://schemas.microsoft.com/office/word/2010/wordprocessingShape" xmlns:wpg="http://schemas.microsoft.com/office/word/2010/wordprocessingGroup" xmlns:mc="http://schemas.openxmlformats.org/markup-compatibility/2006" xmlns:wp14="http://schemas.microsoft.com/office/word/2010/wordprocessingDrawing" xmlns:w14="http://schemas.microsoft.com/office/word/2010/wordml" xmlns:w15="http://schemas.microsoft.com/office/word/2012/wordml" mc:Ignorable="w14 wp14 w15">
+<w:ftr xmlns:o="urn:schemas-microsoft-com:office:office" xmlns:r="http://schemas.openxmlformats.org/officeDocument/2006/relationships" xmlns:v="urn:schemas-microsoft-com:vml" xmlns:w="http://schemas.openxmlformats.org/wordprocessingml/2006/main" xmlns:w10="urn:schemas-microsoft-com:office:word" xmlns:wp="http://schemas.openxmlformats.org/drawingml/2006/wordprocessingDrawing" xmlns:wps="http://schemas.microsoft.com/office/word/2010/wordprocessingShape" xmlns:wpg="http://schemas.microsoft.com/office/word/2010/wordprocessingGroup" xmlns:mc="http://schemas.openxmlformats.org/markup-compatibility/2006" xmlns:wp14="http://schemas.microsoft.com/office/word/2010/wordprocessingDrawing" xmlns:w14="http://schemas.microsoft.com/office/word/2010/wordml" mc:Ignorable="w14 wp14">
   <w:p>
     <w:pPr>
       <w:pStyle w:val="Footer"/>
@@ -2321,7 +2341,7 @@
         <w:szCs w:val="16"/>
         <w:bCs/>
       </w:rPr>
-      <w:instrText xml:space="preserve"> PAGE </w:instrText>
+      <w:instrText> PAGE </w:instrText>
     </w:r>
     <w:r>
       <w:rPr>
@@ -2373,7 +2393,7 @@
         <w:szCs w:val="16"/>
         <w:bCs/>
       </w:rPr>
-      <w:instrText xml:space="preserve"> NUMPAGES </w:instrText>
+      <w:instrText> NUMPAGES </w:instrText>
     </w:r>
     <w:r>
       <w:rPr>
@@ -2407,7 +2427,7 @@
 </file>
 
 <file path=word/header1.xml><?xml version="1.0" encoding="utf-8"?>
-<w:hdr xmlns:o="urn:schemas-microsoft-com:office:office" xmlns:r="http://schemas.openxmlformats.org/officeDocument/2006/relationships" xmlns:v="urn:schemas-microsoft-com:vml" xmlns:w="http://schemas.openxmlformats.org/wordprocessingml/2006/main" xmlns:w10="urn:schemas-microsoft-com:office:word" xmlns:wp="http://schemas.openxmlformats.org/drawingml/2006/wordprocessingDrawing" xmlns:wps="http://schemas.microsoft.com/office/word/2010/wordprocessingShape" xmlns:wpg="http://schemas.microsoft.com/office/word/2010/wordprocessingGroup" xmlns:mc="http://schemas.openxmlformats.org/markup-compatibility/2006" xmlns:wp14="http://schemas.microsoft.com/office/word/2010/wordprocessingDrawing" xmlns:w14="http://schemas.microsoft.com/office/word/2010/wordml" xmlns:w15="http://schemas.microsoft.com/office/word/2012/wordml" mc:Ignorable="w14 wp14 w15">
+<w:hdr xmlns:o="urn:schemas-microsoft-com:office:office" xmlns:r="http://schemas.openxmlformats.org/officeDocument/2006/relationships" xmlns:v="urn:schemas-microsoft-com:vml" xmlns:w="http://schemas.openxmlformats.org/wordprocessingml/2006/main" xmlns:w10="urn:schemas-microsoft-com:office:word" xmlns:wp="http://schemas.openxmlformats.org/drawingml/2006/wordprocessingDrawing" xmlns:wps="http://schemas.microsoft.com/office/word/2010/wordprocessingShape" xmlns:wpg="http://schemas.microsoft.com/office/word/2010/wordprocessingGroup" xmlns:mc="http://schemas.openxmlformats.org/markup-compatibility/2006" xmlns:wp14="http://schemas.microsoft.com/office/word/2010/wordprocessingDrawing" xmlns:w14="http://schemas.microsoft.com/office/word/2010/wordml" mc:Ignorable="w14 wp14">
   <w:p>
     <w:pPr>
       <w:pStyle w:val="Header"/>
@@ -2422,7 +2442,7 @@
 </file>
 
 <file path=word/header2.xml><?xml version="1.0" encoding="utf-8"?>
-<w:hdr xmlns:o="urn:schemas-microsoft-com:office:office" xmlns:r="http://schemas.openxmlformats.org/officeDocument/2006/relationships" xmlns:v="urn:schemas-microsoft-com:vml" xmlns:w="http://schemas.openxmlformats.org/wordprocessingml/2006/main" xmlns:w10="urn:schemas-microsoft-com:office:word" xmlns:wp="http://schemas.openxmlformats.org/drawingml/2006/wordprocessingDrawing" xmlns:wps="http://schemas.microsoft.com/office/word/2010/wordprocessingShape" xmlns:wpg="http://schemas.microsoft.com/office/word/2010/wordprocessingGroup" xmlns:mc="http://schemas.openxmlformats.org/markup-compatibility/2006" xmlns:wp14="http://schemas.microsoft.com/office/word/2010/wordprocessingDrawing" xmlns:w14="http://schemas.microsoft.com/office/word/2010/wordml" xmlns:w15="http://schemas.microsoft.com/office/word/2012/wordml" mc:Ignorable="w14 wp14 w15">
+<w:hdr xmlns:o="urn:schemas-microsoft-com:office:office" xmlns:r="http://schemas.openxmlformats.org/officeDocument/2006/relationships" xmlns:v="urn:schemas-microsoft-com:vml" xmlns:w="http://schemas.openxmlformats.org/wordprocessingml/2006/main" xmlns:w10="urn:schemas-microsoft-com:office:word" xmlns:wp="http://schemas.openxmlformats.org/drawingml/2006/wordprocessingDrawing" xmlns:wps="http://schemas.microsoft.com/office/word/2010/wordprocessingShape" xmlns:wpg="http://schemas.microsoft.com/office/word/2010/wordprocessingGroup" xmlns:mc="http://schemas.openxmlformats.org/markup-compatibility/2006" xmlns:wp14="http://schemas.microsoft.com/office/word/2010/wordprocessingDrawing" xmlns:w14="http://schemas.microsoft.com/office/word/2010/wordml" mc:Ignorable="w14 wp14">
   <w:p>
     <w:pPr>
       <w:pStyle w:val="Header"/>

</xml_diff>

<commit_message>
[Track-515] modify AS anticipated date label
</commit_message>
<xml_diff>
--- a/epictrack-api/src/api/reports/report_templates/anticipated_schedule.docx
+++ b/epictrack-api/src/api/reports/report_templates/anticipated_schedule.docx
@@ -897,7 +897,58 @@
                 <w:sz w:val="18"/>
                 <w:szCs w:val="18"/>
               </w:rPr>
-              <w:t xml:space="preserve">{$item_val[i].anticipated_date_label}: </w:t>
+              <w:t>{$item_val[i].anticipated_date_</w:t>
+            </w:r>
+            <w:r>
+              <w:rPr>
+                <w:rFonts w:eastAsia="Calibri" w:cs="Calibri" w:cstheme="minorHAnsi"/>
+                <w:b/>
+                <w:bCs/>
+                <w:sz w:val="18"/>
+                <w:szCs w:val="18"/>
+              </w:rPr>
+              <w:t>title</w:t>
+            </w:r>
+            <w:r>
+              <w:rPr>
+                <w:rFonts w:eastAsia="Calibri" w:cs="Calibri" w:cstheme="minorHAnsi"/>
+                <w:b/>
+                <w:bCs/>
+                <w:sz w:val="18"/>
+                <w:szCs w:val="18"/>
+              </w:rPr>
+              <w:t>}</w:t>
+            </w:r>
+          </w:p>
+          <w:p>
+            <w:pPr>
+              <w:pStyle w:val="Normal"/>
+              <w:widowControl w:val="false"/>
+              <w:rPr>
+                <w:rFonts w:eastAsia="Calibri" w:cs="Calibri" w:cstheme="minorHAnsi"/>
+                <w:sz w:val="18"/>
+                <w:szCs w:val="18"/>
+              </w:rPr>
+            </w:pPr>
+            <w:r>
+              <w:rPr>
+                <w:rFonts w:eastAsia="Calibri" w:cs="Calibri" w:cstheme="minorHAnsi"/>
+                <w:b/>
+                <w:bCs/>
+                <w:sz w:val="18"/>
+                <w:szCs w:val="18"/>
+              </w:rPr>
+              <w:t>{$item_val[i].anticipated_date_label}:</w:t>
+            </w:r>
+            <w:r>
+              <w:rPr>
+                <w:rFonts w:eastAsia="Calibri" w:cs="Calibri" w:cstheme="minorHAnsi"/>
+                <w:b/>
+                <w:bCs/>
+                <w:sz w:val="18"/>
+                <w:szCs w:val="18"/>
+              </w:rPr>
+              <w:t xml:space="preserve"> </w:t>
             </w:r>
             <w:r>
               <w:rPr>

</xml_diff>

<commit_message>
[Track-515] modify AS anticipated date label (#2615)
</commit_message>
<xml_diff>
--- a/epictrack-api/src/api/reports/report_templates/anticipated_schedule.docx
+++ b/epictrack-api/src/api/reports/report_templates/anticipated_schedule.docx
@@ -897,7 +897,58 @@
                 <w:sz w:val="18"/>
                 <w:szCs w:val="18"/>
               </w:rPr>
-              <w:t xml:space="preserve">{$item_val[i].anticipated_date_label}: </w:t>
+              <w:t>{$item_val[i].anticipated_date_</w:t>
+            </w:r>
+            <w:r>
+              <w:rPr>
+                <w:rFonts w:eastAsia="Calibri" w:cs="Calibri" w:cstheme="minorHAnsi"/>
+                <w:b/>
+                <w:bCs/>
+                <w:sz w:val="18"/>
+                <w:szCs w:val="18"/>
+              </w:rPr>
+              <w:t>title</w:t>
+            </w:r>
+            <w:r>
+              <w:rPr>
+                <w:rFonts w:eastAsia="Calibri" w:cs="Calibri" w:cstheme="minorHAnsi"/>
+                <w:b/>
+                <w:bCs/>
+                <w:sz w:val="18"/>
+                <w:szCs w:val="18"/>
+              </w:rPr>
+              <w:t>}</w:t>
+            </w:r>
+          </w:p>
+          <w:p>
+            <w:pPr>
+              <w:pStyle w:val="Normal"/>
+              <w:widowControl w:val="false"/>
+              <w:rPr>
+                <w:rFonts w:eastAsia="Calibri" w:cs="Calibri" w:cstheme="minorHAnsi"/>
+                <w:sz w:val="18"/>
+                <w:szCs w:val="18"/>
+              </w:rPr>
+            </w:pPr>
+            <w:r>
+              <w:rPr>
+                <w:rFonts w:eastAsia="Calibri" w:cs="Calibri" w:cstheme="minorHAnsi"/>
+                <w:b/>
+                <w:bCs/>
+                <w:sz w:val="18"/>
+                <w:szCs w:val="18"/>
+              </w:rPr>
+              <w:t>{$item_val[i].anticipated_date_label}:</w:t>
+            </w:r>
+            <w:r>
+              <w:rPr>
+                <w:rFonts w:eastAsia="Calibri" w:cs="Calibri" w:cstheme="minorHAnsi"/>
+                <w:b/>
+                <w:bCs/>
+                <w:sz w:val="18"/>
+                <w:szCs w:val="18"/>
+              </w:rPr>
+              <w:t xml:space="preserve"> </w:t>
             </w:r>
             <w:r>
               <w:rPr>

</xml_diff>

<commit_message>
TRACK-724 update referral schedule decision to be made by
</commit_message>
<xml_diff>
--- a/epictrack-api/src/api/reports/report_templates/anticipated_schedule.docx
+++ b/epictrack-api/src/api/reports/report_templates/anticipated_schedule.docx
@@ -1,13 +1,12 @@
 
 <file path=word/document.xml><?xml version="1.0" encoding="utf-8"?>
-<w:document xmlns:o="urn:schemas-microsoft-com:office:office" xmlns:r="http://schemas.openxmlformats.org/officeDocument/2006/relationships" xmlns:v="urn:schemas-microsoft-com:vml" xmlns:w="http://schemas.openxmlformats.org/wordprocessingml/2006/main" xmlns:w10="urn:schemas-microsoft-com:office:word" xmlns:wp="http://schemas.openxmlformats.org/drawingml/2006/wordprocessingDrawing" xmlns:wps="http://schemas.microsoft.com/office/word/2010/wordprocessingShape" xmlns:wpg="http://schemas.microsoft.com/office/word/2010/wordprocessingGroup" xmlns:mc="http://schemas.openxmlformats.org/markup-compatibility/2006" xmlns:wp14="http://schemas.microsoft.com/office/word/2010/wordprocessingDrawing" xmlns:w14="http://schemas.microsoft.com/office/word/2010/wordml" mc:Ignorable="w14 wp14">
+<w:document xmlns:o="urn:schemas-microsoft-com:office:office" xmlns:r="http://schemas.openxmlformats.org/officeDocument/2006/relationships" xmlns:v="urn:schemas-microsoft-com:vml" xmlns:w="http://schemas.openxmlformats.org/wordprocessingml/2006/main" xmlns:w10="urn:schemas-microsoft-com:office:word" xmlns:wp="http://schemas.openxmlformats.org/drawingml/2006/wordprocessingDrawing" xmlns:wps="http://schemas.microsoft.com/office/word/2010/wordprocessingShape" xmlns:wpg="http://schemas.microsoft.com/office/word/2010/wordprocessingGroup" xmlns:mc="http://schemas.openxmlformats.org/markup-compatibility/2006" xmlns:wp14="http://schemas.microsoft.com/office/word/2010/wordprocessingDrawing" xmlns:w14="http://schemas.microsoft.com/office/word/2010/wordml" xmlns:w15="http://schemas.microsoft.com/office/word/2012/wordml" mc:Ignorable="w14 wp14 w15">
   <w:body>
     <w:p>
       <w:pPr>
         <w:pStyle w:val="Normal"/>
         <w:rPr>
           <w:rFonts w:cs="Calibri" w:cstheme="minorHAnsi"/>
-          <w:b/>
           <w:b/>
           <w:sz w:val="20"/>
           <w:szCs w:val="20"/>
@@ -29,7 +28,6 @@
         <w:rPr>
           <w:rFonts w:cs="Calibri" w:cstheme="minorHAnsi"/>
           <w:b/>
-          <w:b/>
           <w:sz w:val="20"/>
           <w:szCs w:val="20"/>
         </w:rPr>
@@ -49,7 +47,6 @@
         <w:spacing w:lineRule="auto" w:line="276"/>
         <w:rPr>
           <w:rFonts w:cs="Calibri" w:cstheme="minorHAnsi"/>
-          <w:b/>
           <w:b/>
           <w:sz w:val="20"/>
           <w:szCs w:val="28"/>
@@ -72,7 +69,6 @@
         <w:jc w:val="center"/>
         <w:rPr>
           <w:rFonts w:cs="Calibri" w:cstheme="minorHAnsi"/>
-          <w:b/>
           <w:b/>
           <w:sz w:val="28"/>
           <w:szCs w:val="28"/>
@@ -167,6 +163,7 @@
         <w:tblW w:w="14417" w:type="dxa"/>
         <w:jc w:val="left"/>
         <w:tblInd w:w="-289" w:type="dxa"/>
+        <w:tblLayout w:type="fixed"/>
         <w:tblCellMar>
           <w:top w:w="0" w:type="dxa"/>
           <w:left w:w="108" w:type="dxa"/>
@@ -196,11 +193,10 @@
             <w:pPr>
               <w:pStyle w:val="Normal"/>
               <w:widowControl w:val="false"/>
-              <w:ind w:right="360" w:hanging="0"/>
+              <w:ind w:hanging="0" w:right="360"/>
               <w:jc w:val="center"/>
               <w:rPr>
                 <w:rFonts w:cs="Calibri" w:cstheme="minorHAnsi"/>
-                <w:b/>
                 <w:b/>
                 <w:sz w:val="20"/>
                 <w:szCs w:val="20"/>
@@ -231,7 +227,6 @@
               <w:rPr>
                 <w:rFonts w:cs="Calibri" w:cstheme="minorHAnsi"/>
                 <w:b/>
-                <w:b/>
                 <w:sz w:val="20"/>
                 <w:szCs w:val="20"/>
               </w:rPr>
@@ -262,7 +257,6 @@
               <w:rPr>
                 <w:rFonts w:cs="Calibri" w:cstheme="minorHAnsi"/>
                 <w:b/>
-                <w:b/>
                 <w:sz w:val="20"/>
                 <w:szCs w:val="20"/>
               </w:rPr>
@@ -292,7 +286,6 @@
               <w:jc w:val="center"/>
               <w:rPr>
                 <w:rFonts w:cs="Calibri" w:cstheme="minorHAnsi"/>
-                <w:b/>
                 <w:b/>
                 <w:sz w:val="20"/>
                 <w:szCs w:val="20"/>
@@ -328,7 +321,7 @@
                 <w:tab w:val="clear" w:pos="720"/>
                 <w:tab w:val="left" w:pos="453" w:leader="none"/>
               </w:tabs>
-              <w:ind w:right="-89" w:hanging="0"/>
+              <w:ind w:hanging="0" w:right="-89"/>
               <w:rPr>
                 <w:rFonts w:ascii="Calibri" w:hAnsi="Calibri" w:eastAsia="Calibri"/>
               </w:rPr>
@@ -582,7 +575,7 @@
                 <w:szCs w:val="18"/>
                 <w:lang w:val="en-US"/>
               </w:rPr>
-              <w:t xml:space="preserve">{$item_val[i].location} </w:t>
+              <w:t>{$item_val[i].location}</w:t>
             </w:r>
           </w:p>
           <w:p>
@@ -730,7 +723,75 @@
                 <w:szCs w:val="18"/>
                 <w:lang w:val="en-US"/>
               </w:rPr>
+              <w:t>{$item_val[i].category_type:ifEQ(</w:t>
+            </w:r>
+            <w:r>
+              <w:rPr>
+                <w:rFonts w:eastAsia="Calibri" w:cs="Calibri" w:cstheme="minorHAnsi"/>
+                <w:bCs/>
+                <w:sz w:val="18"/>
+                <w:szCs w:val="18"/>
+                <w:lang w:val="en-US"/>
+              </w:rPr>
+              <w:t>4</w:t>
+            </w:r>
+            <w:r>
+              <w:rPr>
+                <w:rFonts w:eastAsia="Calibri" w:cs="Calibri" w:cstheme="minorHAnsi"/>
+                <w:bCs/>
+                <w:sz w:val="18"/>
+                <w:szCs w:val="18"/>
+                <w:lang w:val="en-US"/>
+              </w:rPr>
+              <w:t>):showBegin}</w:t>
+            </w:r>
+          </w:p>
+          <w:p>
+            <w:pPr>
+              <w:pStyle w:val="Normal"/>
+              <w:widowControl w:val="false"/>
+              <w:spacing w:lineRule="atLeast" w:line="201"/>
+              <w:rPr>
+                <w:rFonts w:cs="Calibri" w:cstheme="minorHAnsi"/>
+                <w:bCs/>
+                <w:sz w:val="18"/>
+                <w:szCs w:val="18"/>
+                <w:lang w:val="en-US"/>
+              </w:rPr>
+            </w:pPr>
+            <w:r>
+              <w:rPr>
+                <w:rFonts w:eastAsia="Calibri" w:cs="Calibri" w:cstheme="minorHAnsi"/>
+                <w:bCs/>
+                <w:sz w:val="18"/>
+                <w:szCs w:val="18"/>
+                <w:lang w:val="en-US"/>
+              </w:rPr>
               <w:t>{$item_val[i].minister}</w:t>
+            </w:r>
+          </w:p>
+          <w:p>
+            <w:pPr>
+              <w:pStyle w:val="Normal"/>
+              <w:widowControl w:val="false"/>
+              <w:spacing w:lineRule="atLeast" w:line="201"/>
+              <w:rPr>
+                <w:rFonts w:cs="Calibri" w:cstheme="minorHAnsi"/>
+                <w:bCs/>
+                <w:sz w:val="18"/>
+                <w:szCs w:val="18"/>
+                <w:lang w:val="en-US"/>
+              </w:rPr>
+            </w:pPr>
+            <w:r>
+              <w:rPr>
+                <w:rFonts w:eastAsia="Calibri" w:cs="Calibri" w:cstheme="minorHAnsi"/>
+                <w:bCs/>
+                <w:sz w:val="18"/>
+                <w:szCs w:val="18"/>
+                <w:lang w:val="en-US"/>
+              </w:rPr>
+              <w:t>{$item_val[i].category_type:showEnd}</w:t>
             </w:r>
           </w:p>
           <w:p>
@@ -897,58 +958,28 @@
                 <w:sz w:val="18"/>
                 <w:szCs w:val="18"/>
               </w:rPr>
-              <w:t>{$item_val[i].anticipated_date_</w:t>
-            </w:r>
-            <w:r>
-              <w:rPr>
-                <w:rFonts w:eastAsia="Calibri" w:cs="Calibri" w:cstheme="minorHAnsi"/>
-                <w:b/>
-                <w:bCs/>
-                <w:sz w:val="18"/>
-                <w:szCs w:val="18"/>
-              </w:rPr>
-              <w:t>title</w:t>
-            </w:r>
-            <w:r>
-              <w:rPr>
-                <w:rFonts w:eastAsia="Calibri" w:cs="Calibri" w:cstheme="minorHAnsi"/>
-                <w:b/>
-                <w:bCs/>
-                <w:sz w:val="18"/>
-                <w:szCs w:val="18"/>
-              </w:rPr>
-              <w:t>}</w:t>
-            </w:r>
-          </w:p>
-          <w:p>
-            <w:pPr>
-              <w:pStyle w:val="Normal"/>
-              <w:widowControl w:val="false"/>
-              <w:rPr>
-                <w:rFonts w:eastAsia="Calibri" w:cs="Calibri" w:cstheme="minorHAnsi"/>
-                <w:sz w:val="18"/>
-                <w:szCs w:val="18"/>
-              </w:rPr>
-            </w:pPr>
-            <w:r>
-              <w:rPr>
-                <w:rFonts w:eastAsia="Calibri" w:cs="Calibri" w:cstheme="minorHAnsi"/>
-                <w:b/>
-                <w:bCs/>
-                <w:sz w:val="18"/>
-                <w:szCs w:val="18"/>
-              </w:rPr>
-              <w:t>{$item_val[i].anticipated_date_label}:</w:t>
-            </w:r>
-            <w:r>
-              <w:rPr>
-                <w:rFonts w:eastAsia="Calibri" w:cs="Calibri" w:cstheme="minorHAnsi"/>
-                <w:b/>
-                <w:bCs/>
-                <w:sz w:val="18"/>
-                <w:szCs w:val="18"/>
-              </w:rPr>
-              <w:t xml:space="preserve"> </w:t>
+              <w:t>{$item_val[i].anticipated_date_title}</w:t>
+            </w:r>
+          </w:p>
+          <w:p>
+            <w:pPr>
+              <w:pStyle w:val="Normal"/>
+              <w:widowControl w:val="false"/>
+              <w:rPr>
+                <w:rFonts w:eastAsia="Calibri" w:cs="Calibri" w:cstheme="minorHAnsi"/>
+                <w:sz w:val="18"/>
+                <w:szCs w:val="18"/>
+              </w:rPr>
+            </w:pPr>
+            <w:r>
+              <w:rPr>
+                <w:rFonts w:eastAsia="Calibri" w:cs="Calibri" w:cstheme="minorHAnsi"/>
+                <w:b/>
+                <w:bCs/>
+                <w:sz w:val="18"/>
+                <w:szCs w:val="18"/>
+              </w:rPr>
+              <w:t xml:space="preserve">{$item_val[i].anticipated_date_label}: </w:t>
             </w:r>
             <w:r>
               <w:rPr>
@@ -1354,7 +1385,7 @@
                 <w:szCs w:val="18"/>
                 <w:lang w:val="en-US"/>
               </w:rPr>
-              <w:t xml:space="preserve">{$item_val[i+1].proponent:showEnd} </w:t>
+              <w:t>{$item_val[i+1].proponent:showEnd}</w:t>
             </w:r>
           </w:p>
           <w:p>
@@ -1456,7 +1487,7 @@
                 <w:szCs w:val="18"/>
                 <w:lang w:val="en-US"/>
               </w:rPr>
-              <w:t xml:space="preserve">{$item_val[i+1].location} </w:t>
+              <w:t>{$item_val[i+1].location}</w:t>
             </w:r>
           </w:p>
           <w:p>
@@ -1615,17 +1646,172 @@
             <w:pPr>
               <w:pStyle w:val="Normal"/>
               <w:widowControl w:val="false"/>
-              <w:rPr/>
-            </w:pPr>
-            <w:r>
-              <w:rPr>
-                <w:rFonts w:eastAsia="Calibri" w:cs="Calibri" w:cstheme="minorHAnsi"/>
-                <w:bCs/>
-                <w:sz w:val="18"/>
-                <w:szCs w:val="18"/>
-                <w:lang w:val="en-US"/>
-              </w:rPr>
-              <w:t>{$item_val[i+1].minister}</w:t>
+              <w:spacing w:lineRule="atLeast" w:line="201"/>
+              <w:rPr>
+                <w:rFonts w:cs="Calibri" w:cstheme="minorHAnsi"/>
+                <w:bCs/>
+                <w:sz w:val="18"/>
+                <w:szCs w:val="18"/>
+                <w:lang w:val="en-US"/>
+              </w:rPr>
+            </w:pPr>
+            <w:r>
+              <w:rPr>
+                <w:rFonts w:eastAsia="Calibri" w:cs="Calibri" w:cstheme="minorHAnsi"/>
+                <w:bCs/>
+                <w:sz w:val="18"/>
+                <w:szCs w:val="18"/>
+                <w:lang w:val="en-US"/>
+              </w:rPr>
+              <w:t>{$item_val[i</w:t>
+            </w:r>
+            <w:r>
+              <w:rPr>
+                <w:rFonts w:eastAsia="Calibri" w:cs="Calibri" w:cstheme="minorHAnsi"/>
+                <w:bCs/>
+                <w:sz w:val="18"/>
+                <w:szCs w:val="18"/>
+                <w:lang w:val="en-US"/>
+              </w:rPr>
+              <w:t>+1</w:t>
+            </w:r>
+            <w:r>
+              <w:rPr>
+                <w:rFonts w:eastAsia="Calibri" w:cs="Calibri" w:cstheme="minorHAnsi"/>
+                <w:bCs/>
+                <w:sz w:val="18"/>
+                <w:szCs w:val="18"/>
+                <w:lang w:val="en-US"/>
+              </w:rPr>
+              <w:t>].category_type:ifEQ(</w:t>
+            </w:r>
+            <w:r>
+              <w:rPr>
+                <w:rFonts w:eastAsia="Calibri" w:cs="Calibri" w:cstheme="minorHAnsi"/>
+                <w:bCs/>
+                <w:sz w:val="18"/>
+                <w:szCs w:val="18"/>
+                <w:lang w:val="en-US"/>
+              </w:rPr>
+              <w:t>4</w:t>
+            </w:r>
+            <w:r>
+              <w:rPr>
+                <w:rFonts w:eastAsia="Calibri" w:cs="Calibri" w:cstheme="minorHAnsi"/>
+                <w:bCs/>
+                <w:sz w:val="18"/>
+                <w:szCs w:val="18"/>
+                <w:lang w:val="en-US"/>
+              </w:rPr>
+              <w:t>):showBegi</w:t>
+            </w:r>
+            <w:r>
+              <w:rPr>
+                <w:rFonts w:eastAsia="Calibri" w:cs="Calibri" w:cstheme="minorHAnsi"/>
+                <w:bCs/>
+                <w:sz w:val="18"/>
+                <w:szCs w:val="18"/>
+                <w:lang w:val="en-US"/>
+              </w:rPr>
+              <w:t>n</w:t>
+            </w:r>
+            <w:r>
+              <w:rPr>
+                <w:rFonts w:eastAsia="Calibri" w:cs="Calibri" w:cstheme="minorHAnsi"/>
+                <w:bCs/>
+                <w:sz w:val="18"/>
+                <w:szCs w:val="18"/>
+                <w:lang w:val="en-US"/>
+              </w:rPr>
+              <w:t>}</w:t>
+            </w:r>
+          </w:p>
+          <w:p>
+            <w:pPr>
+              <w:pStyle w:val="Normal"/>
+              <w:widowControl w:val="false"/>
+              <w:spacing w:lineRule="atLeast" w:line="201"/>
+              <w:rPr>
+                <w:rFonts w:cs="Calibri" w:cstheme="minorHAnsi"/>
+                <w:bCs/>
+                <w:sz w:val="18"/>
+                <w:szCs w:val="18"/>
+                <w:lang w:val="en-US"/>
+              </w:rPr>
+            </w:pPr>
+            <w:r>
+              <w:rPr>
+                <w:rFonts w:eastAsia="Calibri" w:cs="Calibri" w:cstheme="minorHAnsi"/>
+                <w:bCs/>
+                <w:sz w:val="18"/>
+                <w:szCs w:val="18"/>
+                <w:lang w:val="en-US"/>
+              </w:rPr>
+              <w:t>{$item_val[i</w:t>
+            </w:r>
+            <w:r>
+              <w:rPr>
+                <w:rFonts w:eastAsia="Calibri" w:cs="Calibri" w:cstheme="minorHAnsi"/>
+                <w:bCs/>
+                <w:sz w:val="18"/>
+                <w:szCs w:val="18"/>
+                <w:lang w:val="en-US"/>
+              </w:rPr>
+              <w:t>+1</w:t>
+            </w:r>
+            <w:r>
+              <w:rPr>
+                <w:rFonts w:eastAsia="Calibri" w:cs="Calibri" w:cstheme="minorHAnsi"/>
+                <w:bCs/>
+                <w:sz w:val="18"/>
+                <w:szCs w:val="18"/>
+                <w:lang w:val="en-US"/>
+              </w:rPr>
+              <w:t>].minister}</w:t>
+            </w:r>
+          </w:p>
+          <w:p>
+            <w:pPr>
+              <w:pStyle w:val="Normal"/>
+              <w:widowControl w:val="false"/>
+              <w:spacing w:lineRule="atLeast" w:line="201"/>
+              <w:rPr>
+                <w:rFonts w:cs="Calibri" w:cstheme="minorHAnsi"/>
+                <w:bCs/>
+                <w:sz w:val="18"/>
+                <w:szCs w:val="18"/>
+                <w:lang w:val="en-US"/>
+              </w:rPr>
+            </w:pPr>
+            <w:r>
+              <w:rPr>
+                <w:rFonts w:eastAsia="Calibri" w:cs="Calibri" w:cstheme="minorHAnsi"/>
+                <w:bCs/>
+                <w:sz w:val="18"/>
+                <w:szCs w:val="18"/>
+                <w:lang w:val="en-US"/>
+              </w:rPr>
+              <w:t>{$item_val[i</w:t>
+            </w:r>
+            <w:r>
+              <w:rPr>
+                <w:rFonts w:eastAsia="Calibri" w:cs="Calibri" w:cstheme="minorHAnsi"/>
+                <w:bCs/>
+                <w:sz w:val="18"/>
+                <w:szCs w:val="18"/>
+                <w:lang w:val="en-US"/>
+              </w:rPr>
+              <w:t>+1</w:t>
+            </w:r>
+            <w:r>
+              <w:rPr>
+                <w:rFonts w:eastAsia="Calibri" w:cs="Calibri" w:cstheme="minorHAnsi"/>
+                <w:bCs/>
+                <w:sz w:val="18"/>
+                <w:szCs w:val="18"/>
+                <w:lang w:val="en-US"/>
+              </w:rPr>
+              <w:t>].category_type:showEnd}</w:t>
             </w:r>
           </w:p>
         </w:tc>
@@ -2104,7 +2290,6 @@
               <w:widowControl w:val="false"/>
               <w:rPr>
                 <w:rFonts w:cs="Calibri" w:cstheme="minorHAnsi"/>
-                <w:b/>
                 <w:b/>
                 <w:bCs/>
                 <w:sz w:val="18"/>
@@ -2186,7 +2371,6 @@
         <w:pStyle w:val="Normal"/>
         <w:jc w:val="center"/>
         <w:rPr>
-          <w:b/>
           <w:b/>
           <w:bCs/>
           <w:sz w:val="28"/>
@@ -2208,6 +2392,7 @@
     <w:p>
       <w:pPr>
         <w:pStyle w:val="Normal"/>
+        <w:spacing w:before="0" w:after="0"/>
         <w:jc w:val="center"/>
         <w:rPr/>
       </w:pPr>
@@ -2222,13 +2407,15 @@
       </w:r>
     </w:p>
     <w:sectPr>
-      <w:headerReference w:type="default" r:id="rId2"/>
-      <w:headerReference w:type="first" r:id="rId3"/>
-      <w:footerReference w:type="default" r:id="rId4"/>
-      <w:footerReference w:type="first" r:id="rId5"/>
+      <w:headerReference w:type="even" r:id="rId2"/>
+      <w:headerReference w:type="default" r:id="rId3"/>
+      <w:headerReference w:type="first" r:id="rId4"/>
+      <w:footerReference w:type="even" r:id="rId5"/>
+      <w:footerReference w:type="default" r:id="rId6"/>
+      <w:footerReference w:type="first" r:id="rId7"/>
       <w:type w:val="nextPage"/>
       <w:pgSz w:orient="landscape" w:w="15840" w:h="12240"/>
-      <w:pgMar w:left="851" w:right="851" w:header="624" w:top="681" w:footer="709" w:bottom="766" w:gutter="0"/>
+      <w:pgMar w:left="851" w:right="851" w:gutter="0" w:header="624" w:top="681" w:footer="709" w:bottom="766"/>
       <w:pgNumType w:fmt="decimal"/>
       <w:formProt w:val="false"/>
       <w:titlePg/>
@@ -2240,7 +2427,21 @@
 </file>
 
 <file path=word/footer1.xml><?xml version="1.0" encoding="utf-8"?>
-<w:ftr xmlns:o="urn:schemas-microsoft-com:office:office" xmlns:r="http://schemas.openxmlformats.org/officeDocument/2006/relationships" xmlns:v="urn:schemas-microsoft-com:vml" xmlns:w="http://schemas.openxmlformats.org/wordprocessingml/2006/main" xmlns:w10="urn:schemas-microsoft-com:office:word" xmlns:wp="http://schemas.openxmlformats.org/drawingml/2006/wordprocessingDrawing" xmlns:wps="http://schemas.microsoft.com/office/word/2010/wordprocessingShape" xmlns:wpg="http://schemas.microsoft.com/office/word/2010/wordprocessingGroup" xmlns:mc="http://schemas.openxmlformats.org/markup-compatibility/2006" xmlns:wp14="http://schemas.microsoft.com/office/word/2010/wordprocessingDrawing" xmlns:w14="http://schemas.microsoft.com/office/word/2010/wordml" mc:Ignorable="w14 wp14">
+<w:ftr xmlns:o="urn:schemas-microsoft-com:office:office" xmlns:r="http://schemas.openxmlformats.org/officeDocument/2006/relationships" xmlns:v="urn:schemas-microsoft-com:vml" xmlns:w="http://schemas.openxmlformats.org/wordprocessingml/2006/main" xmlns:w10="urn:schemas-microsoft-com:office:word" xmlns:wp="http://schemas.openxmlformats.org/drawingml/2006/wordprocessingDrawing" xmlns:wps="http://schemas.microsoft.com/office/word/2010/wordprocessingShape" xmlns:wpg="http://schemas.microsoft.com/office/word/2010/wordprocessingGroup" xmlns:mc="http://schemas.openxmlformats.org/markup-compatibility/2006" xmlns:wp14="http://schemas.microsoft.com/office/word/2010/wordprocessingDrawing" xmlns:w14="http://schemas.microsoft.com/office/word/2010/wordml" xmlns:w15="http://schemas.microsoft.com/office/word/2012/wordml" mc:Ignorable="w14 wp14 w15">
+  <w:p>
+    <w:pPr>
+      <w:pStyle w:val="Footer"/>
+      <w:rPr/>
+    </w:pPr>
+    <w:r>
+      <w:rPr/>
+    </w:r>
+  </w:p>
+</w:ftr>
+</file>
+
+<file path=word/footer2.xml><?xml version="1.0" encoding="utf-8"?>
+<w:ftr xmlns:o="urn:schemas-microsoft-com:office:office" xmlns:r="http://schemas.openxmlformats.org/officeDocument/2006/relationships" xmlns:v="urn:schemas-microsoft-com:vml" xmlns:w="http://schemas.openxmlformats.org/wordprocessingml/2006/main" xmlns:w10="urn:schemas-microsoft-com:office:word" xmlns:wp="http://schemas.openxmlformats.org/drawingml/2006/wordprocessingDrawing" xmlns:wps="http://schemas.microsoft.com/office/word/2010/wordprocessingShape" xmlns:wpg="http://schemas.microsoft.com/office/word/2010/wordprocessingGroup" xmlns:mc="http://schemas.openxmlformats.org/markup-compatibility/2006" xmlns:wp14="http://schemas.microsoft.com/office/word/2010/wordprocessingDrawing" xmlns:w14="http://schemas.microsoft.com/office/word/2010/wordml" xmlns:w15="http://schemas.microsoft.com/office/word/2012/wordml" mc:Ignorable="w14 wp14 w15">
   <w:p>
     <w:pPr>
       <w:pStyle w:val="Footer"/>
@@ -2273,7 +2474,7 @@
         <w:szCs w:val="16"/>
         <w:bCs/>
       </w:rPr>
-      <w:instrText> PAGE </w:instrText>
+      <w:instrText xml:space="preserve"> PAGE </w:instrText>
     </w:r>
     <w:r>
       <w:rPr>
@@ -2325,7 +2526,7 @@
         <w:szCs w:val="16"/>
         <w:bCs/>
       </w:rPr>
-      <w:instrText> NUMPAGES </w:instrText>
+      <w:instrText xml:space="preserve"> NUMPAGES </w:instrText>
     </w:r>
     <w:r>
       <w:rPr>
@@ -2358,8 +2559,8 @@
 </w:ftr>
 </file>
 
-<file path=word/footer2.xml><?xml version="1.0" encoding="utf-8"?>
-<w:ftr xmlns:o="urn:schemas-microsoft-com:office:office" xmlns:r="http://schemas.openxmlformats.org/officeDocument/2006/relationships" xmlns:v="urn:schemas-microsoft-com:vml" xmlns:w="http://schemas.openxmlformats.org/wordprocessingml/2006/main" xmlns:w10="urn:schemas-microsoft-com:office:word" xmlns:wp="http://schemas.openxmlformats.org/drawingml/2006/wordprocessingDrawing" xmlns:wps="http://schemas.microsoft.com/office/word/2010/wordprocessingShape" xmlns:wpg="http://schemas.microsoft.com/office/word/2010/wordprocessingGroup" xmlns:mc="http://schemas.openxmlformats.org/markup-compatibility/2006" xmlns:wp14="http://schemas.microsoft.com/office/word/2010/wordprocessingDrawing" xmlns:w14="http://schemas.microsoft.com/office/word/2010/wordml" mc:Ignorable="w14 wp14">
+<file path=word/footer3.xml><?xml version="1.0" encoding="utf-8"?>
+<w:ftr xmlns:o="urn:schemas-microsoft-com:office:office" xmlns:r="http://schemas.openxmlformats.org/officeDocument/2006/relationships" xmlns:v="urn:schemas-microsoft-com:vml" xmlns:w="http://schemas.openxmlformats.org/wordprocessingml/2006/main" xmlns:w10="urn:schemas-microsoft-com:office:word" xmlns:wp="http://schemas.openxmlformats.org/drawingml/2006/wordprocessingDrawing" xmlns:wps="http://schemas.microsoft.com/office/word/2010/wordprocessingShape" xmlns:wpg="http://schemas.microsoft.com/office/word/2010/wordprocessingGroup" xmlns:mc="http://schemas.openxmlformats.org/markup-compatibility/2006" xmlns:wp14="http://schemas.microsoft.com/office/word/2010/wordprocessingDrawing" xmlns:w14="http://schemas.microsoft.com/office/word/2010/wordml" xmlns:w15="http://schemas.microsoft.com/office/word/2012/wordml" mc:Ignorable="w14 wp14 w15">
   <w:p>
     <w:pPr>
       <w:pStyle w:val="Footer"/>
@@ -2392,7 +2593,7 @@
         <w:szCs w:val="16"/>
         <w:bCs/>
       </w:rPr>
-      <w:instrText> PAGE </w:instrText>
+      <w:instrText xml:space="preserve"> PAGE </w:instrText>
     </w:r>
     <w:r>
       <w:rPr>
@@ -2444,7 +2645,7 @@
         <w:szCs w:val="16"/>
         <w:bCs/>
       </w:rPr>
-      <w:instrText> NUMPAGES </w:instrText>
+      <w:instrText xml:space="preserve"> NUMPAGES </w:instrText>
     </w:r>
     <w:r>
       <w:rPr>
@@ -2478,7 +2679,21 @@
 </file>
 
 <file path=word/header1.xml><?xml version="1.0" encoding="utf-8"?>
-<w:hdr xmlns:o="urn:schemas-microsoft-com:office:office" xmlns:r="http://schemas.openxmlformats.org/officeDocument/2006/relationships" xmlns:v="urn:schemas-microsoft-com:vml" xmlns:w="http://schemas.openxmlformats.org/wordprocessingml/2006/main" xmlns:w10="urn:schemas-microsoft-com:office:word" xmlns:wp="http://schemas.openxmlformats.org/drawingml/2006/wordprocessingDrawing" xmlns:wps="http://schemas.microsoft.com/office/word/2010/wordprocessingShape" xmlns:wpg="http://schemas.microsoft.com/office/word/2010/wordprocessingGroup" xmlns:mc="http://schemas.openxmlformats.org/markup-compatibility/2006" xmlns:wp14="http://schemas.microsoft.com/office/word/2010/wordprocessingDrawing" xmlns:w14="http://schemas.microsoft.com/office/word/2010/wordml" mc:Ignorable="w14 wp14">
+<w:hdr xmlns:o="urn:schemas-microsoft-com:office:office" xmlns:r="http://schemas.openxmlformats.org/officeDocument/2006/relationships" xmlns:v="urn:schemas-microsoft-com:vml" xmlns:w="http://schemas.openxmlformats.org/wordprocessingml/2006/main" xmlns:w10="urn:schemas-microsoft-com:office:word" xmlns:wp="http://schemas.openxmlformats.org/drawingml/2006/wordprocessingDrawing" xmlns:wps="http://schemas.microsoft.com/office/word/2010/wordprocessingShape" xmlns:wpg="http://schemas.microsoft.com/office/word/2010/wordprocessingGroup" xmlns:mc="http://schemas.openxmlformats.org/markup-compatibility/2006" xmlns:wp14="http://schemas.microsoft.com/office/word/2010/wordprocessingDrawing" xmlns:w14="http://schemas.microsoft.com/office/word/2010/wordml" xmlns:w15="http://schemas.microsoft.com/office/word/2012/wordml" mc:Ignorable="w14 wp14 w15">
+  <w:p>
+    <w:pPr>
+      <w:pStyle w:val="Header"/>
+      <w:rPr/>
+    </w:pPr>
+    <w:r>
+      <w:rPr/>
+    </w:r>
+  </w:p>
+</w:hdr>
+</file>
+
+<file path=word/header2.xml><?xml version="1.0" encoding="utf-8"?>
+<w:hdr xmlns:o="urn:schemas-microsoft-com:office:office" xmlns:r="http://schemas.openxmlformats.org/officeDocument/2006/relationships" xmlns:v="urn:schemas-microsoft-com:vml" xmlns:w="http://schemas.openxmlformats.org/wordprocessingml/2006/main" xmlns:w10="urn:schemas-microsoft-com:office:word" xmlns:wp="http://schemas.openxmlformats.org/drawingml/2006/wordprocessingDrawing" xmlns:wps="http://schemas.microsoft.com/office/word/2010/wordprocessingShape" xmlns:wpg="http://schemas.microsoft.com/office/word/2010/wordprocessingGroup" xmlns:mc="http://schemas.openxmlformats.org/markup-compatibility/2006" xmlns:wp14="http://schemas.microsoft.com/office/word/2010/wordprocessingDrawing" xmlns:w14="http://schemas.microsoft.com/office/word/2010/wordml" xmlns:w15="http://schemas.microsoft.com/office/word/2012/wordml" mc:Ignorable="w14 wp14 w15">
   <w:p>
     <w:pPr>
       <w:pStyle w:val="Header"/>
@@ -2492,8 +2707,8 @@
 </w:hdr>
 </file>
 
-<file path=word/header2.xml><?xml version="1.0" encoding="utf-8"?>
-<w:hdr xmlns:o="urn:schemas-microsoft-com:office:office" xmlns:r="http://schemas.openxmlformats.org/officeDocument/2006/relationships" xmlns:v="urn:schemas-microsoft-com:vml" xmlns:w="http://schemas.openxmlformats.org/wordprocessingml/2006/main" xmlns:w10="urn:schemas-microsoft-com:office:word" xmlns:wp="http://schemas.openxmlformats.org/drawingml/2006/wordprocessingDrawing" xmlns:wps="http://schemas.microsoft.com/office/word/2010/wordprocessingShape" xmlns:wpg="http://schemas.microsoft.com/office/word/2010/wordprocessingGroup" xmlns:mc="http://schemas.openxmlformats.org/markup-compatibility/2006" xmlns:wp14="http://schemas.microsoft.com/office/word/2010/wordprocessingDrawing" xmlns:w14="http://schemas.microsoft.com/office/word/2010/wordml" mc:Ignorable="w14 wp14">
+<file path=word/header3.xml><?xml version="1.0" encoding="utf-8"?>
+<w:hdr xmlns:o="urn:schemas-microsoft-com:office:office" xmlns:r="http://schemas.openxmlformats.org/officeDocument/2006/relationships" xmlns:v="urn:schemas-microsoft-com:vml" xmlns:w="http://schemas.openxmlformats.org/wordprocessingml/2006/main" xmlns:w10="urn:schemas-microsoft-com:office:word" xmlns:wp="http://schemas.openxmlformats.org/drawingml/2006/wordprocessingDrawing" xmlns:wps="http://schemas.microsoft.com/office/word/2010/wordprocessingShape" xmlns:wpg="http://schemas.microsoft.com/office/word/2010/wordprocessingGroup" xmlns:mc="http://schemas.openxmlformats.org/markup-compatibility/2006" xmlns:wp14="http://schemas.microsoft.com/office/word/2010/wordprocessingDrawing" xmlns:w14="http://schemas.microsoft.com/office/word/2010/wordml" xmlns:w15="http://schemas.microsoft.com/office/word/2012/wordml" mc:Ignorable="w14 wp14 w15">
   <w:p>
     <w:pPr>
       <w:pStyle w:val="Header"/>
@@ -2504,7 +2719,6 @@
         <w:tab w:val="left" w:pos="11025" w:leader="none"/>
       </w:tabs>
       <w:rPr>
-        <w:b/>
         <w:b/>
         <w:sz w:val="28"/>
         <w:szCs w:val="28"/>
@@ -2966,7 +3180,7 @@
     <w:qFormat/>
     <w:rPr/>
   </w:style>
-  <w:style w:type="character" w:styleId="Annotationreference">
+  <w:style w:type="character" w:styleId="annotationreference">
     <w:name w:val="annotation reference"/>
     <w:basedOn w:val="DefaultParagraphFont"/>
     <w:uiPriority w:val="99"/>
@@ -2988,7 +3202,7 @@
       <w:iCs/>
     </w:rPr>
   </w:style>
-  <w:style w:type="character" w:styleId="InternetLink">
+  <w:style w:type="character" w:styleId="Hyperlink">
     <w:name w:val="Hyperlink"/>
     <w:basedOn w:val="DefaultParagraphFont"/>
     <w:uiPriority w:val="99"/>
@@ -3043,7 +3257,7 @@
       <w:szCs w:val="16"/>
     </w:rPr>
   </w:style>
-  <w:style w:type="character" w:styleId="Value3" w:customStyle="1">
+  <w:style w:type="character" w:styleId="value3" w:customStyle="1">
     <w:name w:val="value3"/>
     <w:basedOn w:val="DefaultParagraphFont"/>
     <w:qFormat/>
@@ -3051,13 +3265,13 @@
       <w:color w:val="666666"/>
     </w:rPr>
   </w:style>
-  <w:style w:type="character" w:styleId="Ngbinding" w:customStyle="1">
+  <w:style w:type="character" w:styleId="ng-binding" w:customStyle="1">
     <w:name w:val="ng-binding"/>
     <w:basedOn w:val="DefaultParagraphFont"/>
     <w:qFormat/>
     <w:rPr/>
   </w:style>
-  <w:style w:type="character" w:styleId="Value1" w:customStyle="1">
+  <w:style w:type="character" w:styleId="value1" w:customStyle="1">
     <w:name w:val="value1"/>
     <w:basedOn w:val="DefaultParagraphFont"/>
     <w:qFormat/>
@@ -3090,7 +3304,7 @@
       <w:szCs w:val="20"/>
     </w:rPr>
   </w:style>
-  <w:style w:type="character" w:styleId="Value2" w:customStyle="1">
+  <w:style w:type="character" w:styleId="value2" w:customStyle="1">
     <w:name w:val="value2"/>
     <w:basedOn w:val="DefaultParagraphFont"/>
     <w:qFormat/>
@@ -3098,7 +3312,7 @@
       <w:color w:val="666666"/>
     </w:rPr>
   </w:style>
-  <w:style w:type="character" w:styleId="Value" w:customStyle="1">
+  <w:style w:type="character" w:styleId="value" w:customStyle="1">
     <w:name w:val="value"/>
     <w:basedOn w:val="DefaultParagraphFont"/>
     <w:qFormat/>
@@ -3112,13 +3326,13 @@
     <w:qFormat/>
     <w:rPr>
       <w:rFonts w:ascii="Calibri Light" w:hAnsi="Calibri Light"/>
-      <w:color w:val="000000" w:themeColor="text1"/>
+      <w:color w:themeColor="text1" w:val="000000"/>
     </w:rPr>
   </w:style>
   <w:style w:type="paragraph" w:styleId="Heading" w:customStyle="1">
     <w:name w:val="Heading"/>
     <w:basedOn w:val="Normal"/>
-    <w:next w:val="TextBody"/>
+    <w:next w:val="BodyText"/>
     <w:qFormat/>
     <w:pPr>
       <w:keepNext w:val="true"/>
@@ -3130,7 +3344,7 @@
       <w:szCs w:val="28"/>
     </w:rPr>
   </w:style>
-  <w:style w:type="paragraph" w:styleId="TextBody">
+  <w:style w:type="paragraph" w:styleId="BodyText">
     <w:name w:val="Body Text"/>
     <w:basedOn w:val="Normal"/>
     <w:pPr>
@@ -3140,7 +3354,7 @@
   </w:style>
   <w:style w:type="paragraph" w:styleId="List">
     <w:name w:val="List"/>
-    <w:basedOn w:val="TextBody"/>
+    <w:basedOn w:val="BodyText"/>
     <w:pPr/>
     <w:rPr>
       <w:rFonts w:cs="FreeSans"/>
@@ -3173,22 +3387,6 @@
       <w:rFonts w:cs="FreeSans"/>
     </w:rPr>
   </w:style>
-  <w:style w:type="paragraph" w:styleId="Caption1">
-    <w:name w:val="caption"/>
-    <w:basedOn w:val="Normal"/>
-    <w:qFormat/>
-    <w:pPr>
-      <w:suppressLineNumbers/>
-      <w:spacing w:before="120" w:after="120"/>
-    </w:pPr>
-    <w:rPr>
-      <w:rFonts w:cs="FreeSans"/>
-      <w:i/>
-      <w:iCs/>
-      <w:sz w:val="24"/>
-      <w:szCs w:val="24"/>
-    </w:rPr>
-  </w:style>
   <w:style w:type="paragraph" w:styleId="BalloonText">
     <w:name w:val="Balloon Text"/>
     <w:basedOn w:val="Normal"/>
@@ -3204,8 +3402,8 @@
       <w:szCs w:val="16"/>
     </w:rPr>
   </w:style>
-  <w:style w:type="paragraph" w:styleId="Annotationtext">
-    <w:name w:val="annotation text"/>
+  <w:style w:type="paragraph" w:styleId="AnnotationText">
+    <w:name w:val="Annotation Text"/>
     <w:basedOn w:val="Normal"/>
     <w:link w:val="CommentTextChar"/>
     <w:uiPriority w:val="99"/>
@@ -3217,10 +3415,10 @@
       <w:szCs w:val="20"/>
     </w:rPr>
   </w:style>
-  <w:style w:type="paragraph" w:styleId="Annotationsubject">
+  <w:style w:type="paragraph" w:styleId="annotationsubject">
     <w:name w:val="annotation subject"/>
-    <w:basedOn w:val="Annotationtext"/>
-    <w:next w:val="Annotationtext"/>
+    <w:basedOn w:val="AnnotationText"/>
+    <w:next w:val="AnnotationText"/>
     <w:link w:val="CommentSubjectChar"/>
     <w:uiPriority w:val="99"/>
     <w:semiHidden/>
@@ -3295,7 +3493,7 @@
     <w:qFormat/>
     <w:pPr>
       <w:spacing w:before="0" w:after="0"/>
-      <w:ind w:left="720" w:hanging="0"/>
+      <w:ind w:hanging="0" w:left="720"/>
       <w:contextualSpacing/>
     </w:pPr>
     <w:rPr/>
@@ -3345,7 +3543,30 @@
     </w:pPr>
     <w:rPr>
       <w:rFonts w:ascii="Calibri Light" w:hAnsi="Calibri Light" w:cs="" w:cstheme="minorBidi"/>
-      <w:color w:val="000000" w:themeColor="text1"/>
+      <w:color w:themeColor="text1" w:val="000000"/>
+    </w:rPr>
+  </w:style>
+  <w:style w:type="paragraph" w:styleId="TableContents">
+    <w:name w:val="Table Contents"/>
+    <w:basedOn w:val="Normal"/>
+    <w:qFormat/>
+    <w:pPr>
+      <w:widowControl w:val="false"/>
+      <w:suppressLineNumbers/>
+    </w:pPr>
+    <w:rPr/>
+  </w:style>
+  <w:style w:type="paragraph" w:styleId="TableHeading">
+    <w:name w:val="Table Heading"/>
+    <w:basedOn w:val="TableContents"/>
+    <w:qFormat/>
+    <w:pPr>
+      <w:suppressLineNumbers/>
+      <w:jc w:val="center"/>
+    </w:pPr>
+    <w:rPr>
+      <w:b/>
+      <w:bCs/>
     </w:rPr>
   </w:style>
   <w:style w:type="numbering" w:styleId="NoList" w:default="1">
@@ -3389,41 +3610,41 @@
 </file>
 
 <file path=word/theme/theme1.xml><?xml version="1.0" encoding="utf-8"?>
-<a:theme xmlns:a="http://schemas.openxmlformats.org/drawingml/2006/main" name="Office Theme">
+<a:theme xmlns:a="http://schemas.openxmlformats.org/drawingml/2006/main" xmlns:r="http://schemas.openxmlformats.org/officeDocument/2006/relationships" name="Office Theme">
   <a:themeElements>
     <a:clrScheme name="Office">
       <a:dk1>
-        <a:sysClr val="windowText" lastClr="000000"/>
+        <a:srgbClr val="000000"/>
       </a:dk1>
       <a:lt1>
-        <a:sysClr val="window" lastClr="FFFFFF"/>
+        <a:srgbClr val="ffffff"/>
       </a:lt1>
       <a:dk2>
-        <a:srgbClr val="1F497D"/>
+        <a:srgbClr val="1f497d"/>
       </a:dk2>
       <a:lt2>
-        <a:srgbClr val="EEECE1"/>
+        <a:srgbClr val="eeece1"/>
       </a:lt2>
       <a:accent1>
-        <a:srgbClr val="4F81BD"/>
+        <a:srgbClr val="4f81bd"/>
       </a:accent1>
       <a:accent2>
-        <a:srgbClr val="C0504D"/>
+        <a:srgbClr val="c0504d"/>
       </a:accent2>
       <a:accent3>
-        <a:srgbClr val="9BBB59"/>
+        <a:srgbClr val="9bbb59"/>
       </a:accent3>
       <a:accent4>
-        <a:srgbClr val="8064A2"/>
+        <a:srgbClr val="8064a2"/>
       </a:accent4>
       <a:accent5>
-        <a:srgbClr val="4BACC6"/>
+        <a:srgbClr val="4bacc6"/>
       </a:accent5>
       <a:accent6>
-        <a:srgbClr val="F79646"/>
+        <a:srgbClr val="f79646"/>
       </a:accent6>
       <a:hlink>
-        <a:srgbClr val="0000FF"/>
+        <a:srgbClr val="0000ff"/>
       </a:hlink>
       <a:folHlink>
         <a:srgbClr val="800080"/>
@@ -3431,245 +3652,135 @@
     </a:clrScheme>
     <a:fontScheme name="Office">
       <a:majorFont>
-        <a:latin typeface="Cambria"/>
+        <a:latin typeface="Cambria" pitchFamily="0" charset="1"/>
         <a:ea typeface=""/>
         <a:cs typeface=""/>
-        <a:font script="Jpan" typeface="ＭＳ ゴシック"/>
-        <a:font script="Hang" typeface="맑은 고딕"/>
-        <a:font script="Hans" typeface="宋体"/>
-        <a:font script="Hant" typeface="新細明體"/>
-        <a:font script="Arab" typeface="Times New Roman"/>
-        <a:font script="Hebr" typeface="Times New Roman"/>
-        <a:font script="Thai" typeface="Angsana New"/>
-        <a:font script="Ethi" typeface="Nyala"/>
-        <a:font script="Beng" typeface="Vrinda"/>
-        <a:font script="Gujr" typeface="Shruti"/>
-        <a:font script="Khmr" typeface="MoolBoran"/>
-        <a:font script="Knda" typeface="Tunga"/>
-        <a:font script="Guru" typeface="Raavi"/>
-        <a:font script="Cans" typeface="Euphemia"/>
-        <a:font script="Cher" typeface="Plantagenet Cherokee"/>
-        <a:font script="Yiii" typeface="Microsoft Yi Baiti"/>
-        <a:font script="Tibt" typeface="Microsoft Himalaya"/>
-        <a:font script="Thaa" typeface="MV Boli"/>
-        <a:font script="Deva" typeface="Mangal"/>
-        <a:font script="Telu" typeface="Gautami"/>
-        <a:font script="Taml" typeface="Latha"/>
-        <a:font script="Syrc" typeface="Estrangelo Edessa"/>
-        <a:font script="Orya" typeface="Kalinga"/>
-        <a:font script="Mlym" typeface="Kartika"/>
-        <a:font script="Laoo" typeface="DokChampa"/>
-        <a:font script="Sinh" typeface="Iskoola Pota"/>
-        <a:font script="Mong" typeface="Mongolian Baiti"/>
-        <a:font script="Viet" typeface="Times New Roman"/>
-        <a:font script="Uigh" typeface="Microsoft Uighur"/>
-        <a:font script="Geor" typeface="Sylfaen"/>
       </a:majorFont>
       <a:minorFont>
-        <a:latin typeface="Calibri"/>
+        <a:latin typeface="Calibri" pitchFamily="0" charset="1"/>
         <a:ea typeface=""/>
         <a:cs typeface=""/>
-        <a:font script="Jpan" typeface="ＭＳ 明朝"/>
-        <a:font script="Hang" typeface="맑은 고딕"/>
-        <a:font script="Hans" typeface="宋体"/>
-        <a:font script="Hant" typeface="新細明體"/>
-        <a:font script="Arab" typeface="Arial"/>
-        <a:font script="Hebr" typeface="Arial"/>
-        <a:font script="Thai" typeface="Cordia New"/>
-        <a:font script="Ethi" typeface="Nyala"/>
-        <a:font script="Beng" typeface="Vrinda"/>
-        <a:font script="Gujr" typeface="Shruti"/>
-        <a:font script="Khmr" typeface="DaunPenh"/>
-        <a:font script="Knda" typeface="Tunga"/>
-        <a:font script="Guru" typeface="Raavi"/>
-        <a:font script="Cans" typeface="Euphemia"/>
-        <a:font script="Cher" typeface="Plantagenet Cherokee"/>
-        <a:font script="Yiii" typeface="Microsoft Yi Baiti"/>
-        <a:font script="Tibt" typeface="Microsoft Himalaya"/>
-        <a:font script="Thaa" typeface="MV Boli"/>
-        <a:font script="Deva" typeface="Mangal"/>
-        <a:font script="Telu" typeface="Gautami"/>
-        <a:font script="Taml" typeface="Latha"/>
-        <a:font script="Syrc" typeface="Estrangelo Edessa"/>
-        <a:font script="Orya" typeface="Kalinga"/>
-        <a:font script="Mlym" typeface="Kartika"/>
-        <a:font script="Laoo" typeface="DokChampa"/>
-        <a:font script="Sinh" typeface="Iskoola Pota"/>
-        <a:font script="Mong" typeface="Mongolian Baiti"/>
-        <a:font script="Viet" typeface="Arial"/>
-        <a:font script="Uigh" typeface="Microsoft Uighur"/>
-        <a:font script="Geor" typeface="Sylfaen"/>
       </a:minorFont>
     </a:fontScheme>
-    <a:fmtScheme name="Office">
+    <a:fmtScheme>
       <a:fillStyleLst>
         <a:solidFill>
           <a:schemeClr val="phClr"/>
         </a:solidFill>
-        <a:gradFill rotWithShape="1">
+        <a:gradFill>
           <a:gsLst>
             <a:gs pos="0">
               <a:schemeClr val="phClr">
                 <a:tint val="50000"/>
-                <a:satMod val="300000"/>
               </a:schemeClr>
             </a:gs>
             <a:gs pos="35000">
               <a:schemeClr val="phClr">
                 <a:tint val="37000"/>
-                <a:satMod val="300000"/>
               </a:schemeClr>
             </a:gs>
             <a:gs pos="100000">
               <a:schemeClr val="phClr">
                 <a:tint val="15000"/>
-                <a:satMod val="350000"/>
               </a:schemeClr>
             </a:gs>
           </a:gsLst>
           <a:lin ang="16200000" scaled="1"/>
+          <a:tileRect l="0" t="0" r="0" b="0"/>
         </a:gradFill>
-        <a:gradFill rotWithShape="1">
+        <a:gradFill>
           <a:gsLst>
             <a:gs pos="0">
               <a:schemeClr val="phClr">
                 <a:shade val="51000"/>
-                <a:satMod val="130000"/>
               </a:schemeClr>
             </a:gs>
             <a:gs pos="80000">
               <a:schemeClr val="phClr">
                 <a:shade val="93000"/>
-                <a:satMod val="130000"/>
               </a:schemeClr>
             </a:gs>
             <a:gs pos="100000">
               <a:schemeClr val="phClr">
                 <a:shade val="94000"/>
-                <a:satMod val="135000"/>
               </a:schemeClr>
             </a:gs>
           </a:gsLst>
           <a:lin ang="16200000" scaled="0"/>
+          <a:tileRect l="0" t="0" r="0" b="0"/>
         </a:gradFill>
       </a:fillStyleLst>
       <a:lnStyleLst>
         <a:ln w="9525" cap="flat" cmpd="sng" algn="ctr">
-          <a:solidFill>
-            <a:schemeClr val="phClr">
-              <a:shade val="95000"/>
-              <a:satMod val="105000"/>
-            </a:schemeClr>
-          </a:solidFill>
           <a:prstDash val="solid"/>
         </a:ln>
         <a:ln w="25400" cap="flat" cmpd="sng" algn="ctr">
-          <a:solidFill>
-            <a:schemeClr val="phClr"/>
-          </a:solidFill>
           <a:prstDash val="solid"/>
         </a:ln>
         <a:ln w="38100" cap="flat" cmpd="sng" algn="ctr">
-          <a:solidFill>
-            <a:schemeClr val="phClr"/>
-          </a:solidFill>
           <a:prstDash val="solid"/>
         </a:ln>
       </a:lnStyleLst>
       <a:effectStyleLst>
         <a:effectStyle>
-          <a:effectLst>
-            <a:outerShdw blurRad="40000" dist="20000" dir="5400000" rotWithShape="0">
-              <a:srgbClr val="000000">
-                <a:alpha val="38000"/>
-              </a:srgbClr>
-            </a:outerShdw>
-          </a:effectLst>
+          <a:effectLst/>
         </a:effectStyle>
         <a:effectStyle>
-          <a:effectLst>
-            <a:outerShdw blurRad="40000" dist="23000" dir="5400000" rotWithShape="0">
-              <a:srgbClr val="000000">
-                <a:alpha val="35000"/>
-              </a:srgbClr>
-            </a:outerShdw>
-          </a:effectLst>
+          <a:effectLst/>
         </a:effectStyle>
         <a:effectStyle>
-          <a:effectLst>
-            <a:outerShdw blurRad="40000" dist="23000" dir="5400000" rotWithShape="0">
-              <a:srgbClr val="000000">
-                <a:alpha val="35000"/>
-              </a:srgbClr>
-            </a:outerShdw>
-          </a:effectLst>
-          <a:scene3d>
-            <a:camera prst="orthographicFront">
-              <a:rot lat="0" lon="0" rev="0"/>
-            </a:camera>
-            <a:lightRig rig="threePt" dir="t">
-              <a:rot lat="0" lon="0" rev="1200000"/>
-            </a:lightRig>
-          </a:scene3d>
-          <a:sp3d>
-            <a:bevelT w="63500" h="25400"/>
-          </a:sp3d>
+          <a:effectLst/>
         </a:effectStyle>
       </a:effectStyleLst>
       <a:bgFillStyleLst>
         <a:solidFill>
           <a:schemeClr val="phClr"/>
         </a:solidFill>
-        <a:gradFill rotWithShape="1">
+        <a:gradFill>
           <a:gsLst>
             <a:gs pos="0">
               <a:schemeClr val="phClr">
                 <a:tint val="40000"/>
-                <a:satMod val="350000"/>
               </a:schemeClr>
             </a:gs>
             <a:gs pos="40000">
               <a:schemeClr val="phClr">
                 <a:tint val="45000"/>
                 <a:shade val="99000"/>
-                <a:satMod val="350000"/>
               </a:schemeClr>
             </a:gs>
             <a:gs pos="100000">
               <a:schemeClr val="phClr">
                 <a:shade val="20000"/>
-                <a:satMod val="255000"/>
               </a:schemeClr>
             </a:gs>
           </a:gsLst>
           <a:path path="circle">
             <a:fillToRect l="50000" t="-80000" r="50000" b="180000"/>
           </a:path>
+          <a:tileRect l="0" t="0" r="0" b="0"/>
         </a:gradFill>
-        <a:gradFill rotWithShape="1">
+        <a:gradFill>
           <a:gsLst>
             <a:gs pos="0">
               <a:schemeClr val="phClr">
                 <a:tint val="80000"/>
-                <a:satMod val="300000"/>
               </a:schemeClr>
             </a:gs>
             <a:gs pos="100000">
               <a:schemeClr val="phClr">
                 <a:shade val="30000"/>
-                <a:satMod val="200000"/>
               </a:schemeClr>
             </a:gs>
           </a:gsLst>
           <a:path path="circle">
             <a:fillToRect l="50000" t="50000" r="50000" b="50000"/>
           </a:path>
+          <a:tileRect l="0" t="0" r="0" b="0"/>
         </a:gradFill>
       </a:bgFillStyleLst>
     </a:fmtScheme>
   </a:themeElements>
-  <a:objectDefaults/>
-  <a:extraClrSchemeLst/>
 </a:theme>
 </file>
 

</xml_diff>

<commit_message>
[TRACK-724] update referral schedule decision to be made by (#2782)
</commit_message>
<xml_diff>
--- a/epictrack-api/src/api/reports/report_templates/anticipated_schedule.docx
+++ b/epictrack-api/src/api/reports/report_templates/anticipated_schedule.docx
@@ -1,13 +1,12 @@
 
 <file path=word/document.xml><?xml version="1.0" encoding="utf-8"?>
-<w:document xmlns:o="urn:schemas-microsoft-com:office:office" xmlns:r="http://schemas.openxmlformats.org/officeDocument/2006/relationships" xmlns:v="urn:schemas-microsoft-com:vml" xmlns:w="http://schemas.openxmlformats.org/wordprocessingml/2006/main" xmlns:w10="urn:schemas-microsoft-com:office:word" xmlns:wp="http://schemas.openxmlformats.org/drawingml/2006/wordprocessingDrawing" xmlns:wps="http://schemas.microsoft.com/office/word/2010/wordprocessingShape" xmlns:wpg="http://schemas.microsoft.com/office/word/2010/wordprocessingGroup" xmlns:mc="http://schemas.openxmlformats.org/markup-compatibility/2006" xmlns:wp14="http://schemas.microsoft.com/office/word/2010/wordprocessingDrawing" xmlns:w14="http://schemas.microsoft.com/office/word/2010/wordml" mc:Ignorable="w14 wp14">
+<w:document xmlns:o="urn:schemas-microsoft-com:office:office" xmlns:r="http://schemas.openxmlformats.org/officeDocument/2006/relationships" xmlns:v="urn:schemas-microsoft-com:vml" xmlns:w="http://schemas.openxmlformats.org/wordprocessingml/2006/main" xmlns:w10="urn:schemas-microsoft-com:office:word" xmlns:wp="http://schemas.openxmlformats.org/drawingml/2006/wordprocessingDrawing" xmlns:wps="http://schemas.microsoft.com/office/word/2010/wordprocessingShape" xmlns:wpg="http://schemas.microsoft.com/office/word/2010/wordprocessingGroup" xmlns:mc="http://schemas.openxmlformats.org/markup-compatibility/2006" xmlns:wp14="http://schemas.microsoft.com/office/word/2010/wordprocessingDrawing" xmlns:w14="http://schemas.microsoft.com/office/word/2010/wordml" xmlns:w15="http://schemas.microsoft.com/office/word/2012/wordml" mc:Ignorable="w14 wp14 w15">
   <w:body>
     <w:p>
       <w:pPr>
         <w:pStyle w:val="Normal"/>
         <w:rPr>
           <w:rFonts w:cs="Calibri" w:cstheme="minorHAnsi"/>
-          <w:b/>
           <w:b/>
           <w:sz w:val="20"/>
           <w:szCs w:val="20"/>
@@ -29,7 +28,6 @@
         <w:rPr>
           <w:rFonts w:cs="Calibri" w:cstheme="minorHAnsi"/>
           <w:b/>
-          <w:b/>
           <w:sz w:val="20"/>
           <w:szCs w:val="20"/>
         </w:rPr>
@@ -49,7 +47,6 @@
         <w:spacing w:lineRule="auto" w:line="276"/>
         <w:rPr>
           <w:rFonts w:cs="Calibri" w:cstheme="minorHAnsi"/>
-          <w:b/>
           <w:b/>
           <w:sz w:val="20"/>
           <w:szCs w:val="28"/>
@@ -72,7 +69,6 @@
         <w:jc w:val="center"/>
         <w:rPr>
           <w:rFonts w:cs="Calibri" w:cstheme="minorHAnsi"/>
-          <w:b/>
           <w:b/>
           <w:sz w:val="28"/>
           <w:szCs w:val="28"/>
@@ -167,6 +163,7 @@
         <w:tblW w:w="14417" w:type="dxa"/>
         <w:jc w:val="left"/>
         <w:tblInd w:w="-289" w:type="dxa"/>
+        <w:tblLayout w:type="fixed"/>
         <w:tblCellMar>
           <w:top w:w="0" w:type="dxa"/>
           <w:left w:w="108" w:type="dxa"/>
@@ -196,11 +193,10 @@
             <w:pPr>
               <w:pStyle w:val="Normal"/>
               <w:widowControl w:val="false"/>
-              <w:ind w:right="360" w:hanging="0"/>
+              <w:ind w:hanging="0" w:right="360"/>
               <w:jc w:val="center"/>
               <w:rPr>
                 <w:rFonts w:cs="Calibri" w:cstheme="minorHAnsi"/>
-                <w:b/>
                 <w:b/>
                 <w:sz w:val="20"/>
                 <w:szCs w:val="20"/>
@@ -231,7 +227,6 @@
               <w:rPr>
                 <w:rFonts w:cs="Calibri" w:cstheme="minorHAnsi"/>
                 <w:b/>
-                <w:b/>
                 <w:sz w:val="20"/>
                 <w:szCs w:val="20"/>
               </w:rPr>
@@ -262,7 +257,6 @@
               <w:rPr>
                 <w:rFonts w:cs="Calibri" w:cstheme="minorHAnsi"/>
                 <w:b/>
-                <w:b/>
                 <w:sz w:val="20"/>
                 <w:szCs w:val="20"/>
               </w:rPr>
@@ -292,7 +286,6 @@
               <w:jc w:val="center"/>
               <w:rPr>
                 <w:rFonts w:cs="Calibri" w:cstheme="minorHAnsi"/>
-                <w:b/>
                 <w:b/>
                 <w:sz w:val="20"/>
                 <w:szCs w:val="20"/>
@@ -328,7 +321,7 @@
                 <w:tab w:val="clear" w:pos="720"/>
                 <w:tab w:val="left" w:pos="453" w:leader="none"/>
               </w:tabs>
-              <w:ind w:right="-89" w:hanging="0"/>
+              <w:ind w:hanging="0" w:right="-89"/>
               <w:rPr>
                 <w:rFonts w:ascii="Calibri" w:hAnsi="Calibri" w:eastAsia="Calibri"/>
               </w:rPr>
@@ -582,7 +575,7 @@
                 <w:szCs w:val="18"/>
                 <w:lang w:val="en-US"/>
               </w:rPr>
-              <w:t xml:space="preserve">{$item_val[i].location} </w:t>
+              <w:t>{$item_val[i].location}</w:t>
             </w:r>
           </w:p>
           <w:p>
@@ -730,7 +723,75 @@
                 <w:szCs w:val="18"/>
                 <w:lang w:val="en-US"/>
               </w:rPr>
+              <w:t>{$item_val[i].category_type:ifEQ(</w:t>
+            </w:r>
+            <w:r>
+              <w:rPr>
+                <w:rFonts w:eastAsia="Calibri" w:cs="Calibri" w:cstheme="minorHAnsi"/>
+                <w:bCs/>
+                <w:sz w:val="18"/>
+                <w:szCs w:val="18"/>
+                <w:lang w:val="en-US"/>
+              </w:rPr>
+              <w:t>4</w:t>
+            </w:r>
+            <w:r>
+              <w:rPr>
+                <w:rFonts w:eastAsia="Calibri" w:cs="Calibri" w:cstheme="minorHAnsi"/>
+                <w:bCs/>
+                <w:sz w:val="18"/>
+                <w:szCs w:val="18"/>
+                <w:lang w:val="en-US"/>
+              </w:rPr>
+              <w:t>):showBegin}</w:t>
+            </w:r>
+          </w:p>
+          <w:p>
+            <w:pPr>
+              <w:pStyle w:val="Normal"/>
+              <w:widowControl w:val="false"/>
+              <w:spacing w:lineRule="atLeast" w:line="201"/>
+              <w:rPr>
+                <w:rFonts w:cs="Calibri" w:cstheme="minorHAnsi"/>
+                <w:bCs/>
+                <w:sz w:val="18"/>
+                <w:szCs w:val="18"/>
+                <w:lang w:val="en-US"/>
+              </w:rPr>
+            </w:pPr>
+            <w:r>
+              <w:rPr>
+                <w:rFonts w:eastAsia="Calibri" w:cs="Calibri" w:cstheme="minorHAnsi"/>
+                <w:bCs/>
+                <w:sz w:val="18"/>
+                <w:szCs w:val="18"/>
+                <w:lang w:val="en-US"/>
+              </w:rPr>
               <w:t>{$item_val[i].minister}</w:t>
+            </w:r>
+          </w:p>
+          <w:p>
+            <w:pPr>
+              <w:pStyle w:val="Normal"/>
+              <w:widowControl w:val="false"/>
+              <w:spacing w:lineRule="atLeast" w:line="201"/>
+              <w:rPr>
+                <w:rFonts w:cs="Calibri" w:cstheme="minorHAnsi"/>
+                <w:bCs/>
+                <w:sz w:val="18"/>
+                <w:szCs w:val="18"/>
+                <w:lang w:val="en-US"/>
+              </w:rPr>
+            </w:pPr>
+            <w:r>
+              <w:rPr>
+                <w:rFonts w:eastAsia="Calibri" w:cs="Calibri" w:cstheme="minorHAnsi"/>
+                <w:bCs/>
+                <w:sz w:val="18"/>
+                <w:szCs w:val="18"/>
+                <w:lang w:val="en-US"/>
+              </w:rPr>
+              <w:t>{$item_val[i].category_type:showEnd}</w:t>
             </w:r>
           </w:p>
           <w:p>
@@ -897,58 +958,28 @@
                 <w:sz w:val="18"/>
                 <w:szCs w:val="18"/>
               </w:rPr>
-              <w:t>{$item_val[i].anticipated_date_</w:t>
-            </w:r>
-            <w:r>
-              <w:rPr>
-                <w:rFonts w:eastAsia="Calibri" w:cs="Calibri" w:cstheme="minorHAnsi"/>
-                <w:b/>
-                <w:bCs/>
-                <w:sz w:val="18"/>
-                <w:szCs w:val="18"/>
-              </w:rPr>
-              <w:t>title</w:t>
-            </w:r>
-            <w:r>
-              <w:rPr>
-                <w:rFonts w:eastAsia="Calibri" w:cs="Calibri" w:cstheme="minorHAnsi"/>
-                <w:b/>
-                <w:bCs/>
-                <w:sz w:val="18"/>
-                <w:szCs w:val="18"/>
-              </w:rPr>
-              <w:t>}</w:t>
-            </w:r>
-          </w:p>
-          <w:p>
-            <w:pPr>
-              <w:pStyle w:val="Normal"/>
-              <w:widowControl w:val="false"/>
-              <w:rPr>
-                <w:rFonts w:eastAsia="Calibri" w:cs="Calibri" w:cstheme="minorHAnsi"/>
-                <w:sz w:val="18"/>
-                <w:szCs w:val="18"/>
-              </w:rPr>
-            </w:pPr>
-            <w:r>
-              <w:rPr>
-                <w:rFonts w:eastAsia="Calibri" w:cs="Calibri" w:cstheme="minorHAnsi"/>
-                <w:b/>
-                <w:bCs/>
-                <w:sz w:val="18"/>
-                <w:szCs w:val="18"/>
-              </w:rPr>
-              <w:t>{$item_val[i].anticipated_date_label}:</w:t>
-            </w:r>
-            <w:r>
-              <w:rPr>
-                <w:rFonts w:eastAsia="Calibri" w:cs="Calibri" w:cstheme="minorHAnsi"/>
-                <w:b/>
-                <w:bCs/>
-                <w:sz w:val="18"/>
-                <w:szCs w:val="18"/>
-              </w:rPr>
-              <w:t xml:space="preserve"> </w:t>
+              <w:t>{$item_val[i].anticipated_date_title}</w:t>
+            </w:r>
+          </w:p>
+          <w:p>
+            <w:pPr>
+              <w:pStyle w:val="Normal"/>
+              <w:widowControl w:val="false"/>
+              <w:rPr>
+                <w:rFonts w:eastAsia="Calibri" w:cs="Calibri" w:cstheme="minorHAnsi"/>
+                <w:sz w:val="18"/>
+                <w:szCs w:val="18"/>
+              </w:rPr>
+            </w:pPr>
+            <w:r>
+              <w:rPr>
+                <w:rFonts w:eastAsia="Calibri" w:cs="Calibri" w:cstheme="minorHAnsi"/>
+                <w:b/>
+                <w:bCs/>
+                <w:sz w:val="18"/>
+                <w:szCs w:val="18"/>
+              </w:rPr>
+              <w:t xml:space="preserve">{$item_val[i].anticipated_date_label}: </w:t>
             </w:r>
             <w:r>
               <w:rPr>
@@ -1354,7 +1385,7 @@
                 <w:szCs w:val="18"/>
                 <w:lang w:val="en-US"/>
               </w:rPr>
-              <w:t xml:space="preserve">{$item_val[i+1].proponent:showEnd} </w:t>
+              <w:t>{$item_val[i+1].proponent:showEnd}</w:t>
             </w:r>
           </w:p>
           <w:p>
@@ -1456,7 +1487,7 @@
                 <w:szCs w:val="18"/>
                 <w:lang w:val="en-US"/>
               </w:rPr>
-              <w:t xml:space="preserve">{$item_val[i+1].location} </w:t>
+              <w:t>{$item_val[i+1].location}</w:t>
             </w:r>
           </w:p>
           <w:p>
@@ -1615,17 +1646,172 @@
             <w:pPr>
               <w:pStyle w:val="Normal"/>
               <w:widowControl w:val="false"/>
-              <w:rPr/>
-            </w:pPr>
-            <w:r>
-              <w:rPr>
-                <w:rFonts w:eastAsia="Calibri" w:cs="Calibri" w:cstheme="minorHAnsi"/>
-                <w:bCs/>
-                <w:sz w:val="18"/>
-                <w:szCs w:val="18"/>
-                <w:lang w:val="en-US"/>
-              </w:rPr>
-              <w:t>{$item_val[i+1].minister}</w:t>
+              <w:spacing w:lineRule="atLeast" w:line="201"/>
+              <w:rPr>
+                <w:rFonts w:cs="Calibri" w:cstheme="minorHAnsi"/>
+                <w:bCs/>
+                <w:sz w:val="18"/>
+                <w:szCs w:val="18"/>
+                <w:lang w:val="en-US"/>
+              </w:rPr>
+            </w:pPr>
+            <w:r>
+              <w:rPr>
+                <w:rFonts w:eastAsia="Calibri" w:cs="Calibri" w:cstheme="minorHAnsi"/>
+                <w:bCs/>
+                <w:sz w:val="18"/>
+                <w:szCs w:val="18"/>
+                <w:lang w:val="en-US"/>
+              </w:rPr>
+              <w:t>{$item_val[i</w:t>
+            </w:r>
+            <w:r>
+              <w:rPr>
+                <w:rFonts w:eastAsia="Calibri" w:cs="Calibri" w:cstheme="minorHAnsi"/>
+                <w:bCs/>
+                <w:sz w:val="18"/>
+                <w:szCs w:val="18"/>
+                <w:lang w:val="en-US"/>
+              </w:rPr>
+              <w:t>+1</w:t>
+            </w:r>
+            <w:r>
+              <w:rPr>
+                <w:rFonts w:eastAsia="Calibri" w:cs="Calibri" w:cstheme="minorHAnsi"/>
+                <w:bCs/>
+                <w:sz w:val="18"/>
+                <w:szCs w:val="18"/>
+                <w:lang w:val="en-US"/>
+              </w:rPr>
+              <w:t>].category_type:ifEQ(</w:t>
+            </w:r>
+            <w:r>
+              <w:rPr>
+                <w:rFonts w:eastAsia="Calibri" w:cs="Calibri" w:cstheme="minorHAnsi"/>
+                <w:bCs/>
+                <w:sz w:val="18"/>
+                <w:szCs w:val="18"/>
+                <w:lang w:val="en-US"/>
+              </w:rPr>
+              <w:t>4</w:t>
+            </w:r>
+            <w:r>
+              <w:rPr>
+                <w:rFonts w:eastAsia="Calibri" w:cs="Calibri" w:cstheme="minorHAnsi"/>
+                <w:bCs/>
+                <w:sz w:val="18"/>
+                <w:szCs w:val="18"/>
+                <w:lang w:val="en-US"/>
+              </w:rPr>
+              <w:t>):showBegi</w:t>
+            </w:r>
+            <w:r>
+              <w:rPr>
+                <w:rFonts w:eastAsia="Calibri" w:cs="Calibri" w:cstheme="minorHAnsi"/>
+                <w:bCs/>
+                <w:sz w:val="18"/>
+                <w:szCs w:val="18"/>
+                <w:lang w:val="en-US"/>
+              </w:rPr>
+              <w:t>n</w:t>
+            </w:r>
+            <w:r>
+              <w:rPr>
+                <w:rFonts w:eastAsia="Calibri" w:cs="Calibri" w:cstheme="minorHAnsi"/>
+                <w:bCs/>
+                <w:sz w:val="18"/>
+                <w:szCs w:val="18"/>
+                <w:lang w:val="en-US"/>
+              </w:rPr>
+              <w:t>}</w:t>
+            </w:r>
+          </w:p>
+          <w:p>
+            <w:pPr>
+              <w:pStyle w:val="Normal"/>
+              <w:widowControl w:val="false"/>
+              <w:spacing w:lineRule="atLeast" w:line="201"/>
+              <w:rPr>
+                <w:rFonts w:cs="Calibri" w:cstheme="minorHAnsi"/>
+                <w:bCs/>
+                <w:sz w:val="18"/>
+                <w:szCs w:val="18"/>
+                <w:lang w:val="en-US"/>
+              </w:rPr>
+            </w:pPr>
+            <w:r>
+              <w:rPr>
+                <w:rFonts w:eastAsia="Calibri" w:cs="Calibri" w:cstheme="minorHAnsi"/>
+                <w:bCs/>
+                <w:sz w:val="18"/>
+                <w:szCs w:val="18"/>
+                <w:lang w:val="en-US"/>
+              </w:rPr>
+              <w:t>{$item_val[i</w:t>
+            </w:r>
+            <w:r>
+              <w:rPr>
+                <w:rFonts w:eastAsia="Calibri" w:cs="Calibri" w:cstheme="minorHAnsi"/>
+                <w:bCs/>
+                <w:sz w:val="18"/>
+                <w:szCs w:val="18"/>
+                <w:lang w:val="en-US"/>
+              </w:rPr>
+              <w:t>+1</w:t>
+            </w:r>
+            <w:r>
+              <w:rPr>
+                <w:rFonts w:eastAsia="Calibri" w:cs="Calibri" w:cstheme="minorHAnsi"/>
+                <w:bCs/>
+                <w:sz w:val="18"/>
+                <w:szCs w:val="18"/>
+                <w:lang w:val="en-US"/>
+              </w:rPr>
+              <w:t>].minister}</w:t>
+            </w:r>
+          </w:p>
+          <w:p>
+            <w:pPr>
+              <w:pStyle w:val="Normal"/>
+              <w:widowControl w:val="false"/>
+              <w:spacing w:lineRule="atLeast" w:line="201"/>
+              <w:rPr>
+                <w:rFonts w:cs="Calibri" w:cstheme="minorHAnsi"/>
+                <w:bCs/>
+                <w:sz w:val="18"/>
+                <w:szCs w:val="18"/>
+                <w:lang w:val="en-US"/>
+              </w:rPr>
+            </w:pPr>
+            <w:r>
+              <w:rPr>
+                <w:rFonts w:eastAsia="Calibri" w:cs="Calibri" w:cstheme="minorHAnsi"/>
+                <w:bCs/>
+                <w:sz w:val="18"/>
+                <w:szCs w:val="18"/>
+                <w:lang w:val="en-US"/>
+              </w:rPr>
+              <w:t>{$item_val[i</w:t>
+            </w:r>
+            <w:r>
+              <w:rPr>
+                <w:rFonts w:eastAsia="Calibri" w:cs="Calibri" w:cstheme="minorHAnsi"/>
+                <w:bCs/>
+                <w:sz w:val="18"/>
+                <w:szCs w:val="18"/>
+                <w:lang w:val="en-US"/>
+              </w:rPr>
+              <w:t>+1</w:t>
+            </w:r>
+            <w:r>
+              <w:rPr>
+                <w:rFonts w:eastAsia="Calibri" w:cs="Calibri" w:cstheme="minorHAnsi"/>
+                <w:bCs/>
+                <w:sz w:val="18"/>
+                <w:szCs w:val="18"/>
+                <w:lang w:val="en-US"/>
+              </w:rPr>
+              <w:t>].category_type:showEnd}</w:t>
             </w:r>
           </w:p>
         </w:tc>
@@ -2104,7 +2290,6 @@
               <w:widowControl w:val="false"/>
               <w:rPr>
                 <w:rFonts w:cs="Calibri" w:cstheme="minorHAnsi"/>
-                <w:b/>
                 <w:b/>
                 <w:bCs/>
                 <w:sz w:val="18"/>
@@ -2186,7 +2371,6 @@
         <w:pStyle w:val="Normal"/>
         <w:jc w:val="center"/>
         <w:rPr>
-          <w:b/>
           <w:b/>
           <w:bCs/>
           <w:sz w:val="28"/>
@@ -2208,6 +2392,7 @@
     <w:p>
       <w:pPr>
         <w:pStyle w:val="Normal"/>
+        <w:spacing w:before="0" w:after="0"/>
         <w:jc w:val="center"/>
         <w:rPr/>
       </w:pPr>
@@ -2222,13 +2407,15 @@
       </w:r>
     </w:p>
     <w:sectPr>
-      <w:headerReference w:type="default" r:id="rId2"/>
-      <w:headerReference w:type="first" r:id="rId3"/>
-      <w:footerReference w:type="default" r:id="rId4"/>
-      <w:footerReference w:type="first" r:id="rId5"/>
+      <w:headerReference w:type="even" r:id="rId2"/>
+      <w:headerReference w:type="default" r:id="rId3"/>
+      <w:headerReference w:type="first" r:id="rId4"/>
+      <w:footerReference w:type="even" r:id="rId5"/>
+      <w:footerReference w:type="default" r:id="rId6"/>
+      <w:footerReference w:type="first" r:id="rId7"/>
       <w:type w:val="nextPage"/>
       <w:pgSz w:orient="landscape" w:w="15840" w:h="12240"/>
-      <w:pgMar w:left="851" w:right="851" w:header="624" w:top="681" w:footer="709" w:bottom="766" w:gutter="0"/>
+      <w:pgMar w:left="851" w:right="851" w:gutter="0" w:header="624" w:top="681" w:footer="709" w:bottom="766"/>
       <w:pgNumType w:fmt="decimal"/>
       <w:formProt w:val="false"/>
       <w:titlePg/>
@@ -2240,7 +2427,21 @@
 </file>
 
 <file path=word/footer1.xml><?xml version="1.0" encoding="utf-8"?>
-<w:ftr xmlns:o="urn:schemas-microsoft-com:office:office" xmlns:r="http://schemas.openxmlformats.org/officeDocument/2006/relationships" xmlns:v="urn:schemas-microsoft-com:vml" xmlns:w="http://schemas.openxmlformats.org/wordprocessingml/2006/main" xmlns:w10="urn:schemas-microsoft-com:office:word" xmlns:wp="http://schemas.openxmlformats.org/drawingml/2006/wordprocessingDrawing" xmlns:wps="http://schemas.microsoft.com/office/word/2010/wordprocessingShape" xmlns:wpg="http://schemas.microsoft.com/office/word/2010/wordprocessingGroup" xmlns:mc="http://schemas.openxmlformats.org/markup-compatibility/2006" xmlns:wp14="http://schemas.microsoft.com/office/word/2010/wordprocessingDrawing" xmlns:w14="http://schemas.microsoft.com/office/word/2010/wordml" mc:Ignorable="w14 wp14">
+<w:ftr xmlns:o="urn:schemas-microsoft-com:office:office" xmlns:r="http://schemas.openxmlformats.org/officeDocument/2006/relationships" xmlns:v="urn:schemas-microsoft-com:vml" xmlns:w="http://schemas.openxmlformats.org/wordprocessingml/2006/main" xmlns:w10="urn:schemas-microsoft-com:office:word" xmlns:wp="http://schemas.openxmlformats.org/drawingml/2006/wordprocessingDrawing" xmlns:wps="http://schemas.microsoft.com/office/word/2010/wordprocessingShape" xmlns:wpg="http://schemas.microsoft.com/office/word/2010/wordprocessingGroup" xmlns:mc="http://schemas.openxmlformats.org/markup-compatibility/2006" xmlns:wp14="http://schemas.microsoft.com/office/word/2010/wordprocessingDrawing" xmlns:w14="http://schemas.microsoft.com/office/word/2010/wordml" xmlns:w15="http://schemas.microsoft.com/office/word/2012/wordml" mc:Ignorable="w14 wp14 w15">
+  <w:p>
+    <w:pPr>
+      <w:pStyle w:val="Footer"/>
+      <w:rPr/>
+    </w:pPr>
+    <w:r>
+      <w:rPr/>
+    </w:r>
+  </w:p>
+</w:ftr>
+</file>
+
+<file path=word/footer2.xml><?xml version="1.0" encoding="utf-8"?>
+<w:ftr xmlns:o="urn:schemas-microsoft-com:office:office" xmlns:r="http://schemas.openxmlformats.org/officeDocument/2006/relationships" xmlns:v="urn:schemas-microsoft-com:vml" xmlns:w="http://schemas.openxmlformats.org/wordprocessingml/2006/main" xmlns:w10="urn:schemas-microsoft-com:office:word" xmlns:wp="http://schemas.openxmlformats.org/drawingml/2006/wordprocessingDrawing" xmlns:wps="http://schemas.microsoft.com/office/word/2010/wordprocessingShape" xmlns:wpg="http://schemas.microsoft.com/office/word/2010/wordprocessingGroup" xmlns:mc="http://schemas.openxmlformats.org/markup-compatibility/2006" xmlns:wp14="http://schemas.microsoft.com/office/word/2010/wordprocessingDrawing" xmlns:w14="http://schemas.microsoft.com/office/word/2010/wordml" xmlns:w15="http://schemas.microsoft.com/office/word/2012/wordml" mc:Ignorable="w14 wp14 w15">
   <w:p>
     <w:pPr>
       <w:pStyle w:val="Footer"/>
@@ -2273,7 +2474,7 @@
         <w:szCs w:val="16"/>
         <w:bCs/>
       </w:rPr>
-      <w:instrText> PAGE </w:instrText>
+      <w:instrText xml:space="preserve"> PAGE </w:instrText>
     </w:r>
     <w:r>
       <w:rPr>
@@ -2325,7 +2526,7 @@
         <w:szCs w:val="16"/>
         <w:bCs/>
       </w:rPr>
-      <w:instrText> NUMPAGES </w:instrText>
+      <w:instrText xml:space="preserve"> NUMPAGES </w:instrText>
     </w:r>
     <w:r>
       <w:rPr>
@@ -2358,8 +2559,8 @@
 </w:ftr>
 </file>
 
-<file path=word/footer2.xml><?xml version="1.0" encoding="utf-8"?>
-<w:ftr xmlns:o="urn:schemas-microsoft-com:office:office" xmlns:r="http://schemas.openxmlformats.org/officeDocument/2006/relationships" xmlns:v="urn:schemas-microsoft-com:vml" xmlns:w="http://schemas.openxmlformats.org/wordprocessingml/2006/main" xmlns:w10="urn:schemas-microsoft-com:office:word" xmlns:wp="http://schemas.openxmlformats.org/drawingml/2006/wordprocessingDrawing" xmlns:wps="http://schemas.microsoft.com/office/word/2010/wordprocessingShape" xmlns:wpg="http://schemas.microsoft.com/office/word/2010/wordprocessingGroup" xmlns:mc="http://schemas.openxmlformats.org/markup-compatibility/2006" xmlns:wp14="http://schemas.microsoft.com/office/word/2010/wordprocessingDrawing" xmlns:w14="http://schemas.microsoft.com/office/word/2010/wordml" mc:Ignorable="w14 wp14">
+<file path=word/footer3.xml><?xml version="1.0" encoding="utf-8"?>
+<w:ftr xmlns:o="urn:schemas-microsoft-com:office:office" xmlns:r="http://schemas.openxmlformats.org/officeDocument/2006/relationships" xmlns:v="urn:schemas-microsoft-com:vml" xmlns:w="http://schemas.openxmlformats.org/wordprocessingml/2006/main" xmlns:w10="urn:schemas-microsoft-com:office:word" xmlns:wp="http://schemas.openxmlformats.org/drawingml/2006/wordprocessingDrawing" xmlns:wps="http://schemas.microsoft.com/office/word/2010/wordprocessingShape" xmlns:wpg="http://schemas.microsoft.com/office/word/2010/wordprocessingGroup" xmlns:mc="http://schemas.openxmlformats.org/markup-compatibility/2006" xmlns:wp14="http://schemas.microsoft.com/office/word/2010/wordprocessingDrawing" xmlns:w14="http://schemas.microsoft.com/office/word/2010/wordml" xmlns:w15="http://schemas.microsoft.com/office/word/2012/wordml" mc:Ignorable="w14 wp14 w15">
   <w:p>
     <w:pPr>
       <w:pStyle w:val="Footer"/>
@@ -2392,7 +2593,7 @@
         <w:szCs w:val="16"/>
         <w:bCs/>
       </w:rPr>
-      <w:instrText> PAGE </w:instrText>
+      <w:instrText xml:space="preserve"> PAGE </w:instrText>
     </w:r>
     <w:r>
       <w:rPr>
@@ -2444,7 +2645,7 @@
         <w:szCs w:val="16"/>
         <w:bCs/>
       </w:rPr>
-      <w:instrText> NUMPAGES </w:instrText>
+      <w:instrText xml:space="preserve"> NUMPAGES </w:instrText>
     </w:r>
     <w:r>
       <w:rPr>
@@ -2478,7 +2679,21 @@
 </file>
 
 <file path=word/header1.xml><?xml version="1.0" encoding="utf-8"?>
-<w:hdr xmlns:o="urn:schemas-microsoft-com:office:office" xmlns:r="http://schemas.openxmlformats.org/officeDocument/2006/relationships" xmlns:v="urn:schemas-microsoft-com:vml" xmlns:w="http://schemas.openxmlformats.org/wordprocessingml/2006/main" xmlns:w10="urn:schemas-microsoft-com:office:word" xmlns:wp="http://schemas.openxmlformats.org/drawingml/2006/wordprocessingDrawing" xmlns:wps="http://schemas.microsoft.com/office/word/2010/wordprocessingShape" xmlns:wpg="http://schemas.microsoft.com/office/word/2010/wordprocessingGroup" xmlns:mc="http://schemas.openxmlformats.org/markup-compatibility/2006" xmlns:wp14="http://schemas.microsoft.com/office/word/2010/wordprocessingDrawing" xmlns:w14="http://schemas.microsoft.com/office/word/2010/wordml" mc:Ignorable="w14 wp14">
+<w:hdr xmlns:o="urn:schemas-microsoft-com:office:office" xmlns:r="http://schemas.openxmlformats.org/officeDocument/2006/relationships" xmlns:v="urn:schemas-microsoft-com:vml" xmlns:w="http://schemas.openxmlformats.org/wordprocessingml/2006/main" xmlns:w10="urn:schemas-microsoft-com:office:word" xmlns:wp="http://schemas.openxmlformats.org/drawingml/2006/wordprocessingDrawing" xmlns:wps="http://schemas.microsoft.com/office/word/2010/wordprocessingShape" xmlns:wpg="http://schemas.microsoft.com/office/word/2010/wordprocessingGroup" xmlns:mc="http://schemas.openxmlformats.org/markup-compatibility/2006" xmlns:wp14="http://schemas.microsoft.com/office/word/2010/wordprocessingDrawing" xmlns:w14="http://schemas.microsoft.com/office/word/2010/wordml" xmlns:w15="http://schemas.microsoft.com/office/word/2012/wordml" mc:Ignorable="w14 wp14 w15">
+  <w:p>
+    <w:pPr>
+      <w:pStyle w:val="Header"/>
+      <w:rPr/>
+    </w:pPr>
+    <w:r>
+      <w:rPr/>
+    </w:r>
+  </w:p>
+</w:hdr>
+</file>
+
+<file path=word/header2.xml><?xml version="1.0" encoding="utf-8"?>
+<w:hdr xmlns:o="urn:schemas-microsoft-com:office:office" xmlns:r="http://schemas.openxmlformats.org/officeDocument/2006/relationships" xmlns:v="urn:schemas-microsoft-com:vml" xmlns:w="http://schemas.openxmlformats.org/wordprocessingml/2006/main" xmlns:w10="urn:schemas-microsoft-com:office:word" xmlns:wp="http://schemas.openxmlformats.org/drawingml/2006/wordprocessingDrawing" xmlns:wps="http://schemas.microsoft.com/office/word/2010/wordprocessingShape" xmlns:wpg="http://schemas.microsoft.com/office/word/2010/wordprocessingGroup" xmlns:mc="http://schemas.openxmlformats.org/markup-compatibility/2006" xmlns:wp14="http://schemas.microsoft.com/office/word/2010/wordprocessingDrawing" xmlns:w14="http://schemas.microsoft.com/office/word/2010/wordml" xmlns:w15="http://schemas.microsoft.com/office/word/2012/wordml" mc:Ignorable="w14 wp14 w15">
   <w:p>
     <w:pPr>
       <w:pStyle w:val="Header"/>
@@ -2492,8 +2707,8 @@
 </w:hdr>
 </file>
 
-<file path=word/header2.xml><?xml version="1.0" encoding="utf-8"?>
-<w:hdr xmlns:o="urn:schemas-microsoft-com:office:office" xmlns:r="http://schemas.openxmlformats.org/officeDocument/2006/relationships" xmlns:v="urn:schemas-microsoft-com:vml" xmlns:w="http://schemas.openxmlformats.org/wordprocessingml/2006/main" xmlns:w10="urn:schemas-microsoft-com:office:word" xmlns:wp="http://schemas.openxmlformats.org/drawingml/2006/wordprocessingDrawing" xmlns:wps="http://schemas.microsoft.com/office/word/2010/wordprocessingShape" xmlns:wpg="http://schemas.microsoft.com/office/word/2010/wordprocessingGroup" xmlns:mc="http://schemas.openxmlformats.org/markup-compatibility/2006" xmlns:wp14="http://schemas.microsoft.com/office/word/2010/wordprocessingDrawing" xmlns:w14="http://schemas.microsoft.com/office/word/2010/wordml" mc:Ignorable="w14 wp14">
+<file path=word/header3.xml><?xml version="1.0" encoding="utf-8"?>
+<w:hdr xmlns:o="urn:schemas-microsoft-com:office:office" xmlns:r="http://schemas.openxmlformats.org/officeDocument/2006/relationships" xmlns:v="urn:schemas-microsoft-com:vml" xmlns:w="http://schemas.openxmlformats.org/wordprocessingml/2006/main" xmlns:w10="urn:schemas-microsoft-com:office:word" xmlns:wp="http://schemas.openxmlformats.org/drawingml/2006/wordprocessingDrawing" xmlns:wps="http://schemas.microsoft.com/office/word/2010/wordprocessingShape" xmlns:wpg="http://schemas.microsoft.com/office/word/2010/wordprocessingGroup" xmlns:mc="http://schemas.openxmlformats.org/markup-compatibility/2006" xmlns:wp14="http://schemas.microsoft.com/office/word/2010/wordprocessingDrawing" xmlns:w14="http://schemas.microsoft.com/office/word/2010/wordml" xmlns:w15="http://schemas.microsoft.com/office/word/2012/wordml" mc:Ignorable="w14 wp14 w15">
   <w:p>
     <w:pPr>
       <w:pStyle w:val="Header"/>
@@ -2504,7 +2719,6 @@
         <w:tab w:val="left" w:pos="11025" w:leader="none"/>
       </w:tabs>
       <w:rPr>
-        <w:b/>
         <w:b/>
         <w:sz w:val="28"/>
         <w:szCs w:val="28"/>
@@ -2966,7 +3180,7 @@
     <w:qFormat/>
     <w:rPr/>
   </w:style>
-  <w:style w:type="character" w:styleId="Annotationreference">
+  <w:style w:type="character" w:styleId="annotationreference">
     <w:name w:val="annotation reference"/>
     <w:basedOn w:val="DefaultParagraphFont"/>
     <w:uiPriority w:val="99"/>
@@ -2988,7 +3202,7 @@
       <w:iCs/>
     </w:rPr>
   </w:style>
-  <w:style w:type="character" w:styleId="InternetLink">
+  <w:style w:type="character" w:styleId="Hyperlink">
     <w:name w:val="Hyperlink"/>
     <w:basedOn w:val="DefaultParagraphFont"/>
     <w:uiPriority w:val="99"/>
@@ -3043,7 +3257,7 @@
       <w:szCs w:val="16"/>
     </w:rPr>
   </w:style>
-  <w:style w:type="character" w:styleId="Value3" w:customStyle="1">
+  <w:style w:type="character" w:styleId="value3" w:customStyle="1">
     <w:name w:val="value3"/>
     <w:basedOn w:val="DefaultParagraphFont"/>
     <w:qFormat/>
@@ -3051,13 +3265,13 @@
       <w:color w:val="666666"/>
     </w:rPr>
   </w:style>
-  <w:style w:type="character" w:styleId="Ngbinding" w:customStyle="1">
+  <w:style w:type="character" w:styleId="ng-binding" w:customStyle="1">
     <w:name w:val="ng-binding"/>
     <w:basedOn w:val="DefaultParagraphFont"/>
     <w:qFormat/>
     <w:rPr/>
   </w:style>
-  <w:style w:type="character" w:styleId="Value1" w:customStyle="1">
+  <w:style w:type="character" w:styleId="value1" w:customStyle="1">
     <w:name w:val="value1"/>
     <w:basedOn w:val="DefaultParagraphFont"/>
     <w:qFormat/>
@@ -3090,7 +3304,7 @@
       <w:szCs w:val="20"/>
     </w:rPr>
   </w:style>
-  <w:style w:type="character" w:styleId="Value2" w:customStyle="1">
+  <w:style w:type="character" w:styleId="value2" w:customStyle="1">
     <w:name w:val="value2"/>
     <w:basedOn w:val="DefaultParagraphFont"/>
     <w:qFormat/>
@@ -3098,7 +3312,7 @@
       <w:color w:val="666666"/>
     </w:rPr>
   </w:style>
-  <w:style w:type="character" w:styleId="Value" w:customStyle="1">
+  <w:style w:type="character" w:styleId="value" w:customStyle="1">
     <w:name w:val="value"/>
     <w:basedOn w:val="DefaultParagraphFont"/>
     <w:qFormat/>
@@ -3112,13 +3326,13 @@
     <w:qFormat/>
     <w:rPr>
       <w:rFonts w:ascii="Calibri Light" w:hAnsi="Calibri Light"/>
-      <w:color w:val="000000" w:themeColor="text1"/>
+      <w:color w:themeColor="text1" w:val="000000"/>
     </w:rPr>
   </w:style>
   <w:style w:type="paragraph" w:styleId="Heading" w:customStyle="1">
     <w:name w:val="Heading"/>
     <w:basedOn w:val="Normal"/>
-    <w:next w:val="TextBody"/>
+    <w:next w:val="BodyText"/>
     <w:qFormat/>
     <w:pPr>
       <w:keepNext w:val="true"/>
@@ -3130,7 +3344,7 @@
       <w:szCs w:val="28"/>
     </w:rPr>
   </w:style>
-  <w:style w:type="paragraph" w:styleId="TextBody">
+  <w:style w:type="paragraph" w:styleId="BodyText">
     <w:name w:val="Body Text"/>
     <w:basedOn w:val="Normal"/>
     <w:pPr>
@@ -3140,7 +3354,7 @@
   </w:style>
   <w:style w:type="paragraph" w:styleId="List">
     <w:name w:val="List"/>
-    <w:basedOn w:val="TextBody"/>
+    <w:basedOn w:val="BodyText"/>
     <w:pPr/>
     <w:rPr>
       <w:rFonts w:cs="FreeSans"/>
@@ -3173,22 +3387,6 @@
       <w:rFonts w:cs="FreeSans"/>
     </w:rPr>
   </w:style>
-  <w:style w:type="paragraph" w:styleId="Caption1">
-    <w:name w:val="caption"/>
-    <w:basedOn w:val="Normal"/>
-    <w:qFormat/>
-    <w:pPr>
-      <w:suppressLineNumbers/>
-      <w:spacing w:before="120" w:after="120"/>
-    </w:pPr>
-    <w:rPr>
-      <w:rFonts w:cs="FreeSans"/>
-      <w:i/>
-      <w:iCs/>
-      <w:sz w:val="24"/>
-      <w:szCs w:val="24"/>
-    </w:rPr>
-  </w:style>
   <w:style w:type="paragraph" w:styleId="BalloonText">
     <w:name w:val="Balloon Text"/>
     <w:basedOn w:val="Normal"/>
@@ -3204,8 +3402,8 @@
       <w:szCs w:val="16"/>
     </w:rPr>
   </w:style>
-  <w:style w:type="paragraph" w:styleId="Annotationtext">
-    <w:name w:val="annotation text"/>
+  <w:style w:type="paragraph" w:styleId="AnnotationText">
+    <w:name w:val="Annotation Text"/>
     <w:basedOn w:val="Normal"/>
     <w:link w:val="CommentTextChar"/>
     <w:uiPriority w:val="99"/>
@@ -3217,10 +3415,10 @@
       <w:szCs w:val="20"/>
     </w:rPr>
   </w:style>
-  <w:style w:type="paragraph" w:styleId="Annotationsubject">
+  <w:style w:type="paragraph" w:styleId="annotationsubject">
     <w:name w:val="annotation subject"/>
-    <w:basedOn w:val="Annotationtext"/>
-    <w:next w:val="Annotationtext"/>
+    <w:basedOn w:val="AnnotationText"/>
+    <w:next w:val="AnnotationText"/>
     <w:link w:val="CommentSubjectChar"/>
     <w:uiPriority w:val="99"/>
     <w:semiHidden/>
@@ -3295,7 +3493,7 @@
     <w:qFormat/>
     <w:pPr>
       <w:spacing w:before="0" w:after="0"/>
-      <w:ind w:left="720" w:hanging="0"/>
+      <w:ind w:hanging="0" w:left="720"/>
       <w:contextualSpacing/>
     </w:pPr>
     <w:rPr/>
@@ -3345,7 +3543,30 @@
     </w:pPr>
     <w:rPr>
       <w:rFonts w:ascii="Calibri Light" w:hAnsi="Calibri Light" w:cs="" w:cstheme="minorBidi"/>
-      <w:color w:val="000000" w:themeColor="text1"/>
+      <w:color w:themeColor="text1" w:val="000000"/>
+    </w:rPr>
+  </w:style>
+  <w:style w:type="paragraph" w:styleId="TableContents">
+    <w:name w:val="Table Contents"/>
+    <w:basedOn w:val="Normal"/>
+    <w:qFormat/>
+    <w:pPr>
+      <w:widowControl w:val="false"/>
+      <w:suppressLineNumbers/>
+    </w:pPr>
+    <w:rPr/>
+  </w:style>
+  <w:style w:type="paragraph" w:styleId="TableHeading">
+    <w:name w:val="Table Heading"/>
+    <w:basedOn w:val="TableContents"/>
+    <w:qFormat/>
+    <w:pPr>
+      <w:suppressLineNumbers/>
+      <w:jc w:val="center"/>
+    </w:pPr>
+    <w:rPr>
+      <w:b/>
+      <w:bCs/>
     </w:rPr>
   </w:style>
   <w:style w:type="numbering" w:styleId="NoList" w:default="1">
@@ -3389,41 +3610,41 @@
 </file>
 
 <file path=word/theme/theme1.xml><?xml version="1.0" encoding="utf-8"?>
-<a:theme xmlns:a="http://schemas.openxmlformats.org/drawingml/2006/main" name="Office Theme">
+<a:theme xmlns:a="http://schemas.openxmlformats.org/drawingml/2006/main" xmlns:r="http://schemas.openxmlformats.org/officeDocument/2006/relationships" name="Office Theme">
   <a:themeElements>
     <a:clrScheme name="Office">
       <a:dk1>
-        <a:sysClr val="windowText" lastClr="000000"/>
+        <a:srgbClr val="000000"/>
       </a:dk1>
       <a:lt1>
-        <a:sysClr val="window" lastClr="FFFFFF"/>
+        <a:srgbClr val="ffffff"/>
       </a:lt1>
       <a:dk2>
-        <a:srgbClr val="1F497D"/>
+        <a:srgbClr val="1f497d"/>
       </a:dk2>
       <a:lt2>
-        <a:srgbClr val="EEECE1"/>
+        <a:srgbClr val="eeece1"/>
       </a:lt2>
       <a:accent1>
-        <a:srgbClr val="4F81BD"/>
+        <a:srgbClr val="4f81bd"/>
       </a:accent1>
       <a:accent2>
-        <a:srgbClr val="C0504D"/>
+        <a:srgbClr val="c0504d"/>
       </a:accent2>
       <a:accent3>
-        <a:srgbClr val="9BBB59"/>
+        <a:srgbClr val="9bbb59"/>
       </a:accent3>
       <a:accent4>
-        <a:srgbClr val="8064A2"/>
+        <a:srgbClr val="8064a2"/>
       </a:accent4>
       <a:accent5>
-        <a:srgbClr val="4BACC6"/>
+        <a:srgbClr val="4bacc6"/>
       </a:accent5>
       <a:accent6>
-        <a:srgbClr val="F79646"/>
+        <a:srgbClr val="f79646"/>
       </a:accent6>
       <a:hlink>
-        <a:srgbClr val="0000FF"/>
+        <a:srgbClr val="0000ff"/>
       </a:hlink>
       <a:folHlink>
         <a:srgbClr val="800080"/>
@@ -3431,245 +3652,135 @@
     </a:clrScheme>
     <a:fontScheme name="Office">
       <a:majorFont>
-        <a:latin typeface="Cambria"/>
+        <a:latin typeface="Cambria" pitchFamily="0" charset="1"/>
         <a:ea typeface=""/>
         <a:cs typeface=""/>
-        <a:font script="Jpan" typeface="ＭＳ ゴシック"/>
-        <a:font script="Hang" typeface="맑은 고딕"/>
-        <a:font script="Hans" typeface="宋体"/>
-        <a:font script="Hant" typeface="新細明體"/>
-        <a:font script="Arab" typeface="Times New Roman"/>
-        <a:font script="Hebr" typeface="Times New Roman"/>
-        <a:font script="Thai" typeface="Angsana New"/>
-        <a:font script="Ethi" typeface="Nyala"/>
-        <a:font script="Beng" typeface="Vrinda"/>
-        <a:font script="Gujr" typeface="Shruti"/>
-        <a:font script="Khmr" typeface="MoolBoran"/>
-        <a:font script="Knda" typeface="Tunga"/>
-        <a:font script="Guru" typeface="Raavi"/>
-        <a:font script="Cans" typeface="Euphemia"/>
-        <a:font script="Cher" typeface="Plantagenet Cherokee"/>
-        <a:font script="Yiii" typeface="Microsoft Yi Baiti"/>
-        <a:font script="Tibt" typeface="Microsoft Himalaya"/>
-        <a:font script="Thaa" typeface="MV Boli"/>
-        <a:font script="Deva" typeface="Mangal"/>
-        <a:font script="Telu" typeface="Gautami"/>
-        <a:font script="Taml" typeface="Latha"/>
-        <a:font script="Syrc" typeface="Estrangelo Edessa"/>
-        <a:font script="Orya" typeface="Kalinga"/>
-        <a:font script="Mlym" typeface="Kartika"/>
-        <a:font script="Laoo" typeface="DokChampa"/>
-        <a:font script="Sinh" typeface="Iskoola Pota"/>
-        <a:font script="Mong" typeface="Mongolian Baiti"/>
-        <a:font script="Viet" typeface="Times New Roman"/>
-        <a:font script="Uigh" typeface="Microsoft Uighur"/>
-        <a:font script="Geor" typeface="Sylfaen"/>
       </a:majorFont>
       <a:minorFont>
-        <a:latin typeface="Calibri"/>
+        <a:latin typeface="Calibri" pitchFamily="0" charset="1"/>
         <a:ea typeface=""/>
         <a:cs typeface=""/>
-        <a:font script="Jpan" typeface="ＭＳ 明朝"/>
-        <a:font script="Hang" typeface="맑은 고딕"/>
-        <a:font script="Hans" typeface="宋体"/>
-        <a:font script="Hant" typeface="新細明體"/>
-        <a:font script="Arab" typeface="Arial"/>
-        <a:font script="Hebr" typeface="Arial"/>
-        <a:font script="Thai" typeface="Cordia New"/>
-        <a:font script="Ethi" typeface="Nyala"/>
-        <a:font script="Beng" typeface="Vrinda"/>
-        <a:font script="Gujr" typeface="Shruti"/>
-        <a:font script="Khmr" typeface="DaunPenh"/>
-        <a:font script="Knda" typeface="Tunga"/>
-        <a:font script="Guru" typeface="Raavi"/>
-        <a:font script="Cans" typeface="Euphemia"/>
-        <a:font script="Cher" typeface="Plantagenet Cherokee"/>
-        <a:font script="Yiii" typeface="Microsoft Yi Baiti"/>
-        <a:font script="Tibt" typeface="Microsoft Himalaya"/>
-        <a:font script="Thaa" typeface="MV Boli"/>
-        <a:font script="Deva" typeface="Mangal"/>
-        <a:font script="Telu" typeface="Gautami"/>
-        <a:font script="Taml" typeface="Latha"/>
-        <a:font script="Syrc" typeface="Estrangelo Edessa"/>
-        <a:font script="Orya" typeface="Kalinga"/>
-        <a:font script="Mlym" typeface="Kartika"/>
-        <a:font script="Laoo" typeface="DokChampa"/>
-        <a:font script="Sinh" typeface="Iskoola Pota"/>
-        <a:font script="Mong" typeface="Mongolian Baiti"/>
-        <a:font script="Viet" typeface="Arial"/>
-        <a:font script="Uigh" typeface="Microsoft Uighur"/>
-        <a:font script="Geor" typeface="Sylfaen"/>
       </a:minorFont>
     </a:fontScheme>
-    <a:fmtScheme name="Office">
+    <a:fmtScheme>
       <a:fillStyleLst>
         <a:solidFill>
           <a:schemeClr val="phClr"/>
         </a:solidFill>
-        <a:gradFill rotWithShape="1">
+        <a:gradFill>
           <a:gsLst>
             <a:gs pos="0">
               <a:schemeClr val="phClr">
                 <a:tint val="50000"/>
-                <a:satMod val="300000"/>
               </a:schemeClr>
             </a:gs>
             <a:gs pos="35000">
               <a:schemeClr val="phClr">
                 <a:tint val="37000"/>
-                <a:satMod val="300000"/>
               </a:schemeClr>
             </a:gs>
             <a:gs pos="100000">
               <a:schemeClr val="phClr">
                 <a:tint val="15000"/>
-                <a:satMod val="350000"/>
               </a:schemeClr>
             </a:gs>
           </a:gsLst>
           <a:lin ang="16200000" scaled="1"/>
+          <a:tileRect l="0" t="0" r="0" b="0"/>
         </a:gradFill>
-        <a:gradFill rotWithShape="1">
+        <a:gradFill>
           <a:gsLst>
             <a:gs pos="0">
               <a:schemeClr val="phClr">
                 <a:shade val="51000"/>
-                <a:satMod val="130000"/>
               </a:schemeClr>
             </a:gs>
             <a:gs pos="80000">
               <a:schemeClr val="phClr">
                 <a:shade val="93000"/>
-                <a:satMod val="130000"/>
               </a:schemeClr>
             </a:gs>
             <a:gs pos="100000">
               <a:schemeClr val="phClr">
                 <a:shade val="94000"/>
-                <a:satMod val="135000"/>
               </a:schemeClr>
             </a:gs>
           </a:gsLst>
           <a:lin ang="16200000" scaled="0"/>
+          <a:tileRect l="0" t="0" r="0" b="0"/>
         </a:gradFill>
       </a:fillStyleLst>
       <a:lnStyleLst>
         <a:ln w="9525" cap="flat" cmpd="sng" algn="ctr">
-          <a:solidFill>
-            <a:schemeClr val="phClr">
-              <a:shade val="95000"/>
-              <a:satMod val="105000"/>
-            </a:schemeClr>
-          </a:solidFill>
           <a:prstDash val="solid"/>
         </a:ln>
         <a:ln w="25400" cap="flat" cmpd="sng" algn="ctr">
-          <a:solidFill>
-            <a:schemeClr val="phClr"/>
-          </a:solidFill>
           <a:prstDash val="solid"/>
         </a:ln>
         <a:ln w="38100" cap="flat" cmpd="sng" algn="ctr">
-          <a:solidFill>
-            <a:schemeClr val="phClr"/>
-          </a:solidFill>
           <a:prstDash val="solid"/>
         </a:ln>
       </a:lnStyleLst>
       <a:effectStyleLst>
         <a:effectStyle>
-          <a:effectLst>
-            <a:outerShdw blurRad="40000" dist="20000" dir="5400000" rotWithShape="0">
-              <a:srgbClr val="000000">
-                <a:alpha val="38000"/>
-              </a:srgbClr>
-            </a:outerShdw>
-          </a:effectLst>
+          <a:effectLst/>
         </a:effectStyle>
         <a:effectStyle>
-          <a:effectLst>
-            <a:outerShdw blurRad="40000" dist="23000" dir="5400000" rotWithShape="0">
-              <a:srgbClr val="000000">
-                <a:alpha val="35000"/>
-              </a:srgbClr>
-            </a:outerShdw>
-          </a:effectLst>
+          <a:effectLst/>
         </a:effectStyle>
         <a:effectStyle>
-          <a:effectLst>
-            <a:outerShdw blurRad="40000" dist="23000" dir="5400000" rotWithShape="0">
-              <a:srgbClr val="000000">
-                <a:alpha val="35000"/>
-              </a:srgbClr>
-            </a:outerShdw>
-          </a:effectLst>
-          <a:scene3d>
-            <a:camera prst="orthographicFront">
-              <a:rot lat="0" lon="0" rev="0"/>
-            </a:camera>
-            <a:lightRig rig="threePt" dir="t">
-              <a:rot lat="0" lon="0" rev="1200000"/>
-            </a:lightRig>
-          </a:scene3d>
-          <a:sp3d>
-            <a:bevelT w="63500" h="25400"/>
-          </a:sp3d>
+          <a:effectLst/>
         </a:effectStyle>
       </a:effectStyleLst>
       <a:bgFillStyleLst>
         <a:solidFill>
           <a:schemeClr val="phClr"/>
         </a:solidFill>
-        <a:gradFill rotWithShape="1">
+        <a:gradFill>
           <a:gsLst>
             <a:gs pos="0">
               <a:schemeClr val="phClr">
                 <a:tint val="40000"/>
-                <a:satMod val="350000"/>
               </a:schemeClr>
             </a:gs>
             <a:gs pos="40000">
               <a:schemeClr val="phClr">
                 <a:tint val="45000"/>
                 <a:shade val="99000"/>
-                <a:satMod val="350000"/>
               </a:schemeClr>
             </a:gs>
             <a:gs pos="100000">
               <a:schemeClr val="phClr">
                 <a:shade val="20000"/>
-                <a:satMod val="255000"/>
               </a:schemeClr>
             </a:gs>
           </a:gsLst>
           <a:path path="circle">
             <a:fillToRect l="50000" t="-80000" r="50000" b="180000"/>
           </a:path>
+          <a:tileRect l="0" t="0" r="0" b="0"/>
         </a:gradFill>
-        <a:gradFill rotWithShape="1">
+        <a:gradFill>
           <a:gsLst>
             <a:gs pos="0">
               <a:schemeClr val="phClr">
                 <a:tint val="80000"/>
-                <a:satMod val="300000"/>
               </a:schemeClr>
             </a:gs>
             <a:gs pos="100000">
               <a:schemeClr val="phClr">
                 <a:shade val="30000"/>
-                <a:satMod val="200000"/>
               </a:schemeClr>
             </a:gs>
           </a:gsLst>
           <a:path path="circle">
             <a:fillToRect l="50000" t="50000" r="50000" b="50000"/>
           </a:path>
+          <a:tileRect l="0" t="0" r="0" b="0"/>
         </a:gradFill>
       </a:bgFillStyleLst>
     </a:fmtScheme>
   </a:themeElements>
-  <a:objectDefaults/>
-  <a:extraClrSchemeLst/>
 </a:theme>
 </file>
 

</xml_diff>